<commit_message>
fix(teg): limpiar Capitulo VI eliminando nombres de repositorios y ajustando formato de impresion a carta
</commit_message>
<xml_diff>
--- a/proyecto_de_grado/final.docx
+++ b/proyecto_de_grado/final.docx
@@ -13604,7 +13604,7 @@
           <w:i w:val="0"/>
           <w:sz w:val="24"/>
         </w:rPr>
-        <w:t>En este marco institucional, la presente propuesta técnica comprende el desarrollo e implementación del "Sistema de Información para la Gestión de Inventario y Control de Préstamos Prendarios", concebido a medida para responder a las exigencias operacionales de la empresa Inversiones Más Por Tu Oro 17 C.A., ubicada en la ciudad de Caracas. La solución consolida una plataforma web moderna e integrada, estructurada mediante dos subsistemas tecnológicos altamente especializados y sincronizados:</w:t>
+        <w:t>En este marco institucional, la presente propuesta técnica comprende el diseño e implementación del "Sistema de Información para la Gestión de Inventario y Control de Préstamos Prendarios", concebido a medida para responder a las exigencias operacionales de la empresa Inversiones Más Por Tu Oro 17 C.A., ubicada en la ciudad de Caracas. La solución consolida una plataforma web moderna e integrada, estructurada mediante dos módulos funcionales complementarios y sincronizados:</w:t>
       </w:r>
     </w:p>
     <w:p>
@@ -13621,7 +13621,7 @@
           <w:i w:val="0"/>
           <w:sz w:val="24"/>
         </w:rPr>
-        <w:t>1. Subsistema de Control de Préstamos Prendarios y Empeños (app-empenos): Desarrollado bajo el entorno moderno de Next.js y React con TypeScript, respaldado por el ORM Prisma y una base de datos relacional PostgreSQL desplegada sobre arquitectura en la nube (Supabase). Este subsistema administra el ciclo de vida íntegro de las boletas de empeño, desde la tasación del bien, captura fotográfica en tiempo real de la prenda, cálculo automatizado de tasas de interés y custodia, hasta la emisión digital de contratos con código QR, renovaciones periódicas y rescates.</w:t>
+        <w:t>1. Módulo de Control de Préstamos Prendarios y Empeños: Desarrollado bajo una arquitectura web moderna con Next.js y React en TypeScript, respaldado por el ORM Prisma y una base de datos relacional PostgreSQL desplegada sobre infraestructura en la nube. Este módulo administra el ciclo de vida íntegro de las boletas de empeño, desde la tasación del bien, captura fotográfica remota de la prenda en tiempo real, cálculo automatizado de tasas de interés y custodia, hasta la emisión digital de contratos en formato carta con código QR de verificación, renovaciones periódicas y rescates.</w:t>
       </w:r>
     </w:p>
     <w:p>
@@ -13638,7 +13638,7 @@
           <w:i w:val="0"/>
           <w:sz w:val="24"/>
         </w:rPr>
-        <w:t>2. Subsistema de Arqueo de Caja, Compra de Metales Preciosos e Inventario en Bóveda (ENTRADAS-Y-SALIDAS-TIENDA): Estructurado mediante una arquitectura cliente-servidor desacoplada con backend en Python utilizando Django REST Framework (DRF) y frontend interactivo tipo SPA (Single Page Application) desarrollado en Vite y React. Este subsistema gestiona la compra directa de oro y plata por ley/kilataje, determinando automáticamente los gramos puros equivalentes y el valor de liquidación, a la vez que centraliza el arqueo diario de caja multimoneda (dólares en efectivo y bolívares digitales) y el registro de egresos operativos.</w:t>
+        <w:t>2. Módulo de Arqueo de Caja, Compra de Metales Preciosos e Inventario en Bóveda: Estructurado mediante una arquitectura cliente-servidor desacoplada con servicios backend en Python (Django REST Framework) y una interfaz gráfica interactiva tipo SPA (Single Page Application) desarrollada en Vite y React. Este módulo gestiona la compra directa de oro y plata por kilataje y ley, determinando automáticamente los gramos puros equivalentes y el valor de liquidación, a la vez que centraliza el arqueo diario de caja multimoneda (dólares en efectivo y bolívares digitales) y el registro de egresos operativos.</w:t>
       </w:r>
     </w:p>
     <w:p>
@@ -13655,7 +13655,7 @@
           <w:i w:val="0"/>
           <w:sz w:val="24"/>
         </w:rPr>
-        <w:t>La unificación de estos subsistemas proporciona un ecosistema informático robusto que sustituye de manera definitiva el manejo disperso e inseguro en libros de cálculo de Microsoft Excel, garantizando la centralización de datos, la trazabilidad de los metales en bóveda y la inmediatez en la toma de decisiones gerenciales.</w:t>
+        <w:t>La unificación de estos módulos proporciona un ecosistema informático robusto que sustituye de manera definitiva el manejo disperso en libros de cálculo de Microsoft Excel, garantizando la centralización de datos, la trazabilidad de los metales en bóveda y la inmediatez en la toma de decisiones gerenciales.</w:t>
       </w:r>
     </w:p>
     <w:p>
@@ -13706,7 +13706,7 @@
           <w:i w:val="0"/>
           <w:sz w:val="24"/>
         </w:rPr>
-        <w:t>Desde la perspectiva práctica y operacional, la propuesta erradica la dependencia de registros manuales y hojas de cálculo desarticuladas, las cuales generaban lentitud en la atención al público (con tiempos promedio de espera superiores a 15 minutos por cliente) y recurrentes discrepancias aritméticas en el cálculo de intereses moratorios y días de gracia. Con el nuevo sistema, el tiempo de emisión de contratos se reduce a menos de 3 minutos, emitiendo boletas formales impresas y comprobantes digitales con validación QR.</w:t>
+        <w:t>Desde la perspectiva práctica y operacional, la propuesta erradica la dependencia de registros manuales y hojas de cálculo desarticuladas, las cuales generaban lentitud en la atención al público (con tiempos promedio de espera superiores a 15 minutos por cliente) y recurrentes discrepancias aritméticas en el cálculo de intereses moratorios y días de gracia. Con el nuevo sistema, el tiempo de emisión de contratos se reduce sustancialmente, emitiendo boletas formales impresas y comprobantes digitales en formato carta con validación QR.</w:t>
       </w:r>
     </w:p>
     <w:p>
@@ -14012,7 +14012,7 @@
           <w:i w:val="0"/>
           <w:sz w:val="24"/>
         </w:rPr>
-        <w:t>a) Frontend Reactivo y Modular: La interfaz del subsistema de préstamos está construida con Next.js 16 (React 19, TypeScript y Tailwind CSS), mientras que el subsistema de caja e inventario utiliza Vite con React. Ambos proporcionan renderizado ultrarrápido, componentes accesibles mediante Radix UI/shadcn y compatibilidad multiplataforma para computadores de escritorio, tabletas y teléfonos móviles.</w:t>
+        <w:t>a) Frontend Reactivo y Modular: La interfaz del módulo de préstamos está construida con Next.js (React y TypeScript con Tailwind CSS), mientras que el módulo de caja e inventario utiliza Vite con React. Ambos proporcionan renderizado ágil, componentes accesibles y diseño responsivo adaptado para computadores de escritorio y dispositivos móviles.</w:t>
       </w:r>
     </w:p>
     <w:p>
@@ -14029,7 +14029,7 @@
           <w:i w:val="0"/>
           <w:sz w:val="24"/>
         </w:rPr>
-        <w:t>b) Capa de Servicios Backend y APIs RESTful: Se integran Server Actions en Next.js para operaciones transaccionales seguras y un backend robusto en Django REST Framework (Python 3.12) para la administración contable de caja y compras. La comunicación intermodular se rige por endpoints REST protegidos por autenticación basada en tokens JWT.</w:t>
+        <w:t>b) Capa de Servicios Backend y APIs RESTful: Se integran Server Actions y microservicios construidos con Django REST Framework (Python). Esta capa centraliza las reglas financieras (algoritmos de cálculo de interés diario/mensual, prorrateo, tasas de custodia, conversión de kilatajes a gramos puros) y la validación de datos.</w:t>
       </w:r>
     </w:p>
     <w:p>
@@ -14046,7 +14046,7 @@
           <w:i w:val="0"/>
           <w:sz w:val="24"/>
         </w:rPr>
-        <w:t>c) Persistencia y Despliegue en la Nube: Se utiliza el motor relacional PostgreSQL alojado en Supabase, ofreciendo alta disponibilidad, cifrado en reposo y respaldos diarios automatizados. Los clientes estáticos y APIs se despliegan en Vercel y contenedores Docker, garantizando un tiempo de actividad del 99.9% sin costes elevados de servidores locales.</w:t>
+        <w:t>c) Persistencia y Generación de Documentos: Se utiliza el motor relacional PostgreSQL alojado en la nube, garantizando aislamiento transaccional (ACID). Para la emisión de contratos de empeño, actas de rescate y recibos de pago, se implementa la biblioteca @react-pdf/renderer configurada en formato Carta (Letter), asegurando fidelidad tipográfica, membrete institucional y código QR para verificación digital.</w:t>
       </w:r>
     </w:p>
     <w:p>
@@ -14131,7 +14131,7 @@
           <w:i w:val="0"/>
           <w:sz w:val="24"/>
         </w:rPr>
-        <w:t>3. Ley Especial Contra los Delitos Informáticos (2001): Artículos 6 (acceso indebido) y 7 (sabotaje o daño a sistemas). La arquitectura técnica implementa controles de autenticación biométrica o mediante credenciales cifradas (bcrypt), perfiles con permisos mínimos y tablas de auditoría que impiden la impunidad ante accesos indebidos.</w:t>
+        <w:t>3. Ley Especial Contra los Delitos Informáticos (2001): Artículos 6 (acceso indebido) y 7 (sabotaje o daño a sistemas). La arquitectura técnica implementa controles de autenticación mediante credenciales cifradas (bcrypt), perfiles con permisos mínimos y tablas de auditoría que impiden la impunidad ante accesos indebidos.</w:t>
       </w:r>
     </w:p>
     <w:p>
@@ -14913,7 +14913,26 @@
                 <w:rFonts w:ascii="Times New Roman" w:hAnsi="Times New Roman"/>
                 <w:sz w:val="20"/>
               </w:rPr>
-              <w:t>Papel térmico para recibos (80 mm)</w:t>
+              <w:t>Resma de papel bond blanco tamaño carta</w:t>
+            </w:r>
+          </w:p>
+        </w:tc>
+        <w:tc>
+          <w:tcPr>
+            <w:tcW w:type="dxa" w:w="2068"/>
+          </w:tcPr>
+          <w:p>
+            <w:pPr>
+              <w:jc w:val="center"/>
+              <w:spacing w:line="240" w:after="30"/>
+            </w:pPr>
+            <w:r/>
+            <w:r>
+              <w:rPr>
+                <w:rFonts w:ascii="Times New Roman" w:hAnsi="Times New Roman"/>
+                <w:sz w:val="20"/>
+              </w:rPr>
+              <w:t>3 resmas</w:t>
             </w:r>
           </w:p>
         </w:tc>
@@ -14932,7 +14951,28 @@
                 <w:rFonts w:ascii="Times New Roman" w:hAnsi="Times New Roman"/>
                 <w:sz w:val="20"/>
               </w:rPr>
-              <w:t>10 rollos</w:t>
+              <w:t>Impresión de contratos de empeño, actas de rescate, recibos y reportes.</w:t>
+            </w:r>
+          </w:p>
+        </w:tc>
+      </w:tr>
+      <w:tr>
+        <w:tc>
+          <w:tcPr>
+            <w:tcW w:type="dxa" w:w="2068"/>
+          </w:tcPr>
+          <w:p>
+            <w:pPr>
+              <w:jc w:val="center"/>
+              <w:spacing w:line="240" w:after="30"/>
+            </w:pPr>
+            <w:r/>
+            <w:r>
+              <w:rPr>
+                <w:rFonts w:ascii="Times New Roman" w:hAnsi="Times New Roman"/>
+                <w:sz w:val="20"/>
+              </w:rPr>
+              <w:t>2</w:t>
             </w:r>
           </w:p>
         </w:tc>
@@ -14951,7 +14991,45 @@
                 <w:rFonts w:ascii="Times New Roman" w:hAnsi="Times New Roman"/>
                 <w:sz w:val="20"/>
               </w:rPr>
-              <w:t>Emisión física de comprobantes de pago y recibos de abono.</w:t>
+              <w:t>Cartucho de tóner / tinta para impresora</w:t>
+            </w:r>
+          </w:p>
+        </w:tc>
+        <w:tc>
+          <w:tcPr>
+            <w:tcW w:type="dxa" w:w="2068"/>
+          </w:tcPr>
+          <w:p>
+            <w:pPr>
+              <w:jc w:val="center"/>
+              <w:spacing w:line="240" w:after="30"/>
+            </w:pPr>
+            <w:r/>
+            <w:r>
+              <w:rPr>
+                <w:rFonts w:ascii="Times New Roman" w:hAnsi="Times New Roman"/>
+                <w:sz w:val="20"/>
+              </w:rPr>
+              <w:t>1 unidad</w:t>
+            </w:r>
+          </w:p>
+        </w:tc>
+        <w:tc>
+          <w:tcPr>
+            <w:tcW w:type="dxa" w:w="2068"/>
+          </w:tcPr>
+          <w:p>
+            <w:pPr>
+              <w:jc w:val="left"/>
+              <w:spacing w:line="240" w:after="30"/>
+            </w:pPr>
+            <w:r/>
+            <w:r>
+              <w:rPr>
+                <w:rFonts w:ascii="Times New Roman" w:hAnsi="Times New Roman"/>
+                <w:sz w:val="20"/>
+              </w:rPr>
+              <w:t>Impresión de documentos en formato carta.</w:t>
             </w:r>
           </w:p>
         </w:tc>
@@ -14972,7 +15050,7 @@
                 <w:rFonts w:ascii="Times New Roman" w:hAnsi="Times New Roman"/>
                 <w:sz w:val="20"/>
               </w:rPr>
-              <w:t>2</w:t>
+              <w:t>3</w:t>
             </w:r>
           </w:p>
         </w:tc>
@@ -14991,10 +15069,50 @@
                 <w:rFonts w:ascii="Times New Roman" w:hAnsi="Times New Roman"/>
                 <w:sz w:val="20"/>
               </w:rPr>
-              <w:t>Resma de papel bond blanco tamaño carta</w:t>
-            </w:r>
-          </w:p>
-        </w:tc>
+              <w:t>Bolsas de seguridad sellables numeradas</w:t>
+            </w:r>
+          </w:p>
+        </w:tc>
+        <w:tc>
+          <w:tcPr>
+            <w:tcW w:type="dxa" w:w="2068"/>
+          </w:tcPr>
+          <w:p>
+            <w:pPr>
+              <w:jc w:val="left"/>
+              <w:spacing w:line="240" w:after="30"/>
+            </w:pPr>
+            <w:r/>
+            <w:r>
+              <w:rPr>
+                <w:rFonts w:ascii="Times New Roman" w:hAnsi="Times New Roman"/>
+                <w:sz w:val="20"/>
+              </w:rPr>
+              <w:t>200 unid.</w:t>
+            </w:r>
+          </w:p>
+        </w:tc>
+        <w:tc>
+          <w:tcPr>
+            <w:tcW w:type="dxa" w:w="2068"/>
+          </w:tcPr>
+          <w:p>
+            <w:pPr>
+              <w:jc w:val="left"/>
+              <w:spacing w:line="240" w:after="30"/>
+            </w:pPr>
+            <w:r/>
+            <w:r>
+              <w:rPr>
+                <w:rFonts w:ascii="Times New Roman" w:hAnsi="Times New Roman"/>
+                <w:sz w:val="20"/>
+              </w:rPr>
+              <w:t>Custodia física y precinto de joyas y metales en bóveda.</w:t>
+            </w:r>
+          </w:p>
+        </w:tc>
+      </w:tr>
+      <w:tr>
         <w:tc>
           <w:tcPr>
             <w:tcW w:type="dxa" w:w="2068"/>
@@ -15010,7 +15128,7 @@
                 <w:rFonts w:ascii="Times New Roman" w:hAnsi="Times New Roman"/>
                 <w:sz w:val="20"/>
               </w:rPr>
-              <w:t>2 resmas</w:t>
+              <w:t>4</w:t>
             </w:r>
           </w:p>
         </w:tc>
@@ -15029,125 +15147,7 @@
                 <w:rFonts w:ascii="Times New Roman" w:hAnsi="Times New Roman"/>
                 <w:sz w:val="20"/>
               </w:rPr>
-              <w:t>Impresión de contratos prendarios formales y reportes mensuales.</w:t>
-            </w:r>
-          </w:p>
-        </w:tc>
-      </w:tr>
-      <w:tr>
-        <w:tc>
-          <w:tcPr>
-            <w:tcW w:type="dxa" w:w="2068"/>
-          </w:tcPr>
-          <w:p>
-            <w:pPr>
-              <w:jc w:val="center"/>
-              <w:spacing w:line="240" w:after="30"/>
-            </w:pPr>
-            <w:r/>
-            <w:r>
-              <w:rPr>
-                <w:rFonts w:ascii="Times New Roman" w:hAnsi="Times New Roman"/>
-                <w:sz w:val="20"/>
-              </w:rPr>
-              <w:t>3</w:t>
-            </w:r>
-          </w:p>
-        </w:tc>
-        <w:tc>
-          <w:tcPr>
-            <w:tcW w:type="dxa" w:w="2068"/>
-          </w:tcPr>
-          <w:p>
-            <w:pPr>
-              <w:jc w:val="left"/>
-              <w:spacing w:line="240" w:after="30"/>
-            </w:pPr>
-            <w:r/>
-            <w:r>
-              <w:rPr>
-                <w:rFonts w:ascii="Times New Roman" w:hAnsi="Times New Roman"/>
-                <w:sz w:val="20"/>
-              </w:rPr>
-              <w:t>Bolsas de seguridad sellables numeradas</w:t>
-            </w:r>
-          </w:p>
-        </w:tc>
-        <w:tc>
-          <w:tcPr>
-            <w:tcW w:type="dxa" w:w="2068"/>
-          </w:tcPr>
-          <w:p>
-            <w:pPr>
-              <w:jc w:val="left"/>
-              <w:spacing w:line="240" w:after="30"/>
-            </w:pPr>
-            <w:r/>
-            <w:r>
-              <w:rPr>
-                <w:rFonts w:ascii="Times New Roman" w:hAnsi="Times New Roman"/>
-                <w:sz w:val="20"/>
-              </w:rPr>
-              <w:t>200 unid.</w:t>
-            </w:r>
-          </w:p>
-        </w:tc>
-        <w:tc>
-          <w:tcPr>
-            <w:tcW w:type="dxa" w:w="2068"/>
-          </w:tcPr>
-          <w:p>
-            <w:pPr>
-              <w:jc w:val="left"/>
-              <w:spacing w:line="240" w:after="30"/>
-            </w:pPr>
-            <w:r/>
-            <w:r>
-              <w:rPr>
-                <w:rFonts w:ascii="Times New Roman" w:hAnsi="Times New Roman"/>
-                <w:sz w:val="20"/>
-              </w:rPr>
-              <w:t>Custodia física y precinto de joyas y metales en bóveda.</w:t>
-            </w:r>
-          </w:p>
-        </w:tc>
-      </w:tr>
-      <w:tr>
-        <w:tc>
-          <w:tcPr>
-            <w:tcW w:type="dxa" w:w="2068"/>
-          </w:tcPr>
-          <w:p>
-            <w:pPr>
-              <w:jc w:val="center"/>
-              <w:spacing w:line="240" w:after="30"/>
-            </w:pPr>
-            <w:r/>
-            <w:r>
-              <w:rPr>
-                <w:rFonts w:ascii="Times New Roman" w:hAnsi="Times New Roman"/>
-                <w:sz w:val="20"/>
-              </w:rPr>
-              <w:t>4</w:t>
-            </w:r>
-          </w:p>
-        </w:tc>
-        <w:tc>
-          <w:tcPr>
-            <w:tcW w:type="dxa" w:w="2068"/>
-          </w:tcPr>
-          <w:p>
-            <w:pPr>
-              <w:jc w:val="left"/>
-              <w:spacing w:line="240" w:after="30"/>
-            </w:pPr>
-            <w:r/>
-            <w:r>
-              <w:rPr>
-                <w:rFonts w:ascii="Times New Roman" w:hAnsi="Times New Roman"/>
-                <w:sz w:val="20"/>
-              </w:rPr>
-              <w:t>Etiquetas autoadhesivas con código de barras</w:t>
+              <w:t>Etiquetas autoadhesivas de identificación</w:t>
             </w:r>
           </w:p>
         </w:tc>
@@ -15521,7 +15521,7 @@
                 <w:rFonts w:ascii="Times New Roman" w:hAnsi="Times New Roman"/>
                 <w:sz w:val="20"/>
               </w:rPr>
-              <w:t>Impresora Multifuncional / Térmica</w:t>
+              <w:t>Impresora Multifuncional / Láser Carta</w:t>
             </w:r>
           </w:p>
         </w:tc>
@@ -15540,7 +15540,7 @@
                 <w:rFonts w:ascii="Times New Roman" w:hAnsi="Times New Roman"/>
                 <w:sz w:val="20"/>
               </w:rPr>
-              <w:t>Impresora de tickets 80mm USB + Multifuncional</w:t>
+              <w:t>Impresora estándar USB / Red para hojas tamaño carta</w:t>
             </w:r>
           </w:p>
         </w:tc>
@@ -15696,7 +15696,7 @@
                 <w:rFonts w:ascii="Times New Roman" w:hAnsi="Times New Roman"/>
                 <w:sz w:val="20"/>
               </w:rPr>
-              <w:t>Cámara 12 MP para captura de fotos y escaneo QR</w:t>
+              <w:t>Cámara para captura de fotografías de prendas y escaneo QR</w:t>
             </w:r>
           </w:p>
         </w:tc>
@@ -15774,7 +15774,7 @@
                 <w:rFonts w:ascii="Times New Roman" w:hAnsi="Times New Roman"/>
                 <w:sz w:val="20"/>
               </w:rPr>
-              <w:t>Supabase Cloud (PostgreSQL) + Vercel Platform</w:t>
+              <w:t>Plataforma Cloud (PostgreSQL) + Edge Hosting</w:t>
             </w:r>
           </w:p>
         </w:tc>
@@ -15864,7 +15864,7 @@
           <w:i w:val="0"/>
           <w:sz w:val="24"/>
         </w:rPr>
-        <w:t>El análisis financiero demuestra que la propuesta es plenamente viable, ya que aprovecha tecnologías de código abierto (Open Source) y servicios de computación en la nube con niveles de uso gratuitos o de bajo coste operativo:</w:t>
+        <w:t>El análisis financiero demuestra que la propuesta es plenamente viable, ya que aprovecha tecnologías de código abierto (Open Source) y servicios de computación en la nube con niveles de uso de bajo coste operativo:</w:t>
       </w:r>
     </w:p>
     <w:p>
@@ -16180,7 +16180,7 @@
                 <w:rFonts w:ascii="Times New Roman" w:hAnsi="Times New Roman"/>
                 <w:sz w:val="20"/>
               </w:rPr>
-              <w:t>Suscripción base Supabase + Vercel Edge Hosting</w:t>
+              <w:t>Suscripción base en infraestructura cloud</w:t>
             </w:r>
           </w:p>
         </w:tc>
@@ -16239,7 +16239,7 @@
                 <w:rFonts w:ascii="Times New Roman" w:hAnsi="Times New Roman"/>
                 <w:sz w:val="20"/>
               </w:rPr>
-              <w:t>Insumos Operativos</w:t>
+              <w:t>Insumos de Impresión y Oficina</w:t>
             </w:r>
           </w:p>
         </w:tc>
@@ -16258,7 +16258,7 @@
                 <w:rFonts w:ascii="Times New Roman" w:hAnsi="Times New Roman"/>
                 <w:sz w:val="20"/>
               </w:rPr>
-              <w:t>Papel térmico, etiquetas adhesivas y consumibles de impresión</w:t>
+              <w:t>Papel bond tamaño carta, tóner y etiquetas de custodia</w:t>
             </w:r>
           </w:p>
         </w:tc>
@@ -16727,7 +16727,7 @@
           <w:i w:val="0"/>
           <w:sz w:val="24"/>
         </w:rPr>
-        <w:t>• RF-07 (Cancelación y Rescate de Garantías): Debe procesar el pago total del saldo insoluto, emitiendo el comprobante de entrega y liberando el bien prendario.</w:t>
+        <w:t>• RF-07 (Cancelación y Rescate de Garantías): Debe procesar el pago total del saldo insoluto, emitiendo el acta de desempeño y liberando el bien prendario.</w:t>
       </w:r>
     </w:p>
     <w:p>
@@ -16778,7 +16778,7 @@
           <w:i w:val="0"/>
           <w:sz w:val="24"/>
         </w:rPr>
-        <w:t>• RF-10 (Emisión de Contratos en PDF): Debe generar e imprimir contratos formales de empeño en formato PDF con código QR verificable y cláusulas legales según el Código de Comercio.</w:t>
+        <w:t>• RF-10 (Emisión de Contratos en Formato Carta): Debe generar contratos formales de empeño en formato PDF tamaño Carta con código QR verificable y cláusulas legales según el Código de Comercio.</w:t>
       </w:r>
     </w:p>
     <w:p>
@@ -16914,7 +16914,7 @@
           <w:i w:val="0"/>
           <w:sz w:val="24"/>
         </w:rPr>
-        <w:t>• RNF-05 (Usabilidad y Ergonomía): Interfaces responsivas desarrolladas bajo principios de Diseño Atómico, adaptadas para pantallas táctiles y teclado rápido.</w:t>
+        <w:t>• RNF-05 (Usabilidad y Ergonomía): Interfaces responsivas desarrolladas bajo principios de usabilidad, adaptadas para pantallas táctiles y teclado rápido.</w:t>
       </w:r>
     </w:p>
     <w:p>
@@ -16999,7 +16999,7 @@
           <w:i w:val="0"/>
           <w:sz w:val="24"/>
         </w:rPr>
-        <w:t>2. Capa de Lógica de Negocio (Backend y APIs): Integrada por Server Actions de Next.js y los microservicios REST construidos en Django REST Framework. Esta capa centraliza las reglas financieras (algoritmos de cálculo de interés diario/mensual, prorrateo, tasas de custodia, conversión de kilatajes a gramos puros) y la validación de esquemas mediante Zod.</w:t>
+        <w:t>2. Capa de Lógica de Negocio (Backend y APIs): Integrada por Server Actions de Next.js y los servicios REST construidos en Django REST Framework. Esta capa centraliza las reglas financieras (algoritmos de cálculo de interés diario/mensual, prorrateo, tasas de custodia, conversión de kilatajes a gramos puros) y la validación de esquemas.</w:t>
       </w:r>
     </w:p>
     <w:p>
@@ -17016,7 +17016,7 @@
           <w:i w:val="0"/>
           <w:sz w:val="24"/>
         </w:rPr>
-        <w:t>3. Capa de Persistencia y Almacenamiento (Base de Datos): Soportada por el motor relacional PostgreSQL alojado en la nube. Gestiona las tablas con integridad referencial estricta y almacena los activos multimedia (fotografías de joyas) en almacenamiento de objetos en la nube.</w:t>
+        <w:t>3. Capa de Persistencia y Almacenamiento (Base de Datos): Soportada por el motor relacional PostgreSQL alojado en la nube. Gestiona las tablas con integridad referencial estricta y almacena las fotografías de prendas en almacenamiento seguro de objetos.</w:t>
       </w:r>
     </w:p>
     <w:p>
@@ -17288,7 +17288,7 @@
           <w:i w:val="0"/>
           <w:sz w:val="24"/>
         </w:rPr>
-        <w:t>Módulo III: Emisión de Préstamos Prendarios y Captura de Prenda. Asiste al operador en la tasación física de la prenda. Se ingresa el kilataje, peso neto y monto del préstamo. El operador genera un código QR que escanea desde su teléfono móvil para capturar hasta 5 fotografías nítidas de la joya, las cuales se adjuntan a la boleta. Al confirmar, el sistema genera el contrato de empeño en formato PDF con su tabla de amortización y código QR de autenticidad.</w:t>
+        <w:t>Módulo III: Emisión de Préstamos Prendarios y Captura de Prenda. Asiste al operador en la tasación física de la prenda. Se ingresa el kilataje, peso neto y monto del préstamo. El operador genera un código QR que escanea desde su teléfono móvil para capturar fotografías de la joya, las cuales se adjuntan a la boleta. Al confirmar, el sistema genera el contrato de empeño en formato PDF tamaño Carta con su tabla de amortización y código QR de autenticidad.</w:t>
       </w:r>
     </w:p>
     <w:p>
@@ -17628,7 +17628,7 @@
           <w:i w:val="0"/>
           <w:sz w:val="24"/>
         </w:rPr>
-        <w:t>Paso 2. Emisión de Nuevo Empeño (Cajero / Operador): Ante un cliente que solicita un préstamo prendario, se ingresa su número de cédula en el módulo de clientes. Se detallan las características de la joya, su peso registrado en la balanza de precisión y el importe acordado. Se escanea el código QR de captura fotográfica para registrar la prenda. Se presiona el botón 'Emitir Boleta' y se imprime el contrato por duplicado para firma del cliente.</w:t>
+        <w:t>Paso 2. Emisión de Nuevo Empeño (Cajero / Operador): Ante un cliente que solicita un préstamo prendario, se ingresa su número de cédula en el módulo de clientes. Se detallan las características de la joya, su peso registrado en la balanza de precisión y el importe acordado. Se escanea el código QR de captura fotográfica para registrar la prenda. Se presiona el botón 'Emitir Boleta' y se imprime el contrato en formato carta por duplicado para firma del cliente.</w:t>
       </w:r>
     </w:p>
     <w:p>

</xml_diff>

<commit_message>
fix(legal): reemplazar pacto de retracto por contrato de mutuo con garantia prendaria segun codigo del sistema
</commit_message>
<xml_diff>
--- a/proyecto_de_grado/final.docx
+++ b/proyecto_de_grado/final.docx
@@ -13363,11 +13363,7 @@
         <w:rPr/>
       </w:pPr>
       <w:r>
-        <w:rPr>
-          <w:rFonts w:ascii="Times New Roman" w:hAnsi="Times New Roman"/>
-          <w:sz w:val="24"/>
-        </w:rPr>
-        <w:t>En cuanto a los requerimientos técnicos y funcionales necesarios para la automatización, se determinó que la institución requiere con carácter de urgencia la implementación de una base de datos relacional centralizada. Funcionalmente, se precisó la necesidad de contar con perfiles de acceso escalonados (Gerente, Administrador, Cajero) y módulos independientes que separen la gestión de mercancía en metales (oro y plata) del control contractual de los pactos de retracto.</w:t>
+        <w:t>En cuanto a los requerimientos técnicos y funcionales necesarios para la automatización, se determinó que la institución requiere con carácter de urgencia la implementación de una base de datos relacional centralizada. Funcionalmente, se precisó la necesidad de contar con perfiles de acceso escalonados (Gerente, Administrador, Cajero) y módulos independientes que separen la gestión de mercancía en metales (oro y plata) del control contractual de los préstamos mediante contratos de mutuo con garantía prendaria.</w:t>
       </w:r>
     </w:p>
     <w:p>
@@ -13471,11 +13467,7 @@
         <w:rPr/>
       </w:pPr>
       <w:r>
-        <w:rPr>
-          <w:rFonts w:ascii="Times New Roman" w:hAnsi="Times New Roman"/>
-          <w:sz w:val="24"/>
-        </w:rPr>
-        <w:t>Ejecutar un taller de capacitación técnica e inducción al cambio dirigido al Gerente, el Administrador y el Cajero de la institución, con el fin de garantizar el correcto dominio de las funciones del nuevo sistema, la asignación de permisos según sus roles y el manejo del módulo de empeños (pactos de retracto).</w:t>
+        <w:t>Ejecutar un taller de capacitación técnica e inducción al cambio dirigido al Gerente, el Administrador y el Cajero de la institución, con el fin de garantizar el correcto dominio de las funciones del nuevo sistema, la asignación de permisos según sus roles y el manejo del módulo de empeños (contratos de mutuo con garantía prendaria).</w:t>
       </w:r>
     </w:p>
     <w:p>
@@ -13579,15 +13571,8 @@
         <w:spacing w:line="360" w:lineRule="auto" w:after="120" w:before="0"/>
         <w:ind w:firstLine="720" w:left="0"/>
       </w:pPr>
-      <w:r/>
-      <w:r>
-        <w:rPr>
-          <w:rFonts w:ascii="Times New Roman" w:hAnsi="Times New Roman"/>
-          <w:b w:val="0"/>
-          <w:i w:val="0"/>
-          <w:sz w:val="24"/>
-        </w:rPr>
-        <w:t>El vertiginoso desarrollo de las tecnologías de información y comunicación ha transformado sustancialmente los modelos de gestión operativa y financiera en las organizaciones contemporáneas. En el sector de la compraventa y custodia de metales preciosos (oro y plata), así como en la intermediación de créditos mediante pacto de retracto (préstamos prendarios), la precisión en los cálculos, la rapidez en la tasación física y el resguardo fidedigno de los inventarios constituyen factores determinantes para garantizar la sustentabilidad comercial y el estricto cumplimiento normativo.</w:t>
+      <w:r>
+        <w:t>El vertiginoso desarrollo de las tecnologías de información y comunicación ha transformado sustancialmente los modelos de gestión operativa y financiera en las organizaciones contemporáneas. En el sector de la compraventa y custodia de metales preciosos (oro y plata), así como en la intermediación de créditos mediante contratos de mutuo con garantía prendaria (empeños), la precisión en los cálculos, la rapidez en la tasación física y el resguardo fidedigno de los inventarios constituyen factores determinantes para garantizar la sustentabilidad comercial y el estricto cumplimiento normativo.</w:t>
       </w:r>
     </w:p>
     <w:p>
@@ -17382,15 +17367,8 @@
         <w:spacing w:line="360" w:lineRule="auto" w:after="120" w:before="0"/>
         <w:ind w:firstLine="720" w:left="0"/>
       </w:pPr>
-      <w:r/>
-      <w:r>
-        <w:rPr>
-          <w:rFonts w:ascii="Times New Roman" w:hAnsi="Times New Roman"/>
-          <w:b w:val="0"/>
-          <w:i w:val="0"/>
-          <w:sz w:val="24"/>
-        </w:rPr>
-        <w:t>1. Algoritmo de Préstamos Prendarios (Pacto de Retracto):</w:t>
+      <w:r>
+        <w:t>1. Algoritmo de Préstamos Prendarios (Mutuo con Garantía Prendaria):</w:t>
       </w:r>
     </w:p>
     <w:p>

</xml_diff>

<commit_message>
fix(recursos): sustituir etiquetas por grapas para custodia junto a factura impresa
</commit_message>
<xml_diff>
--- a/proyecto_de_grado/final.docx
+++ b/proyecto_de_grado/final.docx
@@ -15107,32 +15107,18 @@
               <w:jc w:val="center"/>
               <w:spacing w:line="240" w:after="30"/>
             </w:pPr>
-            <w:r/>
             <w:r>
               <w:rPr>
                 <w:rFonts w:ascii="Times New Roman" w:hAnsi="Times New Roman"/>
                 <w:sz w:val="20"/>
               </w:rPr>
-              <w:t>4</w:t>
-            </w:r>
-          </w:p>
-        </w:tc>
-        <w:tc>
-          <w:tcPr>
-            <w:tcW w:type="dxa" w:w="2068"/>
-          </w:tcPr>
-          <w:p>
-            <w:pPr>
-              <w:jc w:val="left"/>
-              <w:spacing w:line="240" w:after="30"/>
-            </w:pPr>
-            <w:r/>
+            </w:r>
             <w:r>
               <w:rPr>
                 <w:rFonts w:ascii="Times New Roman" w:hAnsi="Times New Roman"/>
                 <w:sz w:val="20"/>
               </w:rPr>
-              <w:t>Etiquetas autoadhesivas de identificación</w:t>
+              <w:t>4</w:t>
             </w:r>
           </w:p>
         </w:tc>
@@ -15141,17 +15127,12 @@
             <w:tcW w:type="dxa" w:w="2068"/>
           </w:tcPr>
           <w:p>
-            <w:pPr>
-              <w:jc w:val="left"/>
-              <w:spacing w:line="240" w:after="30"/>
-            </w:pPr>
-            <w:r/>
             <w:r>
               <w:rPr>
                 <w:rFonts w:ascii="Times New Roman" w:hAnsi="Times New Roman"/>
                 <w:sz w:val="20"/>
               </w:rPr>
-              <w:t>500 unid.</w:t>
+              <w:t>Grapas y grapadora estándar</w:t>
             </w:r>
           </w:p>
         </w:tc>
@@ -15160,17 +15141,26 @@
             <w:tcW w:type="dxa" w:w="2068"/>
           </w:tcPr>
           <w:p>
-            <w:pPr>
-              <w:jc w:val="left"/>
-              <w:spacing w:line="240" w:after="30"/>
-            </w:pPr>
-            <w:r/>
             <w:r>
               <w:rPr>
                 <w:rFonts w:ascii="Times New Roman" w:hAnsi="Times New Roman"/>
                 <w:sz w:val="20"/>
               </w:rPr>
-              <w:t>Identificación física de prendas asociadas al número de boleta.</w:t>
+              <w:t>2 cajas</w:t>
+            </w:r>
+          </w:p>
+        </w:tc>
+        <w:tc>
+          <w:tcPr>
+            <w:tcW w:type="dxa" w:w="2068"/>
+          </w:tcPr>
+          <w:p>
+            <w:r>
+              <w:rPr>
+                <w:rFonts w:ascii="Times New Roman" w:hAnsi="Times New Roman"/>
+                <w:sz w:val="20"/>
+              </w:rPr>
+              <w:t>Fijación y custodia de la prenda engrapada directamente junto al contrato/factura física.</w:t>
             </w:r>
           </w:p>
         </w:tc>
@@ -16218,32 +16208,32 @@
               <w:jc w:val="center"/>
               <w:spacing w:line="240" w:after="30"/>
             </w:pPr>
-            <w:r/>
             <w:r>
               <w:rPr>
                 <w:rFonts w:ascii="Times New Roman" w:hAnsi="Times New Roman"/>
                 <w:sz w:val="20"/>
               </w:rPr>
-              <w:t>Insumos de Impresión y Oficina</w:t>
-            </w:r>
-          </w:p>
-        </w:tc>
-        <w:tc>
-          <w:tcPr>
-            <w:tcW w:type="dxa" w:w="2068"/>
-          </w:tcPr>
-          <w:p>
-            <w:pPr>
-              <w:jc w:val="left"/>
-              <w:spacing w:line="240" w:after="30"/>
-            </w:pPr>
-            <w:r/>
+            </w:r>
             <w:r>
               <w:rPr>
                 <w:rFonts w:ascii="Times New Roman" w:hAnsi="Times New Roman"/>
                 <w:sz w:val="20"/>
               </w:rPr>
-              <w:t>Papel bond tamaño carta, tóner y etiquetas de custodia</w:t>
+              <w:t>Insumos de Impresión y Oficina</w:t>
+            </w:r>
+          </w:p>
+        </w:tc>
+        <w:tc>
+          <w:tcPr>
+            <w:tcW w:type="dxa" w:w="2068"/>
+          </w:tcPr>
+          <w:p>
+            <w:r>
+              <w:rPr>
+                <w:rFonts w:ascii="Times New Roman" w:hAnsi="Times New Roman"/>
+                <w:sz w:val="20"/>
+              </w:rPr>
+              <w:t>Papel bond tamaño carta, tóner y grapas para contratos</w:t>
             </w:r>
           </w:p>
         </w:tc>
@@ -16256,12 +16246,17 @@
               <w:jc w:val="center"/>
               <w:spacing w:line="240" w:after="30"/>
             </w:pPr>
-            <w:r/>
             <w:r>
               <w:rPr>
                 <w:rFonts w:ascii="Times New Roman" w:hAnsi="Times New Roman"/>
                 <w:sz w:val="20"/>
               </w:rPr>
+            </w:r>
+            <w:r>
+              <w:rPr>
+                <w:rFonts w:ascii="Times New Roman" w:hAnsi="Times New Roman"/>
+                <w:sz w:val="20"/>
+              </w:rPr>
               <w:t>15.00</w:t>
             </w:r>
           </w:p>
@@ -16275,7 +16270,12 @@
               <w:jc w:val="center"/>
               <w:spacing w:line="240" w:after="30"/>
             </w:pPr>
-            <w:r/>
+            <w:r>
+              <w:rPr>
+                <w:rFonts w:ascii="Times New Roman" w:hAnsi="Times New Roman"/>
+                <w:sz w:val="20"/>
+              </w:rPr>
+            </w:r>
             <w:r>
               <w:rPr>
                 <w:rFonts w:ascii="Times New Roman" w:hAnsi="Times New Roman"/>

</xml_diff>

<commit_message>
style: eliminar parrafos vacios redundantes, formatear referencias APA con sangria francesa y ordenar alfabeticamente
</commit_message>
<xml_diff>
--- a/proyecto_de_grado/final.docx
+++ b/proyecto_de_grado/final.docx
@@ -785,113 +785,8 @@
           <w:szCs w:val="24"/>
         </w:rPr>
       </w:r>
-    </w:p>
-    <w:p>
-      <w:pPr>
-        <w:pStyle w:val="normal1"/>
-        <w:spacing w:lineRule="auto" w:line="360"/>
-        <w:rPr>
-          <w:rFonts w:ascii="Times New Roman" w:hAnsi="Times New Roman" w:eastAsia="Times New Roman" w:cs="Times New Roman"/>
-          <w:sz w:val="24"/>
-          <w:szCs w:val="24"/>
-        </w:rPr>
-      </w:pPr>
-      <w:r>
-        <w:rPr>
-          <w:rFonts w:eastAsia="Times New Roman" w:cs="Times New Roman" w:ascii="Times New Roman" w:hAnsi="Times New Roman"/>
-          <w:sz w:val="24"/>
-          <w:szCs w:val="24"/>
-        </w:rPr>
-      </w:r>
-    </w:p>
-    <w:p>
-      <w:pPr>
-        <w:pStyle w:val="normal1"/>
-        <w:spacing w:lineRule="auto" w:line="360"/>
-        <w:rPr>
-          <w:rFonts w:ascii="Times New Roman" w:hAnsi="Times New Roman" w:eastAsia="Times New Roman" w:cs="Times New Roman"/>
-          <w:sz w:val="24"/>
-          <w:szCs w:val="24"/>
-        </w:rPr>
-      </w:pPr>
-      <w:r>
-        <w:rPr>
-          <w:rFonts w:eastAsia="Times New Roman" w:cs="Times New Roman" w:ascii="Times New Roman" w:hAnsi="Times New Roman"/>
-          <w:sz w:val="24"/>
-          <w:szCs w:val="24"/>
-        </w:rPr>
-      </w:r>
-    </w:p>
-    <w:p>
-      <w:pPr>
-        <w:pStyle w:val="normal1"/>
-        <w:spacing w:lineRule="auto" w:line="360"/>
-        <w:rPr>
-          <w:rFonts w:ascii="Times New Roman" w:hAnsi="Times New Roman" w:eastAsia="Times New Roman" w:cs="Times New Roman"/>
-          <w:sz w:val="24"/>
-          <w:szCs w:val="24"/>
-        </w:rPr>
-      </w:pPr>
-      <w:r>
-        <w:rPr>
-          <w:rFonts w:eastAsia="Times New Roman" w:cs="Times New Roman" w:ascii="Times New Roman" w:hAnsi="Times New Roman"/>
-          <w:sz w:val="24"/>
-          <w:szCs w:val="24"/>
-        </w:rPr>
-      </w:r>
-    </w:p>
-    <w:p>
-      <w:pPr>
-        <w:pStyle w:val="normal1"/>
-        <w:spacing w:lineRule="auto" w:line="360"/>
-        <w:rPr>
-          <w:rFonts w:ascii="Times New Roman" w:hAnsi="Times New Roman" w:eastAsia="Times New Roman" w:cs="Times New Roman"/>
-          <w:sz w:val="24"/>
-          <w:szCs w:val="24"/>
-        </w:rPr>
-      </w:pPr>
-      <w:r>
-        <w:rPr>
-          <w:rFonts w:eastAsia="Times New Roman" w:cs="Times New Roman" w:ascii="Times New Roman" w:hAnsi="Times New Roman"/>
-          <w:sz w:val="24"/>
-          <w:szCs w:val="24"/>
-        </w:rPr>
-      </w:r>
-    </w:p>
-    <w:p>
-      <w:pPr>
-        <w:pStyle w:val="normal1"/>
-        <w:spacing w:lineRule="auto" w:line="360"/>
-        <w:rPr>
-          <w:rFonts w:ascii="Times New Roman" w:hAnsi="Times New Roman" w:eastAsia="Times New Roman" w:cs="Times New Roman"/>
-          <w:sz w:val="24"/>
-          <w:szCs w:val="24"/>
-        </w:rPr>
-      </w:pPr>
-      <w:r>
-        <w:rPr>
-          <w:rFonts w:eastAsia="Times New Roman" w:cs="Times New Roman" w:ascii="Times New Roman" w:hAnsi="Times New Roman"/>
-          <w:sz w:val="24"/>
-          <w:szCs w:val="24"/>
-        </w:rPr>
-      </w:r>
-    </w:p>
-    <w:p>
-      <w:pPr>
-        <w:pStyle w:val="normal1"/>
-        <w:spacing w:lineRule="auto" w:line="360"/>
-        <w:rPr>
-          <w:rFonts w:ascii="Times New Roman" w:hAnsi="Times New Roman" w:eastAsia="Times New Roman" w:cs="Times New Roman"/>
-          <w:sz w:val="24"/>
-          <w:szCs w:val="24"/>
-        </w:rPr>
-      </w:pPr>
-      <w:r>
-        <w:rPr>
-          <w:rFonts w:eastAsia="Times New Roman" w:cs="Times New Roman" w:ascii="Times New Roman" w:hAnsi="Times New Roman"/>
-          <w:sz w:val="24"/>
-          <w:szCs w:val="24"/>
-        </w:rPr>
+      <w:r>
+        <w:br w:type="page"/>
       </w:r>
     </w:p>
     <w:p>
@@ -979,335 +874,8 @@
           <w:szCs w:val="24"/>
         </w:rPr>
       </w:r>
-    </w:p>
-    <w:p>
-      <w:pPr>
-        <w:pStyle w:val="normal1"/>
-        <w:spacing w:lineRule="auto" w:line="360"/>
-        <w:rPr>
-          <w:rFonts w:ascii="Times New Roman" w:hAnsi="Times New Roman" w:eastAsia="Times New Roman" w:cs="Times New Roman"/>
-          <w:b/>
-          <w:bCs/>
-          <w:sz w:val="24"/>
-          <w:szCs w:val="24"/>
-        </w:rPr>
-      </w:pPr>
-      <w:r>
-        <w:rPr>
-          <w:rFonts w:eastAsia="Times New Roman" w:cs="Times New Roman" w:ascii="Times New Roman" w:hAnsi="Times New Roman"/>
-          <w:b/>
-          <w:bCs/>
-          <w:sz w:val="24"/>
-          <w:szCs w:val="24"/>
-        </w:rPr>
-      </w:r>
-    </w:p>
-    <w:p>
-      <w:pPr>
-        <w:pStyle w:val="normal1"/>
-        <w:spacing w:lineRule="auto" w:line="360"/>
-        <w:rPr>
-          <w:rFonts w:ascii="Times New Roman" w:hAnsi="Times New Roman" w:eastAsia="Times New Roman" w:cs="Times New Roman"/>
-          <w:b/>
-          <w:bCs/>
-          <w:sz w:val="24"/>
-          <w:szCs w:val="24"/>
-        </w:rPr>
-      </w:pPr>
-      <w:r>
-        <w:rPr>
-          <w:rFonts w:eastAsia="Times New Roman" w:cs="Times New Roman" w:ascii="Times New Roman" w:hAnsi="Times New Roman"/>
-          <w:b/>
-          <w:bCs/>
-          <w:sz w:val="24"/>
-          <w:szCs w:val="24"/>
-        </w:rPr>
-      </w:r>
-    </w:p>
-    <w:p>
-      <w:pPr>
-        <w:pStyle w:val="normal1"/>
-        <w:spacing w:lineRule="auto" w:line="360"/>
-        <w:rPr>
-          <w:rFonts w:ascii="Times New Roman" w:hAnsi="Times New Roman" w:eastAsia="Times New Roman" w:cs="Times New Roman"/>
-          <w:b/>
-          <w:bCs/>
-          <w:sz w:val="24"/>
-          <w:szCs w:val="24"/>
-        </w:rPr>
-      </w:pPr>
-      <w:r>
-        <w:rPr>
-          <w:rFonts w:eastAsia="Times New Roman" w:cs="Times New Roman" w:ascii="Times New Roman" w:hAnsi="Times New Roman"/>
-          <w:b/>
-          <w:bCs/>
-          <w:sz w:val="24"/>
-          <w:szCs w:val="24"/>
-        </w:rPr>
-      </w:r>
-    </w:p>
-    <w:p>
-      <w:pPr>
-        <w:pStyle w:val="normal1"/>
-        <w:spacing w:lineRule="auto" w:line="360"/>
-        <w:rPr>
-          <w:rFonts w:ascii="Times New Roman" w:hAnsi="Times New Roman" w:eastAsia="Times New Roman" w:cs="Times New Roman"/>
-          <w:b/>
-          <w:bCs/>
-          <w:sz w:val="24"/>
-          <w:szCs w:val="24"/>
-        </w:rPr>
-      </w:pPr>
-      <w:r>
-        <w:rPr>
-          <w:rFonts w:eastAsia="Times New Roman" w:cs="Times New Roman" w:ascii="Times New Roman" w:hAnsi="Times New Roman"/>
-          <w:b/>
-          <w:bCs/>
-          <w:sz w:val="24"/>
-          <w:szCs w:val="24"/>
-        </w:rPr>
-      </w:r>
-    </w:p>
-    <w:p>
-      <w:pPr>
-        <w:pStyle w:val="normal1"/>
-        <w:spacing w:lineRule="auto" w:line="360"/>
-        <w:rPr>
-          <w:rFonts w:ascii="Times New Roman" w:hAnsi="Times New Roman" w:eastAsia="Times New Roman" w:cs="Times New Roman"/>
-          <w:b/>
-          <w:bCs/>
-          <w:sz w:val="24"/>
-          <w:szCs w:val="24"/>
-        </w:rPr>
-      </w:pPr>
-      <w:r>
-        <w:rPr>
-          <w:rFonts w:eastAsia="Times New Roman" w:cs="Times New Roman" w:ascii="Times New Roman" w:hAnsi="Times New Roman"/>
-          <w:b/>
-          <w:bCs/>
-          <w:sz w:val="24"/>
-          <w:szCs w:val="24"/>
-        </w:rPr>
-      </w:r>
-    </w:p>
-    <w:p>
-      <w:pPr>
-        <w:pStyle w:val="normal1"/>
-        <w:spacing w:lineRule="auto" w:line="360"/>
-        <w:rPr>
-          <w:rFonts w:ascii="Times New Roman" w:hAnsi="Times New Roman" w:eastAsia="Times New Roman" w:cs="Times New Roman"/>
-          <w:b/>
-          <w:bCs/>
-          <w:sz w:val="24"/>
-          <w:szCs w:val="24"/>
-        </w:rPr>
-      </w:pPr>
-      <w:r>
-        <w:rPr>
-          <w:rFonts w:eastAsia="Times New Roman" w:cs="Times New Roman" w:ascii="Times New Roman" w:hAnsi="Times New Roman"/>
-          <w:b/>
-          <w:bCs/>
-          <w:sz w:val="24"/>
-          <w:szCs w:val="24"/>
-        </w:rPr>
-      </w:r>
-    </w:p>
-    <w:p>
-      <w:pPr>
-        <w:pStyle w:val="normal1"/>
-        <w:spacing w:lineRule="auto" w:line="360"/>
-        <w:rPr>
-          <w:rFonts w:ascii="Times New Roman" w:hAnsi="Times New Roman" w:eastAsia="Times New Roman" w:cs="Times New Roman"/>
-          <w:b/>
-          <w:bCs/>
-          <w:sz w:val="24"/>
-          <w:szCs w:val="24"/>
-        </w:rPr>
-      </w:pPr>
-      <w:r>
-        <w:rPr>
-          <w:rFonts w:eastAsia="Times New Roman" w:cs="Times New Roman" w:ascii="Times New Roman" w:hAnsi="Times New Roman"/>
-          <w:b/>
-          <w:bCs/>
-          <w:sz w:val="24"/>
-          <w:szCs w:val="24"/>
-        </w:rPr>
-      </w:r>
-    </w:p>
-    <w:p>
-      <w:pPr>
-        <w:pStyle w:val="normal1"/>
-        <w:spacing w:lineRule="auto" w:line="360"/>
-        <w:rPr>
-          <w:rFonts w:ascii="Times New Roman" w:hAnsi="Times New Roman" w:eastAsia="Times New Roman" w:cs="Times New Roman"/>
-          <w:b/>
-          <w:bCs/>
-          <w:sz w:val="24"/>
-          <w:szCs w:val="24"/>
-        </w:rPr>
-      </w:pPr>
-      <w:r>
-        <w:rPr>
-          <w:rFonts w:eastAsia="Times New Roman" w:cs="Times New Roman" w:ascii="Times New Roman" w:hAnsi="Times New Roman"/>
-          <w:b/>
-          <w:bCs/>
-          <w:sz w:val="24"/>
-          <w:szCs w:val="24"/>
-        </w:rPr>
-      </w:r>
-    </w:p>
-    <w:p>
-      <w:pPr>
-        <w:pStyle w:val="normal1"/>
-        <w:spacing w:lineRule="auto" w:line="360"/>
-        <w:rPr>
-          <w:rFonts w:ascii="Times New Roman" w:hAnsi="Times New Roman" w:eastAsia="Times New Roman" w:cs="Times New Roman"/>
-          <w:b/>
-          <w:bCs/>
-          <w:sz w:val="24"/>
-          <w:szCs w:val="24"/>
-        </w:rPr>
-      </w:pPr>
-      <w:r>
-        <w:rPr>
-          <w:rFonts w:eastAsia="Times New Roman" w:cs="Times New Roman" w:ascii="Times New Roman" w:hAnsi="Times New Roman"/>
-          <w:b/>
-          <w:bCs/>
-          <w:sz w:val="24"/>
-          <w:szCs w:val="24"/>
-        </w:rPr>
-      </w:r>
-    </w:p>
-    <w:p>
-      <w:pPr>
-        <w:pStyle w:val="normal1"/>
-        <w:spacing w:lineRule="auto" w:line="360"/>
-        <w:rPr>
-          <w:rFonts w:ascii="Times New Roman" w:hAnsi="Times New Roman" w:eastAsia="Times New Roman" w:cs="Times New Roman"/>
-          <w:b/>
-          <w:bCs/>
-          <w:sz w:val="24"/>
-          <w:szCs w:val="24"/>
-        </w:rPr>
-      </w:pPr>
-      <w:r>
-        <w:rPr>
-          <w:rFonts w:eastAsia="Times New Roman" w:cs="Times New Roman" w:ascii="Times New Roman" w:hAnsi="Times New Roman"/>
-          <w:b/>
-          <w:bCs/>
-          <w:sz w:val="24"/>
-          <w:szCs w:val="24"/>
-        </w:rPr>
-      </w:r>
-    </w:p>
-    <w:p>
-      <w:pPr>
-        <w:pStyle w:val="normal1"/>
-        <w:spacing w:lineRule="auto" w:line="360"/>
-        <w:rPr>
-          <w:rFonts w:ascii="Times New Roman" w:hAnsi="Times New Roman" w:eastAsia="Times New Roman" w:cs="Times New Roman"/>
-          <w:b/>
-          <w:bCs/>
-          <w:sz w:val="24"/>
-          <w:szCs w:val="24"/>
-        </w:rPr>
-      </w:pPr>
-      <w:r>
-        <w:rPr>
-          <w:rFonts w:eastAsia="Times New Roman" w:cs="Times New Roman" w:ascii="Times New Roman" w:hAnsi="Times New Roman"/>
-          <w:b/>
-          <w:bCs/>
-          <w:sz w:val="24"/>
-          <w:szCs w:val="24"/>
-        </w:rPr>
-      </w:r>
-    </w:p>
-    <w:p>
-      <w:pPr>
-        <w:pStyle w:val="normal1"/>
-        <w:spacing w:lineRule="auto" w:line="360"/>
-        <w:rPr>
-          <w:rFonts w:ascii="Times New Roman" w:hAnsi="Times New Roman" w:eastAsia="Times New Roman" w:cs="Times New Roman"/>
-          <w:b/>
-          <w:bCs/>
-          <w:sz w:val="24"/>
-          <w:szCs w:val="24"/>
-        </w:rPr>
-      </w:pPr>
-      <w:r>
-        <w:rPr>
-          <w:rFonts w:eastAsia="Times New Roman" w:cs="Times New Roman" w:ascii="Times New Roman" w:hAnsi="Times New Roman"/>
-          <w:b/>
-          <w:bCs/>
-          <w:sz w:val="24"/>
-          <w:szCs w:val="24"/>
-        </w:rPr>
-      </w:r>
-    </w:p>
-    <w:p>
-      <w:pPr>
-        <w:pStyle w:val="normal1"/>
-        <w:spacing w:lineRule="auto" w:line="360"/>
-        <w:rPr>
-          <w:rFonts w:ascii="Times New Roman" w:hAnsi="Times New Roman" w:eastAsia="Times New Roman" w:cs="Times New Roman"/>
-          <w:b/>
-          <w:bCs/>
-          <w:sz w:val="24"/>
-          <w:szCs w:val="24"/>
-        </w:rPr>
-      </w:pPr>
-      <w:r>
-        <w:rPr>
-          <w:rFonts w:eastAsia="Times New Roman" w:cs="Times New Roman" w:ascii="Times New Roman" w:hAnsi="Times New Roman"/>
-          <w:b/>
-          <w:bCs/>
-          <w:sz w:val="24"/>
-          <w:szCs w:val="24"/>
-        </w:rPr>
-      </w:r>
-    </w:p>
-    <w:p>
-      <w:pPr>
-        <w:pStyle w:val="normal1"/>
-        <w:spacing w:lineRule="auto" w:line="360"/>
-        <w:rPr>
-          <w:rFonts w:ascii="Times New Roman" w:hAnsi="Times New Roman" w:eastAsia="Times New Roman" w:cs="Times New Roman"/>
-          <w:b/>
-          <w:bCs/>
-          <w:sz w:val="24"/>
-          <w:szCs w:val="24"/>
-        </w:rPr>
-      </w:pPr>
-      <w:r>
-        <w:rPr>
-          <w:rFonts w:eastAsia="Times New Roman" w:cs="Times New Roman" w:ascii="Times New Roman" w:hAnsi="Times New Roman"/>
-          <w:b/>
-          <w:bCs/>
-          <w:sz w:val="24"/>
-          <w:szCs w:val="24"/>
-        </w:rPr>
-      </w:r>
-    </w:p>
-    <w:p>
-      <w:pPr>
-        <w:pStyle w:val="normal1"/>
-        <w:spacing w:lineRule="auto" w:line="360"/>
-        <w:rPr>
-          <w:rFonts w:ascii="Times New Roman" w:hAnsi="Times New Roman" w:eastAsia="Times New Roman" w:cs="Times New Roman"/>
-          <w:b/>
-          <w:bCs/>
-          <w:sz w:val="24"/>
-          <w:szCs w:val="24"/>
-        </w:rPr>
-      </w:pPr>
-      <w:r>
-        <w:rPr>
-          <w:rFonts w:eastAsia="Times New Roman" w:cs="Times New Roman" w:ascii="Times New Roman" w:hAnsi="Times New Roman"/>
-          <w:b/>
-          <w:bCs/>
-          <w:sz w:val="24"/>
-          <w:szCs w:val="24"/>
-        </w:rPr>
+      <w:r>
+        <w:br w:type="page"/>
       </w:r>
     </w:p>
     <w:p>
@@ -1372,257 +940,8 @@
           <w:szCs w:val="24"/>
         </w:rPr>
       </w:r>
-    </w:p>
-    <w:p>
-      <w:pPr>
-        <w:pStyle w:val="normal1"/>
-        <w:spacing w:lineRule="auto" w:line="360"/>
-        <w:rPr>
-          <w:rFonts w:ascii="Times New Roman" w:hAnsi="Times New Roman" w:eastAsia="Times New Roman" w:cs="Times New Roman"/>
-          <w:sz w:val="24"/>
-          <w:szCs w:val="24"/>
-        </w:rPr>
-      </w:pPr>
-      <w:r>
-        <w:rPr>
-          <w:rFonts w:eastAsia="Times New Roman" w:cs="Times New Roman" w:ascii="Times New Roman" w:hAnsi="Times New Roman"/>
-          <w:sz w:val="24"/>
-          <w:szCs w:val="24"/>
-        </w:rPr>
-      </w:r>
-    </w:p>
-    <w:p>
-      <w:pPr>
-        <w:pStyle w:val="normal1"/>
-        <w:spacing w:lineRule="auto" w:line="360"/>
-        <w:rPr>
-          <w:rFonts w:ascii="Times New Roman" w:hAnsi="Times New Roman" w:eastAsia="Times New Roman" w:cs="Times New Roman"/>
-          <w:sz w:val="24"/>
-          <w:szCs w:val="24"/>
-        </w:rPr>
-      </w:pPr>
-      <w:r>
-        <w:rPr>
-          <w:rFonts w:eastAsia="Times New Roman" w:cs="Times New Roman" w:ascii="Times New Roman" w:hAnsi="Times New Roman"/>
-          <w:sz w:val="24"/>
-          <w:szCs w:val="24"/>
-        </w:rPr>
-      </w:r>
-    </w:p>
-    <w:p>
-      <w:pPr>
-        <w:pStyle w:val="normal1"/>
-        <w:spacing w:lineRule="auto" w:line="360"/>
-        <w:rPr>
-          <w:rFonts w:ascii="Times New Roman" w:hAnsi="Times New Roman" w:eastAsia="Times New Roman" w:cs="Times New Roman"/>
-          <w:sz w:val="24"/>
-          <w:szCs w:val="24"/>
-        </w:rPr>
-      </w:pPr>
-      <w:r>
-        <w:rPr>
-          <w:rFonts w:eastAsia="Times New Roman" w:cs="Times New Roman" w:ascii="Times New Roman" w:hAnsi="Times New Roman"/>
-          <w:sz w:val="24"/>
-          <w:szCs w:val="24"/>
-        </w:rPr>
-      </w:r>
-    </w:p>
-    <w:p>
-      <w:pPr>
-        <w:pStyle w:val="normal1"/>
-        <w:spacing w:lineRule="auto" w:line="360"/>
-        <w:rPr>
-          <w:rFonts w:ascii="Times New Roman" w:hAnsi="Times New Roman" w:eastAsia="Times New Roman" w:cs="Times New Roman"/>
-          <w:sz w:val="24"/>
-          <w:szCs w:val="24"/>
-        </w:rPr>
-      </w:pPr>
-      <w:r>
-        <w:rPr>
-          <w:rFonts w:eastAsia="Times New Roman" w:cs="Times New Roman" w:ascii="Times New Roman" w:hAnsi="Times New Roman"/>
-          <w:sz w:val="24"/>
-          <w:szCs w:val="24"/>
-        </w:rPr>
-      </w:r>
-    </w:p>
-    <w:p>
-      <w:pPr>
-        <w:pStyle w:val="normal1"/>
-        <w:spacing w:lineRule="auto" w:line="360"/>
-        <w:rPr>
-          <w:rFonts w:ascii="Times New Roman" w:hAnsi="Times New Roman" w:eastAsia="Times New Roman" w:cs="Times New Roman"/>
-          <w:sz w:val="24"/>
-          <w:szCs w:val="24"/>
-        </w:rPr>
-      </w:pPr>
-      <w:r>
-        <w:rPr>
-          <w:rFonts w:eastAsia="Times New Roman" w:cs="Times New Roman" w:ascii="Times New Roman" w:hAnsi="Times New Roman"/>
-          <w:sz w:val="24"/>
-          <w:szCs w:val="24"/>
-        </w:rPr>
-      </w:r>
-    </w:p>
-    <w:p>
-      <w:pPr>
-        <w:pStyle w:val="normal1"/>
-        <w:spacing w:lineRule="auto" w:line="360"/>
-        <w:rPr>
-          <w:rFonts w:ascii="Times New Roman" w:hAnsi="Times New Roman" w:eastAsia="Times New Roman" w:cs="Times New Roman"/>
-          <w:sz w:val="24"/>
-          <w:szCs w:val="24"/>
-        </w:rPr>
-      </w:pPr>
-      <w:r>
-        <w:rPr>
-          <w:rFonts w:eastAsia="Times New Roman" w:cs="Times New Roman" w:ascii="Times New Roman" w:hAnsi="Times New Roman"/>
-          <w:sz w:val="24"/>
-          <w:szCs w:val="24"/>
-        </w:rPr>
-      </w:r>
-    </w:p>
-    <w:p>
-      <w:pPr>
-        <w:pStyle w:val="normal1"/>
-        <w:spacing w:lineRule="auto" w:line="360"/>
-        <w:rPr>
-          <w:rFonts w:ascii="Times New Roman" w:hAnsi="Times New Roman" w:eastAsia="Times New Roman" w:cs="Times New Roman"/>
-          <w:sz w:val="24"/>
-          <w:szCs w:val="24"/>
-        </w:rPr>
-      </w:pPr>
-      <w:r>
-        <w:rPr>
-          <w:rFonts w:eastAsia="Times New Roman" w:cs="Times New Roman" w:ascii="Times New Roman" w:hAnsi="Times New Roman"/>
-          <w:sz w:val="24"/>
-          <w:szCs w:val="24"/>
-        </w:rPr>
-      </w:r>
-    </w:p>
-    <w:p>
-      <w:pPr>
-        <w:pStyle w:val="normal1"/>
-        <w:spacing w:lineRule="auto" w:line="360"/>
-        <w:rPr>
-          <w:rFonts w:ascii="Times New Roman" w:hAnsi="Times New Roman" w:eastAsia="Times New Roman" w:cs="Times New Roman"/>
-          <w:sz w:val="24"/>
-          <w:szCs w:val="24"/>
-        </w:rPr>
-      </w:pPr>
-      <w:r>
-        <w:rPr>
-          <w:rFonts w:eastAsia="Times New Roman" w:cs="Times New Roman" w:ascii="Times New Roman" w:hAnsi="Times New Roman"/>
-          <w:sz w:val="24"/>
-          <w:szCs w:val="24"/>
-        </w:rPr>
-      </w:r>
-    </w:p>
-    <w:p>
-      <w:pPr>
-        <w:pStyle w:val="normal1"/>
-        <w:spacing w:lineRule="auto" w:line="360"/>
-        <w:rPr>
-          <w:rFonts w:ascii="Times New Roman" w:hAnsi="Times New Roman" w:eastAsia="Times New Roman" w:cs="Times New Roman"/>
-          <w:sz w:val="24"/>
-          <w:szCs w:val="24"/>
-        </w:rPr>
-      </w:pPr>
-      <w:r>
-        <w:rPr>
-          <w:rFonts w:eastAsia="Times New Roman" w:cs="Times New Roman" w:ascii="Times New Roman" w:hAnsi="Times New Roman"/>
-          <w:sz w:val="24"/>
-          <w:szCs w:val="24"/>
-        </w:rPr>
-      </w:r>
-    </w:p>
-    <w:p>
-      <w:pPr>
-        <w:pStyle w:val="normal1"/>
-        <w:spacing w:lineRule="auto" w:line="360"/>
-        <w:rPr>
-          <w:rFonts w:ascii="Times New Roman" w:hAnsi="Times New Roman" w:eastAsia="Times New Roman" w:cs="Times New Roman"/>
-          <w:sz w:val="24"/>
-          <w:szCs w:val="24"/>
-        </w:rPr>
-      </w:pPr>
-      <w:r>
-        <w:rPr>
-          <w:rFonts w:eastAsia="Times New Roman" w:cs="Times New Roman" w:ascii="Times New Roman" w:hAnsi="Times New Roman"/>
-          <w:sz w:val="24"/>
-          <w:szCs w:val="24"/>
-        </w:rPr>
-      </w:r>
-    </w:p>
-    <w:p>
-      <w:pPr>
-        <w:pStyle w:val="normal1"/>
-        <w:spacing w:lineRule="auto" w:line="360"/>
-        <w:rPr>
-          <w:rFonts w:ascii="Times New Roman" w:hAnsi="Times New Roman" w:eastAsia="Times New Roman" w:cs="Times New Roman"/>
-          <w:sz w:val="24"/>
-          <w:szCs w:val="24"/>
-        </w:rPr>
-      </w:pPr>
-      <w:r>
-        <w:rPr>
-          <w:rFonts w:eastAsia="Times New Roman" w:cs="Times New Roman" w:ascii="Times New Roman" w:hAnsi="Times New Roman"/>
-          <w:sz w:val="24"/>
-          <w:szCs w:val="24"/>
-        </w:rPr>
-      </w:r>
-    </w:p>
-    <w:p>
-      <w:pPr>
-        <w:pStyle w:val="normal1"/>
-        <w:spacing w:lineRule="auto" w:line="360"/>
-        <w:rPr>
-          <w:rFonts w:ascii="Times New Roman" w:hAnsi="Times New Roman" w:eastAsia="Times New Roman" w:cs="Times New Roman"/>
-          <w:sz w:val="24"/>
-          <w:szCs w:val="24"/>
-        </w:rPr>
-      </w:pPr>
-      <w:r>
-        <w:rPr>
-          <w:rFonts w:eastAsia="Times New Roman" w:cs="Times New Roman" w:ascii="Times New Roman" w:hAnsi="Times New Roman"/>
-          <w:sz w:val="24"/>
-          <w:szCs w:val="24"/>
-        </w:rPr>
-      </w:r>
-    </w:p>
-    <w:p>
-      <w:pPr>
-        <w:pStyle w:val="normal1"/>
-        <w:spacing w:lineRule="auto" w:line="360"/>
-        <w:rPr>
-          <w:rFonts w:ascii="Times New Roman" w:hAnsi="Times New Roman" w:eastAsia="Times New Roman" w:cs="Times New Roman"/>
-          <w:sz w:val="24"/>
-          <w:szCs w:val="24"/>
-        </w:rPr>
-      </w:pPr>
-      <w:r>
-        <w:rPr>
-          <w:rFonts w:eastAsia="Times New Roman" w:cs="Times New Roman" w:ascii="Times New Roman" w:hAnsi="Times New Roman"/>
-          <w:sz w:val="24"/>
-          <w:szCs w:val="24"/>
-        </w:rPr>
-      </w:r>
-    </w:p>
-    <w:p>
-      <w:pPr>
-        <w:pStyle w:val="normal1"/>
-        <w:spacing w:lineRule="auto" w:line="360"/>
-        <w:rPr>
-          <w:rFonts w:ascii="Times New Roman" w:hAnsi="Times New Roman" w:eastAsia="Times New Roman" w:cs="Times New Roman"/>
-          <w:sz w:val="24"/>
-          <w:szCs w:val="24"/>
-        </w:rPr>
-      </w:pPr>
-      <w:r>
-        <w:rPr>
-          <w:rFonts w:eastAsia="Times New Roman" w:cs="Times New Roman" w:ascii="Times New Roman" w:hAnsi="Times New Roman"/>
-          <w:sz w:val="24"/>
-          <w:szCs w:val="24"/>
-        </w:rPr>
+      <w:r>
+        <w:br w:type="page"/>
       </w:r>
     </w:p>
     <w:p>
@@ -2184,150 +1503,6 @@
           <w:sz w:val="22"/>
         </w:rPr>
         <w:t>B. Validación por Juicio de Expertos .............................   48</w:t>
-      </w:r>
-    </w:p>
-    <w:p>
-      <w:pPr>
-        <w:pStyle w:val="normal1"/>
-        <w:spacing w:lineRule="auto" w:line="360"/>
-        <w:rPr>
-          <w:rFonts w:ascii="Times New Roman" w:hAnsi="Times New Roman" w:eastAsia="Times New Roman" w:cs="Times New Roman"/>
-          <w:sz w:val="24"/>
-          <w:szCs w:val="24"/>
-        </w:rPr>
-      </w:pPr>
-      <w:r>
-        <w:rPr>
-          <w:rFonts w:eastAsia="Times New Roman" w:cs="Times New Roman" w:ascii="Times New Roman" w:hAnsi="Times New Roman"/>
-          <w:sz w:val="24"/>
-          <w:szCs w:val="24"/>
-        </w:rPr>
-      </w:r>
-    </w:p>
-    <w:p>
-      <w:pPr>
-        <w:pStyle w:val="normal1"/>
-        <w:spacing w:lineRule="auto" w:line="360"/>
-        <w:rPr>
-          <w:rFonts w:ascii="Times New Roman" w:hAnsi="Times New Roman" w:eastAsia="Times New Roman" w:cs="Times New Roman"/>
-          <w:sz w:val="24"/>
-          <w:szCs w:val="24"/>
-        </w:rPr>
-      </w:pPr>
-      <w:r>
-        <w:rPr>
-          <w:rFonts w:eastAsia="Times New Roman" w:cs="Times New Roman" w:ascii="Times New Roman" w:hAnsi="Times New Roman"/>
-          <w:sz w:val="24"/>
-          <w:szCs w:val="24"/>
-        </w:rPr>
-      </w:r>
-    </w:p>
-    <w:p>
-      <w:pPr>
-        <w:pStyle w:val="normal1"/>
-        <w:spacing w:lineRule="auto" w:line="360"/>
-        <w:rPr>
-          <w:rFonts w:ascii="Times New Roman" w:hAnsi="Times New Roman" w:eastAsia="Times New Roman" w:cs="Times New Roman"/>
-          <w:sz w:val="24"/>
-          <w:szCs w:val="24"/>
-        </w:rPr>
-      </w:pPr>
-      <w:r>
-        <w:rPr>
-          <w:rFonts w:eastAsia="Times New Roman" w:cs="Times New Roman" w:ascii="Times New Roman" w:hAnsi="Times New Roman"/>
-          <w:sz w:val="24"/>
-          <w:szCs w:val="24"/>
-        </w:rPr>
-      </w:r>
-    </w:p>
-    <w:p>
-      <w:pPr>
-        <w:pStyle w:val="normal1"/>
-        <w:spacing w:lineRule="auto" w:line="360"/>
-        <w:rPr>
-          <w:rFonts w:ascii="Times New Roman" w:hAnsi="Times New Roman" w:eastAsia="Times New Roman" w:cs="Times New Roman"/>
-          <w:sz w:val="24"/>
-          <w:szCs w:val="24"/>
-        </w:rPr>
-      </w:pPr>
-      <w:r>
-        <w:rPr>
-          <w:rFonts w:eastAsia="Times New Roman" w:cs="Times New Roman" w:ascii="Times New Roman" w:hAnsi="Times New Roman"/>
-          <w:sz w:val="24"/>
-          <w:szCs w:val="24"/>
-        </w:rPr>
-      </w:r>
-    </w:p>
-    <w:p>
-      <w:pPr>
-        <w:pStyle w:val="normal1"/>
-        <w:spacing w:lineRule="auto" w:line="360"/>
-        <w:rPr>
-          <w:rFonts w:ascii="Times New Roman" w:hAnsi="Times New Roman" w:eastAsia="Times New Roman" w:cs="Times New Roman"/>
-          <w:sz w:val="24"/>
-          <w:szCs w:val="24"/>
-        </w:rPr>
-      </w:pPr>
-      <w:r>
-        <w:rPr>
-          <w:rFonts w:eastAsia="Times New Roman" w:cs="Times New Roman" w:ascii="Times New Roman" w:hAnsi="Times New Roman"/>
-          <w:sz w:val="24"/>
-          <w:szCs w:val="24"/>
-        </w:rPr>
-      </w:r>
-    </w:p>
-    <w:p>
-      <w:pPr>
-        <w:pStyle w:val="normal1"/>
-        <w:spacing w:lineRule="auto" w:line="360"/>
-        <w:rPr>
-          <w:rFonts w:ascii="Times New Roman" w:hAnsi="Times New Roman" w:eastAsia="Times New Roman" w:cs="Times New Roman"/>
-          <w:sz w:val="24"/>
-          <w:szCs w:val="24"/>
-        </w:rPr>
-      </w:pPr>
-      <w:r>
-        <w:rPr>
-          <w:rFonts w:eastAsia="Times New Roman" w:cs="Times New Roman" w:ascii="Times New Roman" w:hAnsi="Times New Roman"/>
-          <w:sz w:val="24"/>
-          <w:szCs w:val="24"/>
-        </w:rPr>
-      </w:r>
-    </w:p>
-    <w:p>
-      <w:pPr>
-        <w:pStyle w:val="normal1"/>
-        <w:spacing w:lineRule="auto" w:line="360"/>
-        <w:rPr>
-          <w:rFonts w:ascii="Times New Roman" w:hAnsi="Times New Roman" w:eastAsia="Times New Roman" w:cs="Times New Roman"/>
-          <w:sz w:val="24"/>
-          <w:szCs w:val="24"/>
-        </w:rPr>
-      </w:pPr>
-      <w:r>
-        <w:rPr>
-          <w:rFonts w:eastAsia="Times New Roman" w:cs="Times New Roman" w:ascii="Times New Roman" w:hAnsi="Times New Roman"/>
-          <w:sz w:val="24"/>
-          <w:szCs w:val="24"/>
-        </w:rPr>
-      </w:r>
-    </w:p>
-    <w:p>
-      <w:pPr>
-        <w:pStyle w:val="normal1"/>
-        <w:spacing w:lineRule="auto" w:line="360"/>
-        <w:rPr>
-          <w:rFonts w:ascii="Times New Roman" w:hAnsi="Times New Roman" w:eastAsia="Times New Roman" w:cs="Times New Roman"/>
-          <w:sz w:val="24"/>
-          <w:szCs w:val="24"/>
-        </w:rPr>
-      </w:pPr>
-      <w:r>
-        <w:rPr>
-          <w:rFonts w:eastAsia="Times New Roman" w:cs="Times New Roman" w:ascii="Times New Roman" w:hAnsi="Times New Roman"/>
-          <w:sz w:val="24"/>
-          <w:szCs w:val="24"/>
-        </w:rPr>
       </w:r>
     </w:p>
     <w:p>
@@ -3089,24 +2264,8 @@
           <w:szCs w:val="24"/>
         </w:rPr>
       </w:r>
-    </w:p>
-    <w:p>
-      <w:pPr>
-        <w:pStyle w:val="normal1"/>
-        <w:spacing w:lineRule="auto" w:line="240"/>
-        <w:jc w:val="both"/>
-        <w:rPr>
-          <w:rFonts w:ascii="Times New Roman" w:hAnsi="Times New Roman" w:eastAsia="Times New Roman" w:cs="Times New Roman"/>
-          <w:sz w:val="24"/>
-          <w:szCs w:val="24"/>
-        </w:rPr>
-      </w:pPr>
-      <w:r>
-        <w:rPr>
-          <w:rFonts w:eastAsia="Times New Roman" w:cs="Times New Roman" w:ascii="Times New Roman" w:hAnsi="Times New Roman"/>
-          <w:sz w:val="24"/>
-          <w:szCs w:val="24"/>
-        </w:rPr>
+      <w:r>
+        <w:br w:type="page"/>
       </w:r>
     </w:p>
     <w:p>
@@ -3362,49 +2521,8 @@
           <w:szCs w:val="24"/>
         </w:rPr>
       </w:r>
-    </w:p>
-    <w:p>
-      <w:pPr>
-        <w:pStyle w:val="normal1"/>
-        <w:spacing w:lineRule="auto" w:line="360"/>
-        <w:rPr>
-          <w:rFonts w:ascii="Times New Roman" w:hAnsi="Times New Roman" w:eastAsia="Times New Roman" w:cs="Times New Roman"/>
-          <w:b/>
-          <w:bCs/>
-          <w:sz w:val="24"/>
-          <w:szCs w:val="24"/>
-        </w:rPr>
-      </w:pPr>
-      <w:r>
-        <w:rPr>
-          <w:rFonts w:eastAsia="Times New Roman" w:cs="Times New Roman" w:ascii="Times New Roman" w:hAnsi="Times New Roman"/>
-          <w:b/>
-          <w:bCs/>
-          <w:sz w:val="24"/>
-          <w:szCs w:val="24"/>
-        </w:rPr>
-      </w:r>
-    </w:p>
-    <w:p>
-      <w:pPr>
-        <w:pStyle w:val="normal1"/>
-        <w:spacing w:lineRule="auto" w:line="360"/>
-        <w:rPr>
-          <w:rFonts w:ascii="Times New Roman" w:hAnsi="Times New Roman" w:eastAsia="Times New Roman" w:cs="Times New Roman"/>
-          <w:b/>
-          <w:bCs/>
-          <w:sz w:val="24"/>
-          <w:szCs w:val="24"/>
-        </w:rPr>
-      </w:pPr>
-      <w:r>
-        <w:rPr>
-          <w:rFonts w:eastAsia="Times New Roman" w:cs="Times New Roman" w:ascii="Times New Roman" w:hAnsi="Times New Roman"/>
-          <w:b/>
-          <w:bCs/>
-          <w:sz w:val="24"/>
-          <w:szCs w:val="24"/>
-        </w:rPr>
+      <w:r>
+        <w:br w:type="page"/>
       </w:r>
     </w:p>
     <w:p>
@@ -3902,101 +3020,6 @@
         <w:jc w:val="both"/>
         <w:rPr>
           <w:rFonts w:ascii="Times New Roman" w:hAnsi="Times New Roman" w:eastAsia="Times New Roman" w:cs="Times New Roman"/>
-          <w:sz w:val="24"/>
-          <w:szCs w:val="24"/>
-        </w:rPr>
-      </w:pPr>
-      <w:r>
-        <w:rPr>
-          <w:rFonts w:eastAsia="Times New Roman" w:cs="Times New Roman" w:ascii="Times New Roman" w:hAnsi="Times New Roman"/>
-          <w:sz w:val="24"/>
-          <w:szCs w:val="24"/>
-        </w:rPr>
-      </w:r>
-    </w:p>
-    <w:p>
-      <w:pPr>
-        <w:pStyle w:val="normal1"/>
-        <w:spacing w:lineRule="auto" w:line="360"/>
-        <w:jc w:val="both"/>
-        <w:rPr>
-          <w:rFonts w:ascii="Times New Roman" w:hAnsi="Times New Roman" w:eastAsia="Times New Roman" w:cs="Times New Roman"/>
-          <w:sz w:val="24"/>
-          <w:szCs w:val="24"/>
-        </w:rPr>
-      </w:pPr>
-      <w:r>
-        <w:rPr>
-          <w:rFonts w:eastAsia="Times New Roman" w:cs="Times New Roman" w:ascii="Times New Roman" w:hAnsi="Times New Roman"/>
-          <w:sz w:val="24"/>
-          <w:szCs w:val="24"/>
-        </w:rPr>
-      </w:r>
-    </w:p>
-    <w:p>
-      <w:pPr>
-        <w:pStyle w:val="normal1"/>
-        <w:spacing w:lineRule="auto" w:line="360"/>
-        <w:jc w:val="both"/>
-        <w:rPr>
-          <w:rFonts w:ascii="Times New Roman" w:hAnsi="Times New Roman" w:eastAsia="Times New Roman" w:cs="Times New Roman"/>
-          <w:sz w:val="24"/>
-          <w:szCs w:val="24"/>
-        </w:rPr>
-      </w:pPr>
-      <w:r>
-        <w:rPr>
-          <w:rFonts w:eastAsia="Times New Roman" w:cs="Times New Roman" w:ascii="Times New Roman" w:hAnsi="Times New Roman"/>
-          <w:sz w:val="24"/>
-          <w:szCs w:val="24"/>
-        </w:rPr>
-      </w:r>
-    </w:p>
-    <w:p>
-      <w:pPr>
-        <w:pStyle w:val="normal1"/>
-        <w:spacing w:lineRule="auto" w:line="360"/>
-        <w:jc w:val="both"/>
-        <w:rPr>
-          <w:rFonts w:ascii="Times New Roman" w:hAnsi="Times New Roman" w:eastAsia="Times New Roman" w:cs="Times New Roman"/>
-          <w:sz w:val="24"/>
-          <w:szCs w:val="24"/>
-        </w:rPr>
-      </w:pPr>
-      <w:r>
-        <w:rPr>
-          <w:rFonts w:eastAsia="Times New Roman" w:cs="Times New Roman" w:ascii="Times New Roman" w:hAnsi="Times New Roman"/>
-          <w:sz w:val="24"/>
-          <w:szCs w:val="24"/>
-        </w:rPr>
-      </w:r>
-    </w:p>
-    <w:p>
-      <w:pPr>
-        <w:pStyle w:val="normal1"/>
-        <w:spacing w:lineRule="auto" w:line="360"/>
-        <w:jc w:val="both"/>
-        <w:rPr>
-          <w:rFonts w:ascii="Times New Roman" w:hAnsi="Times New Roman" w:eastAsia="Times New Roman" w:cs="Times New Roman"/>
-          <w:sz w:val="24"/>
-          <w:szCs w:val="24"/>
-        </w:rPr>
-      </w:pPr>
-      <w:r>
-        <w:rPr>
-          <w:rFonts w:eastAsia="Times New Roman" w:cs="Times New Roman" w:ascii="Times New Roman" w:hAnsi="Times New Roman"/>
-          <w:sz w:val="24"/>
-          <w:szCs w:val="24"/>
-        </w:rPr>
-      </w:r>
-    </w:p>
-    <w:p>
-      <w:pPr>
-        <w:pStyle w:val="normal1"/>
-        <w:spacing w:lineRule="auto" w:line="360"/>
-        <w:jc w:val="both"/>
-        <w:rPr>
-          <w:rFonts w:ascii="Times New Roman" w:hAnsi="Times New Roman" w:eastAsia="Times New Roman" w:cs="Times New Roman"/>
           <w:b/>
           <w:bCs/>
           <w:sz w:val="24"/>
@@ -4011,6 +3034,9 @@
           <w:sz w:val="24"/>
           <w:szCs w:val="24"/>
         </w:rPr>
+      </w:r>
+      <w:r>
+        <w:br w:type="page"/>
       </w:r>
     </w:p>
     <w:p>
@@ -6393,309 +5419,8 @@
           <w:szCs w:val="24"/>
         </w:rPr>
       </w:r>
-    </w:p>
-    <w:p>
-      <w:pPr>
-        <w:pStyle w:val="normal1"/>
-        <w:ind w:hanging="0" w:start="720"/>
-        <w:jc w:val="both"/>
-        <w:rPr>
-          <w:rFonts w:ascii="Times New Roman" w:hAnsi="Times New Roman" w:eastAsia="Times New Roman" w:cs="Times New Roman"/>
-          <w:sz w:val="24"/>
-          <w:szCs w:val="24"/>
-        </w:rPr>
-      </w:pPr>
-      <w:r>
-        <w:rPr>
-          <w:rFonts w:eastAsia="Times New Roman" w:cs="Times New Roman" w:ascii="Times New Roman" w:hAnsi="Times New Roman"/>
-          <w:sz w:val="24"/>
-          <w:szCs w:val="24"/>
-        </w:rPr>
-      </w:r>
-    </w:p>
-    <w:p>
-      <w:pPr>
-        <w:pStyle w:val="normal1"/>
-        <w:ind w:hanging="0" w:start="720"/>
-        <w:jc w:val="both"/>
-        <w:rPr>
-          <w:rFonts w:ascii="Times New Roman" w:hAnsi="Times New Roman" w:eastAsia="Times New Roman" w:cs="Times New Roman"/>
-          <w:sz w:val="24"/>
-          <w:szCs w:val="24"/>
-        </w:rPr>
-      </w:pPr>
-      <w:r>
-        <w:rPr>
-          <w:rFonts w:eastAsia="Times New Roman" w:cs="Times New Roman" w:ascii="Times New Roman" w:hAnsi="Times New Roman"/>
-          <w:sz w:val="24"/>
-          <w:szCs w:val="24"/>
-        </w:rPr>
-      </w:r>
-    </w:p>
-    <w:p>
-      <w:pPr>
-        <w:pStyle w:val="normal1"/>
-        <w:ind w:hanging="0" w:start="720"/>
-        <w:jc w:val="both"/>
-        <w:rPr>
-          <w:rFonts w:ascii="Times New Roman" w:hAnsi="Times New Roman" w:eastAsia="Times New Roman" w:cs="Times New Roman"/>
-          <w:sz w:val="24"/>
-          <w:szCs w:val="24"/>
-        </w:rPr>
-      </w:pPr>
-      <w:r>
-        <w:rPr>
-          <w:rFonts w:eastAsia="Times New Roman" w:cs="Times New Roman" w:ascii="Times New Roman" w:hAnsi="Times New Roman"/>
-          <w:sz w:val="24"/>
-          <w:szCs w:val="24"/>
-        </w:rPr>
-      </w:r>
-    </w:p>
-    <w:p>
-      <w:pPr>
-        <w:pStyle w:val="normal1"/>
-        <w:ind w:hanging="0" w:start="720"/>
-        <w:jc w:val="both"/>
-        <w:rPr>
-          <w:rFonts w:ascii="Times New Roman" w:hAnsi="Times New Roman" w:eastAsia="Times New Roman" w:cs="Times New Roman"/>
-          <w:sz w:val="24"/>
-          <w:szCs w:val="24"/>
-        </w:rPr>
-      </w:pPr>
-      <w:r>
-        <w:rPr>
-          <w:rFonts w:eastAsia="Times New Roman" w:cs="Times New Roman" w:ascii="Times New Roman" w:hAnsi="Times New Roman"/>
-          <w:sz w:val="24"/>
-          <w:szCs w:val="24"/>
-        </w:rPr>
-      </w:r>
-    </w:p>
-    <w:p>
-      <w:pPr>
-        <w:pStyle w:val="normal1"/>
-        <w:ind w:hanging="0" w:start="720"/>
-        <w:jc w:val="both"/>
-        <w:rPr>
-          <w:rFonts w:ascii="Times New Roman" w:hAnsi="Times New Roman" w:eastAsia="Times New Roman" w:cs="Times New Roman"/>
-          <w:sz w:val="24"/>
-          <w:szCs w:val="24"/>
-        </w:rPr>
-      </w:pPr>
-      <w:r>
-        <w:rPr>
-          <w:rFonts w:eastAsia="Times New Roman" w:cs="Times New Roman" w:ascii="Times New Roman" w:hAnsi="Times New Roman"/>
-          <w:sz w:val="24"/>
-          <w:szCs w:val="24"/>
-        </w:rPr>
-      </w:r>
-    </w:p>
-    <w:p>
-      <w:pPr>
-        <w:pStyle w:val="normal1"/>
-        <w:ind w:hanging="0" w:start="720"/>
-        <w:jc w:val="both"/>
-        <w:rPr>
-          <w:rFonts w:ascii="Times New Roman" w:hAnsi="Times New Roman" w:eastAsia="Times New Roman" w:cs="Times New Roman"/>
-          <w:sz w:val="24"/>
-          <w:szCs w:val="24"/>
-        </w:rPr>
-      </w:pPr>
-      <w:r>
-        <w:rPr>
-          <w:rFonts w:eastAsia="Times New Roman" w:cs="Times New Roman" w:ascii="Times New Roman" w:hAnsi="Times New Roman"/>
-          <w:sz w:val="24"/>
-          <w:szCs w:val="24"/>
-        </w:rPr>
-      </w:r>
-    </w:p>
-    <w:p>
-      <w:pPr>
-        <w:pStyle w:val="normal1"/>
-        <w:ind w:hanging="0" w:start="720"/>
-        <w:jc w:val="both"/>
-        <w:rPr>
-          <w:rFonts w:ascii="Times New Roman" w:hAnsi="Times New Roman" w:eastAsia="Times New Roman" w:cs="Times New Roman"/>
-          <w:sz w:val="24"/>
-          <w:szCs w:val="24"/>
-        </w:rPr>
-      </w:pPr>
-      <w:r>
-        <w:rPr>
-          <w:rFonts w:eastAsia="Times New Roman" w:cs="Times New Roman" w:ascii="Times New Roman" w:hAnsi="Times New Roman"/>
-          <w:sz w:val="24"/>
-          <w:szCs w:val="24"/>
-        </w:rPr>
-      </w:r>
-    </w:p>
-    <w:p>
-      <w:pPr>
-        <w:pStyle w:val="normal1"/>
-        <w:ind w:hanging="0" w:start="720"/>
-        <w:jc w:val="both"/>
-        <w:rPr>
-          <w:rFonts w:ascii="Times New Roman" w:hAnsi="Times New Roman" w:eastAsia="Times New Roman" w:cs="Times New Roman"/>
-          <w:sz w:val="24"/>
-          <w:szCs w:val="24"/>
-        </w:rPr>
-      </w:pPr>
-      <w:r>
-        <w:rPr>
-          <w:rFonts w:eastAsia="Times New Roman" w:cs="Times New Roman" w:ascii="Times New Roman" w:hAnsi="Times New Roman"/>
-          <w:sz w:val="24"/>
-          <w:szCs w:val="24"/>
-        </w:rPr>
-      </w:r>
-    </w:p>
-    <w:p>
-      <w:pPr>
-        <w:pStyle w:val="normal1"/>
-        <w:ind w:hanging="0" w:start="720"/>
-        <w:jc w:val="both"/>
-        <w:rPr>
-          <w:rFonts w:ascii="Times New Roman" w:hAnsi="Times New Roman" w:eastAsia="Times New Roman" w:cs="Times New Roman"/>
-          <w:sz w:val="24"/>
-          <w:szCs w:val="24"/>
-        </w:rPr>
-      </w:pPr>
-      <w:r>
-        <w:rPr>
-          <w:rFonts w:eastAsia="Times New Roman" w:cs="Times New Roman" w:ascii="Times New Roman" w:hAnsi="Times New Roman"/>
-          <w:sz w:val="24"/>
-          <w:szCs w:val="24"/>
-        </w:rPr>
-      </w:r>
-    </w:p>
-    <w:p>
-      <w:pPr>
-        <w:pStyle w:val="normal1"/>
-        <w:ind w:hanging="0" w:start="720"/>
-        <w:jc w:val="both"/>
-        <w:rPr>
-          <w:rFonts w:ascii="Times New Roman" w:hAnsi="Times New Roman" w:eastAsia="Times New Roman" w:cs="Times New Roman"/>
-          <w:sz w:val="24"/>
-          <w:szCs w:val="24"/>
-        </w:rPr>
-      </w:pPr>
-      <w:r>
-        <w:rPr>
-          <w:rFonts w:eastAsia="Times New Roman" w:cs="Times New Roman" w:ascii="Times New Roman" w:hAnsi="Times New Roman"/>
-          <w:sz w:val="24"/>
-          <w:szCs w:val="24"/>
-        </w:rPr>
-      </w:r>
-    </w:p>
-    <w:p>
-      <w:pPr>
-        <w:pStyle w:val="normal1"/>
-        <w:ind w:hanging="0" w:start="720"/>
-        <w:jc w:val="both"/>
-        <w:rPr>
-          <w:rFonts w:ascii="Times New Roman" w:hAnsi="Times New Roman" w:eastAsia="Times New Roman" w:cs="Times New Roman"/>
-          <w:sz w:val="24"/>
-          <w:szCs w:val="24"/>
-        </w:rPr>
-      </w:pPr>
-      <w:r>
-        <w:rPr>
-          <w:rFonts w:eastAsia="Times New Roman" w:cs="Times New Roman" w:ascii="Times New Roman" w:hAnsi="Times New Roman"/>
-          <w:sz w:val="24"/>
-          <w:szCs w:val="24"/>
-        </w:rPr>
-      </w:r>
-    </w:p>
-    <w:p>
-      <w:pPr>
-        <w:pStyle w:val="normal1"/>
-        <w:ind w:hanging="0" w:start="720"/>
-        <w:jc w:val="both"/>
-        <w:rPr>
-          <w:rFonts w:ascii="Times New Roman" w:hAnsi="Times New Roman" w:eastAsia="Times New Roman" w:cs="Times New Roman"/>
-          <w:sz w:val="24"/>
-          <w:szCs w:val="24"/>
-        </w:rPr>
-      </w:pPr>
-      <w:r>
-        <w:rPr>
-          <w:rFonts w:eastAsia="Times New Roman" w:cs="Times New Roman" w:ascii="Times New Roman" w:hAnsi="Times New Roman"/>
-          <w:sz w:val="24"/>
-          <w:szCs w:val="24"/>
-        </w:rPr>
-      </w:r>
-    </w:p>
-    <w:p>
-      <w:pPr>
-        <w:pStyle w:val="normal1"/>
-        <w:ind w:hanging="0" w:start="720"/>
-        <w:jc w:val="both"/>
-        <w:rPr>
-          <w:rFonts w:ascii="Times New Roman" w:hAnsi="Times New Roman" w:eastAsia="Times New Roman" w:cs="Times New Roman"/>
-          <w:sz w:val="24"/>
-          <w:szCs w:val="24"/>
-        </w:rPr>
-      </w:pPr>
-      <w:r>
-        <w:rPr>
-          <w:rFonts w:eastAsia="Times New Roman" w:cs="Times New Roman" w:ascii="Times New Roman" w:hAnsi="Times New Roman"/>
-          <w:sz w:val="24"/>
-          <w:szCs w:val="24"/>
-        </w:rPr>
-      </w:r>
-    </w:p>
-    <w:p>
-      <w:pPr>
-        <w:pStyle w:val="normal1"/>
-        <w:ind w:hanging="0" w:start="720"/>
-        <w:jc w:val="both"/>
-        <w:rPr>
-          <w:rFonts w:ascii="Times New Roman" w:hAnsi="Times New Roman" w:eastAsia="Times New Roman" w:cs="Times New Roman"/>
-          <w:sz w:val="24"/>
-          <w:szCs w:val="24"/>
-        </w:rPr>
-      </w:pPr>
-      <w:r>
-        <w:rPr>
-          <w:rFonts w:eastAsia="Times New Roman" w:cs="Times New Roman" w:ascii="Times New Roman" w:hAnsi="Times New Roman"/>
-          <w:sz w:val="24"/>
-          <w:szCs w:val="24"/>
-        </w:rPr>
-      </w:r>
-    </w:p>
-    <w:p>
-      <w:pPr>
-        <w:pStyle w:val="normal1"/>
-        <w:ind w:hanging="0" w:start="720"/>
-        <w:jc w:val="both"/>
-        <w:rPr>
-          <w:rFonts w:ascii="Times New Roman" w:hAnsi="Times New Roman" w:eastAsia="Times New Roman" w:cs="Times New Roman"/>
-          <w:sz w:val="24"/>
-          <w:szCs w:val="24"/>
-        </w:rPr>
-      </w:pPr>
-      <w:r>
-        <w:rPr>
-          <w:rFonts w:eastAsia="Times New Roman" w:cs="Times New Roman" w:ascii="Times New Roman" w:hAnsi="Times New Roman"/>
-          <w:sz w:val="24"/>
-          <w:szCs w:val="24"/>
-        </w:rPr>
-      </w:r>
-    </w:p>
-    <w:p>
-      <w:pPr>
-        <w:pStyle w:val="normal1"/>
-        <w:ind w:hanging="0" w:start="720"/>
-        <w:jc w:val="both"/>
-        <w:rPr>
-          <w:rFonts w:ascii="Times New Roman" w:hAnsi="Times New Roman" w:eastAsia="Times New Roman" w:cs="Times New Roman"/>
-          <w:sz w:val="24"/>
-          <w:szCs w:val="24"/>
-        </w:rPr>
-      </w:pPr>
-      <w:r>
-        <w:rPr>
-          <w:rFonts w:eastAsia="Times New Roman" w:cs="Times New Roman" w:ascii="Times New Roman" w:hAnsi="Times New Roman"/>
-          <w:sz w:val="24"/>
-          <w:szCs w:val="24"/>
-        </w:rPr>
+      <w:r>
+        <w:br w:type="page"/>
       </w:r>
     </w:p>
     <w:p>
@@ -8087,126 +6812,6 @@
           <w:b/>
           <w:sz w:val="24"/>
         </w:rPr>
-      </w:r>
-    </w:p>
-    <w:p>
-      <w:pPr>
-        <w:pStyle w:val="normal1"/>
-        <w:spacing w:lineRule="auto" w:line="360" w:before="0" w:after="120"/>
-        <w:ind w:hanging="0" w:start="0"/>
-        <w:jc w:val="start"/>
-        <w:rPr>
-          <w:rFonts w:ascii="Times New Roman" w:hAnsi="Times New Roman" w:eastAsia="Times New Roman" w:cs="Times New Roman"/>
-          <w:b/>
-          <w:sz w:val="24"/>
-        </w:rPr>
-      </w:pPr>
-      <w:r>
-        <w:rPr>
-          <w:rFonts w:eastAsia="Times New Roman" w:cs="Times New Roman" w:ascii="Times New Roman" w:hAnsi="Times New Roman"/>
-          <w:b/>
-          <w:sz w:val="24"/>
-        </w:rPr>
-      </w:r>
-    </w:p>
-    <w:p>
-      <w:pPr>
-        <w:pStyle w:val="normal1"/>
-        <w:spacing w:lineRule="auto" w:line="360" w:before="0" w:after="120"/>
-        <w:ind w:hanging="0" w:start="0"/>
-        <w:jc w:val="start"/>
-        <w:rPr>
-          <w:rFonts w:ascii="Times New Roman" w:hAnsi="Times New Roman" w:eastAsia="Times New Roman" w:cs="Times New Roman"/>
-          <w:b/>
-          <w:sz w:val="24"/>
-        </w:rPr>
-      </w:pPr>
-      <w:r>
-        <w:rPr>
-          <w:rFonts w:eastAsia="Times New Roman" w:cs="Times New Roman" w:ascii="Times New Roman" w:hAnsi="Times New Roman"/>
-          <w:b/>
-          <w:sz w:val="24"/>
-        </w:rPr>
-      </w:r>
-    </w:p>
-    <w:p>
-      <w:pPr>
-        <w:pStyle w:val="normal1"/>
-        <w:spacing w:lineRule="auto" w:line="360" w:before="0" w:after="120"/>
-        <w:ind w:hanging="0" w:start="0"/>
-        <w:jc w:val="start"/>
-        <w:rPr>
-          <w:rFonts w:ascii="Times New Roman" w:hAnsi="Times New Roman" w:eastAsia="Times New Roman" w:cs="Times New Roman"/>
-          <w:b/>
-          <w:sz w:val="24"/>
-        </w:rPr>
-      </w:pPr>
-      <w:r>
-        <w:rPr>
-          <w:rFonts w:eastAsia="Times New Roman" w:cs="Times New Roman" w:ascii="Times New Roman" w:hAnsi="Times New Roman"/>
-          <w:b/>
-          <w:sz w:val="24"/>
-        </w:rPr>
-      </w:r>
-    </w:p>
-    <w:p>
-      <w:pPr>
-        <w:pStyle w:val="normal1"/>
-        <w:spacing w:lineRule="auto" w:line="360" w:before="0" w:after="120"/>
-        <w:ind w:hanging="0" w:start="0"/>
-        <w:jc w:val="start"/>
-        <w:rPr>
-          <w:rFonts w:ascii="Times New Roman" w:hAnsi="Times New Roman" w:eastAsia="Times New Roman" w:cs="Times New Roman"/>
-          <w:b/>
-          <w:sz w:val="24"/>
-        </w:rPr>
-      </w:pPr>
-      <w:r>
-        <w:rPr>
-          <w:rFonts w:eastAsia="Times New Roman" w:cs="Times New Roman" w:ascii="Times New Roman" w:hAnsi="Times New Roman"/>
-          <w:b/>
-          <w:sz w:val="24"/>
-        </w:rPr>
-      </w:r>
-    </w:p>
-    <w:p>
-      <w:pPr>
-        <w:pStyle w:val="normal1"/>
-        <w:spacing w:lineRule="auto" w:line="360" w:before="0" w:after="120"/>
-        <w:ind w:hanging="0" w:start="0"/>
-        <w:jc w:val="start"/>
-        <w:rPr>
-          <w:rFonts w:ascii="Times New Roman" w:hAnsi="Times New Roman" w:eastAsia="Times New Roman" w:cs="Times New Roman"/>
-          <w:b/>
-          <w:sz w:val="24"/>
-        </w:rPr>
-      </w:pPr>
-      <w:r>
-        <w:rPr>
-          <w:rFonts w:eastAsia="Times New Roman" w:cs="Times New Roman" w:ascii="Times New Roman" w:hAnsi="Times New Roman"/>
-          <w:b/>
-          <w:sz w:val="24"/>
-        </w:rPr>
-      </w:r>
-    </w:p>
-    <w:p>
-      <w:pPr>
-        <w:pStyle w:val="normal1"/>
-        <w:spacing w:lineRule="auto" w:line="360" w:before="0" w:after="120"/>
-        <w:ind w:hanging="0" w:start="0"/>
-        <w:jc w:val="start"/>
-        <w:rPr>
-          <w:rFonts w:ascii="Times New Roman" w:hAnsi="Times New Roman" w:eastAsia="Times New Roman" w:cs="Times New Roman"/>
-          <w:b/>
-          <w:sz w:val="24"/>
-        </w:rPr>
-      </w:pPr>
-      <w:r>
-        <w:rPr>
-          <w:rFonts w:eastAsia="Times New Roman" w:cs="Times New Roman" w:ascii="Times New Roman" w:hAnsi="Times New Roman"/>
-          <w:b/>
-          <w:sz w:val="24"/>
-        </w:rPr>
         <w:t>Análisis e Interpretación</w:t>
       </w:r>
     </w:p>
@@ -8734,86 +7339,6 @@
         <w:pStyle w:val="normal1"/>
         <w:spacing w:lineRule="auto" w:line="360" w:before="0" w:after="120"/>
         <w:ind w:hanging="0" w:start="0"/>
-        <w:jc w:val="center"/>
-        <w:rPr>
-          <w:rFonts w:ascii="Times New Roman" w:hAnsi="Times New Roman" w:eastAsia="Times New Roman" w:cs="Times New Roman"/>
-          <w:b/>
-          <w:sz w:val="24"/>
-        </w:rPr>
-      </w:pPr>
-      <w:r>
-        <w:rPr>
-          <w:rFonts w:eastAsia="Times New Roman" w:cs="Times New Roman" w:ascii="Times New Roman" w:hAnsi="Times New Roman"/>
-          <w:b/>
-          <w:sz w:val="24"/>
-        </w:rPr>
-      </w:r>
-    </w:p>
-    <w:p>
-      <w:pPr>
-        <w:pStyle w:val="normal1"/>
-        <w:spacing w:lineRule="auto" w:line="360" w:before="0" w:after="120"/>
-        <w:ind w:hanging="0" w:start="0"/>
-        <w:jc w:val="center"/>
-        <w:rPr>
-          <w:rFonts w:ascii="Times New Roman" w:hAnsi="Times New Roman" w:eastAsia="Times New Roman" w:cs="Times New Roman"/>
-          <w:b/>
-          <w:sz w:val="24"/>
-        </w:rPr>
-      </w:pPr>
-      <w:r>
-        <w:rPr>
-          <w:rFonts w:eastAsia="Times New Roman" w:cs="Times New Roman" w:ascii="Times New Roman" w:hAnsi="Times New Roman"/>
-          <w:b/>
-          <w:sz w:val="24"/>
-        </w:rPr>
-      </w:r>
-    </w:p>
-    <w:p>
-      <w:pPr>
-        <w:pStyle w:val="normal1"/>
-        <w:spacing w:lineRule="auto" w:line="360" w:before="0" w:after="120"/>
-        <w:ind w:hanging="0" w:start="0"/>
-        <w:jc w:val="center"/>
-        <w:rPr>
-          <w:rFonts w:ascii="Times New Roman" w:hAnsi="Times New Roman" w:eastAsia="Times New Roman" w:cs="Times New Roman"/>
-          <w:b/>
-          <w:sz w:val="24"/>
-        </w:rPr>
-      </w:pPr>
-      <w:r>
-        <w:rPr>
-          <w:rFonts w:eastAsia="Times New Roman" w:cs="Times New Roman" w:ascii="Times New Roman" w:hAnsi="Times New Roman"/>
-          <w:b/>
-          <w:sz w:val="24"/>
-        </w:rPr>
-      </w:r>
-    </w:p>
-    <w:p>
-      <w:pPr>
-        <w:pStyle w:val="normal1"/>
-        <w:spacing w:lineRule="auto" w:line="360" w:before="0" w:after="120"/>
-        <w:ind w:hanging="0" w:start="0"/>
-        <w:jc w:val="center"/>
-        <w:rPr>
-          <w:rFonts w:ascii="Times New Roman" w:hAnsi="Times New Roman" w:eastAsia="Times New Roman" w:cs="Times New Roman"/>
-          <w:b/>
-          <w:sz w:val="24"/>
-        </w:rPr>
-      </w:pPr>
-      <w:r>
-        <w:rPr>
-          <w:rFonts w:eastAsia="Times New Roman" w:cs="Times New Roman" w:ascii="Times New Roman" w:hAnsi="Times New Roman"/>
-          <w:b/>
-          <w:sz w:val="24"/>
-        </w:rPr>
-      </w:r>
-    </w:p>
-    <w:p>
-      <w:pPr>
-        <w:pStyle w:val="normal1"/>
-        <w:spacing w:lineRule="auto" w:line="360" w:before="0" w:after="120"/>
-        <w:ind w:hanging="0" w:start="0"/>
         <w:jc w:val="start"/>
         <w:rPr/>
       </w:pPr>
@@ -9272,106 +7797,6 @@
           <w:sz w:val="24"/>
         </w:rPr>
         <w:t>Fuente: Alvarado, L. (2026).</w:t>
-      </w:r>
-    </w:p>
-    <w:p>
-      <w:pPr>
-        <w:pStyle w:val="normal1"/>
-        <w:spacing w:lineRule="auto" w:line="360" w:before="0" w:after="120"/>
-        <w:ind w:hanging="0" w:start="0"/>
-        <w:jc w:val="center"/>
-        <w:rPr>
-          <w:rFonts w:ascii="Times New Roman" w:hAnsi="Times New Roman" w:eastAsia="Times New Roman" w:cs="Times New Roman"/>
-          <w:b/>
-          <w:sz w:val="24"/>
-        </w:rPr>
-      </w:pPr>
-      <w:r>
-        <w:rPr>
-          <w:rFonts w:eastAsia="Times New Roman" w:cs="Times New Roman" w:ascii="Times New Roman" w:hAnsi="Times New Roman"/>
-          <w:b/>
-          <w:sz w:val="24"/>
-        </w:rPr>
-      </w:r>
-    </w:p>
-    <w:p>
-      <w:pPr>
-        <w:pStyle w:val="normal1"/>
-        <w:spacing w:lineRule="auto" w:line="360" w:before="0" w:after="120"/>
-        <w:ind w:hanging="0" w:start="0"/>
-        <w:jc w:val="center"/>
-        <w:rPr>
-          <w:rFonts w:ascii="Times New Roman" w:hAnsi="Times New Roman" w:eastAsia="Times New Roman" w:cs="Times New Roman"/>
-          <w:b/>
-          <w:sz w:val="24"/>
-        </w:rPr>
-      </w:pPr>
-      <w:r>
-        <w:rPr>
-          <w:rFonts w:eastAsia="Times New Roman" w:cs="Times New Roman" w:ascii="Times New Roman" w:hAnsi="Times New Roman"/>
-          <w:b/>
-          <w:sz w:val="24"/>
-        </w:rPr>
-      </w:r>
-    </w:p>
-    <w:p>
-      <w:pPr>
-        <w:pStyle w:val="normal1"/>
-        <w:spacing w:lineRule="auto" w:line="360" w:before="0" w:after="120"/>
-        <w:ind w:hanging="0" w:start="0"/>
-        <w:jc w:val="center"/>
-        <w:rPr>
-          <w:rFonts w:ascii="Times New Roman" w:hAnsi="Times New Roman" w:eastAsia="Times New Roman" w:cs="Times New Roman"/>
-          <w:b/>
-          <w:sz w:val="24"/>
-        </w:rPr>
-      </w:pPr>
-      <w:r>
-        <w:rPr>
-          <w:rFonts w:eastAsia="Times New Roman" w:cs="Times New Roman" w:ascii="Times New Roman" w:hAnsi="Times New Roman"/>
-          <w:b/>
-          <w:sz w:val="24"/>
-        </w:rPr>
-      </w:r>
-    </w:p>
-    <w:p>
-      <w:pPr>
-        <w:pStyle w:val="normal1"/>
-        <w:spacing w:lineRule="auto" w:line="360" w:before="0" w:after="120"/>
-        <w:ind w:hanging="0" w:start="0"/>
-        <w:jc w:val="center"/>
-        <w:rPr>
-          <w:rFonts w:ascii="Times New Roman" w:hAnsi="Times New Roman" w:eastAsia="Times New Roman" w:cs="Times New Roman"/>
-          <w:b/>
-          <w:sz w:val="24"/>
-        </w:rPr>
-      </w:pPr>
-      <w:r>
-        <w:rPr>
-          <w:rFonts w:eastAsia="Times New Roman" w:cs="Times New Roman" w:ascii="Times New Roman" w:hAnsi="Times New Roman"/>
-          <w:b/>
-          <w:sz w:val="24"/>
-        </w:rPr>
-      </w:r>
-    </w:p>
-    <w:p>
-      <w:pPr>
-        <w:pStyle w:val="normal1"/>
-        <w:spacing w:lineRule="auto" w:line="360" w:before="0" w:after="120"/>
-        <w:ind w:hanging="0" w:start="0"/>
-        <w:jc w:val="center"/>
-        <w:rPr>
-          <w:rFonts w:ascii="Times New Roman" w:hAnsi="Times New Roman" w:eastAsia="Times New Roman" w:cs="Times New Roman"/>
-          <w:b/>
-          <w:sz w:val="24"/>
-        </w:rPr>
-      </w:pPr>
-      <w:r>
-        <w:rPr>
-          <w:rFonts w:eastAsia="Times New Roman" w:cs="Times New Roman" w:ascii="Times New Roman" w:hAnsi="Times New Roman"/>
-          <w:b/>
-          <w:sz w:val="24"/>
-        </w:rPr>
       </w:r>
     </w:p>
     <w:p>
@@ -9485,126 +7910,6 @@
         <w:pStyle w:val="normal1"/>
         <w:spacing w:lineRule="auto" w:line="360" w:before="0" w:after="120"/>
         <w:ind w:hanging="0" w:start="0"/>
-        <w:jc w:val="center"/>
-        <w:rPr>
-          <w:rFonts w:ascii="Times New Roman" w:hAnsi="Times New Roman" w:eastAsia="Times New Roman" w:cs="Times New Roman"/>
-          <w:b/>
-          <w:sz w:val="24"/>
-        </w:rPr>
-      </w:pPr>
-      <w:r>
-        <w:rPr>
-          <w:rFonts w:eastAsia="Times New Roman" w:cs="Times New Roman" w:ascii="Times New Roman" w:hAnsi="Times New Roman"/>
-          <w:b/>
-          <w:sz w:val="24"/>
-        </w:rPr>
-      </w:r>
-    </w:p>
-    <w:p>
-      <w:pPr>
-        <w:pStyle w:val="normal1"/>
-        <w:spacing w:lineRule="auto" w:line="360" w:before="0" w:after="120"/>
-        <w:ind w:hanging="0" w:start="0"/>
-        <w:jc w:val="center"/>
-        <w:rPr>
-          <w:rFonts w:ascii="Times New Roman" w:hAnsi="Times New Roman" w:eastAsia="Times New Roman" w:cs="Times New Roman"/>
-          <w:b/>
-          <w:sz w:val="24"/>
-        </w:rPr>
-      </w:pPr>
-      <w:r>
-        <w:rPr>
-          <w:rFonts w:eastAsia="Times New Roman" w:cs="Times New Roman" w:ascii="Times New Roman" w:hAnsi="Times New Roman"/>
-          <w:b/>
-          <w:sz w:val="24"/>
-        </w:rPr>
-      </w:r>
-    </w:p>
-    <w:p>
-      <w:pPr>
-        <w:pStyle w:val="normal1"/>
-        <w:spacing w:lineRule="auto" w:line="360" w:before="0" w:after="120"/>
-        <w:ind w:hanging="0" w:start="0"/>
-        <w:jc w:val="center"/>
-        <w:rPr>
-          <w:rFonts w:ascii="Times New Roman" w:hAnsi="Times New Roman" w:eastAsia="Times New Roman" w:cs="Times New Roman"/>
-          <w:b/>
-          <w:sz w:val="24"/>
-        </w:rPr>
-      </w:pPr>
-      <w:r>
-        <w:rPr>
-          <w:rFonts w:eastAsia="Times New Roman" w:cs="Times New Roman" w:ascii="Times New Roman" w:hAnsi="Times New Roman"/>
-          <w:b/>
-          <w:sz w:val="24"/>
-        </w:rPr>
-      </w:r>
-    </w:p>
-    <w:p>
-      <w:pPr>
-        <w:pStyle w:val="normal1"/>
-        <w:spacing w:lineRule="auto" w:line="360" w:before="0" w:after="120"/>
-        <w:ind w:hanging="0" w:start="0"/>
-        <w:jc w:val="center"/>
-        <w:rPr>
-          <w:rFonts w:ascii="Times New Roman" w:hAnsi="Times New Roman" w:eastAsia="Times New Roman" w:cs="Times New Roman"/>
-          <w:b/>
-          <w:sz w:val="24"/>
-        </w:rPr>
-      </w:pPr>
-      <w:r>
-        <w:rPr>
-          <w:rFonts w:eastAsia="Times New Roman" w:cs="Times New Roman" w:ascii="Times New Roman" w:hAnsi="Times New Roman"/>
-          <w:b/>
-          <w:sz w:val="24"/>
-        </w:rPr>
-      </w:r>
-    </w:p>
-    <w:p>
-      <w:pPr>
-        <w:pStyle w:val="normal1"/>
-        <w:spacing w:lineRule="auto" w:line="360" w:before="0" w:after="120"/>
-        <w:ind w:hanging="0" w:start="0"/>
-        <w:jc w:val="center"/>
-        <w:rPr>
-          <w:rFonts w:ascii="Times New Roman" w:hAnsi="Times New Roman" w:eastAsia="Times New Roman" w:cs="Times New Roman"/>
-          <w:b/>
-          <w:sz w:val="24"/>
-        </w:rPr>
-      </w:pPr>
-      <w:r>
-        <w:rPr>
-          <w:rFonts w:eastAsia="Times New Roman" w:cs="Times New Roman" w:ascii="Times New Roman" w:hAnsi="Times New Roman"/>
-          <w:b/>
-          <w:sz w:val="24"/>
-        </w:rPr>
-      </w:r>
-    </w:p>
-    <w:p>
-      <w:pPr>
-        <w:pStyle w:val="normal1"/>
-        <w:spacing w:lineRule="auto" w:line="360" w:before="0" w:after="120"/>
-        <w:ind w:hanging="0" w:start="0"/>
-        <w:jc w:val="center"/>
-        <w:rPr>
-          <w:rFonts w:ascii="Times New Roman" w:hAnsi="Times New Roman" w:eastAsia="Times New Roman" w:cs="Times New Roman"/>
-          <w:b/>
-          <w:sz w:val="24"/>
-        </w:rPr>
-      </w:pPr>
-      <w:r>
-        <w:rPr>
-          <w:rFonts w:eastAsia="Times New Roman" w:cs="Times New Roman" w:ascii="Times New Roman" w:hAnsi="Times New Roman"/>
-          <w:b/>
-          <w:sz w:val="24"/>
-        </w:rPr>
-      </w:r>
-    </w:p>
-    <w:p>
-      <w:pPr>
-        <w:pStyle w:val="normal1"/>
-        <w:spacing w:lineRule="auto" w:line="360" w:before="0" w:after="120"/>
-        <w:ind w:hanging="0" w:start="0"/>
         <w:jc w:val="start"/>
         <w:rPr/>
       </w:pPr>
@@ -9653,66 +7958,6 @@
           <w:sz w:val="24"/>
         </w:rPr>
         <w:t>Como señala Date (2004), los sistemas de bases de datos relacionales son esenciales para garantizar la consistencia y la integridad referencial de la información, previniendo los errores de cálculo humano y la sobreescritura accidental. Para el control de préstamos prendarios, donde la precisión de las tasas de interés es vital, la ausencia de un algoritmo de cálculo automatizado representa un riesgo operativo que el nuevo sistema propuesto logrará mitigar estructuralmente.</w:t>
-      </w:r>
-    </w:p>
-    <w:p>
-      <w:pPr>
-        <w:pStyle w:val="normal1"/>
-        <w:spacing w:lineRule="auto" w:line="360" w:before="0" w:after="120"/>
-        <w:ind w:firstLine="720" w:start="0"/>
-        <w:jc w:val="both"/>
-        <w:rPr>
-          <w:rFonts w:ascii="Times New Roman" w:hAnsi="Times New Roman" w:eastAsia="Times New Roman" w:cs="Times New Roman"/>
-          <w:b w:val="false"/>
-          <w:sz w:val="24"/>
-        </w:rPr>
-      </w:pPr>
-      <w:r>
-        <w:rPr>
-          <w:rFonts w:eastAsia="Times New Roman" w:cs="Times New Roman" w:ascii="Times New Roman" w:hAnsi="Times New Roman"/>
-          <w:b w:val="false"/>
-          <w:sz w:val="24"/>
-        </w:rPr>
-      </w:r>
-    </w:p>
-    <w:p>
-      <w:pPr>
-        <w:pStyle w:val="normal1"/>
-        <w:spacing w:lineRule="auto" w:line="360" w:before="0" w:after="120"/>
-        <w:ind w:firstLine="720" w:start="0"/>
-        <w:jc w:val="both"/>
-        <w:rPr>
-          <w:rFonts w:ascii="Times New Roman" w:hAnsi="Times New Roman" w:eastAsia="Times New Roman" w:cs="Times New Roman"/>
-          <w:b w:val="false"/>
-          <w:sz w:val="24"/>
-        </w:rPr>
-      </w:pPr>
-      <w:r>
-        <w:rPr>
-          <w:rFonts w:eastAsia="Times New Roman" w:cs="Times New Roman" w:ascii="Times New Roman" w:hAnsi="Times New Roman"/>
-          <w:b w:val="false"/>
-          <w:sz w:val="24"/>
-        </w:rPr>
-      </w:r>
-    </w:p>
-    <w:p>
-      <w:pPr>
-        <w:pStyle w:val="normal1"/>
-        <w:spacing w:lineRule="auto" w:line="360" w:before="0" w:after="120"/>
-        <w:ind w:firstLine="720" w:start="0"/>
-        <w:jc w:val="both"/>
-        <w:rPr>
-          <w:rFonts w:ascii="Times New Roman" w:hAnsi="Times New Roman" w:eastAsia="Times New Roman" w:cs="Times New Roman"/>
-          <w:b w:val="false"/>
-          <w:sz w:val="24"/>
-        </w:rPr>
-      </w:pPr>
-      <w:r>
-        <w:rPr>
-          <w:rFonts w:eastAsia="Times New Roman" w:cs="Times New Roman" w:ascii="Times New Roman" w:hAnsi="Times New Roman"/>
-          <w:b w:val="false"/>
-          <w:sz w:val="24"/>
-        </w:rPr>
       </w:r>
     </w:p>
     <w:p>
@@ -10209,146 +8454,6 @@
         <w:pStyle w:val="normal1"/>
         <w:spacing w:lineRule="auto" w:line="360" w:before="0" w:after="120"/>
         <w:ind w:hanging="0" w:start="0"/>
-        <w:jc w:val="center"/>
-        <w:rPr>
-          <w:rFonts w:ascii="Times New Roman" w:hAnsi="Times New Roman" w:eastAsia="Times New Roman" w:cs="Times New Roman"/>
-          <w:b/>
-          <w:sz w:val="24"/>
-        </w:rPr>
-      </w:pPr>
-      <w:r>
-        <w:rPr>
-          <w:rFonts w:eastAsia="Times New Roman" w:cs="Times New Roman" w:ascii="Times New Roman" w:hAnsi="Times New Roman"/>
-          <w:b/>
-          <w:sz w:val="24"/>
-        </w:rPr>
-      </w:r>
-    </w:p>
-    <w:p>
-      <w:pPr>
-        <w:pStyle w:val="normal1"/>
-        <w:spacing w:lineRule="auto" w:line="360" w:before="0" w:after="120"/>
-        <w:ind w:hanging="0" w:start="0"/>
-        <w:jc w:val="center"/>
-        <w:rPr>
-          <w:rFonts w:ascii="Times New Roman" w:hAnsi="Times New Roman" w:eastAsia="Times New Roman" w:cs="Times New Roman"/>
-          <w:b/>
-          <w:sz w:val="24"/>
-        </w:rPr>
-      </w:pPr>
-      <w:r>
-        <w:rPr>
-          <w:rFonts w:eastAsia="Times New Roman" w:cs="Times New Roman" w:ascii="Times New Roman" w:hAnsi="Times New Roman"/>
-          <w:b/>
-          <w:sz w:val="24"/>
-        </w:rPr>
-      </w:r>
-    </w:p>
-    <w:p>
-      <w:pPr>
-        <w:pStyle w:val="normal1"/>
-        <w:spacing w:lineRule="auto" w:line="360" w:before="0" w:after="120"/>
-        <w:ind w:hanging="0" w:start="0"/>
-        <w:jc w:val="center"/>
-        <w:rPr>
-          <w:rFonts w:ascii="Times New Roman" w:hAnsi="Times New Roman" w:eastAsia="Times New Roman" w:cs="Times New Roman"/>
-          <w:b/>
-          <w:sz w:val="24"/>
-        </w:rPr>
-      </w:pPr>
-      <w:r>
-        <w:rPr>
-          <w:rFonts w:eastAsia="Times New Roman" w:cs="Times New Roman" w:ascii="Times New Roman" w:hAnsi="Times New Roman"/>
-          <w:b/>
-          <w:sz w:val="24"/>
-        </w:rPr>
-      </w:r>
-    </w:p>
-    <w:p>
-      <w:pPr>
-        <w:pStyle w:val="normal1"/>
-        <w:spacing w:lineRule="auto" w:line="360" w:before="0" w:after="120"/>
-        <w:ind w:hanging="0" w:start="0"/>
-        <w:jc w:val="center"/>
-        <w:rPr>
-          <w:rFonts w:ascii="Times New Roman" w:hAnsi="Times New Roman" w:eastAsia="Times New Roman" w:cs="Times New Roman"/>
-          <w:b/>
-          <w:sz w:val="24"/>
-        </w:rPr>
-      </w:pPr>
-      <w:r>
-        <w:rPr>
-          <w:rFonts w:eastAsia="Times New Roman" w:cs="Times New Roman" w:ascii="Times New Roman" w:hAnsi="Times New Roman"/>
-          <w:b/>
-          <w:sz w:val="24"/>
-        </w:rPr>
-      </w:r>
-    </w:p>
-    <w:p>
-      <w:pPr>
-        <w:pStyle w:val="normal1"/>
-        <w:spacing w:lineRule="auto" w:line="360" w:before="0" w:after="120"/>
-        <w:ind w:hanging="0" w:start="0"/>
-        <w:jc w:val="center"/>
-        <w:rPr>
-          <w:rFonts w:ascii="Times New Roman" w:hAnsi="Times New Roman" w:eastAsia="Times New Roman" w:cs="Times New Roman"/>
-          <w:b/>
-          <w:sz w:val="24"/>
-        </w:rPr>
-      </w:pPr>
-      <w:r>
-        <w:rPr>
-          <w:rFonts w:eastAsia="Times New Roman" w:cs="Times New Roman" w:ascii="Times New Roman" w:hAnsi="Times New Roman"/>
-          <w:b/>
-          <w:sz w:val="24"/>
-        </w:rPr>
-      </w:r>
-    </w:p>
-    <w:p>
-      <w:pPr>
-        <w:pStyle w:val="normal1"/>
-        <w:spacing w:lineRule="auto" w:line="360" w:before="0" w:after="120"/>
-        <w:ind w:hanging="0" w:start="0"/>
-        <w:jc w:val="center"/>
-        <w:rPr>
-          <w:rFonts w:ascii="Times New Roman" w:hAnsi="Times New Roman" w:eastAsia="Times New Roman" w:cs="Times New Roman"/>
-          <w:b/>
-          <w:sz w:val="24"/>
-        </w:rPr>
-      </w:pPr>
-      <w:r>
-        <w:rPr>
-          <w:rFonts w:eastAsia="Times New Roman" w:cs="Times New Roman" w:ascii="Times New Roman" w:hAnsi="Times New Roman"/>
-          <w:b/>
-          <w:sz w:val="24"/>
-        </w:rPr>
-      </w:r>
-    </w:p>
-    <w:p>
-      <w:pPr>
-        <w:pStyle w:val="normal1"/>
-        <w:spacing w:lineRule="auto" w:line="360" w:before="0" w:after="120"/>
-        <w:ind w:hanging="0" w:start="0"/>
-        <w:jc w:val="center"/>
-        <w:rPr>
-          <w:rFonts w:ascii="Times New Roman" w:hAnsi="Times New Roman" w:eastAsia="Times New Roman" w:cs="Times New Roman"/>
-          <w:b/>
-          <w:sz w:val="24"/>
-        </w:rPr>
-      </w:pPr>
-      <w:r>
-        <w:rPr>
-          <w:rFonts w:eastAsia="Times New Roman" w:cs="Times New Roman" w:ascii="Times New Roman" w:hAnsi="Times New Roman"/>
-          <w:b/>
-          <w:sz w:val="24"/>
-        </w:rPr>
-      </w:r>
-    </w:p>
-    <w:p>
-      <w:pPr>
-        <w:pStyle w:val="normal1"/>
-        <w:spacing w:lineRule="auto" w:line="360" w:before="0" w:after="120"/>
-        <w:ind w:hanging="0" w:start="0"/>
         <w:jc w:val="start"/>
         <w:rPr>
           <w:rFonts w:ascii="Times New Roman" w:hAnsi="Times New Roman" w:eastAsia="Times New Roman" w:cs="Times New Roman"/>
@@ -10909,126 +9014,6 @@
         <w:pStyle w:val="normal1"/>
         <w:spacing w:lineRule="auto" w:line="360" w:before="0" w:after="120"/>
         <w:ind w:hanging="0" w:start="0"/>
-        <w:jc w:val="center"/>
-        <w:rPr>
-          <w:rFonts w:ascii="Times New Roman" w:hAnsi="Times New Roman" w:eastAsia="Times New Roman" w:cs="Times New Roman"/>
-          <w:b/>
-          <w:sz w:val="24"/>
-        </w:rPr>
-      </w:pPr>
-      <w:r>
-        <w:rPr>
-          <w:rFonts w:eastAsia="Times New Roman" w:cs="Times New Roman" w:ascii="Times New Roman" w:hAnsi="Times New Roman"/>
-          <w:b/>
-          <w:sz w:val="24"/>
-        </w:rPr>
-      </w:r>
-    </w:p>
-    <w:p>
-      <w:pPr>
-        <w:pStyle w:val="normal1"/>
-        <w:spacing w:lineRule="auto" w:line="360" w:before="0" w:after="120"/>
-        <w:ind w:hanging="0" w:start="0"/>
-        <w:jc w:val="center"/>
-        <w:rPr>
-          <w:rFonts w:ascii="Times New Roman" w:hAnsi="Times New Roman" w:eastAsia="Times New Roman" w:cs="Times New Roman"/>
-          <w:b/>
-          <w:sz w:val="24"/>
-        </w:rPr>
-      </w:pPr>
-      <w:r>
-        <w:rPr>
-          <w:rFonts w:eastAsia="Times New Roman" w:cs="Times New Roman" w:ascii="Times New Roman" w:hAnsi="Times New Roman"/>
-          <w:b/>
-          <w:sz w:val="24"/>
-        </w:rPr>
-      </w:r>
-    </w:p>
-    <w:p>
-      <w:pPr>
-        <w:pStyle w:val="normal1"/>
-        <w:spacing w:lineRule="auto" w:line="360" w:before="0" w:after="120"/>
-        <w:ind w:hanging="0" w:start="0"/>
-        <w:jc w:val="center"/>
-        <w:rPr>
-          <w:rFonts w:ascii="Times New Roman" w:hAnsi="Times New Roman" w:eastAsia="Times New Roman" w:cs="Times New Roman"/>
-          <w:b/>
-          <w:sz w:val="24"/>
-        </w:rPr>
-      </w:pPr>
-      <w:r>
-        <w:rPr>
-          <w:rFonts w:eastAsia="Times New Roman" w:cs="Times New Roman" w:ascii="Times New Roman" w:hAnsi="Times New Roman"/>
-          <w:b/>
-          <w:sz w:val="24"/>
-        </w:rPr>
-      </w:r>
-    </w:p>
-    <w:p>
-      <w:pPr>
-        <w:pStyle w:val="normal1"/>
-        <w:spacing w:lineRule="auto" w:line="360" w:before="0" w:after="120"/>
-        <w:ind w:hanging="0" w:start="0"/>
-        <w:jc w:val="center"/>
-        <w:rPr>
-          <w:rFonts w:ascii="Times New Roman" w:hAnsi="Times New Roman" w:eastAsia="Times New Roman" w:cs="Times New Roman"/>
-          <w:b/>
-          <w:sz w:val="24"/>
-        </w:rPr>
-      </w:pPr>
-      <w:r>
-        <w:rPr>
-          <w:rFonts w:eastAsia="Times New Roman" w:cs="Times New Roman" w:ascii="Times New Roman" w:hAnsi="Times New Roman"/>
-          <w:b/>
-          <w:sz w:val="24"/>
-        </w:rPr>
-      </w:r>
-    </w:p>
-    <w:p>
-      <w:pPr>
-        <w:pStyle w:val="normal1"/>
-        <w:spacing w:lineRule="auto" w:line="360" w:before="0" w:after="120"/>
-        <w:ind w:hanging="0" w:start="0"/>
-        <w:jc w:val="center"/>
-        <w:rPr>
-          <w:rFonts w:ascii="Times New Roman" w:hAnsi="Times New Roman" w:eastAsia="Times New Roman" w:cs="Times New Roman"/>
-          <w:b/>
-          <w:sz w:val="24"/>
-        </w:rPr>
-      </w:pPr>
-      <w:r>
-        <w:rPr>
-          <w:rFonts w:eastAsia="Times New Roman" w:cs="Times New Roman" w:ascii="Times New Roman" w:hAnsi="Times New Roman"/>
-          <w:b/>
-          <w:sz w:val="24"/>
-        </w:rPr>
-      </w:r>
-    </w:p>
-    <w:p>
-      <w:pPr>
-        <w:pStyle w:val="normal1"/>
-        <w:spacing w:lineRule="auto" w:line="360" w:before="0" w:after="120"/>
-        <w:ind w:hanging="0" w:start="0"/>
-        <w:jc w:val="center"/>
-        <w:rPr>
-          <w:rFonts w:ascii="Times New Roman" w:hAnsi="Times New Roman" w:eastAsia="Times New Roman" w:cs="Times New Roman"/>
-          <w:b/>
-          <w:sz w:val="24"/>
-        </w:rPr>
-      </w:pPr>
-      <w:r>
-        <w:rPr>
-          <w:rFonts w:eastAsia="Times New Roman" w:cs="Times New Roman" w:ascii="Times New Roman" w:hAnsi="Times New Roman"/>
-          <w:b/>
-          <w:sz w:val="24"/>
-        </w:rPr>
-      </w:r>
-    </w:p>
-    <w:p>
-      <w:pPr>
-        <w:pStyle w:val="normal1"/>
-        <w:spacing w:lineRule="auto" w:line="360" w:before="0" w:after="120"/>
-        <w:ind w:hanging="0" w:start="0"/>
         <w:jc w:val="start"/>
         <w:rPr/>
       </w:pPr>
@@ -11565,126 +9550,6 @@
         <w:pStyle w:val="normal1"/>
         <w:spacing w:lineRule="auto" w:line="360" w:before="0" w:after="120"/>
         <w:ind w:hanging="0" w:start="0"/>
-        <w:jc w:val="center"/>
-        <w:rPr>
-          <w:rFonts w:ascii="Times New Roman" w:hAnsi="Times New Roman" w:eastAsia="Times New Roman" w:cs="Times New Roman"/>
-          <w:b/>
-          <w:sz w:val="24"/>
-        </w:rPr>
-      </w:pPr>
-      <w:r>
-        <w:rPr>
-          <w:rFonts w:eastAsia="Times New Roman" w:cs="Times New Roman" w:ascii="Times New Roman" w:hAnsi="Times New Roman"/>
-          <w:b/>
-          <w:sz w:val="24"/>
-        </w:rPr>
-      </w:r>
-    </w:p>
-    <w:p>
-      <w:pPr>
-        <w:pStyle w:val="normal1"/>
-        <w:spacing w:lineRule="auto" w:line="360" w:before="0" w:after="120"/>
-        <w:ind w:hanging="0" w:start="0"/>
-        <w:jc w:val="center"/>
-        <w:rPr>
-          <w:rFonts w:ascii="Times New Roman" w:hAnsi="Times New Roman" w:eastAsia="Times New Roman" w:cs="Times New Roman"/>
-          <w:b/>
-          <w:sz w:val="24"/>
-        </w:rPr>
-      </w:pPr>
-      <w:r>
-        <w:rPr>
-          <w:rFonts w:eastAsia="Times New Roman" w:cs="Times New Roman" w:ascii="Times New Roman" w:hAnsi="Times New Roman"/>
-          <w:b/>
-          <w:sz w:val="24"/>
-        </w:rPr>
-      </w:r>
-    </w:p>
-    <w:p>
-      <w:pPr>
-        <w:pStyle w:val="normal1"/>
-        <w:spacing w:lineRule="auto" w:line="360" w:before="0" w:after="120"/>
-        <w:ind w:hanging="0" w:start="0"/>
-        <w:jc w:val="center"/>
-        <w:rPr>
-          <w:rFonts w:ascii="Times New Roman" w:hAnsi="Times New Roman" w:eastAsia="Times New Roman" w:cs="Times New Roman"/>
-          <w:b/>
-          <w:sz w:val="24"/>
-        </w:rPr>
-      </w:pPr>
-      <w:r>
-        <w:rPr>
-          <w:rFonts w:eastAsia="Times New Roman" w:cs="Times New Roman" w:ascii="Times New Roman" w:hAnsi="Times New Roman"/>
-          <w:b/>
-          <w:sz w:val="24"/>
-        </w:rPr>
-      </w:r>
-    </w:p>
-    <w:p>
-      <w:pPr>
-        <w:pStyle w:val="normal1"/>
-        <w:spacing w:lineRule="auto" w:line="360" w:before="0" w:after="120"/>
-        <w:ind w:hanging="0" w:start="0"/>
-        <w:jc w:val="center"/>
-        <w:rPr>
-          <w:rFonts w:ascii="Times New Roman" w:hAnsi="Times New Roman" w:eastAsia="Times New Roman" w:cs="Times New Roman"/>
-          <w:b/>
-          <w:sz w:val="24"/>
-        </w:rPr>
-      </w:pPr>
-      <w:r>
-        <w:rPr>
-          <w:rFonts w:eastAsia="Times New Roman" w:cs="Times New Roman" w:ascii="Times New Roman" w:hAnsi="Times New Roman"/>
-          <w:b/>
-          <w:sz w:val="24"/>
-        </w:rPr>
-      </w:r>
-    </w:p>
-    <w:p>
-      <w:pPr>
-        <w:pStyle w:val="normal1"/>
-        <w:spacing w:lineRule="auto" w:line="360" w:before="0" w:after="120"/>
-        <w:ind w:hanging="0" w:start="0"/>
-        <w:jc w:val="center"/>
-        <w:rPr>
-          <w:rFonts w:ascii="Times New Roman" w:hAnsi="Times New Roman" w:eastAsia="Times New Roman" w:cs="Times New Roman"/>
-          <w:b/>
-          <w:sz w:val="24"/>
-        </w:rPr>
-      </w:pPr>
-      <w:r>
-        <w:rPr>
-          <w:rFonts w:eastAsia="Times New Roman" w:cs="Times New Roman" w:ascii="Times New Roman" w:hAnsi="Times New Roman"/>
-          <w:b/>
-          <w:sz w:val="24"/>
-        </w:rPr>
-      </w:r>
-    </w:p>
-    <w:p>
-      <w:pPr>
-        <w:pStyle w:val="normal1"/>
-        <w:spacing w:lineRule="auto" w:line="360" w:before="0" w:after="120"/>
-        <w:ind w:hanging="0" w:start="0"/>
-        <w:jc w:val="center"/>
-        <w:rPr>
-          <w:rFonts w:ascii="Times New Roman" w:hAnsi="Times New Roman" w:eastAsia="Times New Roman" w:cs="Times New Roman"/>
-          <w:b/>
-          <w:sz w:val="24"/>
-        </w:rPr>
-      </w:pPr>
-      <w:r>
-        <w:rPr>
-          <w:rFonts w:eastAsia="Times New Roman" w:cs="Times New Roman" w:ascii="Times New Roman" w:hAnsi="Times New Roman"/>
-          <w:b/>
-          <w:sz w:val="24"/>
-        </w:rPr>
-      </w:r>
-    </w:p>
-    <w:p>
-      <w:pPr>
-        <w:pStyle w:val="normal1"/>
-        <w:spacing w:lineRule="auto" w:line="360" w:before="0" w:after="120"/>
-        <w:ind w:hanging="0" w:start="0"/>
         <w:jc w:val="start"/>
         <w:rPr/>
       </w:pPr>
@@ -12221,126 +10086,6 @@
         <w:pStyle w:val="normal1"/>
         <w:spacing w:lineRule="auto" w:line="360" w:before="0" w:after="120"/>
         <w:ind w:hanging="0" w:start="0"/>
-        <w:jc w:val="center"/>
-        <w:rPr>
-          <w:rFonts w:ascii="Times New Roman" w:hAnsi="Times New Roman" w:eastAsia="Times New Roman" w:cs="Times New Roman"/>
-          <w:b/>
-          <w:sz w:val="24"/>
-        </w:rPr>
-      </w:pPr>
-      <w:r>
-        <w:rPr>
-          <w:rFonts w:eastAsia="Times New Roman" w:cs="Times New Roman" w:ascii="Times New Roman" w:hAnsi="Times New Roman"/>
-          <w:b/>
-          <w:sz w:val="24"/>
-        </w:rPr>
-      </w:r>
-    </w:p>
-    <w:p>
-      <w:pPr>
-        <w:pStyle w:val="normal1"/>
-        <w:spacing w:lineRule="auto" w:line="360" w:before="0" w:after="120"/>
-        <w:ind w:hanging="0" w:start="0"/>
-        <w:jc w:val="center"/>
-        <w:rPr>
-          <w:rFonts w:ascii="Times New Roman" w:hAnsi="Times New Roman" w:eastAsia="Times New Roman" w:cs="Times New Roman"/>
-          <w:b/>
-          <w:sz w:val="24"/>
-        </w:rPr>
-      </w:pPr>
-      <w:r>
-        <w:rPr>
-          <w:rFonts w:eastAsia="Times New Roman" w:cs="Times New Roman" w:ascii="Times New Roman" w:hAnsi="Times New Roman"/>
-          <w:b/>
-          <w:sz w:val="24"/>
-        </w:rPr>
-      </w:r>
-    </w:p>
-    <w:p>
-      <w:pPr>
-        <w:pStyle w:val="normal1"/>
-        <w:spacing w:lineRule="auto" w:line="360" w:before="0" w:after="120"/>
-        <w:ind w:hanging="0" w:start="0"/>
-        <w:jc w:val="center"/>
-        <w:rPr>
-          <w:rFonts w:ascii="Times New Roman" w:hAnsi="Times New Roman" w:eastAsia="Times New Roman" w:cs="Times New Roman"/>
-          <w:b/>
-          <w:sz w:val="24"/>
-        </w:rPr>
-      </w:pPr>
-      <w:r>
-        <w:rPr>
-          <w:rFonts w:eastAsia="Times New Roman" w:cs="Times New Roman" w:ascii="Times New Roman" w:hAnsi="Times New Roman"/>
-          <w:b/>
-          <w:sz w:val="24"/>
-        </w:rPr>
-      </w:r>
-    </w:p>
-    <w:p>
-      <w:pPr>
-        <w:pStyle w:val="normal1"/>
-        <w:spacing w:lineRule="auto" w:line="360" w:before="0" w:after="120"/>
-        <w:ind w:hanging="0" w:start="0"/>
-        <w:jc w:val="center"/>
-        <w:rPr>
-          <w:rFonts w:ascii="Times New Roman" w:hAnsi="Times New Roman" w:eastAsia="Times New Roman" w:cs="Times New Roman"/>
-          <w:b/>
-          <w:sz w:val="24"/>
-        </w:rPr>
-      </w:pPr>
-      <w:r>
-        <w:rPr>
-          <w:rFonts w:eastAsia="Times New Roman" w:cs="Times New Roman" w:ascii="Times New Roman" w:hAnsi="Times New Roman"/>
-          <w:b/>
-          <w:sz w:val="24"/>
-        </w:rPr>
-      </w:r>
-    </w:p>
-    <w:p>
-      <w:pPr>
-        <w:pStyle w:val="normal1"/>
-        <w:spacing w:lineRule="auto" w:line="360" w:before="0" w:after="120"/>
-        <w:ind w:hanging="0" w:start="0"/>
-        <w:jc w:val="center"/>
-        <w:rPr>
-          <w:rFonts w:ascii="Times New Roman" w:hAnsi="Times New Roman" w:eastAsia="Times New Roman" w:cs="Times New Roman"/>
-          <w:b/>
-          <w:sz w:val="24"/>
-        </w:rPr>
-      </w:pPr>
-      <w:r>
-        <w:rPr>
-          <w:rFonts w:eastAsia="Times New Roman" w:cs="Times New Roman" w:ascii="Times New Roman" w:hAnsi="Times New Roman"/>
-          <w:b/>
-          <w:sz w:val="24"/>
-        </w:rPr>
-      </w:r>
-    </w:p>
-    <w:p>
-      <w:pPr>
-        <w:pStyle w:val="normal1"/>
-        <w:spacing w:lineRule="auto" w:line="360" w:before="0" w:after="120"/>
-        <w:ind w:hanging="0" w:start="0"/>
-        <w:jc w:val="center"/>
-        <w:rPr>
-          <w:rFonts w:ascii="Times New Roman" w:hAnsi="Times New Roman" w:eastAsia="Times New Roman" w:cs="Times New Roman"/>
-          <w:b/>
-          <w:sz w:val="24"/>
-        </w:rPr>
-      </w:pPr>
-      <w:r>
-        <w:rPr>
-          <w:rFonts w:eastAsia="Times New Roman" w:cs="Times New Roman" w:ascii="Times New Roman" w:hAnsi="Times New Roman"/>
-          <w:b/>
-          <w:sz w:val="24"/>
-        </w:rPr>
-      </w:r>
-    </w:p>
-    <w:p>
-      <w:pPr>
-        <w:pStyle w:val="normal1"/>
-        <w:spacing w:lineRule="auto" w:line="360" w:before="0" w:after="120"/>
-        <w:ind w:hanging="0" w:start="0"/>
         <w:jc w:val="start"/>
         <w:rPr/>
       </w:pPr>
@@ -12784,106 +10529,6 @@
           <w:sz w:val="24"/>
         </w:rPr>
         <w:t>Fuente: Alvarado, L. (2026).</w:t>
-      </w:r>
-    </w:p>
-    <w:p>
-      <w:pPr>
-        <w:pStyle w:val="normal1"/>
-        <w:spacing w:lineRule="auto" w:line="360" w:before="0" w:after="120"/>
-        <w:ind w:hanging="0" w:start="0"/>
-        <w:jc w:val="center"/>
-        <w:rPr>
-          <w:rFonts w:ascii="Times New Roman" w:hAnsi="Times New Roman" w:eastAsia="Times New Roman" w:cs="Times New Roman"/>
-          <w:b/>
-          <w:sz w:val="24"/>
-        </w:rPr>
-      </w:pPr>
-      <w:r>
-        <w:rPr>
-          <w:rFonts w:eastAsia="Times New Roman" w:cs="Times New Roman" w:ascii="Times New Roman" w:hAnsi="Times New Roman"/>
-          <w:b/>
-          <w:sz w:val="24"/>
-        </w:rPr>
-      </w:r>
-    </w:p>
-    <w:p>
-      <w:pPr>
-        <w:pStyle w:val="normal1"/>
-        <w:spacing w:lineRule="auto" w:line="360" w:before="0" w:after="120"/>
-        <w:ind w:hanging="0" w:start="0"/>
-        <w:jc w:val="center"/>
-        <w:rPr>
-          <w:rFonts w:ascii="Times New Roman" w:hAnsi="Times New Roman" w:eastAsia="Times New Roman" w:cs="Times New Roman"/>
-          <w:b/>
-          <w:sz w:val="24"/>
-        </w:rPr>
-      </w:pPr>
-      <w:r>
-        <w:rPr>
-          <w:rFonts w:eastAsia="Times New Roman" w:cs="Times New Roman" w:ascii="Times New Roman" w:hAnsi="Times New Roman"/>
-          <w:b/>
-          <w:sz w:val="24"/>
-        </w:rPr>
-      </w:r>
-    </w:p>
-    <w:p>
-      <w:pPr>
-        <w:pStyle w:val="normal1"/>
-        <w:spacing w:lineRule="auto" w:line="360" w:before="0" w:after="120"/>
-        <w:ind w:hanging="0" w:start="0"/>
-        <w:jc w:val="center"/>
-        <w:rPr>
-          <w:rFonts w:ascii="Times New Roman" w:hAnsi="Times New Roman" w:eastAsia="Times New Roman" w:cs="Times New Roman"/>
-          <w:b/>
-          <w:sz w:val="24"/>
-        </w:rPr>
-      </w:pPr>
-      <w:r>
-        <w:rPr>
-          <w:rFonts w:eastAsia="Times New Roman" w:cs="Times New Roman" w:ascii="Times New Roman" w:hAnsi="Times New Roman"/>
-          <w:b/>
-          <w:sz w:val="24"/>
-        </w:rPr>
-      </w:r>
-    </w:p>
-    <w:p>
-      <w:pPr>
-        <w:pStyle w:val="normal1"/>
-        <w:spacing w:lineRule="auto" w:line="360" w:before="0" w:after="120"/>
-        <w:ind w:hanging="0" w:start="0"/>
-        <w:jc w:val="center"/>
-        <w:rPr>
-          <w:rFonts w:ascii="Times New Roman" w:hAnsi="Times New Roman" w:eastAsia="Times New Roman" w:cs="Times New Roman"/>
-          <w:b/>
-          <w:sz w:val="24"/>
-        </w:rPr>
-      </w:pPr>
-      <w:r>
-        <w:rPr>
-          <w:rFonts w:eastAsia="Times New Roman" w:cs="Times New Roman" w:ascii="Times New Roman" w:hAnsi="Times New Roman"/>
-          <w:b/>
-          <w:sz w:val="24"/>
-        </w:rPr>
-      </w:r>
-    </w:p>
-    <w:p>
-      <w:pPr>
-        <w:pStyle w:val="normal1"/>
-        <w:spacing w:lineRule="auto" w:line="360" w:before="0" w:after="120"/>
-        <w:ind w:hanging="0" w:start="0"/>
-        <w:jc w:val="center"/>
-        <w:rPr>
-          <w:rFonts w:ascii="Times New Roman" w:hAnsi="Times New Roman" w:eastAsia="Times New Roman" w:cs="Times New Roman"/>
-          <w:b/>
-          <w:sz w:val="24"/>
-        </w:rPr>
-      </w:pPr>
-      <w:r>
-        <w:rPr>
-          <w:rFonts w:eastAsia="Times New Roman" w:cs="Times New Roman" w:ascii="Times New Roman" w:hAnsi="Times New Roman"/>
-          <w:b/>
-          <w:sz w:val="24"/>
-        </w:rPr>
       </w:r>
     </w:p>
     <w:p>
@@ -13066,226 +10711,6 @@
           <w:sz w:val="24"/>
         </w:rPr>
       </w:r>
-    </w:p>
-    <w:p>
-      <w:pPr>
-        <w:pStyle w:val="normal1"/>
-        <w:spacing w:lineRule="auto" w:line="360" w:before="0" w:after="120"/>
-        <w:ind w:firstLine="720" w:start="0"/>
-        <w:jc w:val="both"/>
-        <w:rPr>
-          <w:rFonts w:ascii="Times New Roman" w:hAnsi="Times New Roman" w:eastAsia="Times New Roman" w:cs="Times New Roman"/>
-          <w:b w:val="false"/>
-          <w:sz w:val="24"/>
-        </w:rPr>
-      </w:pPr>
-      <w:r>
-        <w:rPr>
-          <w:rFonts w:eastAsia="Times New Roman" w:cs="Times New Roman" w:ascii="Times New Roman" w:hAnsi="Times New Roman"/>
-          <w:b w:val="false"/>
-          <w:sz w:val="24"/>
-        </w:rPr>
-      </w:r>
-    </w:p>
-    <w:p>
-      <w:pPr>
-        <w:pStyle w:val="normal1"/>
-        <w:spacing w:lineRule="auto" w:line="360" w:before="0" w:after="120"/>
-        <w:ind w:firstLine="720" w:start="0"/>
-        <w:jc w:val="both"/>
-        <w:rPr>
-          <w:rFonts w:ascii="Times New Roman" w:hAnsi="Times New Roman" w:eastAsia="Times New Roman" w:cs="Times New Roman"/>
-          <w:b w:val="false"/>
-          <w:sz w:val="24"/>
-        </w:rPr>
-      </w:pPr>
-      <w:r>
-        <w:rPr>
-          <w:rFonts w:eastAsia="Times New Roman" w:cs="Times New Roman" w:ascii="Times New Roman" w:hAnsi="Times New Roman"/>
-          <w:b w:val="false"/>
-          <w:sz w:val="24"/>
-        </w:rPr>
-      </w:r>
-    </w:p>
-    <w:p>
-      <w:pPr>
-        <w:pStyle w:val="normal1"/>
-        <w:spacing w:lineRule="auto" w:line="360" w:before="0" w:after="120"/>
-        <w:ind w:firstLine="720" w:start="0"/>
-        <w:jc w:val="both"/>
-        <w:rPr>
-          <w:rFonts w:ascii="Times New Roman" w:hAnsi="Times New Roman" w:eastAsia="Times New Roman" w:cs="Times New Roman"/>
-          <w:b w:val="false"/>
-          <w:sz w:val="24"/>
-        </w:rPr>
-      </w:pPr>
-      <w:r>
-        <w:rPr>
-          <w:rFonts w:eastAsia="Times New Roman" w:cs="Times New Roman" w:ascii="Times New Roman" w:hAnsi="Times New Roman"/>
-          <w:b w:val="false"/>
-          <w:sz w:val="24"/>
-        </w:rPr>
-      </w:r>
-    </w:p>
-    <w:p>
-      <w:pPr>
-        <w:pStyle w:val="normal1"/>
-        <w:spacing w:lineRule="auto" w:line="360" w:before="0" w:after="120"/>
-        <w:ind w:firstLine="720" w:start="0"/>
-        <w:jc w:val="both"/>
-        <w:rPr>
-          <w:rFonts w:ascii="Times New Roman" w:hAnsi="Times New Roman" w:eastAsia="Times New Roman" w:cs="Times New Roman"/>
-          <w:b w:val="false"/>
-          <w:sz w:val="24"/>
-        </w:rPr>
-      </w:pPr>
-      <w:r>
-        <w:rPr>
-          <w:rFonts w:eastAsia="Times New Roman" w:cs="Times New Roman" w:ascii="Times New Roman" w:hAnsi="Times New Roman"/>
-          <w:b w:val="false"/>
-          <w:sz w:val="24"/>
-        </w:rPr>
-      </w:r>
-    </w:p>
-    <w:p>
-      <w:pPr>
-        <w:pStyle w:val="normal1"/>
-        <w:spacing w:lineRule="auto" w:line="360" w:before="0" w:after="120"/>
-        <w:ind w:firstLine="720" w:start="0"/>
-        <w:jc w:val="both"/>
-        <w:rPr>
-          <w:rFonts w:ascii="Times New Roman" w:hAnsi="Times New Roman" w:eastAsia="Times New Roman" w:cs="Times New Roman"/>
-          <w:b w:val="false"/>
-          <w:sz w:val="24"/>
-        </w:rPr>
-      </w:pPr>
-      <w:r>
-        <w:rPr>
-          <w:rFonts w:eastAsia="Times New Roman" w:cs="Times New Roman" w:ascii="Times New Roman" w:hAnsi="Times New Roman"/>
-          <w:b w:val="false"/>
-          <w:sz w:val="24"/>
-        </w:rPr>
-      </w:r>
-    </w:p>
-    <w:p>
-      <w:pPr>
-        <w:pStyle w:val="normal1"/>
-        <w:spacing w:lineRule="auto" w:line="360" w:before="0" w:after="120"/>
-        <w:ind w:firstLine="720" w:start="0"/>
-        <w:jc w:val="both"/>
-        <w:rPr>
-          <w:rFonts w:ascii="Times New Roman" w:hAnsi="Times New Roman" w:eastAsia="Times New Roman" w:cs="Times New Roman"/>
-          <w:b w:val="false"/>
-          <w:sz w:val="24"/>
-        </w:rPr>
-      </w:pPr>
-      <w:r>
-        <w:rPr>
-          <w:rFonts w:eastAsia="Times New Roman" w:cs="Times New Roman" w:ascii="Times New Roman" w:hAnsi="Times New Roman"/>
-          <w:b w:val="false"/>
-          <w:sz w:val="24"/>
-        </w:rPr>
-      </w:r>
-    </w:p>
-    <w:p>
-      <w:pPr>
-        <w:pStyle w:val="normal1"/>
-        <w:spacing w:lineRule="auto" w:line="360" w:before="0" w:after="120"/>
-        <w:ind w:firstLine="720" w:start="0"/>
-        <w:jc w:val="both"/>
-        <w:rPr>
-          <w:rFonts w:ascii="Times New Roman" w:hAnsi="Times New Roman" w:eastAsia="Times New Roman" w:cs="Times New Roman"/>
-          <w:b w:val="false"/>
-          <w:sz w:val="24"/>
-        </w:rPr>
-      </w:pPr>
-      <w:r>
-        <w:rPr>
-          <w:rFonts w:eastAsia="Times New Roman" w:cs="Times New Roman" w:ascii="Times New Roman" w:hAnsi="Times New Roman"/>
-          <w:b w:val="false"/>
-          <w:sz w:val="24"/>
-        </w:rPr>
-      </w:r>
-    </w:p>
-    <w:p>
-      <w:pPr>
-        <w:pStyle w:val="normal1"/>
-        <w:spacing w:lineRule="auto" w:line="360" w:before="0" w:after="120"/>
-        <w:ind w:firstLine="720" w:start="0"/>
-        <w:jc w:val="both"/>
-        <w:rPr>
-          <w:rFonts w:ascii="Times New Roman" w:hAnsi="Times New Roman" w:eastAsia="Times New Roman" w:cs="Times New Roman"/>
-          <w:b w:val="false"/>
-          <w:sz w:val="24"/>
-        </w:rPr>
-      </w:pPr>
-      <w:r>
-        <w:rPr>
-          <w:rFonts w:eastAsia="Times New Roman" w:cs="Times New Roman" w:ascii="Times New Roman" w:hAnsi="Times New Roman"/>
-          <w:b w:val="false"/>
-          <w:sz w:val="24"/>
-        </w:rPr>
-      </w:r>
-    </w:p>
-    <w:p>
-      <w:pPr>
-        <w:pStyle w:val="normal1"/>
-        <w:spacing w:lineRule="auto" w:line="360" w:before="0" w:after="120"/>
-        <w:ind w:firstLine="720" w:start="0"/>
-        <w:jc w:val="both"/>
-        <w:rPr>
-          <w:rFonts w:ascii="Times New Roman" w:hAnsi="Times New Roman" w:eastAsia="Times New Roman" w:cs="Times New Roman"/>
-          <w:b w:val="false"/>
-          <w:sz w:val="24"/>
-        </w:rPr>
-      </w:pPr>
-      <w:r>
-        <w:rPr>
-          <w:rFonts w:eastAsia="Times New Roman" w:cs="Times New Roman" w:ascii="Times New Roman" w:hAnsi="Times New Roman"/>
-          <w:b w:val="false"/>
-          <w:sz w:val="24"/>
-        </w:rPr>
-      </w:r>
-    </w:p>
-    <w:p>
-      <w:pPr>
-        <w:pStyle w:val="normal1"/>
-        <w:spacing w:lineRule="auto" w:line="360" w:before="0" w:after="120"/>
-        <w:ind w:firstLine="720" w:start="0"/>
-        <w:jc w:val="both"/>
-        <w:rPr>
-          <w:rFonts w:ascii="Times New Roman" w:hAnsi="Times New Roman" w:eastAsia="Times New Roman" w:cs="Times New Roman"/>
-          <w:b w:val="false"/>
-          <w:sz w:val="24"/>
-        </w:rPr>
-      </w:pPr>
-      <w:r>
-        <w:rPr>
-          <w:rFonts w:eastAsia="Times New Roman" w:cs="Times New Roman" w:ascii="Times New Roman" w:hAnsi="Times New Roman"/>
-          <w:b w:val="false"/>
-          <w:sz w:val="24"/>
-        </w:rPr>
-      </w:r>
-    </w:p>
-    <w:p>
-      <w:pPr>
-        <w:pStyle w:val="normal1"/>
-        <w:spacing w:lineRule="auto" w:line="360" w:before="0" w:after="120"/>
-        <w:ind w:firstLine="720" w:start="0"/>
-        <w:jc w:val="both"/>
-        <w:rPr>
-          <w:rFonts w:ascii="Times New Roman" w:hAnsi="Times New Roman" w:eastAsia="Times New Roman" w:cs="Times New Roman"/>
-          <w:b w:val="false"/>
-          <w:sz w:val="24"/>
-        </w:rPr>
-      </w:pPr>
-      <w:r>
-        <w:rPr>
-          <w:rFonts w:eastAsia="Times New Roman" w:cs="Times New Roman" w:ascii="Times New Roman" w:hAnsi="Times New Roman"/>
-          <w:b w:val="false"/>
-          <w:sz w:val="24"/>
-        </w:rPr>
-      </w:r>
       <w:r>
         <w:br w:type="page"/>
       </w:r>
@@ -17678,6 +15103,11 @@
       </w:r>
     </w:p>
     <w:p>
+      <w:r>
+        <w:br w:type="page"/>
+      </w:r>
+    </w:p>
+    <w:p>
       <w:pPr>
         <w:pStyle w:val="normal1"/>
         <w:spacing w:before="0" w:after="360"/>
@@ -17695,15 +15125,14 @@
     </w:p>
     <w:p>
       <w:pPr>
-        <w:pStyle w:val="normal1"/>
-        <w:spacing w:lineRule="auto" w:line="360" w:before="0" w:after="120"/>
-        <w:ind w:hanging="720" w:start="720"/>
-        <w:jc w:val="start"/>
-        <w:rPr/>
-      </w:pPr>
-      <w:r>
-        <w:rPr>
-          <w:rFonts w:eastAsia="Times New Roman" w:cs="Times New Roman" w:ascii="Times New Roman" w:hAnsi="Times New Roman"/>
+        <w:jc w:val="both"/>
+        <w:spacing w:line="360" w:lineRule="auto" w:after="120"/>
+        <w:ind w:hanging="720" w:left="720"/>
+      </w:pPr>
+      <w:r/>
+      <w:r>
+        <w:rPr>
+          <w:rFonts w:ascii="Times New Roman" w:hAnsi="Times New Roman"/>
           <w:sz w:val="24"/>
         </w:rPr>
         <w:t>Arias, F. (2012). El Proyecto de Investigación: Introducción a la Metodología Científica (6ta ed.). Editorial Episteme.</w:t>
@@ -17711,15 +15140,14 @@
     </w:p>
     <w:p>
       <w:pPr>
-        <w:pStyle w:val="normal1"/>
-        <w:spacing w:lineRule="auto" w:line="360" w:before="0" w:after="120"/>
-        <w:ind w:hanging="720" w:start="720"/>
-        <w:jc w:val="start"/>
-        <w:rPr/>
-      </w:pPr>
-      <w:r>
-        <w:rPr>
-          <w:rFonts w:eastAsia="Times New Roman" w:cs="Times New Roman" w:ascii="Times New Roman" w:hAnsi="Times New Roman"/>
+        <w:jc w:val="both"/>
+        <w:spacing w:line="360" w:lineRule="auto" w:after="120"/>
+        <w:ind w:hanging="720" w:left="720"/>
+      </w:pPr>
+      <w:r/>
+      <w:r>
+        <w:rPr>
+          <w:rFonts w:ascii="Times New Roman" w:hAnsi="Times New Roman"/>
           <w:sz w:val="24"/>
         </w:rPr>
         <w:t>Asamblea Nacional Constituyente. (1999). Constitución de la República Bolivariana de Venezuela. Gaceta Oficial de la República Bolivariana de Venezuela, 5.453 (Extraordinario), marzo 24, 2000.</w:t>
@@ -17727,15 +15155,14 @@
     </w:p>
     <w:p>
       <w:pPr>
-        <w:pStyle w:val="normal1"/>
-        <w:spacing w:lineRule="auto" w:line="360" w:before="0" w:after="120"/>
-        <w:ind w:hanging="720" w:start="720"/>
-        <w:jc w:val="start"/>
-        <w:rPr/>
-      </w:pPr>
-      <w:r>
-        <w:rPr>
-          <w:rFonts w:eastAsia="Times New Roman" w:cs="Times New Roman" w:ascii="Times New Roman" w:hAnsi="Times New Roman"/>
+        <w:jc w:val="both"/>
+        <w:spacing w:line="360" w:lineRule="auto" w:after="120"/>
+        <w:ind w:hanging="720" w:left="720"/>
+      </w:pPr>
+      <w:r/>
+      <w:r>
+        <w:rPr>
+          <w:rFonts w:ascii="Times New Roman" w:hAnsi="Times New Roman"/>
           <w:sz w:val="24"/>
         </w:rPr>
         <w:t>Asamblea Nacional de la República Bolivariana de Venezuela. (2001). Ley Especial Contra los Delitos Informáticos. Gaceta Oficial de la República Bolivariana de Venezuela, 37.313, octubre 30, 2001.</w:t>
@@ -17743,15 +15170,14 @@
     </w:p>
     <w:p>
       <w:pPr>
-        <w:pStyle w:val="normal1"/>
-        <w:spacing w:lineRule="auto" w:line="360" w:before="0" w:after="120"/>
-        <w:ind w:hanging="720" w:start="720"/>
-        <w:jc w:val="start"/>
-        <w:rPr/>
-      </w:pPr>
-      <w:r>
-        <w:rPr>
-          <w:rFonts w:eastAsia="Times New Roman" w:cs="Times New Roman" w:ascii="Times New Roman" w:hAnsi="Times New Roman"/>
+        <w:jc w:val="both"/>
+        <w:spacing w:line="360" w:lineRule="auto" w:after="120"/>
+        <w:ind w:hanging="720" w:left="720"/>
+      </w:pPr>
+      <w:r/>
+      <w:r>
+        <w:rPr>
+          <w:rFonts w:ascii="Times New Roman" w:hAnsi="Times New Roman"/>
           <w:sz w:val="24"/>
         </w:rPr>
         <w:t>Colina, J. (2024). Automatización de procesos de facturación y control de préstamos prendarios. Trabajo de Grado no publicado. Universidad Alejandro de Humboldt, Caracas.</w:t>
@@ -17759,15 +15185,14 @@
     </w:p>
     <w:p>
       <w:pPr>
-        <w:pStyle w:val="normal1"/>
-        <w:spacing w:lineRule="auto" w:line="360" w:before="0" w:after="120"/>
-        <w:ind w:hanging="720" w:start="720"/>
-        <w:jc w:val="start"/>
-        <w:rPr/>
-      </w:pPr>
-      <w:r>
-        <w:rPr>
-          <w:rFonts w:eastAsia="Times New Roman" w:cs="Times New Roman" w:ascii="Times New Roman" w:hAnsi="Times New Roman"/>
+        <w:jc w:val="both"/>
+        <w:spacing w:line="360" w:lineRule="auto" w:after="120"/>
+        <w:ind w:hanging="720" w:left="720"/>
+      </w:pPr>
+      <w:r/>
+      <w:r>
+        <w:rPr>
+          <w:rFonts w:ascii="Times New Roman" w:hAnsi="Times New Roman"/>
           <w:sz w:val="24"/>
         </w:rPr>
         <w:t>Congreso de la República de Venezuela. (1955). Código de Comercio. Gaceta Oficial de la República de Venezuela, 475 (Extraordinario), diciembre 21, 1955.</w:t>
@@ -17775,15 +15200,14 @@
     </w:p>
     <w:p>
       <w:pPr>
-        <w:pStyle w:val="normal1"/>
-        <w:spacing w:lineRule="auto" w:line="360" w:before="0" w:after="120"/>
-        <w:ind w:hanging="720" w:start="720"/>
-        <w:jc w:val="start"/>
-        <w:rPr/>
-      </w:pPr>
-      <w:r>
-        <w:rPr>
-          <w:rFonts w:eastAsia="Times New Roman" w:cs="Times New Roman" w:ascii="Times New Roman" w:hAnsi="Times New Roman"/>
+        <w:jc w:val="both"/>
+        <w:spacing w:line="360" w:lineRule="auto" w:after="120"/>
+        <w:ind w:hanging="720" w:left="720"/>
+      </w:pPr>
+      <w:r/>
+      <w:r>
+        <w:rPr>
+          <w:rFonts w:ascii="Times New Roman" w:hAnsi="Times New Roman"/>
           <w:sz w:val="24"/>
         </w:rPr>
         <w:t>Date, C. J. (2004). Introducción a los Sistemas de Bases de Datos (8va ed.). Pearson Educación.</w:t>
@@ -17791,15 +15215,14 @@
     </w:p>
     <w:p>
       <w:pPr>
-        <w:pStyle w:val="normal1"/>
-        <w:spacing w:lineRule="auto" w:line="360" w:before="0" w:after="120"/>
-        <w:ind w:hanging="720" w:start="720"/>
-        <w:jc w:val="start"/>
-        <w:rPr/>
-      </w:pPr>
-      <w:r>
-        <w:rPr>
-          <w:rFonts w:eastAsia="Times New Roman" w:cs="Times New Roman" w:ascii="Times New Roman" w:hAnsi="Times New Roman"/>
+        <w:jc w:val="both"/>
+        <w:spacing w:line="360" w:lineRule="auto" w:after="120"/>
+        <w:ind w:hanging="720" w:left="720"/>
+      </w:pPr>
+      <w:r/>
+      <w:r>
+        <w:rPr>
+          <w:rFonts w:ascii="Times New Roman" w:hAnsi="Times New Roman"/>
           <w:sz w:val="24"/>
         </w:rPr>
         <w:t>Kendall, K. E., y Kendall, J. E. (2011). Análisis y diseño de sistemas (8va ed.). Pearson Educación.</w:t>
@@ -17807,15 +15230,14 @@
     </w:p>
     <w:p>
       <w:pPr>
-        <w:pStyle w:val="normal1"/>
-        <w:spacing w:lineRule="auto" w:line="360" w:before="0" w:after="120"/>
-        <w:ind w:hanging="720" w:start="720"/>
-        <w:jc w:val="start"/>
-        <w:rPr/>
-      </w:pPr>
-      <w:r>
-        <w:rPr>
-          <w:rFonts w:eastAsia="Times New Roman" w:cs="Times New Roman" w:ascii="Times New Roman" w:hAnsi="Times New Roman"/>
+        <w:jc w:val="both"/>
+        <w:spacing w:line="360" w:lineRule="auto" w:after="120"/>
+        <w:ind w:hanging="720" w:left="720"/>
+      </w:pPr>
+      <w:r/>
+      <w:r>
+        <w:rPr>
+          <w:rFonts w:ascii="Times New Roman" w:hAnsi="Times New Roman"/>
           <w:sz w:val="24"/>
         </w:rPr>
         <w:t>Laudon, K., y Laudon, J. (2012). Sistemas de Información Gerencial (12da ed.). Pearson Educación.</w:t>
@@ -17823,15 +15245,14 @@
     </w:p>
     <w:p>
       <w:pPr>
-        <w:pStyle w:val="normal1"/>
-        <w:spacing w:lineRule="auto" w:line="360" w:before="0" w:after="120"/>
-        <w:ind w:hanging="720" w:start="720"/>
-        <w:jc w:val="start"/>
-        <w:rPr/>
-      </w:pPr>
-      <w:r>
-        <w:rPr>
-          <w:rFonts w:eastAsia="Times New Roman" w:cs="Times New Roman" w:ascii="Times New Roman" w:hAnsi="Times New Roman"/>
+        <w:jc w:val="both"/>
+        <w:spacing w:line="360" w:lineRule="auto" w:after="120"/>
+        <w:ind w:hanging="720" w:left="720"/>
+      </w:pPr>
+      <w:r/>
+      <w:r>
+        <w:rPr>
+          <w:rFonts w:ascii="Times New Roman" w:hAnsi="Times New Roman"/>
           <w:sz w:val="24"/>
         </w:rPr>
         <w:t>Martínez, A. (2025). Sistema de información para la gestión administrativa y control de inventarios. Trabajo de Grado no publicado. Colegio Universitario de Administración y Mercadeo, Extensión Caracas.</w:t>
@@ -17839,15 +15260,14 @@
     </w:p>
     <w:p>
       <w:pPr>
-        <w:pStyle w:val="normal1"/>
-        <w:spacing w:lineRule="auto" w:line="360" w:before="0" w:after="120"/>
-        <w:ind w:hanging="720" w:start="720"/>
-        <w:jc w:val="start"/>
-        <w:rPr/>
-      </w:pPr>
-      <w:r>
-        <w:rPr>
-          <w:rFonts w:eastAsia="Times New Roman" w:cs="Times New Roman" w:ascii="Times New Roman" w:hAnsi="Times New Roman"/>
+        <w:jc w:val="both"/>
+        <w:spacing w:line="360" w:lineRule="auto" w:after="120"/>
+        <w:ind w:hanging="720" w:left="720"/>
+      </w:pPr>
+      <w:r/>
+      <w:r>
+        <w:rPr>
+          <w:rFonts w:ascii="Times New Roman" w:hAnsi="Times New Roman"/>
           <w:sz w:val="24"/>
         </w:rPr>
         <w:t>Naranjo, E. (2023). Centralización de información en base de datos para empresas de custodia y empeño. Trabajo de Grado no publicado. Instituto Universitario de Tecnología de Administración Industrial, Caracas.</w:t>
@@ -17855,15 +15275,29 @@
     </w:p>
     <w:p>
       <w:pPr>
-        <w:pStyle w:val="normal1"/>
-        <w:spacing w:lineRule="auto" w:line="360" w:before="0" w:after="120"/>
-        <w:ind w:hanging="720" w:start="720"/>
-        <w:jc w:val="start"/>
-        <w:rPr/>
-      </w:pPr>
-      <w:r>
-        <w:rPr>
-          <w:rFonts w:eastAsia="Times New Roman" w:cs="Times New Roman" w:ascii="Times New Roman" w:hAnsi="Times New Roman"/>
+        <w:jc w:val="both"/>
+        <w:spacing w:line="360" w:lineRule="auto" w:after="120"/>
+        <w:ind w:hanging="720" w:left="720"/>
+      </w:pPr>
+      <w:r/>
+      <w:r>
+        <w:rPr>
+          <w:rFonts w:ascii="Times New Roman" w:hAnsi="Times New Roman"/>
+          <w:sz w:val="24"/>
+        </w:rPr>
+        <w:t>Presidencia de la República Bolivariana de Venezuela. (2015). Decreto con Rango, Valor y Fuerza de Ley que Reserva al Estado las Actividades de Exploración y Explotación del Oro y demás Minerales Estratégicos. Gaceta Oficial de la República Bolivariana de Venezuela, 6.210 (Extraordinario), diciembre 30, 2015.</w:t>
+      </w:r>
+    </w:p>
+    <w:p>
+      <w:pPr>
+        <w:jc w:val="both"/>
+        <w:spacing w:line="360" w:lineRule="auto" w:after="120"/>
+        <w:ind w:hanging="720" w:left="720"/>
+      </w:pPr>
+      <w:r/>
+      <w:r>
+        <w:rPr>
+          <w:rFonts w:ascii="Times New Roman" w:hAnsi="Times New Roman"/>
           <w:sz w:val="24"/>
         </w:rPr>
         <w:t>Presidencia de la República Bolivariana de Venezuela. (2026). Ley Orgánica de Minas. Gaceta Oficial de la República Bolivariana de Venezuela, 6.802 (Extraordinario), abril 15, 2026.</w:t>
@@ -17871,15 +15305,14 @@
     </w:p>
     <w:p>
       <w:pPr>
-        <w:pStyle w:val="normal1"/>
-        <w:spacing w:lineRule="auto" w:line="360" w:before="0" w:after="120"/>
-        <w:ind w:hanging="720" w:start="720"/>
-        <w:jc w:val="start"/>
-        <w:rPr/>
-      </w:pPr>
-      <w:r>
-        <w:rPr>
-          <w:rFonts w:eastAsia="Times New Roman" w:cs="Times New Roman" w:ascii="Times New Roman" w:hAnsi="Times New Roman"/>
+        <w:jc w:val="both"/>
+        <w:spacing w:line="360" w:lineRule="auto" w:after="120"/>
+        <w:ind w:hanging="720" w:left="720"/>
+      </w:pPr>
+      <w:r/>
+      <w:r>
+        <w:rPr>
+          <w:rFonts w:ascii="Times New Roman" w:hAnsi="Times New Roman"/>
           <w:sz w:val="24"/>
         </w:rPr>
         <w:t>Pressman, R. (2010). Ingeniería del Software: Un Enfoque Práctico (7ma ed.). McGraw-Hill.</w:t>
@@ -17887,286 +15320,22 @@
     </w:p>
     <w:p>
       <w:pPr>
-        <w:pStyle w:val="normal1"/>
-        <w:spacing w:lineRule="auto" w:line="360" w:before="0" w:after="120"/>
-        <w:ind w:hanging="720" w:start="720"/>
-        <w:jc w:val="start"/>
-        <w:rPr/>
-      </w:pPr>
-      <w:r>
-        <w:rPr>
-          <w:rFonts w:eastAsia="Times New Roman" w:cs="Times New Roman" w:ascii="Times New Roman" w:hAnsi="Times New Roman"/>
+        <w:jc w:val="both"/>
+        <w:spacing w:line="360" w:lineRule="auto" w:after="120"/>
+        <w:ind w:hanging="720" w:left="720"/>
+      </w:pPr>
+      <w:r/>
+      <w:r>
+        <w:rPr>
+          <w:rFonts w:ascii="Times New Roman" w:hAnsi="Times New Roman"/>
           <w:sz w:val="24"/>
         </w:rPr>
         <w:t>Universidad Pedagógica Experimental Libertador (UPEL). (2016). Manual de Trabajos de Grado de Especialización y Maestría y Tesis Doctorales (5ta ed.). FEDUPEL.</w:t>
       </w:r>
     </w:p>
     <w:p>
-      <w:pPr>
-        <w:pStyle w:val="normal1"/>
-        <w:spacing w:before="0" w:after="240"/>
-        <w:rPr/>
-      </w:pPr>
-      <w:r>
-        <w:rPr/>
-      </w:r>
-    </w:p>
-    <w:p>
-      <w:pPr>
-        <w:pStyle w:val="normal1"/>
-        <w:spacing w:before="0" w:after="240"/>
-        <w:rPr/>
-      </w:pPr>
-      <w:r>
-        <w:rPr/>
-      </w:r>
-    </w:p>
-    <w:p>
-      <w:pPr>
-        <w:pStyle w:val="normal1"/>
-        <w:spacing w:before="0" w:after="240"/>
-        <w:rPr/>
-      </w:pPr>
-      <w:r>
-        <w:rPr/>
-      </w:r>
-    </w:p>
-    <w:p>
-      <w:pPr>
-        <w:pStyle w:val="normal1"/>
-        <w:spacing w:before="0" w:after="240"/>
-        <w:rPr/>
-      </w:pPr>
-      <w:r>
-        <w:rPr/>
-      </w:r>
-    </w:p>
-    <w:p>
-      <w:pPr>
-        <w:pStyle w:val="normal1"/>
-        <w:spacing w:before="0" w:after="240"/>
-        <w:rPr/>
-      </w:pPr>
-      <w:r>
-        <w:rPr/>
-      </w:r>
-    </w:p>
-    <w:p>
-      <w:pPr>
-        <w:pStyle w:val="normal1"/>
-        <w:spacing w:before="0" w:after="240"/>
-        <w:rPr/>
-      </w:pPr>
-      <w:r>
-        <w:rPr/>
-      </w:r>
-    </w:p>
-    <w:p>
-      <w:pPr>
-        <w:pStyle w:val="normal1"/>
-        <w:spacing w:before="0" w:after="240"/>
-        <w:rPr/>
-      </w:pPr>
-      <w:r>
-        <w:rPr/>
-      </w:r>
-    </w:p>
-    <w:p>
-      <w:pPr>
-        <w:pStyle w:val="normal1"/>
-        <w:spacing w:lineRule="auto" w:line="360"/>
-        <w:rPr>
-          <w:rFonts w:ascii="Times New Roman" w:hAnsi="Times New Roman" w:eastAsia="Times New Roman" w:cs="Times New Roman"/>
-          <w:b/>
-          <w:bCs/>
-          <w:sz w:val="24"/>
-          <w:szCs w:val="24"/>
-        </w:rPr>
-      </w:pPr>
-      <w:r>
-        <w:rPr>
-          <w:rFonts w:eastAsia="Times New Roman" w:cs="Times New Roman" w:ascii="Times New Roman" w:hAnsi="Times New Roman"/>
-          <w:b/>
-          <w:bCs/>
-          <w:sz w:val="24"/>
-          <w:szCs w:val="24"/>
-        </w:rPr>
-      </w:r>
-    </w:p>
-    <w:p>
-      <w:pPr>
-        <w:pStyle w:val="normal1"/>
-        <w:spacing w:lineRule="auto" w:line="360"/>
-        <w:rPr>
-          <w:rFonts w:ascii="Times New Roman" w:hAnsi="Times New Roman" w:eastAsia="Times New Roman" w:cs="Times New Roman"/>
-          <w:b/>
-          <w:bCs/>
-          <w:sz w:val="24"/>
-          <w:szCs w:val="24"/>
-        </w:rPr>
-      </w:pPr>
-      <w:r>
-        <w:rPr>
-          <w:rFonts w:eastAsia="Times New Roman" w:cs="Times New Roman" w:ascii="Times New Roman" w:hAnsi="Times New Roman"/>
-          <w:b/>
-          <w:bCs/>
-          <w:sz w:val="24"/>
-          <w:szCs w:val="24"/>
-        </w:rPr>
-      </w:r>
-    </w:p>
-    <w:p>
-      <w:pPr>
-        <w:pStyle w:val="normal1"/>
-        <w:spacing w:lineRule="auto" w:line="360"/>
-        <w:rPr>
-          <w:rFonts w:ascii="Times New Roman" w:hAnsi="Times New Roman" w:eastAsia="Times New Roman" w:cs="Times New Roman"/>
-          <w:b/>
-          <w:bCs/>
-          <w:sz w:val="24"/>
-          <w:szCs w:val="24"/>
-        </w:rPr>
-      </w:pPr>
-      <w:r>
-        <w:rPr>
-          <w:rFonts w:eastAsia="Times New Roman" w:cs="Times New Roman" w:ascii="Times New Roman" w:hAnsi="Times New Roman"/>
-          <w:b/>
-          <w:bCs/>
-          <w:sz w:val="24"/>
-          <w:szCs w:val="24"/>
-        </w:rPr>
-      </w:r>
-    </w:p>
-    <w:p>
-      <w:pPr>
-        <w:pStyle w:val="normal1"/>
-        <w:spacing w:lineRule="auto" w:line="360"/>
-        <w:rPr>
-          <w:rFonts w:ascii="Times New Roman" w:hAnsi="Times New Roman" w:eastAsia="Times New Roman" w:cs="Times New Roman"/>
-          <w:b/>
-          <w:bCs/>
-          <w:sz w:val="24"/>
-          <w:szCs w:val="24"/>
-        </w:rPr>
-      </w:pPr>
-      <w:r>
-        <w:rPr>
-          <w:rFonts w:eastAsia="Times New Roman" w:cs="Times New Roman" w:ascii="Times New Roman" w:hAnsi="Times New Roman"/>
-          <w:b/>
-          <w:bCs/>
-          <w:sz w:val="24"/>
-          <w:szCs w:val="24"/>
-        </w:rPr>
-      </w:r>
-    </w:p>
-    <w:p>
-      <w:pPr>
-        <w:pStyle w:val="normal1"/>
-        <w:spacing w:lineRule="auto" w:line="360"/>
-        <w:rPr>
-          <w:rFonts w:ascii="Times New Roman" w:hAnsi="Times New Roman" w:eastAsia="Times New Roman" w:cs="Times New Roman"/>
-          <w:b/>
-          <w:bCs/>
-          <w:sz w:val="24"/>
-          <w:szCs w:val="24"/>
-        </w:rPr>
-      </w:pPr>
-      <w:r>
-        <w:rPr>
-          <w:rFonts w:eastAsia="Times New Roman" w:cs="Times New Roman" w:ascii="Times New Roman" w:hAnsi="Times New Roman"/>
-          <w:b/>
-          <w:bCs/>
-          <w:sz w:val="24"/>
-          <w:szCs w:val="24"/>
-        </w:rPr>
-      </w:r>
-    </w:p>
-    <w:p>
-      <w:pPr>
-        <w:pStyle w:val="normal1"/>
-        <w:spacing w:lineRule="auto" w:line="360"/>
-        <w:rPr>
-          <w:rFonts w:ascii="Times New Roman" w:hAnsi="Times New Roman" w:eastAsia="Times New Roman" w:cs="Times New Roman"/>
-          <w:b/>
-          <w:bCs/>
-          <w:sz w:val="24"/>
-          <w:szCs w:val="24"/>
-        </w:rPr>
-      </w:pPr>
-      <w:r>
-        <w:rPr>
-          <w:rFonts w:eastAsia="Times New Roman" w:cs="Times New Roman" w:ascii="Times New Roman" w:hAnsi="Times New Roman"/>
-          <w:b/>
-          <w:bCs/>
-          <w:sz w:val="24"/>
-          <w:szCs w:val="24"/>
-        </w:rPr>
-      </w:r>
-    </w:p>
-    <w:p>
-      <w:pPr>
-        <w:pStyle w:val="normal1"/>
-        <w:spacing w:lineRule="auto" w:line="360"/>
-        <w:rPr>
-          <w:rFonts w:ascii="Times New Roman" w:hAnsi="Times New Roman" w:eastAsia="Times New Roman" w:cs="Times New Roman"/>
-          <w:b/>
-          <w:bCs/>
-          <w:sz w:val="24"/>
-          <w:szCs w:val="24"/>
-        </w:rPr>
-      </w:pPr>
-      <w:r>
-        <w:rPr>
-          <w:rFonts w:eastAsia="Times New Roman" w:cs="Times New Roman" w:ascii="Times New Roman" w:hAnsi="Times New Roman"/>
-          <w:b/>
-          <w:bCs/>
-          <w:sz w:val="24"/>
-          <w:szCs w:val="24"/>
-        </w:rPr>
-      </w:r>
-    </w:p>
-    <w:p>
-      <w:pPr>
-        <w:pStyle w:val="normal1"/>
-        <w:spacing w:lineRule="auto" w:line="360"/>
-        <w:rPr>
-          <w:rFonts w:ascii="Times New Roman" w:hAnsi="Times New Roman" w:eastAsia="Times New Roman" w:cs="Times New Roman"/>
-          <w:b/>
-          <w:bCs/>
-          <w:sz w:val="24"/>
-          <w:szCs w:val="24"/>
-        </w:rPr>
-      </w:pPr>
-      <w:r>
-        <w:rPr>
-          <w:rFonts w:eastAsia="Times New Roman" w:cs="Times New Roman" w:ascii="Times New Roman" w:hAnsi="Times New Roman"/>
-          <w:b/>
-          <w:bCs/>
-          <w:sz w:val="24"/>
-          <w:szCs w:val="24"/>
-        </w:rPr>
-      </w:r>
-    </w:p>
-    <w:p>
-      <w:pPr>
-        <w:pStyle w:val="normal1"/>
-        <w:spacing w:lineRule="auto" w:line="360"/>
-        <w:rPr>
-          <w:rFonts w:ascii="Times New Roman" w:hAnsi="Times New Roman" w:eastAsia="Times New Roman" w:cs="Times New Roman"/>
-          <w:b/>
-          <w:bCs/>
-          <w:sz w:val="24"/>
-          <w:szCs w:val="24"/>
-        </w:rPr>
-      </w:pPr>
-      <w:r>
-        <w:rPr>
-          <w:rFonts w:eastAsia="Times New Roman" w:cs="Times New Roman" w:ascii="Times New Roman" w:hAnsi="Times New Roman"/>
-          <w:b/>
-          <w:bCs/>
-          <w:sz w:val="24"/>
-          <w:szCs w:val="24"/>
-        </w:rPr>
+      <w:r>
+        <w:br w:type="page"/>
       </w:r>
     </w:p>
     <w:p>
@@ -19899,24 +17068,8 @@
           <w:sz w:val="24"/>
         </w:rPr>
       </w:r>
-    </w:p>
-    <w:p>
-      <w:pPr>
-        <w:pStyle w:val="normal1"/>
-        <w:spacing w:before="0" w:after="160"/>
-        <w:jc w:val="center"/>
-        <w:rPr>
-          <w:rFonts w:ascii="Times New Roman" w:hAnsi="Times New Roman" w:eastAsia="Times New Roman" w:cs="Times New Roman"/>
-          <w:b/>
-          <w:sz w:val="24"/>
-        </w:rPr>
-      </w:pPr>
-      <w:r>
-        <w:rPr>
-          <w:rFonts w:eastAsia="Times New Roman" w:cs="Times New Roman" w:ascii="Times New Roman" w:hAnsi="Times New Roman"/>
-          <w:b/>
-          <w:sz w:val="24"/>
-        </w:rPr>
+      <w:r>
+        <w:br w:type="page"/>
       </w:r>
     </w:p>
     <w:p>

</xml_diff>

<commit_message>
fix(docs): relocate section break from introduction body to chapter boundary
</commit_message>
<xml_diff>
--- a/proyecto_de_grado/final.docx
+++ b/proyecto_de_grado/final.docx
@@ -2362,6 +2362,119 @@
         <w:spacing w:lineRule="auto" w:line="360"/>
         <w:ind w:firstLine="720"/>
         <w:rPr/>
+      </w:pPr>
+      <w:r>
+        <w:rPr>
+          <w:rFonts w:eastAsia="Times New Roman" w:cs="Times New Roman" w:ascii="Times New Roman" w:hAnsi="Times New Roman"/>
+          <w:sz w:val="24"/>
+          <w:szCs w:val="24"/>
+        </w:rPr>
+        <w:t>Con el fin de estructurar de forma coherente la fundamentación y factibilidad del sistema, este Trabajo de Grado se articula a través de las siguientes secciones capitulares:</w:t>
+      </w:r>
+    </w:p>
+    <w:p>
+      <w:pPr>
+        <w:pStyle w:val="normal1"/>
+        <w:spacing w:lineRule="auto" w:line="360"/>
+        <w:ind w:hanging="0" w:start="0"/>
+        <w:rPr/>
+      </w:pPr>
+      <w:r>
+        <w:rPr>
+          <w:rFonts w:eastAsia="Times New Roman" w:cs="Times New Roman" w:ascii="Times New Roman" w:hAnsi="Times New Roman"/>
+          <w:sz w:val="24"/>
+        </w:rPr>
+        <w:t xml:space="preserve">          </w:t>
+      </w:r>
+      <w:r>
+        <w:rPr>
+          <w:rFonts w:eastAsia="Times New Roman" w:cs="Times New Roman" w:ascii="Times New Roman" w:hAnsi="Times New Roman"/>
+          <w:sz w:val="24"/>
+          <w:szCs w:val="24"/>
+        </w:rPr>
+        <w:t>Capítulo I: El Problema, sección que aborda el diagnóstico situacional de la entidad, los cuestionamientos de la investigación, el objetivo general y las metas específicas para la automatización, junto con la justificación técnica que sustenta la viabilidad del estudio.</w:t>
+      </w:r>
+    </w:p>
+    <w:p>
+      <w:pPr>
+        <w:pStyle w:val="normal1"/>
+        <w:spacing w:lineRule="auto" w:line="360"/>
+        <w:ind w:firstLine="720"/>
+        <w:rPr/>
+      </w:pPr>
+      <w:r>
+        <w:rPr>
+          <w:rFonts w:eastAsia="Times New Roman" w:cs="Times New Roman" w:ascii="Times New Roman" w:hAnsi="Times New Roman"/>
+          <w:sz w:val="24"/>
+          <w:szCs w:val="24"/>
+        </w:rPr>
+        <w:t>Capítulo II: Corresponde al Marco Teórico, donde se recopilan los antecedentes referenciales, los conceptos de ingeniería informática y gestión de inventario, el marco legal venezolano y el esquema de operacionalización de las variables involucradas.</w:t>
+      </w:r>
+    </w:p>
+    <w:p>
+      <w:pPr>
+        <w:pStyle w:val="normal1"/>
+        <w:spacing w:lineRule="auto" w:line="360"/>
+        <w:ind w:firstLine="720"/>
+        <w:rPr/>
+      </w:pPr>
+      <w:r>
+        <w:rPr>
+          <w:rFonts w:eastAsia="Times New Roman" w:cs="Times New Roman" w:ascii="Times New Roman" w:hAnsi="Times New Roman"/>
+          <w:sz w:val="24"/>
+          <w:szCs w:val="24"/>
+        </w:rPr>
+        <w:t>Capítulo III: Define el Marco Metodológico, describiendo los enfoques descriptivos y de campo aplicados, la determinación de la muestra censal, los instrumentos de recolección, la validación técnica y los procedimientos de análisis estadístico utilizados.</w:t>
+      </w:r>
+    </w:p>
+    <w:p>
+      <w:pPr>
+        <w:pStyle w:val="normal1"/>
+        <w:spacing w:lineRule="auto" w:line="360"/>
+        <w:ind w:firstLine="720"/>
+        <w:rPr/>
+      </w:pPr>
+      <w:r>
+        <w:rPr>
+          <w:rFonts w:eastAsia="Times New Roman" w:cs="Times New Roman" w:ascii="Times New Roman" w:hAnsi="Times New Roman"/>
+          <w:sz w:val="24"/>
+          <w:szCs w:val="24"/>
+        </w:rPr>
+        <w:t>Capítulo IV: Análisis e Interpretación de Resultados, apartado dedicado a la exposición detallada de los hallazgos mediante tabulaciones y gráficos, contrastando la realidad técnica de la empresa con los postulados teóricos del área.</w:t>
+      </w:r>
+    </w:p>
+    <w:p>
+      <w:pPr>
+        <w:pStyle w:val="normal1"/>
+        <w:spacing w:lineRule="auto" w:line="360"/>
+        <w:ind w:firstLine="720"/>
+        <w:rPr/>
+      </w:pPr>
+      <w:r>
+        <w:rPr>
+          <w:rFonts w:eastAsia="Times New Roman" w:cs="Times New Roman" w:ascii="Times New Roman" w:hAnsi="Times New Roman"/>
+          <w:sz w:val="24"/>
+          <w:szCs w:val="24"/>
+        </w:rPr>
+        <w:t>Capítulo V: Contiene las Conclusiones y Recomendaciones, sintetizando los objetivos logrados y planteando las directrices necesarias para potenciar la eficiencia administrativa y la protección de datos en la organización.</w:t>
+      </w:r>
+    </w:p>
+    <w:p>
+      <w:pPr>
+        <w:pStyle w:val="normal1"/>
+        <w:spacing w:lineRule="auto" w:line="360"/>
+        <w:rPr/>
+      </w:pPr>
+      <w:r>
+        <w:rPr/>
+      </w:r>
+    </w:p>
+    <w:p>
+      <w:pPr>
+        <w:pStyle w:val="normal1"/>
+        <w:spacing w:lineRule="auto" w:line="360"/>
+        <w:ind w:firstLine="720"/>
+        <w:rPr/>
         <w:sectPr>
           <w:headerReference w:type="even" r:id="rId6"/>
           <w:headerReference w:type="default" r:id="rId7"/>
@@ -2384,145 +2497,7 @@
           <w:sz w:val="24"/>
           <w:szCs w:val="24"/>
         </w:rPr>
-        <w:t>Con el fin de estructurar de forma coherente la fundamentación y factibilidad del sistema, este Trabajo de Grado se articula a través de las siguientes secciones capitulares:</w:t>
-      </w:r>
-    </w:p>
-    <w:p>
-      <w:pPr>
-        <w:pStyle w:val="normal1"/>
-        <w:spacing w:lineRule="auto" w:line="360"/>
-        <w:ind w:hanging="0" w:start="0"/>
-        <w:rPr/>
-      </w:pPr>
-      <w:r>
-        <w:rPr>
-          <w:rFonts w:eastAsia="Times New Roman" w:cs="Times New Roman" w:ascii="Times New Roman" w:hAnsi="Times New Roman"/>
-          <w:sz w:val="24"/>
-        </w:rPr>
-        <w:t xml:space="preserve">          </w:t>
-      </w:r>
-      <w:r>
-        <w:rPr>
-          <w:rFonts w:eastAsia="Times New Roman" w:cs="Times New Roman" w:ascii="Times New Roman" w:hAnsi="Times New Roman"/>
-          <w:sz w:val="24"/>
-          <w:szCs w:val="24"/>
-        </w:rPr>
-        <w:t>Capítulo I: El Problema, sección que aborda el diagnóstico situacional de la entidad, los cuestionamientos de la investigación, el objetivo general y las metas específicas para la automatización, junto con la justificación técnica que sustenta la viabilidad del estudio.</w:t>
-      </w:r>
-    </w:p>
-    <w:p>
-      <w:pPr>
-        <w:pStyle w:val="normal1"/>
-        <w:spacing w:lineRule="auto" w:line="360"/>
-        <w:ind w:firstLine="720"/>
-        <w:rPr/>
-      </w:pPr>
-      <w:r>
-        <w:rPr>
-          <w:rFonts w:eastAsia="Times New Roman" w:cs="Times New Roman" w:ascii="Times New Roman" w:hAnsi="Times New Roman"/>
-          <w:sz w:val="24"/>
-          <w:szCs w:val="24"/>
-        </w:rPr>
-        <w:t>Capítulo II: Corresponde al Marco Teórico, donde se recopilan los antecedentes referenciales, los conceptos de ingeniería informática y gestión de inventario, el marco legal venezolano y el esquema de operacionalización de las variables involucradas.</w:t>
-      </w:r>
-    </w:p>
-    <w:p>
-      <w:pPr>
-        <w:pStyle w:val="normal1"/>
-        <w:spacing w:lineRule="auto" w:line="360"/>
-        <w:ind w:firstLine="720"/>
-        <w:rPr/>
-      </w:pPr>
-      <w:r>
-        <w:rPr>
-          <w:rFonts w:eastAsia="Times New Roman" w:cs="Times New Roman" w:ascii="Times New Roman" w:hAnsi="Times New Roman"/>
-          <w:sz w:val="24"/>
-          <w:szCs w:val="24"/>
-        </w:rPr>
-        <w:t>Capítulo III: Define el Marco Metodológico, describiendo los enfoques descriptivos y de campo aplicados, la determinación de la muestra censal, los instrumentos de recolección, la validación técnica y los procedimientos de análisis estadístico utilizados.</w:t>
-      </w:r>
-    </w:p>
-    <w:p>
-      <w:pPr>
-        <w:pStyle w:val="normal1"/>
-        <w:spacing w:lineRule="auto" w:line="360"/>
-        <w:ind w:firstLine="720"/>
-        <w:rPr/>
-      </w:pPr>
-      <w:r>
-        <w:rPr>
-          <w:rFonts w:eastAsia="Times New Roman" w:cs="Times New Roman" w:ascii="Times New Roman" w:hAnsi="Times New Roman"/>
-          <w:sz w:val="24"/>
-          <w:szCs w:val="24"/>
-        </w:rPr>
-        <w:t>Capítulo IV: Análisis e Interpretación de Resultados, apartado dedicado a la exposición detallada de los hallazgos mediante tabulaciones y gráficos, contrastando la realidad técnica de la empresa con los postulados teóricos del área.</w:t>
-      </w:r>
-    </w:p>
-    <w:p>
-      <w:pPr>
-        <w:pStyle w:val="normal1"/>
-        <w:spacing w:lineRule="auto" w:line="360"/>
-        <w:ind w:firstLine="720"/>
-        <w:rPr/>
-      </w:pPr>
-      <w:r>
-        <w:rPr>
-          <w:rFonts w:eastAsia="Times New Roman" w:cs="Times New Roman" w:ascii="Times New Roman" w:hAnsi="Times New Roman"/>
-          <w:sz w:val="24"/>
-          <w:szCs w:val="24"/>
-        </w:rPr>
-        <w:t>Capítulo V: Contiene las Conclusiones y Recomendaciones, sintetizando los objetivos logrados y planteando las directrices necesarias para potenciar la eficiencia administrativa y la protección de datos en la organización.</w:t>
-      </w:r>
-    </w:p>
-    <w:p>
-      <w:pPr>
-        <w:pStyle w:val="normal1"/>
-        <w:spacing w:lineRule="auto" w:line="360"/>
-        <w:rPr/>
-      </w:pPr>
-      <w:r>
-        <w:rPr/>
-      </w:r>
-    </w:p>
-    <w:p>
-      <w:pPr>
-        <w:pStyle w:val="normal1"/>
-        <w:spacing w:lineRule="auto" w:line="360"/>
-        <w:ind w:firstLine="720"/>
-        <w:rPr/>
-      </w:pPr>
-      <w:r>
-        <w:rPr>
-          <w:rFonts w:eastAsia="Times New Roman" w:cs="Times New Roman" w:ascii="Times New Roman" w:hAnsi="Times New Roman"/>
-          <w:sz w:val="24"/>
-          <w:szCs w:val="24"/>
-        </w:rPr>
         <w:t>Capítulo VI: La Propuesta, fase culminante donde se describe la arquitectura del software, detallando los requisitos, el diseño de la base de datos, los prototipos de interfaz y el estudio de factibilidad económica y operativa. Finalmente, se presentan las fuentes consultadas y los soportes de validación del proyecto.</w:t>
-      </w:r>
-    </w:p>
-    <w:p>
-      <w:pPr>
-        <w:pStyle w:val="normal1"/>
-        <w:spacing w:lineRule="auto" w:line="360"/>
-        <w:rPr>
-          <w:rFonts w:ascii="Times New Roman" w:hAnsi="Times New Roman" w:eastAsia="Times New Roman" w:cs="Times New Roman"/>
-          <w:b/>
-          <w:bCs/>
-          <w:sz w:val="24"/>
-          <w:szCs w:val="24"/>
-        </w:rPr>
-      </w:pPr>
-      <w:r>
-        <w:rPr>
-          <w:rFonts w:eastAsia="Times New Roman" w:cs="Times New Roman" w:ascii="Times New Roman" w:hAnsi="Times New Roman"/>
-          <w:b/>
-          <w:bCs/>
-          <w:sz w:val="24"/>
-          <w:szCs w:val="24"/>
-        </w:rPr>
-      </w:r>
-      <w:r>
-        <w:br w:type="page"/>
       </w:r>
     </w:p>
     <w:p>

</xml_diff>

<commit_message>
fix(docs): reformat Chapter IV charts as inline elements and synchronize indices
</commit_message>
<xml_diff>
--- a/proyecto_de_grado/final.docx
+++ b/proyecto_de_grado/final.docx
@@ -1063,11 +1063,104 @@
         <w:spacing w:line="280" w:after="20"/>
       </w:pPr>
       <w:r>
+        <w:t>Planteamiento del Problema  .......................................   1</w:t>
+      </w:r>
+    </w:p>
+    <w:p>
+      <w:pPr>
+        <w:spacing w:line="280" w:after="20"/>
+      </w:pPr>
+      <w:r>
+        <w:t>Interrogantes de la Investigación  ................................   2</w:t>
+      </w:r>
+    </w:p>
+    <w:p>
+      <w:pPr>
+        <w:spacing w:line="280" w:after="20"/>
+      </w:pPr>
+      <w:r>
+        <w:t>Objetivos de la Investigación  ....................................   2</w:t>
+      </w:r>
+    </w:p>
+    <w:p>
+      <w:pPr>
+        <w:spacing w:line="280" w:after="20"/>
+      </w:pPr>
+      <w:r>
+        <w:t>Objetivo General  .................................................   2</w:t>
+      </w:r>
+    </w:p>
+    <w:p>
+      <w:pPr>
+        <w:spacing w:line="280" w:after="20"/>
+      </w:pPr>
+      <w:r>
+        <w:t>Objetivos Específicos  ............................................   2</w:t>
+      </w:r>
+    </w:p>
+    <w:p>
+      <w:pPr>
+        <w:spacing w:line="280" w:after="20"/>
+      </w:pPr>
+      <w:r>
+        <w:t>Justificación de la Investigación  ................................   3</w:t>
+      </w:r>
+    </w:p>
+    <w:p>
+      <w:pPr>
+        <w:spacing w:line="280" w:after="20"/>
+      </w:pPr>
+      <w:r>
+        <w:rPr>
+          <w:rFonts w:ascii="Times New Roman" w:hAnsi="Times New Roman"/>
+          <w:b/>
+          <w:sz w:val="22"/>
+        </w:rPr>
+        <w:t>II. MARCO TEÓRICO</w:t>
+      </w:r>
+    </w:p>
+    <w:p>
+      <w:pPr>
+        <w:spacing w:line="280" w:after="20"/>
+      </w:pPr>
+      <w:r>
+        <w:t>Antecedentes de la Investigación  .................................   4</w:t>
+      </w:r>
+    </w:p>
+    <w:p>
+      <w:pPr>
+        <w:spacing w:line="280" w:after="20"/>
+      </w:pPr>
+      <w:r>
+        <w:t>Bases Teóricas  ...................................................   5</w:t>
+      </w:r>
+    </w:p>
+    <w:p>
+      <w:pPr>
+        <w:spacing w:line="280" w:after="20"/>
+      </w:pPr>
+      <w:r>
+        <w:t>Bases Legales  ...................................................   9</w:t>
+      </w:r>
+    </w:p>
+    <w:p>
+      <w:pPr>
+        <w:spacing w:line="280" w:after="20"/>
+      </w:pPr>
+      <w:r>
+        <w:t>Cuadro de Operacionalización de Variables  .......................   11</w:t>
+      </w:r>
+    </w:p>
+    <w:p>
+      <w:pPr>
+        <w:spacing w:line="280" w:after="20"/>
+      </w:pPr>
+      <w:r>
         <w:rPr>
           <w:rFonts w:ascii="Times New Roman" w:hAnsi="Times New Roman"/>
           <w:sz w:val="22"/>
         </w:rPr>
-        <w:t>Planteamiento del Problema  .......................................   2</w:t>
+        <w:t>Sistema de Variables  ............................................   13</w:t>
       </w:r>
     </w:p>
     <w:p>
@@ -1079,7 +1172,20 @@
           <w:rFonts w:ascii="Times New Roman" w:hAnsi="Times New Roman"/>
           <w:sz w:val="22"/>
         </w:rPr>
-        <w:t>Interrogantes de la Investigación  ................................   3</w:t>
+        <w:t>Definición de Términos Básicos  ..................................   13</w:t>
+      </w:r>
+    </w:p>
+    <w:p>
+      <w:pPr>
+        <w:spacing w:line="280" w:after="20"/>
+      </w:pPr>
+      <w:r>
+        <w:rPr>
+          <w:rFonts w:ascii="Times New Roman" w:hAnsi="Times New Roman"/>
+          <w:b/>
+          <w:sz w:val="22"/>
+        </w:rPr>
+        <w:t>III. MARCO METODOLÓGICO</w:t>
       </w:r>
     </w:p>
     <w:p>
@@ -1091,7 +1197,23 @@
           <w:rFonts w:ascii="Times New Roman" w:hAnsi="Times New Roman"/>
           <w:sz w:val="22"/>
         </w:rPr>
-        <w:t>Objetivos de la Investigación  ....................................   3</w:t>
+        <w:t>Tipo y Diseño de la Investigación  ...............................   15</w:t>
+      </w:r>
+    </w:p>
+    <w:p>
+      <w:pPr>
+        <w:spacing w:line="280" w:after="20"/>
+      </w:pPr>
+      <w:r>
+        <w:t>Fases del Proyecto Factible  .....................................   15</w:t>
+      </w:r>
+    </w:p>
+    <w:p>
+      <w:pPr>
+        <w:spacing w:line="280" w:after="20"/>
+      </w:pPr>
+      <w:r>
+        <w:t>Población y Muestra  .............................................   16</w:t>
       </w:r>
     </w:p>
     <w:p>
@@ -1103,7 +1225,7 @@
           <w:rFonts w:ascii="Times New Roman" w:hAnsi="Times New Roman"/>
           <w:sz w:val="22"/>
         </w:rPr>
-        <w:t>Objetivo General  .................................................   3</w:t>
+        <w:t>Técnicas de Recolección de Datos  ................................   17</w:t>
       </w:r>
     </w:p>
     <w:p>
@@ -1115,7 +1237,7 @@
           <w:rFonts w:ascii="Times New Roman" w:hAnsi="Times New Roman"/>
           <w:sz w:val="22"/>
         </w:rPr>
-        <w:t>Objetivos Específicos  ............................................   3</w:t>
+        <w:t>Instrumentos de Recolección de Datos  ............................   17</w:t>
       </w:r>
     </w:p>
     <w:p>
@@ -1127,20 +1249,7 @@
           <w:rFonts w:ascii="Times New Roman" w:hAnsi="Times New Roman"/>
           <w:sz w:val="22"/>
         </w:rPr>
-        <w:t>Justificación de la Investigación  ................................   4</w:t>
-      </w:r>
-    </w:p>
-    <w:p>
-      <w:pPr>
-        <w:spacing w:line="280" w:after="20"/>
-      </w:pPr>
-      <w:r>
-        <w:rPr>
-          <w:rFonts w:ascii="Times New Roman" w:hAnsi="Times New Roman"/>
-          <w:b/>
-          <w:sz w:val="22"/>
-        </w:rPr>
-        <w:t>II. MARCO TEÓRICO</w:t>
+        <w:t>Validez de los Instrumentos y Confiabilidad  .....................   17</w:t>
       </w:r>
     </w:p>
     <w:p>
@@ -1152,7 +1261,7 @@
           <w:rFonts w:ascii="Times New Roman" w:hAnsi="Times New Roman"/>
           <w:sz w:val="22"/>
         </w:rPr>
-        <w:t>Antecedentes de la Investigación  .................................   5</w:t>
+        <w:t>Técnica de Análisis de Datos  ....................................   19</w:t>
       </w:r>
     </w:p>
     <w:p>
@@ -1164,7 +1273,7 @@
           <w:rFonts w:ascii="Times New Roman" w:hAnsi="Times New Roman"/>
           <w:sz w:val="22"/>
         </w:rPr>
-        <w:t>Bases Teóricas  ...................................................   6</w:t>
+        <w:t>IV. ANÁLISIS E INTERPRETACIÓN DE LOS RESULTADOS  .................   20</w:t>
       </w:r>
     </w:p>
     <w:p>
@@ -1176,7 +1285,7 @@
           <w:rFonts w:ascii="Times New Roman" w:hAnsi="Times New Roman"/>
           <w:sz w:val="22"/>
         </w:rPr>
-        <w:t>Bases Legales  ...................................................   10</w:t>
+        <w:t>Tabulación, Graficación y Análisis de los Resultados  ............   20</w:t>
       </w:r>
     </w:p>
     <w:p>
@@ -1188,7 +1297,23 @@
           <w:rFonts w:ascii="Times New Roman" w:hAnsi="Times New Roman"/>
           <w:sz w:val="22"/>
         </w:rPr>
-        <w:t>Cuadro de Operacionalización de Variables  .......................   12</w:t>
+        <w:t>V.  CONCLUSIONES Y RECOMENDACIONES  ..............................   30</w:t>
+      </w:r>
+    </w:p>
+    <w:p>
+      <w:pPr>
+        <w:spacing w:line="280" w:after="20"/>
+      </w:pPr>
+      <w:r>
+        <w:t>Conclusiones  ....................................................   31</w:t>
+      </w:r>
+    </w:p>
+    <w:p>
+      <w:pPr>
+        <w:spacing w:line="280" w:after="20"/>
+      </w:pPr>
+      <w:r>
+        <w:t>Recomendaciones  ..................................................   32</w:t>
       </w:r>
     </w:p>
     <w:p>
@@ -1200,7 +1325,23 @@
           <w:rFonts w:ascii="Times New Roman" w:hAnsi="Times New Roman"/>
           <w:sz w:val="22"/>
         </w:rPr>
-        <w:t>Sistema de Variables  ............................................   13</w:t>
+        <w:t>VI. LA PROPUESTA  ................................................   32</w:t>
+      </w:r>
+    </w:p>
+    <w:p>
+      <w:pPr>
+        <w:spacing w:line="280" w:after="20"/>
+      </w:pPr>
+      <w:r>
+        <w:t>Justificación de la Propuesta  ...................................   35</w:t>
+      </w:r>
+    </w:p>
+    <w:p>
+      <w:pPr>
+        <w:spacing w:line="280" w:after="20"/>
+      </w:pPr>
+      <w:r>
+        <w:t>Objetivos de la Propuesta  .......................................   36</w:t>
       </w:r>
     </w:p>
     <w:p>
@@ -1212,7 +1353,7 @@
           <w:rFonts w:ascii="Times New Roman" w:hAnsi="Times New Roman"/>
           <w:sz w:val="22"/>
         </w:rPr>
-        <w:t>Definición de Términos Básicos  ..................................   13</w:t>
+        <w:t>Fundamentación Teórica, Técnica y Legal  ..........................   33</w:t>
       </w:r>
     </w:p>
     <w:p>
@@ -1220,12 +1361,7 @@
         <w:spacing w:line="280" w:after="20"/>
       </w:pPr>
       <w:r>
-        <w:rPr>
-          <w:rFonts w:ascii="Times New Roman" w:hAnsi="Times New Roman"/>
-          <w:b/>
-          <w:sz w:val="22"/>
-        </w:rPr>
-        <w:t>III. MARCO METODOLÓGICO</w:t>
+        <w:t>Estudio de Factibilidad  .........................................   38</w:t>
       </w:r>
     </w:p>
     <w:p>
@@ -1237,7 +1373,7 @@
           <w:rFonts w:ascii="Times New Roman" w:hAnsi="Times New Roman"/>
           <w:sz w:val="22"/>
         </w:rPr>
-        <w:t>Tipo y Diseño de la Investigación  ...............................   15</w:t>
+        <w:t>Estructura, Arquitectura y Modelo de Datos Relacional  ............   37</w:t>
       </w:r>
     </w:p>
     <w:p>
@@ -1249,7 +1385,7 @@
           <w:rFonts w:ascii="Times New Roman" w:hAnsi="Times New Roman"/>
           <w:sz w:val="22"/>
         </w:rPr>
-        <w:t>Fases del Proyecto Factible  ......................................   15</w:t>
+        <w:t>Diseño de Módulos y Manual de Operación para el Usuario  ..........   40</w:t>
       </w:r>
     </w:p>
     <w:p>
@@ -1257,215 +1393,7 @@
         <w:spacing w:line="280" w:after="20"/>
       </w:pPr>
       <w:r>
-        <w:rPr>
-          <w:rFonts w:ascii="Times New Roman" w:hAnsi="Times New Roman"/>
-          <w:sz w:val="22"/>
-        </w:rPr>
-        <w:t>Población y Muestra  .............................................   16</w:t>
-      </w:r>
-    </w:p>
-    <w:p>
-      <w:pPr>
-        <w:spacing w:line="280" w:after="20"/>
-      </w:pPr>
-      <w:r>
-        <w:rPr>
-          <w:rFonts w:ascii="Times New Roman" w:hAnsi="Times New Roman"/>
-          <w:sz w:val="22"/>
-        </w:rPr>
-        <w:t>Técnicas de Recolección de Datos  ................................   17</w:t>
-      </w:r>
-    </w:p>
-    <w:p>
-      <w:pPr>
-        <w:spacing w:line="280" w:after="20"/>
-      </w:pPr>
-      <w:r>
-        <w:rPr>
-          <w:rFonts w:ascii="Times New Roman" w:hAnsi="Times New Roman"/>
-          <w:sz w:val="22"/>
-        </w:rPr>
-        <w:t>Instrumentos de Recolección de Datos  ............................   17</w:t>
-      </w:r>
-    </w:p>
-    <w:p>
-      <w:pPr>
-        <w:spacing w:line="280" w:after="20"/>
-      </w:pPr>
-      <w:r>
-        <w:rPr>
-          <w:rFonts w:ascii="Times New Roman" w:hAnsi="Times New Roman"/>
-          <w:sz w:val="22"/>
-        </w:rPr>
-        <w:t>Validez de los Instrumentos y Confiabilidad  .....................   17</w:t>
-      </w:r>
-    </w:p>
-    <w:p>
-      <w:pPr>
-        <w:spacing w:line="280" w:after="20"/>
-      </w:pPr>
-      <w:r>
-        <w:rPr>
-          <w:rFonts w:ascii="Times New Roman" w:hAnsi="Times New Roman"/>
-          <w:sz w:val="22"/>
-        </w:rPr>
-        <w:t>Técnica de Análisis de Datos  ....................................   19</w:t>
-      </w:r>
-    </w:p>
-    <w:p>
-      <w:pPr>
-        <w:spacing w:line="280" w:after="20"/>
-      </w:pPr>
-      <w:r>
-        <w:rPr>
-          <w:rFonts w:ascii="Times New Roman" w:hAnsi="Times New Roman"/>
-          <w:sz w:val="22"/>
-        </w:rPr>
-        <w:t>IV. ANÁLISIS E INTERPRETACIÓN DE LOS RESULTADOS  .................   20</w:t>
-      </w:r>
-    </w:p>
-    <w:p>
-      <w:pPr>
-        <w:spacing w:line="280" w:after="20"/>
-      </w:pPr>
-      <w:r>
-        <w:rPr>
-          <w:rFonts w:ascii="Times New Roman" w:hAnsi="Times New Roman"/>
-          <w:sz w:val="22"/>
-        </w:rPr>
-        <w:t>Tabulación, Graficación y Análisis de los Resultados  ............   20</w:t>
-      </w:r>
-    </w:p>
-    <w:p>
-      <w:pPr>
-        <w:spacing w:line="280" w:after="20"/>
-      </w:pPr>
-      <w:r>
-        <w:rPr>
-          <w:rFonts w:ascii="Times New Roman" w:hAnsi="Times New Roman"/>
-          <w:sz w:val="22"/>
-        </w:rPr>
-        <w:t>V.  CONCLUSIONES Y RECOMENDACIONES  ..............................   30</w:t>
-      </w:r>
-    </w:p>
-    <w:p>
-      <w:pPr>
-        <w:spacing w:line="280" w:after="20"/>
-      </w:pPr>
-      <w:r>
-        <w:rPr>
-          <w:rFonts w:ascii="Times New Roman" w:hAnsi="Times New Roman"/>
-          <w:sz w:val="22"/>
-        </w:rPr>
-        <w:t>Conclusiones  .....................................................   30</w:t>
-      </w:r>
-    </w:p>
-    <w:p>
-      <w:pPr>
-        <w:spacing w:line="280" w:after="20"/>
-      </w:pPr>
-      <w:r>
-        <w:rPr>
-          <w:rFonts w:ascii="Times New Roman" w:hAnsi="Times New Roman"/>
-          <w:sz w:val="22"/>
-        </w:rPr>
-        <w:t>Recomendaciones  .................................................   31</w:t>
-      </w:r>
-    </w:p>
-    <w:p>
-      <w:pPr>
-        <w:spacing w:line="280" w:after="20"/>
-      </w:pPr>
-      <w:r>
-        <w:rPr>
-          <w:rFonts w:ascii="Times New Roman" w:hAnsi="Times New Roman"/>
-          <w:sz w:val="22"/>
-        </w:rPr>
-        <w:t>VI. LA PROPUESTA  ................................................   32</w:t>
-      </w:r>
-    </w:p>
-    <w:p>
-      <w:pPr>
-        <w:spacing w:line="280" w:after="20"/>
-      </w:pPr>
-      <w:r>
-        <w:rPr>
-          <w:rFonts w:ascii="Times New Roman" w:hAnsi="Times New Roman"/>
-          <w:sz w:val="22"/>
-        </w:rPr>
-        <w:t>Presentación y Justificación de la Propuesta  .....................   32</w:t>
-      </w:r>
-    </w:p>
-    <w:p>
-      <w:pPr>
-        <w:spacing w:line="280" w:after="20"/>
-      </w:pPr>
-      <w:r>
-        <w:rPr>
-          <w:rFonts w:ascii="Times New Roman" w:hAnsi="Times New Roman"/>
-          <w:sz w:val="22"/>
-        </w:rPr>
-        <w:t>Objetivos de la Propuesta  ........................................   33</w:t>
-      </w:r>
-    </w:p>
-    <w:p>
-      <w:pPr>
-        <w:spacing w:line="280" w:after="20"/>
-      </w:pPr>
-      <w:r>
-        <w:rPr>
-          <w:rFonts w:ascii="Times New Roman" w:hAnsi="Times New Roman"/>
-          <w:sz w:val="22"/>
-        </w:rPr>
-        <w:t>Fundamentación Teórica, Técnica y Legal  ..........................   33</w:t>
-      </w:r>
-    </w:p>
-    <w:p>
-      <w:pPr>
-        <w:spacing w:line="280" w:after="20"/>
-      </w:pPr>
-      <w:r>
-        <w:rPr>
-          <w:rFonts w:ascii="Times New Roman" w:hAnsi="Times New Roman"/>
-          <w:sz w:val="22"/>
-        </w:rPr>
-        <w:t>Estudio de Factibilidad (Mercado, Técnica y Económica)  ...........   34</w:t>
-      </w:r>
-    </w:p>
-    <w:p>
-      <w:pPr>
-        <w:spacing w:line="280" w:after="20"/>
-      </w:pPr>
-      <w:r>
-        <w:rPr>
-          <w:rFonts w:ascii="Times New Roman" w:hAnsi="Times New Roman"/>
-          <w:sz w:val="22"/>
-        </w:rPr>
-        <w:t>Estructura, Arquitectura y Modelo de Datos Relacional  ............   37</w:t>
-      </w:r>
-    </w:p>
-    <w:p>
-      <w:pPr>
-        <w:spacing w:line="280" w:after="20"/>
-      </w:pPr>
-      <w:r>
-        <w:rPr>
-          <w:rFonts w:ascii="Times New Roman" w:hAnsi="Times New Roman"/>
-          <w:sz w:val="22"/>
-        </w:rPr>
-        <w:t>Diseño de Módulos y Manual de Operación para el Usuario  ..........   40</w:t>
-      </w:r>
-    </w:p>
-    <w:p>
-      <w:pPr>
-        <w:spacing w:line="280" w:after="20"/>
-      </w:pPr>
-      <w:r>
-        <w:rPr>
-          <w:rFonts w:ascii="Times New Roman" w:hAnsi="Times New Roman"/>
-          <w:sz w:val="22"/>
-        </w:rPr>
-        <w:t>REFERENCIAS  .....................................................   44</w:t>
+        <w:t>REFERENCIAS  .....................................................   50</w:t>
       </w:r>
     </w:p>
     <w:p>
@@ -1584,14 +1512,7 @@
         <w:spacing w:line="360" w:lineRule="auto" w:after="80" w:before="0"/>
         <w:ind w:firstLine="0" w:left="0"/>
       </w:pPr>
-      <w:r/>
-      <w:r>
-        <w:rPr>
-          <w:rFonts w:ascii="Times New Roman" w:hAnsi="Times New Roman"/>
-          <w:b w:val="0"/>
-          <w:i w:val="0"/>
-          <w:sz w:val="24"/>
-        </w:rPr>
+      <w:r>
         <w:t>1  Eficiencia de la integración de datos en Excel ............................   20</w:t>
       </w:r>
     </w:p>
@@ -1601,15 +1522,8 @@
         <w:spacing w:line="360" w:lineRule="auto" w:after="80" w:before="0"/>
         <w:ind w:firstLine="0" w:left="0"/>
       </w:pPr>
-      <w:r/>
-      <w:r>
-        <w:rPr>
-          <w:rFonts w:ascii="Times New Roman" w:hAnsi="Times New Roman"/>
-          <w:b w:val="0"/>
-          <w:i w:val="0"/>
-          <w:sz w:val="24"/>
-        </w:rPr>
-        <w:t>2  Disponibilidad de un módulo centralizado de inventario de metales .........   21</w:t>
+      <w:r>
+        <w:t>2  Impacto del tiempo de respuesta en la productividad .......................   21</w:t>
       </w:r>
     </w:p>
     <w:p>
@@ -1618,15 +1532,8 @@
         <w:spacing w:line="360" w:lineRule="auto" w:after="80" w:before="0"/>
         <w:ind w:firstLine="0" w:left="0"/>
       </w:pPr>
-      <w:r/>
-      <w:r>
-        <w:rPr>
-          <w:rFonts w:ascii="Times New Roman" w:hAnsi="Times New Roman"/>
-          <w:b w:val="0"/>
-          <w:i w:val="0"/>
-          <w:sz w:val="24"/>
-        </w:rPr>
-        <w:t>3  Automatización del cálculo de fechas de vencimiento e intereses de empeño .....   23</w:t>
+      <w:r>
+        <w:t>3  Inconsistencias en cálculos de intereses y fechas .........................   23</w:t>
       </w:r>
     </w:p>
     <w:p>
@@ -1635,15 +1542,8 @@
         <w:spacing w:line="360" w:lineRule="auto" w:after="80" w:before="0"/>
         <w:ind w:firstLine="0" w:left="0"/>
       </w:pPr>
-      <w:r/>
-      <w:r>
-        <w:rPr>
-          <w:rFonts w:ascii="Times New Roman" w:hAnsi="Times New Roman"/>
-          <w:b w:val="0"/>
-          <w:i w:val="0"/>
-          <w:sz w:val="24"/>
-        </w:rPr>
-        <w:t>4  Existencia de mecanismos automatizados de respaldo para la información crítica .....   24</w:t>
+      <w:r>
+        <w:t>4  Mecanismos automatizados de respaldo de información .......................   24</w:t>
       </w:r>
     </w:p>
     <w:p>
@@ -1652,15 +1552,8 @@
         <w:spacing w:line="360" w:lineRule="auto" w:after="80" w:before="0"/>
         <w:ind w:firstLine="0" w:left="0"/>
       </w:pPr>
-      <w:r/>
-      <w:r>
-        <w:rPr>
-          <w:rFonts w:ascii="Times New Roman" w:hAnsi="Times New Roman"/>
-          <w:b w:val="0"/>
-          <w:i w:val="0"/>
-          <w:sz w:val="24"/>
-        </w:rPr>
-        <w:t>5  Requerimiento de una interfaz amigable e intuitiva adaptada al usuario final .....   25</w:t>
+      <w:r>
+        <w:t>5  Importancia de un sistema centralizado para trazabilidad ..................   26</w:t>
       </w:r>
     </w:p>
     <w:p>
@@ -1669,15 +1562,8 @@
         <w:spacing w:line="360" w:lineRule="auto" w:after="80" w:before="0"/>
         <w:ind w:firstLine="0" w:left="0"/>
       </w:pPr>
-      <w:r/>
-      <w:r>
-        <w:rPr>
-          <w:rFonts w:ascii="Times New Roman" w:hAnsi="Times New Roman"/>
-          <w:b w:val="0"/>
-          <w:i w:val="0"/>
-          <w:sz w:val="24"/>
-        </w:rPr>
-        <w:t>6  Registro y control de préstamos mediante roles y perfiles diferenciados .....   27</w:t>
+      <w:r>
+        <w:t>6  Necesidad de interfaces intuitivas ........................................   27</w:t>
       </w:r>
     </w:p>
     <w:p>
@@ -1686,15 +1572,8 @@
         <w:spacing w:line="360" w:lineRule="auto" w:after="80" w:before="0"/>
         <w:ind w:firstLine="0" w:left="0"/>
       </w:pPr>
-      <w:r/>
-      <w:r>
-        <w:rPr>
-          <w:rFonts w:ascii="Times New Roman" w:hAnsi="Times New Roman"/>
-          <w:b w:val="0"/>
-          <w:i w:val="0"/>
-          <w:sz w:val="24"/>
-        </w:rPr>
-        <w:t>7  Necesidad de reportes administrativos y financieros automáticos para la gerencia .....   28</w:t>
+      <w:r>
+        <w:t>7  Requerimiento de reportes administrativos automáticos .....................   28</w:t>
       </w:r>
     </w:p>
     <w:p>
@@ -1703,15 +1582,8 @@
         <w:spacing w:line="360" w:lineRule="auto" w:after="80" w:before="0"/>
         <w:ind w:firstLine="0" w:left="0"/>
       </w:pPr>
-      <w:r/>
-      <w:r>
-        <w:rPr>
-          <w:rFonts w:ascii="Times New Roman" w:hAnsi="Times New Roman"/>
-          <w:b w:val="0"/>
-          <w:i w:val="0"/>
-          <w:sz w:val="24"/>
-        </w:rPr>
-        <w:t>8  Importancia de la automatización de consultas operativas para optimizar el flujo de trabajo .....   29</w:t>
+      <w:r>
+        <w:t>8  Esencialidad de la automatización de consultas ............................   30</w:t>
       </w:r>
     </w:p>
     <w:p>
@@ -1720,15 +1592,8 @@
         <w:spacing w:line="360" w:lineRule="auto" w:after="80" w:before="0"/>
         <w:ind w:firstLine="0" w:left="0"/>
       </w:pPr>
-      <w:r/>
-      <w:r>
-        <w:rPr>
-          <w:rFonts w:ascii="Times New Roman" w:hAnsi="Times New Roman"/>
-          <w:b w:val="0"/>
-          <w:i w:val="0"/>
-          <w:sz w:val="24"/>
-        </w:rPr>
-        <w:t>9  Disponibilidad de Talento Humano ..........................................   34</w:t>
+      <w:r>
+        <w:t>9  Disponibilidad de Talento Humano ..........................................   39</w:t>
       </w:r>
     </w:p>
     <w:p>
@@ -1737,15 +1602,8 @@
         <w:spacing w:line="360" w:lineRule="auto" w:after="80" w:before="0"/>
         <w:ind w:firstLine="0" w:left="0"/>
       </w:pPr>
-      <w:r/>
-      <w:r>
-        <w:rPr>
-          <w:rFonts w:ascii="Times New Roman" w:hAnsi="Times New Roman"/>
-          <w:b w:val="0"/>
-          <w:i w:val="0"/>
-          <w:sz w:val="24"/>
-        </w:rPr>
-        <w:t>10  Recursos Materiales Requeridos ...........................................   35</w:t>
+      <w:r>
+        <w:t>10  Recursos Materiales Requeridos ...........................................   40</w:t>
       </w:r>
     </w:p>
     <w:p>
@@ -1754,15 +1612,8 @@
         <w:spacing w:line="360" w:lineRule="auto" w:after="80" w:before="0"/>
         <w:ind w:firstLine="0" w:left="0"/>
       </w:pPr>
-      <w:r/>
-      <w:r>
-        <w:rPr>
-          <w:rFonts w:ascii="Times New Roman" w:hAnsi="Times New Roman"/>
-          <w:b w:val="0"/>
-          <w:i w:val="0"/>
-          <w:sz w:val="24"/>
-        </w:rPr>
-        <w:t>11  Recursos Tecnológicos y de Conectividad ..................................   35</w:t>
+      <w:r>
+        <w:t>11  Recursos Tecnológicos y de Conectividad ..................................   40</w:t>
       </w:r>
     </w:p>
     <w:p>
@@ -1771,15 +1622,8 @@
         <w:spacing w:line="360" w:lineRule="auto" w:after="80" w:before="0"/>
         <w:ind w:firstLine="0" w:left="0"/>
       </w:pPr>
-      <w:r/>
-      <w:r>
-        <w:rPr>
-          <w:rFonts w:ascii="Times New Roman" w:hAnsi="Times New Roman"/>
-          <w:b w:val="0"/>
-          <w:i w:val="0"/>
-          <w:sz w:val="24"/>
-        </w:rPr>
-        <w:t>12  Estimación de Costos de la Propuesta Tecnológica .........................   36</w:t>
+      <w:r>
+        <w:t>12  Estimación de Costos de la Propuesta Tecnológica .........................   41</w:t>
       </w:r>
     </w:p>
     <w:p>
@@ -1843,15 +1687,8 @@
         <w:spacing w:line="360" w:lineRule="auto" w:after="80" w:before="0"/>
         <w:ind w:firstLine="0" w:left="0"/>
       </w:pPr>
-      <w:r/>
-      <w:r>
-        <w:rPr>
-          <w:rFonts w:ascii="Times New Roman" w:hAnsi="Times New Roman"/>
-          <w:b w:val="0"/>
-          <w:i w:val="0"/>
-          <w:sz w:val="24"/>
-        </w:rPr>
-        <w:t>1  Representación porcentual sobre la eficiencia de la integración de datos en Excel .....   20</w:t>
+      <w:r>
+        <w:t>1  Eficiencia de la integración de datos en Excel ............................   20</w:t>
       </w:r>
     </w:p>
     <w:p>
@@ -1860,15 +1697,8 @@
         <w:spacing w:line="360" w:lineRule="auto" w:after="80" w:before="0"/>
         <w:ind w:firstLine="0" w:left="0"/>
       </w:pPr>
-      <w:r/>
-      <w:r>
-        <w:rPr>
-          <w:rFonts w:ascii="Times New Roman" w:hAnsi="Times New Roman"/>
-          <w:b w:val="0"/>
-          <w:i w:val="0"/>
-          <w:sz w:val="24"/>
-        </w:rPr>
-        <w:t>2  Representación porcentual sobre la disponibilidad de un módulo centralizado de inventario .....   22</w:t>
+      <w:r>
+        <w:t>2  Impacto del tiempo de respuesta en la productividad .......................   22</w:t>
       </w:r>
     </w:p>
     <w:p>
@@ -1877,15 +1707,8 @@
         <w:spacing w:line="360" w:lineRule="auto" w:after="80" w:before="0"/>
         <w:ind w:firstLine="0" w:left="0"/>
       </w:pPr>
-      <w:r/>
-      <w:r>
-        <w:rPr>
-          <w:rFonts w:ascii="Times New Roman" w:hAnsi="Times New Roman"/>
-          <w:b w:val="0"/>
-          <w:i w:val="0"/>
-          <w:sz w:val="24"/>
-        </w:rPr>
-        <w:t>3  Representación porcentual sobre la automatización del cálculo de fechas e intereses .....   23</w:t>
+      <w:r>
+        <w:t>3  Inconsistencias en cálculos de intereses y fechas .........................   23</w:t>
       </w:r>
     </w:p>
     <w:p>
@@ -1894,15 +1717,8 @@
         <w:spacing w:line="360" w:lineRule="auto" w:after="80" w:before="0"/>
         <w:ind w:firstLine="0" w:left="0"/>
       </w:pPr>
-      <w:r/>
-      <w:r>
-        <w:rPr>
-          <w:rFonts w:ascii="Times New Roman" w:hAnsi="Times New Roman"/>
-          <w:b w:val="0"/>
-          <w:i w:val="0"/>
-          <w:sz w:val="24"/>
-        </w:rPr>
-        <w:t>4  Representación porcentual sobre la existencia de respaldos automatizados .....   24</w:t>
+      <w:r>
+        <w:t>4  Mecanismos automatizados de respaldo de información .......................   25</w:t>
       </w:r>
     </w:p>
     <w:p>
@@ -1911,15 +1727,8 @@
         <w:spacing w:line="360" w:lineRule="auto" w:after="80" w:before="0"/>
         <w:ind w:firstLine="0" w:left="0"/>
       </w:pPr>
-      <w:r/>
-      <w:r>
-        <w:rPr>
-          <w:rFonts w:ascii="Times New Roman" w:hAnsi="Times New Roman"/>
-          <w:b w:val="0"/>
-          <w:i w:val="0"/>
-          <w:sz w:val="24"/>
-        </w:rPr>
-        <w:t>5  Representación porcentual sobre el requerimiento de una interfaz amigable .....   26</w:t>
+      <w:r>
+        <w:t>5  Importancia de un sistema centralizado para trazabilidad ..................   26</w:t>
       </w:r>
     </w:p>
     <w:p>
@@ -1928,15 +1737,8 @@
         <w:spacing w:line="360" w:lineRule="auto" w:after="80" w:before="0"/>
         <w:ind w:firstLine="0" w:left="0"/>
       </w:pPr>
-      <w:r/>
-      <w:r>
-        <w:rPr>
-          <w:rFonts w:ascii="Times New Roman" w:hAnsi="Times New Roman"/>
-          <w:b w:val="0"/>
-          <w:i w:val="0"/>
-          <w:sz w:val="24"/>
-        </w:rPr>
-        <w:t>6  Representación porcentual sobre el registro mediante roles y perfiles diferenciados .....   27</w:t>
+      <w:r>
+        <w:t>6  Necesidad de interfaces intuitivas ........................................   27</w:t>
       </w:r>
     </w:p>
     <w:p>
@@ -1945,15 +1747,8 @@
         <w:spacing w:line="360" w:lineRule="auto" w:after="80" w:before="0"/>
         <w:ind w:firstLine="0" w:left="0"/>
       </w:pPr>
-      <w:r/>
-      <w:r>
-        <w:rPr>
-          <w:rFonts w:ascii="Times New Roman" w:hAnsi="Times New Roman"/>
-          <w:b w:val="0"/>
-          <w:i w:val="0"/>
-          <w:sz w:val="24"/>
-        </w:rPr>
-        <w:t>7  Representación porcentual sobre la necesidad de reportes administrativos y financieros .....   28</w:t>
+      <w:r>
+        <w:t>7  Requerimiento de reportes administrativos automáticos .....................   29</w:t>
       </w:r>
     </w:p>
     <w:p>
@@ -1962,15 +1757,8 @@
         <w:spacing w:line="360" w:lineRule="auto" w:after="80" w:before="0"/>
         <w:ind w:firstLine="0" w:left="0"/>
       </w:pPr>
-      <w:r/>
-      <w:r>
-        <w:rPr>
-          <w:rFonts w:ascii="Times New Roman" w:hAnsi="Times New Roman"/>
-          <w:b w:val="0"/>
-          <w:i w:val="0"/>
-          <w:sz w:val="24"/>
-        </w:rPr>
-        <w:t>8  Representación porcentual sobre la importancia de la automatización de consultas .....   29</w:t>
+      <w:r>
+        <w:t>8  Esencialidad de la automatización de consultas ............................   30</w:t>
       </w:r>
     </w:p>
     <w:p>
@@ -6283,16 +6071,16 @@
     <w:p>
       <w:pPr>
         <w:pStyle w:val="normal1"/>
-        <w:spacing w:lineRule="auto" w:line="360" w:before="0" w:after="120"/>
+        <w:spacing w:line="360" w:lineRule="auto" w:before="240" w:after="120"/>
         <w:ind w:hanging="0" w:start="0"/>
-        <w:jc w:val="start"/>
-        <w:rPr/>
-      </w:pPr>
-      <w:r>
-        <w:rPr>
-          <w:rFonts w:eastAsia="Times New Roman" w:cs="Times New Roman" w:ascii="Times New Roman" w:hAnsi="Times New Roman"/>
-          <w:b/>
-          <w:sz w:val="24"/>
+        <w:jc w:val="justify"/>
+        <w:keepNext/>
+      </w:pPr>
+      <w:r>
+        <w:rPr>
+          <w:rFonts w:ascii="Times New Roman" w:hAnsi="Times New Roman" w:cs="Times New Roman"/>
+          <w:sz w:val="24"/>
+          <w:b/>
         </w:rPr>
         <w:t>Ítem 1. ¿Considera que el estado actual de los archivos de Excel permite la integración y cruce eficiente de los datos de la empresa?</w:t>
       </w:r>
@@ -6300,19 +6088,28 @@
     <w:p>
       <w:pPr>
         <w:pStyle w:val="normal1"/>
-        <w:spacing w:lineRule="auto" w:line="360" w:before="0" w:after="120"/>
+        <w:spacing w:line="360" w:lineRule="auto" w:before="120" w:after="120"/>
         <w:ind w:hanging="0" w:start="0"/>
         <w:jc w:val="center"/>
-        <w:rPr/>
-      </w:pPr>
-      <w:r>
-        <w:rPr>
-          <w:rFonts w:eastAsia="Times New Roman" w:cs="Times New Roman" w:ascii="Times New Roman" w:hAnsi="Times New Roman"/>
-          <w:b w:val="false"/>
-          <w:sz w:val="24"/>
+        <w:keepNext/>
+      </w:pPr>
+      <w:r>
+        <w:rPr>
+          <w:rFonts w:ascii="Times New Roman" w:hAnsi="Times New Roman" w:cs="Times New Roman"/>
+          <w:sz w:val="24"/>
+          <w:b/>
         </w:rPr>
         <w:t>Cuadro 1</w:t>
+      </w:r>
+      <w:r>
         <w:br/>
+      </w:r>
+      <w:r>
+        <w:rPr>
+          <w:rFonts w:ascii="Times New Roman" w:hAnsi="Times New Roman" w:cs="Times New Roman"/>
+          <w:sz w:val="24"/>
+          <w:b/>
+        </w:rPr>
         <w:t>Eficiencia de la integración de datos en Excel</w:t>
       </w:r>
     </w:p>
@@ -6665,15 +6462,13 @@
     <w:p>
       <w:pPr>
         <w:pStyle w:val="normal1"/>
-        <w:spacing w:lineRule="auto" w:line="360" w:before="0" w:after="120"/>
+        <w:spacing w:line="360" w:lineRule="auto" w:before="40" w:after="160"/>
         <w:ind w:hanging="0" w:start="0"/>
-        <w:jc w:val="start"/>
-        <w:rPr/>
-      </w:pPr>
-      <w:r>
-        <w:rPr>
-          <w:rFonts w:eastAsia="Times New Roman" w:cs="Times New Roman" w:ascii="Times New Roman" w:hAnsi="Times New Roman"/>
-          <w:b w:val="false"/>
+        <w:jc w:val="left"/>
+      </w:pPr>
+      <w:r>
+        <w:rPr>
+          <w:rFonts w:ascii="Times New Roman" w:hAnsi="Times New Roman" w:cs="Times New Roman"/>
           <w:sz w:val="24"/>
         </w:rPr>
         <w:t>Fuente: Alvarado, L. (2026).</w:t>
@@ -6682,9 +6477,37 @@
     <w:p>
       <w:pPr>
         <w:pStyle w:val="normal1"/>
-        <w:spacing w:lineRule="auto" w:line="360" w:before="0" w:after="120"/>
+        <w:spacing w:line="360" w:lineRule="auto" w:before="160" w:after="80"/>
         <w:ind w:hanging="0" w:start="0"/>
         <w:jc w:val="center"/>
+        <w:keepNext/>
+      </w:pPr>
+      <w:r>
+        <w:rPr>
+          <w:rFonts w:ascii="Times New Roman" w:hAnsi="Times New Roman" w:cs="Times New Roman"/>
+          <w:sz w:val="24"/>
+          <w:b/>
+        </w:rPr>
+        <w:t>Gráfico 1</w:t>
+      </w:r>
+      <w:r>
+        <w:br/>
+      </w:r>
+      <w:r>
+        <w:rPr>
+          <w:rFonts w:ascii="Times New Roman" w:hAnsi="Times New Roman" w:cs="Times New Roman"/>
+          <w:sz w:val="24"/>
+          <w:b/>
+        </w:rPr>
+        <w:t>Eficiencia de la integración de datos en Excel</w:t>
+      </w:r>
+    </w:p>
+    <w:p>
+      <w:pPr>
+        <w:pStyle w:val="normal1"/>
+        <w:spacing w:lineRule="auto" w:line="360" w:before="80" w:after="40"/>
+        <w:ind w:hanging="0" w:start="0"/>
+        <w:jc w:val="center"/>
         <w:rPr>
           <w:rFonts w:ascii="Times New Roman" w:hAnsi="Times New Roman" w:eastAsia="Times New Roman" w:cs="Times New Roman"/>
           <w:b/>
@@ -6692,6 +6515,7 @@
           <w:iCs/>
           <w:sz w:val="24"/>
         </w:rPr>
+        <w:keepNext/>
       </w:pPr>
       <w:r>
         <w:rPr>
@@ -6702,24 +6526,16 @@
           <w:sz w:val="24"/>
         </w:rPr>
         <w:drawing>
-          <wp:anchor distT="0" distB="0" distL="0" distR="0" simplePos="0" relativeHeight="17" behindDoc="0" locked="0" layoutInCell="0" allowOverlap="1">
-            <wp:simplePos x="0" y="0"/>
-            <wp:positionH relativeFrom="column">
-              <wp:posOffset>782955</wp:posOffset>
-            </wp:positionH>
-            <wp:positionV relativeFrom="paragraph">
-              <wp:posOffset>38735</wp:posOffset>
-            </wp:positionV>
+          <wp:inline distT="0" distB="0" distL="0" distR="0">
             <wp:extent cx="3545205" cy="2532380"/>
             <wp:effectExtent l="0" t="0" r="0" b="0"/>
-            <wp:wrapSquare wrapText="largest"/>
             <wp:docPr id="4" name="Image1"/>
             <wp:cNvGraphicFramePr>
               <a:graphicFrameLocks xmlns:a="http://schemas.openxmlformats.org/drawingml/2006/main" noChangeAspect="1"/>
             </wp:cNvGraphicFramePr>
             <a:graphic xmlns:a="http://schemas.openxmlformats.org/drawingml/2006/main">
               <a:graphicData uri="http://schemas.openxmlformats.org/drawingml/2006/picture">
-                <pic:pic xmlns:pic="http://schemas.openxmlformats.org/drawingml/2006/picture">
+                <pic:pic>
                   <pic:nvPicPr>
                     <pic:cNvPr id="4" name="Image1"/>
                     <pic:cNvPicPr>
@@ -6745,47 +6561,38 @@
                 </pic:pic>
               </a:graphicData>
             </a:graphic>
-          </wp:anchor>
+          </wp:inline>
         </w:drawing>
       </w:r>
     </w:p>
     <w:p>
       <w:pPr>
         <w:pStyle w:val="normal1"/>
-        <w:spacing w:lineRule="auto" w:line="360" w:before="0" w:after="120"/>
+        <w:spacing w:line="360" w:lineRule="auto" w:before="40" w:after="160"/>
         <w:ind w:hanging="0" w:start="0"/>
-        <w:jc w:val="start"/>
-        <w:rPr>
-          <w:rFonts w:ascii="Times New Roman" w:hAnsi="Times New Roman" w:eastAsia="Times New Roman" w:cs="Times New Roman"/>
-          <w:b/>
-          <w:sz w:val="24"/>
-        </w:rPr>
-      </w:pPr>
-      <w:r>
-        <w:rPr>
-          <w:rFonts w:eastAsia="Times New Roman" w:cs="Times New Roman" w:ascii="Times New Roman" w:hAnsi="Times New Roman"/>
-          <w:b/>
-          <w:sz w:val="24"/>
-        </w:rPr>
-      </w:r>
-    </w:p>
-    <w:p>
-      <w:pPr>
-        <w:pStyle w:val="normal1"/>
-        <w:spacing w:lineRule="auto" w:line="360" w:before="0" w:after="120"/>
+        <w:jc w:val="left"/>
+      </w:pPr>
+      <w:r>
+        <w:rPr>
+          <w:rFonts w:ascii="Times New Roman" w:hAnsi="Times New Roman" w:cs="Times New Roman"/>
+          <w:sz w:val="24"/>
+        </w:rPr>
+        <w:t>Fuente: Alvarado, L. (2026).</w:t>
+      </w:r>
+    </w:p>
+    <w:p>
+      <w:pPr>
+        <w:pStyle w:val="normal1"/>
+        <w:spacing w:line="360" w:lineRule="auto" w:before="160" w:after="80"/>
         <w:ind w:hanging="0" w:start="0"/>
-        <w:jc w:val="start"/>
-        <w:rPr>
-          <w:rFonts w:ascii="Times New Roman" w:hAnsi="Times New Roman" w:eastAsia="Times New Roman" w:cs="Times New Roman"/>
-          <w:b/>
-          <w:sz w:val="24"/>
-        </w:rPr>
-      </w:pPr>
-      <w:r>
-        <w:rPr>
-          <w:rFonts w:eastAsia="Times New Roman" w:cs="Times New Roman" w:ascii="Times New Roman" w:hAnsi="Times New Roman"/>
-          <w:b/>
-          <w:sz w:val="24"/>
+        <w:jc w:val="left"/>
+        <w:keepNext/>
+      </w:pPr>
+      <w:r>
+        <w:rPr>
+          <w:rFonts w:ascii="Times New Roman" w:hAnsi="Times New Roman" w:cs="Times New Roman"/>
+          <w:sz w:val="24"/>
+          <w:b/>
         </w:rPr>
         <w:t>Análisis e Interpretación</w:t>
       </w:r>
@@ -6793,15 +6600,13 @@
     <w:p>
       <w:pPr>
         <w:pStyle w:val="normal1"/>
-        <w:spacing w:lineRule="auto" w:line="360" w:before="0" w:after="120"/>
-        <w:ind w:firstLine="720" w:start="0"/>
-        <w:jc w:val="both"/>
-        <w:rPr/>
-      </w:pPr>
-      <w:r>
-        <w:rPr>
-          <w:rFonts w:eastAsia="Times New Roman" w:cs="Times New Roman" w:ascii="Times New Roman" w:hAnsi="Times New Roman"/>
-          <w:b w:val="false"/>
+        <w:spacing w:line="360" w:lineRule="auto" w:before="0" w:after="120"/>
+        <w:ind w:hanging="0" w:firstLine="720"/>
+        <w:jc w:val="justify"/>
+      </w:pPr>
+      <w:r>
+        <w:rPr>
+          <w:rFonts w:ascii="Times New Roman" w:hAnsi="Times New Roman" w:cs="Times New Roman"/>
           <w:sz w:val="24"/>
         </w:rPr>
         <w:t>De acuerdo con los datos reflejados en el Cuadro 1, el 67% de la población encuestada (equivalente a dos empleados) considera que el estado actual de los archivos de Excel no permite una integración y cruce eficiente de los datos en la empresa Inversiones Más Por Tu Oro 17 C.A., mientras que el 33% restante (un empleado) considera que sí lo permite.</w:t>
@@ -6810,15 +6615,13 @@
     <w:p>
       <w:pPr>
         <w:pStyle w:val="normal1"/>
-        <w:spacing w:lineRule="auto" w:line="360" w:before="0" w:after="120"/>
-        <w:ind w:firstLine="720" w:start="0"/>
-        <w:jc w:val="both"/>
-        <w:rPr/>
-      </w:pPr>
-      <w:r>
-        <w:rPr>
-          <w:rFonts w:eastAsia="Times New Roman" w:cs="Times New Roman" w:ascii="Times New Roman" w:hAnsi="Times New Roman"/>
-          <w:b w:val="false"/>
+        <w:spacing w:line="360" w:lineRule="auto" w:before="0" w:after="240"/>
+        <w:ind w:hanging="0" w:firstLine="720"/>
+        <w:jc w:val="justify"/>
+      </w:pPr>
+      <w:r>
+        <w:rPr>
+          <w:rFonts w:ascii="Times New Roman" w:hAnsi="Times New Roman" w:cs="Times New Roman"/>
           <w:sz w:val="24"/>
         </w:rPr>
         <w:t>Estos resultados evidencian una clara deficiencia en el manejo de la información bajo la modalidad de registro manual actual. Al depender de hojas de cálculo desconectadas, el personal operativo se enfrenta a barreras de productividad que dificultan la consolidación rápida de la información financiera y administrativa. Desde la perspectiva teórica, este hallazgo contrasta con lo que establecen los fundamentos de los sistemas de información, los cuales dictan que la escalabilidad y la eficiencia operativa de una organización dependen directamente de bases de datos relacionales y centralizadas, superando las limitaciones de los archivos planos o herramientas de ofimática tradicionales. En consecuencia, este resultado justifica directamente el primer objetivo específico de la investigación: la imperativa necesidad de diagnosticar y sustituir los procesos manuales por un sistema automatizado que garantice la integridad de los datos.</w:t>
@@ -6827,16 +6630,16 @@
     <w:p>
       <w:pPr>
         <w:pStyle w:val="normal1"/>
-        <w:spacing w:lineRule="auto" w:line="360" w:before="0" w:after="120"/>
+        <w:spacing w:line="360" w:lineRule="auto" w:before="240" w:after="120"/>
         <w:ind w:hanging="0" w:start="0"/>
-        <w:jc w:val="start"/>
-        <w:rPr/>
-      </w:pPr>
-      <w:r>
-        <w:rPr>
-          <w:rFonts w:eastAsia="Times New Roman" w:cs="Times New Roman" w:ascii="Times New Roman" w:hAnsi="Times New Roman"/>
-          <w:b/>
-          <w:sz w:val="24"/>
+        <w:jc w:val="justify"/>
+        <w:keepNext/>
+      </w:pPr>
+      <w:r>
+        <w:rPr>
+          <w:rFonts w:ascii="Times New Roman" w:hAnsi="Times New Roman" w:cs="Times New Roman"/>
+          <w:sz w:val="24"/>
+          <w:b/>
         </w:rPr>
         <w:t>Ítem 2. ¿El tiempo de respuesta manual afecta la productividad?</w:t>
       </w:r>
@@ -6844,19 +6647,28 @@
     <w:p>
       <w:pPr>
         <w:pStyle w:val="normal1"/>
-        <w:spacing w:lineRule="auto" w:line="360" w:before="0" w:after="120"/>
+        <w:spacing w:line="360" w:lineRule="auto" w:before="120" w:after="120"/>
         <w:ind w:hanging="0" w:start="0"/>
         <w:jc w:val="center"/>
-        <w:rPr/>
-      </w:pPr>
-      <w:r>
-        <w:rPr>
-          <w:rFonts w:eastAsia="Times New Roman" w:cs="Times New Roman" w:ascii="Times New Roman" w:hAnsi="Times New Roman"/>
-          <w:b w:val="false"/>
-          <w:sz w:val="24"/>
+        <w:keepNext/>
+      </w:pPr>
+      <w:r>
+        <w:rPr>
+          <w:rFonts w:ascii="Times New Roman" w:hAnsi="Times New Roman" w:cs="Times New Roman"/>
+          <w:sz w:val="24"/>
+          <w:b/>
         </w:rPr>
         <w:t>Cuadro 2</w:t>
+      </w:r>
+      <w:r>
         <w:br/>
+      </w:r>
+      <w:r>
+        <w:rPr>
+          <w:rFonts w:ascii="Times New Roman" w:hAnsi="Times New Roman" w:cs="Times New Roman"/>
+          <w:sz w:val="24"/>
+          <w:b/>
+        </w:rPr>
         <w:t>Impacto del tiempo de respuesta en la productividad</w:t>
       </w:r>
     </w:p>
@@ -7209,15 +7021,13 @@
     <w:p>
       <w:pPr>
         <w:pStyle w:val="normal1"/>
-        <w:spacing w:lineRule="auto" w:line="360" w:before="0" w:after="120"/>
+        <w:spacing w:line="360" w:lineRule="auto" w:before="40" w:after="160"/>
         <w:ind w:hanging="0" w:start="0"/>
-        <w:jc w:val="start"/>
-        <w:rPr/>
-      </w:pPr>
-      <w:r>
-        <w:rPr>
-          <w:rFonts w:eastAsia="Times New Roman" w:cs="Times New Roman" w:ascii="Times New Roman" w:hAnsi="Times New Roman"/>
-          <w:b w:val="false"/>
+        <w:jc w:val="left"/>
+      </w:pPr>
+      <w:r>
+        <w:rPr>
+          <w:rFonts w:ascii="Times New Roman" w:hAnsi="Times New Roman" w:cs="Times New Roman"/>
           <w:sz w:val="24"/>
         </w:rPr>
         <w:t>Fuente: Alvarado, L. (2026).</w:t>
@@ -7226,14 +7036,43 @@
     <w:p>
       <w:pPr>
         <w:pStyle w:val="normal1"/>
-        <w:spacing w:lineRule="auto" w:line="360" w:before="0" w:after="120"/>
+        <w:spacing w:line="360" w:lineRule="auto" w:before="160" w:after="80"/>
         <w:ind w:hanging="0" w:start="0"/>
         <w:jc w:val="center"/>
+        <w:keepNext/>
+      </w:pPr>
+      <w:r>
+        <w:rPr>
+          <w:rFonts w:ascii="Times New Roman" w:hAnsi="Times New Roman" w:cs="Times New Roman"/>
+          <w:sz w:val="24"/>
+          <w:b/>
+        </w:rPr>
+        <w:t>Gráfico 2</w:t>
+      </w:r>
+      <w:r>
+        <w:br/>
+      </w:r>
+      <w:r>
+        <w:rPr>
+          <w:rFonts w:ascii="Times New Roman" w:hAnsi="Times New Roman" w:cs="Times New Roman"/>
+          <w:sz w:val="24"/>
+          <w:b/>
+        </w:rPr>
+        <w:t>Impacto del tiempo de respuesta en la productividad</w:t>
+      </w:r>
+    </w:p>
+    <w:p>
+      <w:pPr>
+        <w:pStyle w:val="normal1"/>
+        <w:spacing w:lineRule="auto" w:line="360" w:before="80" w:after="40"/>
+        <w:ind w:hanging="0" w:start="0"/>
+        <w:jc w:val="center"/>
         <w:rPr>
           <w:rFonts w:ascii="Times New Roman" w:hAnsi="Times New Roman" w:eastAsia="Times New Roman" w:cs="Times New Roman"/>
           <w:b/>
           <w:sz w:val="24"/>
         </w:rPr>
+        <w:keepNext/>
       </w:pPr>
       <w:r>
         <w:rPr>
@@ -7242,24 +7081,16 @@
           <w:sz w:val="24"/>
         </w:rPr>
         <w:drawing>
-          <wp:anchor distT="0" distB="0" distL="0" distR="0" simplePos="0" relativeHeight="18" behindDoc="0" locked="0" layoutInCell="0" allowOverlap="1">
-            <wp:simplePos x="0" y="0"/>
-            <wp:positionH relativeFrom="column">
-              <wp:align>center</wp:align>
-            </wp:positionH>
-            <wp:positionV relativeFrom="paragraph">
-              <wp:posOffset>635</wp:posOffset>
-            </wp:positionV>
+          <wp:inline distT="0" distB="0" distL="0" distR="0">
             <wp:extent cx="2964180" cy="2117090"/>
             <wp:effectExtent l="0" t="0" r="0" b="0"/>
-            <wp:wrapSquare wrapText="largest"/>
             <wp:docPr id="5" name="Image5"/>
             <wp:cNvGraphicFramePr>
               <a:graphicFrameLocks xmlns:a="http://schemas.openxmlformats.org/drawingml/2006/main" noChangeAspect="1"/>
             </wp:cNvGraphicFramePr>
             <a:graphic xmlns:a="http://schemas.openxmlformats.org/drawingml/2006/main">
               <a:graphicData uri="http://schemas.openxmlformats.org/drawingml/2006/picture">
-                <pic:pic xmlns:pic="http://schemas.openxmlformats.org/drawingml/2006/picture">
+                <pic:pic>
                   <pic:nvPicPr>
                     <pic:cNvPr id="5" name="Image5"/>
                     <pic:cNvPicPr>
@@ -7285,105 +7116,114 @@
                 </pic:pic>
               </a:graphicData>
             </a:graphic>
-          </wp:anchor>
+          </wp:inline>
         </w:drawing>
       </w:r>
     </w:p>
     <w:p>
       <w:pPr>
         <w:pStyle w:val="normal1"/>
-        <w:spacing w:lineRule="auto" w:line="360" w:before="0" w:after="120"/>
+        <w:spacing w:line="360" w:lineRule="auto" w:before="40" w:after="160"/>
+        <w:ind w:hanging="0" w:start="0"/>
+        <w:jc w:val="left"/>
+      </w:pPr>
+      <w:r>
+        <w:rPr>
+          <w:rFonts w:ascii="Times New Roman" w:hAnsi="Times New Roman" w:cs="Times New Roman"/>
+          <w:sz w:val="24"/>
+        </w:rPr>
+        <w:t>Fuente: Alvarado, L. (2026).</w:t>
+      </w:r>
+    </w:p>
+    <w:p>
+      <w:pPr>
+        <w:pStyle w:val="normal1"/>
+        <w:spacing w:line="360" w:lineRule="auto" w:before="160" w:after="80"/>
+        <w:ind w:hanging="0" w:start="0"/>
+        <w:jc w:val="left"/>
+        <w:keepNext/>
+      </w:pPr>
+      <w:r>
+        <w:rPr>
+          <w:rFonts w:ascii="Times New Roman" w:hAnsi="Times New Roman" w:cs="Times New Roman"/>
+          <w:sz w:val="24"/>
+          <w:b/>
+        </w:rPr>
+        <w:t>Análisis e Interpretación</w:t>
+      </w:r>
+    </w:p>
+    <w:p>
+      <w:pPr>
+        <w:pStyle w:val="normal1"/>
+        <w:spacing w:line="360" w:lineRule="auto" w:before="0" w:after="120"/>
+        <w:ind w:hanging="0" w:firstLine="720"/>
+        <w:jc w:val="justify"/>
+      </w:pPr>
+      <w:r>
+        <w:rPr>
+          <w:rFonts w:ascii="Times New Roman" w:hAnsi="Times New Roman" w:cs="Times New Roman"/>
+          <w:sz w:val="24"/>
+        </w:rPr>
+        <w:t>De acuerdo con los datos reflejados en el Cuadro 2, el 100% de la población encuestada considera que el tiempo de respuesta bajo la modalidad manual actual afecta negativamente la productividad diaria. Este resultado demuestra un consenso absoluto sobre los cuellos de botella generados por la dependencia de procesos no automatizados.</w:t>
+      </w:r>
+    </w:p>
+    <w:p>
+      <w:pPr>
+        <w:pStyle w:val="normal1"/>
+        <w:spacing w:line="360" w:lineRule="auto" w:before="0" w:after="240"/>
+        <w:ind w:hanging="0" w:firstLine="720"/>
+        <w:jc w:val="justify"/>
+      </w:pPr>
+      <w:r>
+        <w:rPr>
+          <w:rFonts w:ascii="Times New Roman" w:hAnsi="Times New Roman" w:cs="Times New Roman"/>
+          <w:sz w:val="24"/>
+        </w:rPr>
+        <w:t>Desde una perspectiva teórica, este hallazgo concuerda con lo expuesto por Kendall y Kendall (2011), quienes afirman que la automatización de procesos mediante sistemas de información es fundamental para agilizar las operaciones y eliminar las latencias inherentes a las tareas manuales. En el contexto de Inversiones Más Por Tu Oro 17 C.A., este resultado justifica la necesidad inminente de desarrollar módulos de atención y registro ágiles que maximicen la productividad de la gerencia y el personal operativo.</w:t>
+      </w:r>
+    </w:p>
+    <w:p>
+      <w:pPr>
+        <w:pStyle w:val="normal1"/>
+        <w:spacing w:line="360" w:lineRule="auto" w:before="240" w:after="120"/>
+        <w:ind w:hanging="0" w:start="0"/>
+        <w:jc w:val="justify"/>
+        <w:keepNext/>
+      </w:pPr>
+      <w:r>
+        <w:rPr>
+          <w:rFonts w:ascii="Times New Roman" w:hAnsi="Times New Roman" w:cs="Times New Roman"/>
+          <w:sz w:val="24"/>
+          <w:b/>
+        </w:rPr>
+        <w:t>Ítem 3. ¿Se han registrado discrepancias o inconsistencias en los cálculos de intereses y fechas de vencimiento bajo la modalidad manual?</w:t>
+      </w:r>
+    </w:p>
+    <w:p>
+      <w:pPr>
+        <w:pStyle w:val="normal1"/>
+        <w:spacing w:line="360" w:lineRule="auto" w:before="120" w:after="120"/>
         <w:ind w:hanging="0" w:start="0"/>
         <w:jc w:val="center"/>
-        <w:rPr>
-          <w:rFonts w:ascii="Times New Roman" w:hAnsi="Times New Roman" w:eastAsia="Times New Roman" w:cs="Times New Roman"/>
-          <w:b/>
-          <w:sz w:val="24"/>
-        </w:rPr>
-      </w:pPr>
-      <w:r>
-        <w:rPr>
-          <w:rFonts w:eastAsia="Times New Roman" w:cs="Times New Roman" w:ascii="Times New Roman" w:hAnsi="Times New Roman"/>
-          <w:b/>
-          <w:sz w:val="24"/>
-        </w:rPr>
-      </w:r>
-    </w:p>
-    <w:p>
-      <w:pPr>
-        <w:pStyle w:val="normal1"/>
-        <w:spacing w:lineRule="auto" w:line="360" w:before="0" w:after="120"/>
-        <w:ind w:hanging="0" w:start="0"/>
-        <w:jc w:val="start"/>
-        <w:rPr/>
-      </w:pPr>
-      <w:r>
-        <w:rPr>
-          <w:rFonts w:eastAsia="Times New Roman" w:cs="Times New Roman" w:ascii="Times New Roman" w:hAnsi="Times New Roman"/>
-          <w:b/>
-          <w:sz w:val="24"/>
-        </w:rPr>
-        <w:t>Análisis e Interpretación</w:t>
-      </w:r>
-    </w:p>
-    <w:p>
-      <w:pPr>
-        <w:pStyle w:val="normal1"/>
-        <w:spacing w:lineRule="auto" w:line="360" w:before="0" w:after="120"/>
-        <w:ind w:firstLine="720" w:start="0"/>
-        <w:jc w:val="both"/>
-        <w:rPr/>
-      </w:pPr>
-      <w:r>
-        <w:rPr>
-          <w:rFonts w:eastAsia="Times New Roman" w:cs="Times New Roman" w:ascii="Times New Roman" w:hAnsi="Times New Roman"/>
-          <w:b w:val="false"/>
-          <w:sz w:val="24"/>
-        </w:rPr>
-        <w:t>De acuerdo con los datos reflejados en el Cuadro 2, el 100% de la población encuestada considera que el tiempo de respuesta bajo la modalidad manual actual afecta negativamente la productividad diaria. Este resultado demuestra un consenso absoluto sobre los cuellos de botella generados por la dependencia de procesos no automatizados.</w:t>
-      </w:r>
-    </w:p>
-    <w:p>
-      <w:pPr>
-        <w:pStyle w:val="normal1"/>
-        <w:spacing w:lineRule="auto" w:line="360" w:before="0" w:after="120"/>
-        <w:ind w:firstLine="720" w:start="0"/>
-        <w:jc w:val="both"/>
-        <w:rPr/>
-      </w:pPr>
-      <w:r>
-        <w:rPr>
-          <w:rFonts w:eastAsia="Times New Roman" w:cs="Times New Roman" w:ascii="Times New Roman" w:hAnsi="Times New Roman"/>
-          <w:b w:val="false"/>
-          <w:sz w:val="24"/>
-        </w:rPr>
-        <w:t>Desde una perspectiva teórica, este hallazgo concuerda con lo expuesto por Kendall y Kendall (2011), quienes afirman que la automatización de procesos mediante sistemas de información es fundamental para agilizar las operaciones y eliminar las latencias inherentes a las tareas manuales. En el contexto de Inversiones Más Por Tu Oro 17 C.A., este resultado justifica la necesidad inminente de desarrollar módulos de atención y registro ágiles que maximicen la productividad de la gerencia y el personal operativo.</w:t>
-      </w:r>
-    </w:p>
-    <w:p>
-      <w:pPr>
-        <w:pStyle w:val="normal1"/>
-        <w:spacing w:lineRule="auto" w:line="360" w:before="0" w:after="120"/>
-        <w:ind w:hanging="0" w:start="0"/>
-        <w:jc w:val="start"/>
-        <w:rPr/>
-      </w:pPr>
-      <w:r>
-        <w:rPr>
-          <w:rFonts w:eastAsia="Times New Roman" w:cs="Times New Roman" w:ascii="Times New Roman" w:hAnsi="Times New Roman"/>
-          <w:b/>
-          <w:sz w:val="24"/>
-        </w:rPr>
-        <w:t>Ítem 3. ¿Se han registrado discrepancias o inconsistencias en los cálculos de intereses y fechas de vencimiento bajo la modalidad manual?</w:t>
-      </w:r>
-      <w:r>
-        <w:rPr>
-          <w:rFonts w:eastAsia="Times New Roman" w:cs="Times New Roman" w:ascii="Times New Roman" w:hAnsi="Times New Roman"/>
-          <w:b w:val="false"/>
-          <w:sz w:val="24"/>
+        <w:keepNext/>
+      </w:pPr>
+      <w:r>
+        <w:rPr>
+          <w:rFonts w:ascii="Times New Roman" w:hAnsi="Times New Roman" w:cs="Times New Roman"/>
+          <w:sz w:val="24"/>
+          <w:b/>
         </w:rPr>
         <w:t>Cuadro 3</w:t>
+      </w:r>
+      <w:r>
         <w:br/>
+      </w:r>
+      <w:r>
+        <w:rPr>
+          <w:rFonts w:ascii="Times New Roman" w:hAnsi="Times New Roman" w:cs="Times New Roman"/>
+          <w:sz w:val="24"/>
+          <w:b/>
+        </w:rPr>
         <w:t>Inconsistencias en cálculos de intereses y fechas</w:t>
       </w:r>
     </w:p>
@@ -7736,39 +7576,13 @@
     <w:p>
       <w:pPr>
         <w:pStyle w:val="normal1"/>
-        <w:spacing w:lineRule="auto" w:line="360" w:before="0" w:after="120"/>
+        <w:spacing w:line="360" w:lineRule="auto" w:before="40" w:after="160"/>
         <w:ind w:hanging="0" w:start="0"/>
-        <w:jc w:val="start"/>
-        <w:rPr>
-          <w:rFonts w:ascii="Times New Roman" w:hAnsi="Times New Roman" w:eastAsia="Times New Roman" w:cs="Times New Roman"/>
-          <w:b w:val="false"/>
-          <w:sz w:val="24"/>
-        </w:rPr>
-      </w:pPr>
-      <w:r>
-        <w:rPr>
-          <w:rFonts w:eastAsia="Times New Roman" w:cs="Times New Roman" w:ascii="Times New Roman" w:hAnsi="Times New Roman"/>
-          <w:b w:val="false"/>
-          <w:sz w:val="24"/>
-        </w:rPr>
-      </w:r>
-    </w:p>
-    <w:p>
-      <w:pPr>
-        <w:pStyle w:val="normal1"/>
-        <w:spacing w:lineRule="auto" w:line="360" w:before="0" w:after="120"/>
-        <w:ind w:hanging="0" w:start="0"/>
-        <w:jc w:val="start"/>
-        <w:rPr>
-          <w:rFonts w:ascii="Times New Roman" w:hAnsi="Times New Roman" w:eastAsia="Times New Roman" w:cs="Times New Roman"/>
-          <w:b w:val="false"/>
-          <w:sz w:val="24"/>
-        </w:rPr>
-      </w:pPr>
-      <w:r>
-        <w:rPr>
-          <w:rFonts w:eastAsia="Times New Roman" w:cs="Times New Roman" w:ascii="Times New Roman" w:hAnsi="Times New Roman"/>
-          <w:b w:val="false"/>
+        <w:jc w:val="left"/>
+      </w:pPr>
+      <w:r>
+        <w:rPr>
+          <w:rFonts w:ascii="Times New Roman" w:hAnsi="Times New Roman" w:cs="Times New Roman"/>
           <w:sz w:val="24"/>
         </w:rPr>
         <w:t>Fuente: Alvarado, L. (2026).</w:t>
@@ -7777,27 +7591,35 @@
     <w:p>
       <w:pPr>
         <w:pStyle w:val="normal1"/>
-        <w:spacing w:lineRule="auto" w:line="360" w:before="0" w:after="120"/>
+        <w:spacing w:line="360" w:lineRule="auto" w:before="160" w:after="80"/>
         <w:ind w:hanging="0" w:start="0"/>
         <w:jc w:val="center"/>
-        <w:rPr>
-          <w:rFonts w:ascii="Times New Roman" w:hAnsi="Times New Roman" w:eastAsia="Times New Roman" w:cs="Times New Roman"/>
-          <w:b/>
-          <w:sz w:val="24"/>
-        </w:rPr>
-      </w:pPr>
-      <w:r>
-        <w:rPr>
-          <w:rFonts w:eastAsia="Times New Roman" w:cs="Times New Roman" w:ascii="Times New Roman" w:hAnsi="Times New Roman"/>
-          <w:b/>
-          <w:sz w:val="24"/>
-        </w:rPr>
-      </w:r>
-    </w:p>
-    <w:p>
-      <w:pPr>
-        <w:pStyle w:val="normal1"/>
-        <w:spacing w:lineRule="auto" w:line="360" w:before="0" w:after="120"/>
+        <w:keepNext/>
+      </w:pPr>
+      <w:r>
+        <w:rPr>
+          <w:rFonts w:ascii="Times New Roman" w:hAnsi="Times New Roman" w:cs="Times New Roman"/>
+          <w:sz w:val="24"/>
+          <w:b/>
+        </w:rPr>
+        <w:t>Gráfico 3</w:t>
+      </w:r>
+      <w:r>
+        <w:br/>
+      </w:r>
+      <w:r>
+        <w:rPr>
+          <w:rFonts w:ascii="Times New Roman" w:hAnsi="Times New Roman" w:cs="Times New Roman"/>
+          <w:sz w:val="24"/>
+          <w:b/>
+        </w:rPr>
+        <w:t>Inconsistencias en cálculos de intereses y fechas</w:t>
+      </w:r>
+    </w:p>
+    <w:p>
+      <w:pPr>
+        <w:pStyle w:val="normal1"/>
+        <w:spacing w:lineRule="auto" w:line="360" w:before="80" w:after="40"/>
         <w:ind w:hanging="0" w:start="0"/>
         <w:jc w:val="center"/>
         <w:rPr>
@@ -7805,6 +7627,7 @@
           <w:b/>
           <w:sz w:val="24"/>
         </w:rPr>
+        <w:keepNext/>
       </w:pPr>
       <w:r>
         <w:rPr>
@@ -7813,24 +7636,16 @@
           <w:sz w:val="24"/>
         </w:rPr>
         <w:drawing>
-          <wp:anchor distT="0" distB="0" distL="0" distR="0" simplePos="0" relativeHeight="19" behindDoc="0" locked="0" layoutInCell="0" allowOverlap="1">
-            <wp:simplePos x="0" y="0"/>
-            <wp:positionH relativeFrom="column">
-              <wp:posOffset>902335</wp:posOffset>
-            </wp:positionH>
-            <wp:positionV relativeFrom="paragraph">
-              <wp:posOffset>37465</wp:posOffset>
-            </wp:positionV>
+          <wp:inline distT="0" distB="0" distL="0" distR="0">
             <wp:extent cx="3397250" cy="2426335"/>
             <wp:effectExtent l="0" t="0" r="0" b="0"/>
-            <wp:wrapSquare wrapText="largest"/>
             <wp:docPr id="6" name="Image6"/>
             <wp:cNvGraphicFramePr>
               <a:graphicFrameLocks xmlns:a="http://schemas.openxmlformats.org/drawingml/2006/main" noChangeAspect="1"/>
             </wp:cNvGraphicFramePr>
             <a:graphic xmlns:a="http://schemas.openxmlformats.org/drawingml/2006/main">
               <a:graphicData uri="http://schemas.openxmlformats.org/drawingml/2006/picture">
-                <pic:pic xmlns:pic="http://schemas.openxmlformats.org/drawingml/2006/picture">
+                <pic:pic>
                   <pic:nvPicPr>
                     <pic:cNvPr id="6" name="Image6"/>
                     <pic:cNvPicPr>
@@ -7856,142 +7671,114 @@
                 </pic:pic>
               </a:graphicData>
             </a:graphic>
-          </wp:anchor>
+          </wp:inline>
         </w:drawing>
       </w:r>
     </w:p>
     <w:p>
       <w:pPr>
         <w:pStyle w:val="normal1"/>
-        <w:spacing w:lineRule="auto" w:line="360" w:before="0" w:after="120"/>
+        <w:spacing w:line="360" w:lineRule="auto" w:before="40" w:after="160"/>
+        <w:ind w:hanging="0" w:start="0"/>
+        <w:jc w:val="left"/>
+      </w:pPr>
+      <w:r>
+        <w:rPr>
+          <w:rFonts w:ascii="Times New Roman" w:hAnsi="Times New Roman" w:cs="Times New Roman"/>
+          <w:sz w:val="24"/>
+        </w:rPr>
+        <w:t>Fuente: Alvarado, L. (2026).</w:t>
+      </w:r>
+    </w:p>
+    <w:p>
+      <w:pPr>
+        <w:pStyle w:val="normal1"/>
+        <w:spacing w:line="360" w:lineRule="auto" w:before="160" w:after="80"/>
+        <w:ind w:hanging="0" w:start="0"/>
+        <w:jc w:val="left"/>
+        <w:keepNext/>
+      </w:pPr>
+      <w:r>
+        <w:rPr>
+          <w:rFonts w:ascii="Times New Roman" w:hAnsi="Times New Roman" w:cs="Times New Roman"/>
+          <w:sz w:val="24"/>
+          <w:b/>
+        </w:rPr>
+        <w:t>Análisis e Interpretación</w:t>
+      </w:r>
+    </w:p>
+    <w:p>
+      <w:pPr>
+        <w:pStyle w:val="normal1"/>
+        <w:spacing w:line="360" w:lineRule="auto" w:before="0" w:after="120"/>
+        <w:ind w:hanging="0" w:firstLine="720"/>
+        <w:jc w:val="justify"/>
+      </w:pPr>
+      <w:r>
+        <w:rPr>
+          <w:rFonts w:ascii="Times New Roman" w:hAnsi="Times New Roman" w:cs="Times New Roman"/>
+          <w:sz w:val="24"/>
+        </w:rPr>
+        <w:t>El Cuadro 3 muestra que la totalidad de los encuestados (100%) ha registrado discrepancias o inconsistencias en los cálculos de intereses y fechas de vencimiento al utilizar el modelo de trabajo actual. Esta homogeneidad en las respuestas subraya una vulnerabilidad crítica en la exactitud financiera de la empresa.</w:t>
+      </w:r>
+    </w:p>
+    <w:p>
+      <w:pPr>
+        <w:pStyle w:val="normal1"/>
+        <w:spacing w:line="360" w:lineRule="auto" w:before="0" w:after="240"/>
+        <w:ind w:hanging="0" w:firstLine="720"/>
+        <w:jc w:val="justify"/>
+      </w:pPr>
+      <w:r>
+        <w:rPr>
+          <w:rFonts w:ascii="Times New Roman" w:hAnsi="Times New Roman" w:cs="Times New Roman"/>
+          <w:sz w:val="24"/>
+        </w:rPr>
+        <w:t>Como señala Date (2004), los sistemas de bases de datos relacionales son esenciales para garantizar la consistencia y la integridad referencial de la información, previniendo los errores de cálculo humano y la sobreescritura accidental. Para el control de préstamos prendarios, donde la precisión de las tasas de interés es vital, la ausencia de un algoritmo de cálculo automatizado representa un riesgo operativo que el nuevo sistema propuesto logrará mitigar estructuralmente.</w:t>
+      </w:r>
+    </w:p>
+    <w:p>
+      <w:pPr>
+        <w:pStyle w:val="normal1"/>
+        <w:spacing w:line="360" w:lineRule="auto" w:before="240" w:after="120"/>
+        <w:ind w:hanging="0" w:start="0"/>
+        <w:jc w:val="justify"/>
+        <w:keepNext/>
+      </w:pPr>
+      <w:r>
+        <w:rPr>
+          <w:rFonts w:ascii="Times New Roman" w:hAnsi="Times New Roman" w:cs="Times New Roman"/>
+          <w:sz w:val="24"/>
+          <w:b/>
+        </w:rPr>
+        <w:t>Ítem 4. ¿Dispone la empresa de mecanismos automatizados de respaldo para proteger la información frente a fallos del sistema o sobreescrituras?</w:t>
+      </w:r>
+    </w:p>
+    <w:p>
+      <w:pPr>
+        <w:pStyle w:val="normal1"/>
+        <w:spacing w:line="360" w:lineRule="auto" w:before="120" w:after="120"/>
         <w:ind w:hanging="0" w:start="0"/>
         <w:jc w:val="center"/>
-        <w:rPr>
-          <w:rFonts w:ascii="Times New Roman" w:hAnsi="Times New Roman" w:eastAsia="Times New Roman" w:cs="Times New Roman"/>
-          <w:b/>
-          <w:sz w:val="24"/>
-        </w:rPr>
-      </w:pPr>
-      <w:r>
-        <w:rPr>
-          <w:rFonts w:eastAsia="Times New Roman" w:cs="Times New Roman" w:ascii="Times New Roman" w:hAnsi="Times New Roman"/>
-          <w:b/>
-          <w:sz w:val="24"/>
-        </w:rPr>
-      </w:r>
-    </w:p>
-    <w:p>
-      <w:pPr>
-        <w:pStyle w:val="normal1"/>
-        <w:spacing w:lineRule="auto" w:line="360" w:before="0" w:after="120"/>
-        <w:ind w:hanging="0" w:start="0"/>
-        <w:jc w:val="start"/>
-        <w:rPr/>
-      </w:pPr>
-      <w:r>
-        <w:rPr>
-          <w:rFonts w:eastAsia="Times New Roman" w:cs="Times New Roman" w:ascii="Times New Roman" w:hAnsi="Times New Roman"/>
-          <w:b/>
-          <w:sz w:val="24"/>
-        </w:rPr>
-        <w:t>Análisis e Interpretación</w:t>
-      </w:r>
-    </w:p>
-    <w:p>
-      <w:pPr>
-        <w:pStyle w:val="normal1"/>
-        <w:spacing w:lineRule="auto" w:line="360" w:before="0" w:after="120"/>
-        <w:ind w:firstLine="720" w:start="0"/>
-        <w:jc w:val="both"/>
-        <w:rPr/>
-      </w:pPr>
-      <w:r>
-        <w:rPr>
-          <w:rFonts w:eastAsia="Times New Roman" w:cs="Times New Roman" w:ascii="Times New Roman" w:hAnsi="Times New Roman"/>
-          <w:b w:val="false"/>
-          <w:sz w:val="24"/>
-        </w:rPr>
-        <w:t>El Cuadro 3 muestra que la totalidad de los encuestados (100%) ha registrado discrepancias o inconsistencias en los cálculos de intereses y fechas de vencimiento al utilizar el modelo de trabajo actual. Esta homogeneidad en las respuestas subraya una vulnerabilidad crítica en la exactitud financiera de la empresa.</w:t>
-      </w:r>
-    </w:p>
-    <w:p>
-      <w:pPr>
-        <w:pStyle w:val="normal1"/>
-        <w:spacing w:lineRule="auto" w:line="360" w:before="0" w:after="120"/>
-        <w:ind w:firstLine="720" w:start="0"/>
-        <w:jc w:val="both"/>
-        <w:rPr>
-          <w:rFonts w:ascii="Times New Roman" w:hAnsi="Times New Roman" w:eastAsia="Times New Roman" w:cs="Times New Roman"/>
-          <w:b w:val="false"/>
-          <w:sz w:val="24"/>
-        </w:rPr>
-      </w:pPr>
-      <w:r>
-        <w:rPr>
-          <w:rFonts w:eastAsia="Times New Roman" w:cs="Times New Roman" w:ascii="Times New Roman" w:hAnsi="Times New Roman"/>
-          <w:b w:val="false"/>
-          <w:sz w:val="24"/>
-        </w:rPr>
-        <w:t>Como señala Date (2004), los sistemas de bases de datos relacionales son esenciales para garantizar la consistencia y la integridad referencial de la información, previniendo los errores de cálculo humano y la sobreescritura accidental. Para el control de préstamos prendarios, donde la precisión de las tasas de interés es vital, la ausencia de un algoritmo de cálculo automatizado representa un riesgo operativo que el nuevo sistema propuesto logrará mitigar estructuralmente.</w:t>
-      </w:r>
-    </w:p>
-    <w:p>
-      <w:pPr>
-        <w:pStyle w:val="normal1"/>
-        <w:spacing w:lineRule="auto" w:line="360" w:before="0" w:after="120"/>
-        <w:ind w:firstLine="720" w:start="0"/>
-        <w:jc w:val="both"/>
-        <w:rPr>
-          <w:rFonts w:ascii="Times New Roman" w:hAnsi="Times New Roman" w:eastAsia="Times New Roman" w:cs="Times New Roman"/>
-          <w:b w:val="false"/>
-          <w:sz w:val="24"/>
-        </w:rPr>
-      </w:pPr>
-      <w:r>
-        <w:rPr>
-          <w:rFonts w:eastAsia="Times New Roman" w:cs="Times New Roman" w:ascii="Times New Roman" w:hAnsi="Times New Roman"/>
-          <w:b w:val="false"/>
-          <w:sz w:val="24"/>
-        </w:rPr>
-      </w:r>
-    </w:p>
-    <w:p>
-      <w:pPr>
-        <w:pStyle w:val="normal1"/>
-        <w:spacing w:lineRule="auto" w:line="360" w:before="0" w:after="120"/>
-        <w:ind w:hanging="0" w:start="0"/>
-        <w:jc w:val="start"/>
-        <w:rPr>
-          <w:rFonts w:ascii="Times New Roman" w:hAnsi="Times New Roman" w:eastAsia="Times New Roman" w:cs="Times New Roman"/>
-          <w:b/>
-          <w:sz w:val="24"/>
-        </w:rPr>
-      </w:pPr>
-      <w:r>
-        <w:rPr>
-          <w:rFonts w:eastAsia="Times New Roman" w:cs="Times New Roman" w:ascii="Times New Roman" w:hAnsi="Times New Roman"/>
-          <w:b/>
-          <w:sz w:val="24"/>
-        </w:rPr>
-        <w:t>Ítem 4. ¿Dispone la empresa de mecanismos automatizados de respaldo para proteger la información frente a fallos del sistema o sobreescrituras?</w:t>
-      </w:r>
-    </w:p>
-    <w:p>
-      <w:pPr>
-        <w:pStyle w:val="normal1"/>
-        <w:spacing w:lineRule="auto" w:line="360" w:before="0" w:after="120"/>
-        <w:ind w:hanging="0" w:start="0"/>
-        <w:jc w:val="center"/>
-        <w:rPr/>
-      </w:pPr>
-      <w:r>
-        <w:rPr>
-          <w:rFonts w:eastAsia="Times New Roman" w:cs="Times New Roman" w:ascii="Times New Roman" w:hAnsi="Times New Roman"/>
-          <w:b w:val="false"/>
-          <w:sz w:val="24"/>
+        <w:keepNext/>
+      </w:pPr>
+      <w:r>
+        <w:rPr>
+          <w:rFonts w:ascii="Times New Roman" w:hAnsi="Times New Roman" w:cs="Times New Roman"/>
+          <w:sz w:val="24"/>
+          <w:b/>
         </w:rPr>
         <w:t>Cuadro 4</w:t>
+      </w:r>
+      <w:r>
         <w:br/>
+      </w:r>
+      <w:r>
+        <w:rPr>
+          <w:rFonts w:ascii="Times New Roman" w:hAnsi="Times New Roman" w:cs="Times New Roman"/>
+          <w:sz w:val="24"/>
+          <w:b/>
+        </w:rPr>
         <w:t>Mecanismos automatizados de respaldo de información</w:t>
       </w:r>
     </w:p>
@@ -8344,15 +8131,13 @@
     <w:p>
       <w:pPr>
         <w:pStyle w:val="normal1"/>
-        <w:spacing w:lineRule="auto" w:line="360" w:before="0" w:after="120"/>
+        <w:spacing w:line="360" w:lineRule="auto" w:before="40" w:after="160"/>
         <w:ind w:hanging="0" w:start="0"/>
-        <w:jc w:val="start"/>
-        <w:rPr/>
-      </w:pPr>
-      <w:r>
-        <w:rPr>
-          <w:rFonts w:eastAsia="Times New Roman" w:cs="Times New Roman" w:ascii="Times New Roman" w:hAnsi="Times New Roman"/>
-          <w:b w:val="false"/>
+        <w:jc w:val="left"/>
+      </w:pPr>
+      <w:r>
+        <w:rPr>
+          <w:rFonts w:ascii="Times New Roman" w:hAnsi="Times New Roman" w:cs="Times New Roman"/>
           <w:sz w:val="24"/>
         </w:rPr>
         <w:t>Fuente: Alvarado, L. (2026).</w:t>
@@ -8361,14 +8146,43 @@
     <w:p>
       <w:pPr>
         <w:pStyle w:val="normal1"/>
-        <w:spacing w:lineRule="auto" w:line="360" w:before="0" w:after="120"/>
+        <w:spacing w:line="360" w:lineRule="auto" w:before="160" w:after="80"/>
         <w:ind w:hanging="0" w:start="0"/>
         <w:jc w:val="center"/>
+        <w:keepNext/>
+      </w:pPr>
+      <w:r>
+        <w:rPr>
+          <w:rFonts w:ascii="Times New Roman" w:hAnsi="Times New Roman" w:cs="Times New Roman"/>
+          <w:sz w:val="24"/>
+          <w:b/>
+        </w:rPr>
+        <w:t>Gráfico 4</w:t>
+      </w:r>
+      <w:r>
+        <w:br/>
+      </w:r>
+      <w:r>
+        <w:rPr>
+          <w:rFonts w:ascii="Times New Roman" w:hAnsi="Times New Roman" w:cs="Times New Roman"/>
+          <w:sz w:val="24"/>
+          <w:b/>
+        </w:rPr>
+        <w:t>Mecanismos automatizados de respaldo de información</w:t>
+      </w:r>
+    </w:p>
+    <w:p>
+      <w:pPr>
+        <w:pStyle w:val="normal1"/>
+        <w:spacing w:lineRule="auto" w:line="360" w:before="80" w:after="40"/>
+        <w:ind w:hanging="0" w:start="0"/>
+        <w:jc w:val="center"/>
         <w:rPr>
           <w:rFonts w:ascii="Times New Roman" w:hAnsi="Times New Roman" w:eastAsia="Times New Roman" w:cs="Times New Roman"/>
           <w:b/>
           <w:sz w:val="24"/>
         </w:rPr>
+        <w:keepNext/>
       </w:pPr>
       <w:r>
         <w:rPr>
@@ -8377,24 +8191,16 @@
           <w:sz w:val="24"/>
         </w:rPr>
         <w:drawing>
-          <wp:anchor distT="0" distB="0" distL="0" distR="0" simplePos="0" relativeHeight="23" behindDoc="0" locked="0" layoutInCell="0" allowOverlap="1">
-            <wp:simplePos x="0" y="0"/>
-            <wp:positionH relativeFrom="column">
-              <wp:align>center</wp:align>
-            </wp:positionH>
-            <wp:positionV relativeFrom="paragraph">
-              <wp:posOffset>635</wp:posOffset>
-            </wp:positionV>
+          <wp:inline distT="0" distB="0" distL="0" distR="0">
             <wp:extent cx="3723640" cy="2660015"/>
             <wp:effectExtent l="0" t="0" r="0" b="0"/>
-            <wp:wrapSquare wrapText="largest"/>
             <wp:docPr id="7" name="Image7"/>
             <wp:cNvGraphicFramePr>
               <a:graphicFrameLocks xmlns:a="http://schemas.openxmlformats.org/drawingml/2006/main" noChangeAspect="1"/>
             </wp:cNvGraphicFramePr>
             <a:graphic xmlns:a="http://schemas.openxmlformats.org/drawingml/2006/main">
               <a:graphicData uri="http://schemas.openxmlformats.org/drawingml/2006/picture">
-                <pic:pic xmlns:pic="http://schemas.openxmlformats.org/drawingml/2006/picture">
+                <pic:pic>
                   <pic:nvPicPr>
                     <pic:cNvPr id="7" name="Image7"/>
                     <pic:cNvPicPr>
@@ -8420,47 +8226,38 @@
                 </pic:pic>
               </a:graphicData>
             </a:graphic>
-          </wp:anchor>
+          </wp:inline>
         </w:drawing>
       </w:r>
     </w:p>
     <w:p>
       <w:pPr>
         <w:pStyle w:val="normal1"/>
-        <w:spacing w:lineRule="auto" w:line="360" w:before="0" w:after="120"/>
+        <w:spacing w:line="360" w:lineRule="auto" w:before="40" w:after="160"/>
         <w:ind w:hanging="0" w:start="0"/>
-        <w:jc w:val="start"/>
-        <w:rPr>
-          <w:rFonts w:ascii="Times New Roman" w:hAnsi="Times New Roman" w:eastAsia="Times New Roman" w:cs="Times New Roman"/>
-          <w:b/>
-          <w:sz w:val="24"/>
-        </w:rPr>
-      </w:pPr>
-      <w:r>
-        <w:rPr>
-          <w:rFonts w:eastAsia="Times New Roman" w:cs="Times New Roman" w:ascii="Times New Roman" w:hAnsi="Times New Roman"/>
-          <w:b/>
-          <w:sz w:val="24"/>
-        </w:rPr>
-      </w:r>
-    </w:p>
-    <w:p>
-      <w:pPr>
-        <w:pStyle w:val="normal1"/>
-        <w:spacing w:lineRule="auto" w:line="360" w:before="0" w:after="120"/>
+        <w:jc w:val="left"/>
+      </w:pPr>
+      <w:r>
+        <w:rPr>
+          <w:rFonts w:ascii="Times New Roman" w:hAnsi="Times New Roman" w:cs="Times New Roman"/>
+          <w:sz w:val="24"/>
+        </w:rPr>
+        <w:t>Fuente: Alvarado, L. (2026).</w:t>
+      </w:r>
+    </w:p>
+    <w:p>
+      <w:pPr>
+        <w:pStyle w:val="normal1"/>
+        <w:spacing w:line="360" w:lineRule="auto" w:before="160" w:after="80"/>
         <w:ind w:hanging="0" w:start="0"/>
-        <w:jc w:val="start"/>
-        <w:rPr>
-          <w:rFonts w:ascii="Times New Roman" w:hAnsi="Times New Roman" w:eastAsia="Times New Roman" w:cs="Times New Roman"/>
-          <w:b/>
-          <w:sz w:val="24"/>
-        </w:rPr>
-      </w:pPr>
-      <w:r>
-        <w:rPr>
-          <w:rFonts w:eastAsia="Times New Roman" w:cs="Times New Roman" w:ascii="Times New Roman" w:hAnsi="Times New Roman"/>
-          <w:b/>
-          <w:sz w:val="24"/>
+        <w:jc w:val="left"/>
+        <w:keepNext/>
+      </w:pPr>
+      <w:r>
+        <w:rPr>
+          <w:rFonts w:ascii="Times New Roman" w:hAnsi="Times New Roman" w:cs="Times New Roman"/>
+          <w:sz w:val="24"/>
+          <w:b/>
         </w:rPr>
         <w:t>Análisis e Interpretación</w:t>
       </w:r>
@@ -8468,15 +8265,13 @@
     <w:p>
       <w:pPr>
         <w:pStyle w:val="normal1"/>
-        <w:spacing w:lineRule="auto" w:line="360" w:before="0" w:after="120"/>
-        <w:ind w:firstLine="720" w:start="0"/>
-        <w:jc w:val="both"/>
-        <w:rPr/>
-      </w:pPr>
-      <w:r>
-        <w:rPr>
-          <w:rFonts w:eastAsia="Times New Roman" w:cs="Times New Roman" w:ascii="Times New Roman" w:hAnsi="Times New Roman"/>
-          <w:b w:val="false"/>
+        <w:spacing w:line="360" w:lineRule="auto" w:before="0" w:after="120"/>
+        <w:ind w:hanging="0" w:firstLine="720"/>
+        <w:jc w:val="justify"/>
+      </w:pPr>
+      <w:r>
+        <w:rPr>
+          <w:rFonts w:ascii="Times New Roman" w:hAnsi="Times New Roman" w:cs="Times New Roman"/>
           <w:sz w:val="24"/>
         </w:rPr>
         <w:t>Como se observa en el Cuadro 4, el 100% de la muestra afirma contundentemente que la empresa no dispone en la actualidad de mecanismos automatizados de respaldo para proteger sus datos financieros y operativos frente a fallos o sobreescrituras. Este diagnóstico revela una deficiencia severa en los protocolos de seguridad de la información.</w:t>
@@ -8485,15 +8280,13 @@
     <w:p>
       <w:pPr>
         <w:pStyle w:val="normal1"/>
-        <w:spacing w:lineRule="auto" w:line="360" w:before="0" w:after="120"/>
-        <w:ind w:firstLine="720" w:start="0"/>
-        <w:jc w:val="both"/>
-        <w:rPr/>
-      </w:pPr>
-      <w:r>
-        <w:rPr>
-          <w:rFonts w:eastAsia="Times New Roman" w:cs="Times New Roman" w:ascii="Times New Roman" w:hAnsi="Times New Roman"/>
-          <w:b w:val="false"/>
+        <w:spacing w:line="360" w:lineRule="auto" w:before="0" w:after="240"/>
+        <w:ind w:hanging="0" w:firstLine="720"/>
+        <w:jc w:val="justify"/>
+      </w:pPr>
+      <w:r>
+        <w:rPr>
+          <w:rFonts w:ascii="Times New Roman" w:hAnsi="Times New Roman" w:cs="Times New Roman"/>
           <w:sz w:val="24"/>
         </w:rPr>
         <w:t>De acuerdo con los lineamientos de seguridad y privacidad, las organizaciones deben velar por la integridad y resguardo de sus activos de información crítica. La carencia absoluta de respaldos justifica plenamente la arquitectura del sistema propuesto, el cual incluirá rutinas automatizadas de salvaguarda de la base de datos relacional, protegiendo así los registros de empeños y el inventario físico de metales preciosos ante cualquier contingencia técnica.</w:t>
@@ -8502,16 +8295,16 @@
     <w:p>
       <w:pPr>
         <w:pStyle w:val="normal1"/>
-        <w:spacing w:lineRule="auto" w:line="360" w:before="0" w:after="120"/>
+        <w:spacing w:line="360" w:lineRule="auto" w:before="240" w:after="120"/>
         <w:ind w:hanging="0" w:start="0"/>
-        <w:jc w:val="start"/>
-        <w:rPr/>
-      </w:pPr>
-      <w:r>
-        <w:rPr>
-          <w:rFonts w:eastAsia="Times New Roman" w:cs="Times New Roman" w:ascii="Times New Roman" w:hAnsi="Times New Roman"/>
-          <w:b/>
-          <w:sz w:val="24"/>
+        <w:jc w:val="justify"/>
+        <w:keepNext/>
+      </w:pPr>
+      <w:r>
+        <w:rPr>
+          <w:rFonts w:ascii="Times New Roman" w:hAnsi="Times New Roman" w:cs="Times New Roman"/>
+          <w:sz w:val="24"/>
+          <w:b/>
         </w:rPr>
         <w:t>Ítem 5. ¿Es fundamental un sistema centralizado para la trazabilidad?</w:t>
       </w:r>
@@ -8519,19 +8312,28 @@
     <w:p>
       <w:pPr>
         <w:pStyle w:val="normal1"/>
-        <w:spacing w:lineRule="auto" w:line="360" w:before="0" w:after="120"/>
+        <w:spacing w:line="360" w:lineRule="auto" w:before="120" w:after="120"/>
         <w:ind w:hanging="0" w:start="0"/>
         <w:jc w:val="center"/>
-        <w:rPr/>
-      </w:pPr>
-      <w:r>
-        <w:rPr>
-          <w:rFonts w:eastAsia="Times New Roman" w:cs="Times New Roman" w:ascii="Times New Roman" w:hAnsi="Times New Roman"/>
-          <w:b w:val="false"/>
-          <w:sz w:val="24"/>
+        <w:keepNext/>
+      </w:pPr>
+      <w:r>
+        <w:rPr>
+          <w:rFonts w:ascii="Times New Roman" w:hAnsi="Times New Roman" w:cs="Times New Roman"/>
+          <w:sz w:val="24"/>
+          <w:b/>
         </w:rPr>
         <w:t>Cuadro 5</w:t>
+      </w:r>
+      <w:r>
         <w:br/>
+      </w:r>
+      <w:r>
+        <w:rPr>
+          <w:rFonts w:ascii="Times New Roman" w:hAnsi="Times New Roman" w:cs="Times New Roman"/>
+          <w:sz w:val="24"/>
+          <w:b/>
+        </w:rPr>
         <w:t>Importancia de un sistema centralizado para trazabilidad</w:t>
       </w:r>
     </w:p>
@@ -8884,15 +8686,13 @@
     <w:p>
       <w:pPr>
         <w:pStyle w:val="normal1"/>
-        <w:spacing w:lineRule="auto" w:line="360" w:before="0" w:after="120"/>
+        <w:spacing w:line="360" w:lineRule="auto" w:before="40" w:after="160"/>
         <w:ind w:hanging="0" w:start="0"/>
-        <w:jc w:val="start"/>
-        <w:rPr/>
-      </w:pPr>
-      <w:r>
-        <w:rPr>
-          <w:rFonts w:eastAsia="Times New Roman" w:cs="Times New Roman" w:ascii="Times New Roman" w:hAnsi="Times New Roman"/>
-          <w:b w:val="false"/>
+        <w:jc w:val="left"/>
+      </w:pPr>
+      <w:r>
+        <w:rPr>
+          <w:rFonts w:ascii="Times New Roman" w:hAnsi="Times New Roman" w:cs="Times New Roman"/>
           <w:sz w:val="24"/>
         </w:rPr>
         <w:t>Fuente: Alvarado, L. (2026).</w:t>
@@ -8901,14 +8701,43 @@
     <w:p>
       <w:pPr>
         <w:pStyle w:val="normal1"/>
-        <w:spacing w:lineRule="auto" w:line="360" w:before="0" w:after="120"/>
+        <w:spacing w:line="360" w:lineRule="auto" w:before="160" w:after="80"/>
         <w:ind w:hanging="0" w:start="0"/>
         <w:jc w:val="center"/>
+        <w:keepNext/>
+      </w:pPr>
+      <w:r>
+        <w:rPr>
+          <w:rFonts w:ascii="Times New Roman" w:hAnsi="Times New Roman" w:cs="Times New Roman"/>
+          <w:sz w:val="24"/>
+          <w:b/>
+        </w:rPr>
+        <w:t>Gráfico 5</w:t>
+      </w:r>
+      <w:r>
+        <w:br/>
+      </w:r>
+      <w:r>
+        <w:rPr>
+          <w:rFonts w:ascii="Times New Roman" w:hAnsi="Times New Roman" w:cs="Times New Roman"/>
+          <w:sz w:val="24"/>
+          <w:b/>
+        </w:rPr>
+        <w:t>Importancia de un sistema centralizado para trazabilidad</w:t>
+      </w:r>
+    </w:p>
+    <w:p>
+      <w:pPr>
+        <w:pStyle w:val="normal1"/>
+        <w:spacing w:lineRule="auto" w:line="360" w:before="80" w:after="40"/>
+        <w:ind w:hanging="0" w:start="0"/>
+        <w:jc w:val="center"/>
         <w:rPr>
           <w:rFonts w:ascii="Times New Roman" w:hAnsi="Times New Roman" w:eastAsia="Times New Roman" w:cs="Times New Roman"/>
           <w:b/>
           <w:sz w:val="24"/>
         </w:rPr>
+        <w:keepNext/>
       </w:pPr>
       <w:r>
         <w:rPr>
@@ -8917,24 +8746,16 @@
           <w:sz w:val="24"/>
         </w:rPr>
         <w:drawing>
-          <wp:anchor distT="0" distB="0" distL="0" distR="0" simplePos="0" relativeHeight="20" behindDoc="0" locked="0" layoutInCell="0" allowOverlap="1">
-            <wp:simplePos x="0" y="0"/>
-            <wp:positionH relativeFrom="column">
-              <wp:posOffset>902335</wp:posOffset>
-            </wp:positionH>
-            <wp:positionV relativeFrom="paragraph">
-              <wp:posOffset>93980</wp:posOffset>
-            </wp:positionV>
+          <wp:inline distT="0" distB="0" distL="0" distR="0">
             <wp:extent cx="3397250" cy="2426335"/>
             <wp:effectExtent l="0" t="0" r="0" b="0"/>
-            <wp:wrapSquare wrapText="largest"/>
             <wp:docPr id="8" name="Image6 Copy 1 Copy 1"/>
             <wp:cNvGraphicFramePr>
               <a:graphicFrameLocks xmlns:a="http://schemas.openxmlformats.org/drawingml/2006/main" noChangeAspect="1"/>
             </wp:cNvGraphicFramePr>
             <a:graphic xmlns:a="http://schemas.openxmlformats.org/drawingml/2006/main">
               <a:graphicData uri="http://schemas.openxmlformats.org/drawingml/2006/picture">
-                <pic:pic xmlns:pic="http://schemas.openxmlformats.org/drawingml/2006/picture">
+                <pic:pic>
                   <pic:nvPicPr>
                     <pic:cNvPr id="8" name="Image6 Copy 1 Copy 1"/>
                     <pic:cNvPicPr>
@@ -8960,114 +8781,114 @@
                 </pic:pic>
               </a:graphicData>
             </a:graphic>
-          </wp:anchor>
+          </wp:inline>
         </w:drawing>
       </w:r>
     </w:p>
     <w:p>
       <w:pPr>
         <w:pStyle w:val="normal1"/>
-        <w:spacing w:lineRule="auto" w:line="360" w:before="0" w:after="120"/>
+        <w:spacing w:line="360" w:lineRule="auto" w:before="40" w:after="160"/>
+        <w:ind w:hanging="0" w:start="0"/>
+        <w:jc w:val="left"/>
+      </w:pPr>
+      <w:r>
+        <w:rPr>
+          <w:rFonts w:ascii="Times New Roman" w:hAnsi="Times New Roman" w:cs="Times New Roman"/>
+          <w:sz w:val="24"/>
+        </w:rPr>
+        <w:t>Fuente: Alvarado, L. (2026).</w:t>
+      </w:r>
+    </w:p>
+    <w:p>
+      <w:pPr>
+        <w:pStyle w:val="normal1"/>
+        <w:spacing w:line="360" w:lineRule="auto" w:before="160" w:after="80"/>
+        <w:ind w:hanging="0" w:start="0"/>
+        <w:jc w:val="left"/>
+        <w:keepNext/>
+      </w:pPr>
+      <w:r>
+        <w:rPr>
+          <w:rFonts w:ascii="Times New Roman" w:hAnsi="Times New Roman" w:cs="Times New Roman"/>
+          <w:sz w:val="24"/>
+          <w:b/>
+        </w:rPr>
+        <w:t>Análisis e Interpretación</w:t>
+      </w:r>
+    </w:p>
+    <w:p>
+      <w:pPr>
+        <w:pStyle w:val="normal1"/>
+        <w:spacing w:line="360" w:lineRule="auto" w:before="0" w:after="120"/>
+        <w:ind w:hanging="0" w:firstLine="720"/>
+        <w:jc w:val="justify"/>
+      </w:pPr>
+      <w:r>
+        <w:rPr>
+          <w:rFonts w:ascii="Times New Roman" w:hAnsi="Times New Roman" w:cs="Times New Roman"/>
+          <w:sz w:val="24"/>
+        </w:rPr>
+        <w:t>Los resultados expuestos en el Cuadro 5 indican que el 100% del personal encuestado considera que es fundamental contar con un sistema centralizado para garantizar la trazabilidad de las operaciones comerciales. Esta percepción unánime corrobora el postulado teórico sobre la eficiencia estructural organizacional.</w:t>
+      </w:r>
+    </w:p>
+    <w:p>
+      <w:pPr>
+        <w:pStyle w:val="normal1"/>
+        <w:spacing w:line="360" w:lineRule="auto" w:before="0" w:after="240"/>
+        <w:ind w:hanging="0" w:firstLine="720"/>
+        <w:jc w:val="justify"/>
+      </w:pPr>
+      <w:r>
+        <w:rPr>
+          <w:rFonts w:ascii="Times New Roman" w:hAnsi="Times New Roman" w:cs="Times New Roman"/>
+          <w:sz w:val="24"/>
+        </w:rPr>
+        <w:t>Según la perspectiva de teóricos como Laudon y Laudon (2012), los sistemas de información deben transformar datos dispersos en repositorios centralizados para apoyar eficazmente el control organizacional. Para Inversiones Más Por Tu Oro 17 C.A., la trazabilidad exacta de cuándo ingresa una joya como garantía y cuándo se liquida el préstamo es el núcleo del negocio. Este resultado valida la arquitectura centralizada del diseño propuesto, superando la gran limitante actual de operar mediante múltiples archivos de ofimática fragmentados.</w:t>
+      </w:r>
+    </w:p>
+    <w:p>
+      <w:pPr>
+        <w:pStyle w:val="normal1"/>
+        <w:spacing w:line="360" w:lineRule="auto" w:before="240" w:after="120"/>
+        <w:ind w:hanging="0" w:start="0"/>
+        <w:jc w:val="justify"/>
+        <w:keepNext/>
+      </w:pPr>
+      <w:r>
+        <w:rPr>
+          <w:rFonts w:ascii="Times New Roman" w:hAnsi="Times New Roman" w:cs="Times New Roman"/>
+          <w:sz w:val="24"/>
+          <w:b/>
+        </w:rPr>
+        <w:t>Ítem 6. ¿Deben las interfaces ser intuitivas para facilitar el uso?</w:t>
+      </w:r>
+    </w:p>
+    <w:p>
+      <w:pPr>
+        <w:pStyle w:val="normal1"/>
+        <w:spacing w:line="360" w:lineRule="auto" w:before="120" w:after="120"/>
         <w:ind w:hanging="0" w:start="0"/>
         <w:jc w:val="center"/>
-        <w:rPr>
-          <w:rFonts w:ascii="Times New Roman" w:hAnsi="Times New Roman" w:eastAsia="Times New Roman" w:cs="Times New Roman"/>
-          <w:b/>
-          <w:sz w:val="24"/>
-        </w:rPr>
-      </w:pPr>
-      <w:r>
-        <w:rPr>
-          <w:rFonts w:eastAsia="Times New Roman" w:cs="Times New Roman" w:ascii="Times New Roman" w:hAnsi="Times New Roman"/>
-          <w:b/>
-          <w:sz w:val="24"/>
-        </w:rPr>
-      </w:r>
-    </w:p>
-    <w:p>
-      <w:pPr>
-        <w:pStyle w:val="normal1"/>
-        <w:spacing w:lineRule="auto" w:line="360" w:before="0" w:after="120"/>
-        <w:ind w:hanging="0" w:start="0"/>
-        <w:jc w:val="start"/>
-        <w:rPr/>
-      </w:pPr>
-      <w:r>
-        <w:rPr>
-          <w:rFonts w:eastAsia="Times New Roman" w:cs="Times New Roman" w:ascii="Times New Roman" w:hAnsi="Times New Roman"/>
-          <w:b/>
-          <w:sz w:val="24"/>
-        </w:rPr>
-        <w:t>Análisis e Interpretación</w:t>
-      </w:r>
-    </w:p>
-    <w:p>
-      <w:pPr>
-        <w:pStyle w:val="normal1"/>
-        <w:spacing w:lineRule="auto" w:line="360" w:before="0" w:after="120"/>
-        <w:ind w:firstLine="720" w:start="0"/>
-        <w:jc w:val="both"/>
-        <w:rPr/>
-      </w:pPr>
-      <w:r>
-        <w:rPr>
-          <w:rFonts w:eastAsia="Times New Roman" w:cs="Times New Roman" w:ascii="Times New Roman" w:hAnsi="Times New Roman"/>
-          <w:b w:val="false"/>
-          <w:sz w:val="24"/>
-        </w:rPr>
-        <w:t>Los resultados expuestos en el Cuadro 5 indican que el 100% del personal encuestado considera que es fundamental contar con un sistema centralizado para garantizar la trazabilidad de las operaciones comerciales. Esta percepción unánime corrobora el postulado teórico sobre la eficiencia estructural organizacional.</w:t>
-      </w:r>
-    </w:p>
-    <w:p>
-      <w:pPr>
-        <w:pStyle w:val="normal1"/>
-        <w:spacing w:lineRule="auto" w:line="360" w:before="0" w:after="120"/>
-        <w:ind w:firstLine="720" w:start="0"/>
-        <w:jc w:val="both"/>
-        <w:rPr/>
-      </w:pPr>
-      <w:r>
-        <w:rPr>
-          <w:rFonts w:eastAsia="Times New Roman" w:cs="Times New Roman" w:ascii="Times New Roman" w:hAnsi="Times New Roman"/>
-          <w:b w:val="false"/>
-          <w:sz w:val="24"/>
-        </w:rPr>
-        <w:t>Según la perspectiva de teóricos como Laudon y Laudon (2012), los sistemas de información deben transformar datos dispersos en repositorios centralizados para apoyar eficazmente el control organizacional. Para Inversiones Más Por Tu Oro 17 C.A., la trazabilidad exacta de cuándo ingresa una joya como garantía y cuándo se liquida el préstamo es el núcleo del negocio. Este resultado valida la arquitectura centralizada del diseño propuesto, superando la gran limitante actual de operar mediante múltiples archivos de ofimática fragmentados.</w:t>
-      </w:r>
-    </w:p>
-    <w:p>
-      <w:pPr>
-        <w:pStyle w:val="normal1"/>
-        <w:spacing w:lineRule="auto" w:line="360" w:before="0" w:after="120"/>
-        <w:ind w:hanging="0" w:start="0"/>
-        <w:jc w:val="start"/>
-        <w:rPr/>
-      </w:pPr>
-      <w:r>
-        <w:rPr>
-          <w:rFonts w:eastAsia="Times New Roman" w:cs="Times New Roman" w:ascii="Times New Roman" w:hAnsi="Times New Roman"/>
-          <w:b/>
-          <w:sz w:val="24"/>
-        </w:rPr>
-        <w:t>Ítem 6. ¿Deben las interfaces ser intuitivas para facilitar el uso?</w:t>
-      </w:r>
-    </w:p>
-    <w:p>
-      <w:pPr>
-        <w:pStyle w:val="normal1"/>
-        <w:spacing w:lineRule="auto" w:line="360" w:before="0" w:after="120"/>
-        <w:ind w:hanging="0" w:start="0"/>
-        <w:jc w:val="center"/>
-        <w:rPr/>
-      </w:pPr>
-      <w:r>
-        <w:rPr>
-          <w:rFonts w:eastAsia="Times New Roman" w:cs="Times New Roman" w:ascii="Times New Roman" w:hAnsi="Times New Roman"/>
-          <w:b w:val="false"/>
-          <w:sz w:val="24"/>
+        <w:keepNext/>
+      </w:pPr>
+      <w:r>
+        <w:rPr>
+          <w:rFonts w:ascii="Times New Roman" w:hAnsi="Times New Roman" w:cs="Times New Roman"/>
+          <w:sz w:val="24"/>
+          <w:b/>
         </w:rPr>
         <w:t>Cuadro 6</w:t>
+      </w:r>
+      <w:r>
         <w:br/>
+      </w:r>
+      <w:r>
+        <w:rPr>
+          <w:rFonts w:ascii="Times New Roman" w:hAnsi="Times New Roman" w:cs="Times New Roman"/>
+          <w:sz w:val="24"/>
+          <w:b/>
+        </w:rPr>
         <w:t>Necesidad de interfaces intuitivas</w:t>
       </w:r>
     </w:p>
@@ -9420,15 +9241,13 @@
     <w:p>
       <w:pPr>
         <w:pStyle w:val="normal1"/>
-        <w:spacing w:lineRule="auto" w:line="360" w:before="0" w:after="120"/>
+        <w:spacing w:line="360" w:lineRule="auto" w:before="40" w:after="160"/>
         <w:ind w:hanging="0" w:start="0"/>
-        <w:jc w:val="start"/>
-        <w:rPr/>
-      </w:pPr>
-      <w:r>
-        <w:rPr>
-          <w:rFonts w:eastAsia="Times New Roman" w:cs="Times New Roman" w:ascii="Times New Roman" w:hAnsi="Times New Roman"/>
-          <w:b w:val="false"/>
+        <w:jc w:val="left"/>
+      </w:pPr>
+      <w:r>
+        <w:rPr>
+          <w:rFonts w:ascii="Times New Roman" w:hAnsi="Times New Roman" w:cs="Times New Roman"/>
           <w:sz w:val="24"/>
         </w:rPr>
         <w:t>Fuente: Alvarado, L. (2026).</w:t>
@@ -9437,14 +9256,43 @@
     <w:p>
       <w:pPr>
         <w:pStyle w:val="normal1"/>
-        <w:spacing w:lineRule="auto" w:line="360" w:before="0" w:after="120"/>
+        <w:spacing w:line="360" w:lineRule="auto" w:before="160" w:after="80"/>
         <w:ind w:hanging="0" w:start="0"/>
         <w:jc w:val="center"/>
+        <w:keepNext/>
+      </w:pPr>
+      <w:r>
+        <w:rPr>
+          <w:rFonts w:ascii="Times New Roman" w:hAnsi="Times New Roman" w:cs="Times New Roman"/>
+          <w:sz w:val="24"/>
+          <w:b/>
+        </w:rPr>
+        <w:t>Gráfico 6</w:t>
+      </w:r>
+      <w:r>
+        <w:br/>
+      </w:r>
+      <w:r>
+        <w:rPr>
+          <w:rFonts w:ascii="Times New Roman" w:hAnsi="Times New Roman" w:cs="Times New Roman"/>
+          <w:sz w:val="24"/>
+          <w:b/>
+        </w:rPr>
+        <w:t>Necesidad de interfaces intuitivas</w:t>
+      </w:r>
+    </w:p>
+    <w:p>
+      <w:pPr>
+        <w:pStyle w:val="normal1"/>
+        <w:spacing w:lineRule="auto" w:line="360" w:before="80" w:after="40"/>
+        <w:ind w:hanging="0" w:start="0"/>
+        <w:jc w:val="center"/>
         <w:rPr>
           <w:rFonts w:ascii="Times New Roman" w:hAnsi="Times New Roman" w:eastAsia="Times New Roman" w:cs="Times New Roman"/>
           <w:b/>
           <w:sz w:val="24"/>
         </w:rPr>
+        <w:keepNext/>
       </w:pPr>
       <w:r>
         <w:rPr>
@@ -9453,24 +9301,16 @@
           <w:sz w:val="24"/>
         </w:rPr>
         <w:drawing>
-          <wp:anchor distT="0" distB="0" distL="0" distR="0" simplePos="0" relativeHeight="21" behindDoc="0" locked="0" layoutInCell="0" allowOverlap="1">
-            <wp:simplePos x="0" y="0"/>
-            <wp:positionH relativeFrom="column">
-              <wp:posOffset>902335</wp:posOffset>
-            </wp:positionH>
-            <wp:positionV relativeFrom="paragraph">
-              <wp:posOffset>93980</wp:posOffset>
-            </wp:positionV>
+          <wp:inline distT="0" distB="0" distL="0" distR="0">
             <wp:extent cx="3397250" cy="2426335"/>
             <wp:effectExtent l="0" t="0" r="0" b="0"/>
-            <wp:wrapSquare wrapText="largest"/>
             <wp:docPr id="9" name="Image6 Copy 1 Copy 2"/>
             <wp:cNvGraphicFramePr>
               <a:graphicFrameLocks xmlns:a="http://schemas.openxmlformats.org/drawingml/2006/main" noChangeAspect="1"/>
             </wp:cNvGraphicFramePr>
             <a:graphic xmlns:a="http://schemas.openxmlformats.org/drawingml/2006/main">
               <a:graphicData uri="http://schemas.openxmlformats.org/drawingml/2006/picture">
-                <pic:pic xmlns:pic="http://schemas.openxmlformats.org/drawingml/2006/picture">
+                <pic:pic>
                   <pic:nvPicPr>
                     <pic:cNvPr id="9" name="Image6 Copy 1 Copy 2"/>
                     <pic:cNvPicPr>
@@ -9496,114 +9336,114 @@
                 </pic:pic>
               </a:graphicData>
             </a:graphic>
-          </wp:anchor>
+          </wp:inline>
         </w:drawing>
       </w:r>
     </w:p>
     <w:p>
       <w:pPr>
         <w:pStyle w:val="normal1"/>
-        <w:spacing w:lineRule="auto" w:line="360" w:before="0" w:after="120"/>
+        <w:spacing w:line="360" w:lineRule="auto" w:before="40" w:after="160"/>
+        <w:ind w:hanging="0" w:start="0"/>
+        <w:jc w:val="left"/>
+      </w:pPr>
+      <w:r>
+        <w:rPr>
+          <w:rFonts w:ascii="Times New Roman" w:hAnsi="Times New Roman" w:cs="Times New Roman"/>
+          <w:sz w:val="24"/>
+        </w:rPr>
+        <w:t>Fuente: Alvarado, L. (2026).</w:t>
+      </w:r>
+    </w:p>
+    <w:p>
+      <w:pPr>
+        <w:pStyle w:val="normal1"/>
+        <w:spacing w:line="360" w:lineRule="auto" w:before="160" w:after="80"/>
+        <w:ind w:hanging="0" w:start="0"/>
+        <w:jc w:val="left"/>
+        <w:keepNext/>
+      </w:pPr>
+      <w:r>
+        <w:rPr>
+          <w:rFonts w:ascii="Times New Roman" w:hAnsi="Times New Roman" w:cs="Times New Roman"/>
+          <w:sz w:val="24"/>
+          <w:b/>
+        </w:rPr>
+        <w:t>Análisis e Interpretación</w:t>
+      </w:r>
+    </w:p>
+    <w:p>
+      <w:pPr>
+        <w:pStyle w:val="normal1"/>
+        <w:spacing w:line="360" w:lineRule="auto" w:before="0" w:after="120"/>
+        <w:ind w:hanging="0" w:firstLine="720"/>
+        <w:jc w:val="justify"/>
+      </w:pPr>
+      <w:r>
+        <w:rPr>
+          <w:rFonts w:ascii="Times New Roman" w:hAnsi="Times New Roman" w:cs="Times New Roman"/>
+          <w:sz w:val="24"/>
+        </w:rPr>
+        <w:t>Tal como se detalla en el Cuadro 6, el 100% de la población concuerda en que las interfaces del nuevo sistema deben ser altamente intuitivas para facilitar su uso diario. Este hallazgo es crucial para la etapa de desarrollo y diseño de la interfaz gráfica e interacción usuario-máquina.</w:t>
+      </w:r>
+    </w:p>
+    <w:p>
+      <w:pPr>
+        <w:pStyle w:val="normal1"/>
+        <w:spacing w:line="360" w:lineRule="auto" w:before="0" w:after="240"/>
+        <w:ind w:hanging="0" w:firstLine="720"/>
+        <w:jc w:val="justify"/>
+      </w:pPr>
+      <w:r>
+        <w:rPr>
+          <w:rFonts w:ascii="Times New Roman" w:hAnsi="Times New Roman" w:cs="Times New Roman"/>
+          <w:sz w:val="24"/>
+        </w:rPr>
+        <w:t>Atendiendo a lo que establece Pressman (2010) respecto al modelo de construcción de prototipos, la usabilidad y la amigabilidad de la interfaz son determinantes para asegurar la adopción tecnológica por parte del usuario final y minimizar la resistencia al cambio. En consecuencia, el sistema se desarrollará con principios de ergonomía visual y flujos de trabajo claros, asegurando que el cajero y el administrador puedan registrar operaciones complejas de empeño de forma natural y ágil.</w:t>
+      </w:r>
+    </w:p>
+    <w:p>
+      <w:pPr>
+        <w:pStyle w:val="normal1"/>
+        <w:spacing w:line="360" w:lineRule="auto" w:before="240" w:after="120"/>
+        <w:ind w:hanging="0" w:start="0"/>
+        <w:jc w:val="justify"/>
+        <w:keepNext/>
+      </w:pPr>
+      <w:r>
+        <w:rPr>
+          <w:rFonts w:ascii="Times New Roman" w:hAnsi="Times New Roman" w:cs="Times New Roman"/>
+          <w:sz w:val="24"/>
+          <w:b/>
+        </w:rPr>
+        <w:t>Ítem 7. ¿Requiere reportes administrativos automáticos para gerencia?</w:t>
+      </w:r>
+    </w:p>
+    <w:p>
+      <w:pPr>
+        <w:pStyle w:val="normal1"/>
+        <w:spacing w:line="360" w:lineRule="auto" w:before="120" w:after="120"/>
         <w:ind w:hanging="0" w:start="0"/>
         <w:jc w:val="center"/>
-        <w:rPr>
-          <w:rFonts w:ascii="Times New Roman" w:hAnsi="Times New Roman" w:eastAsia="Times New Roman" w:cs="Times New Roman"/>
-          <w:b/>
-          <w:sz w:val="24"/>
-        </w:rPr>
-      </w:pPr>
-      <w:r>
-        <w:rPr>
-          <w:rFonts w:eastAsia="Times New Roman" w:cs="Times New Roman" w:ascii="Times New Roman" w:hAnsi="Times New Roman"/>
-          <w:b/>
-          <w:sz w:val="24"/>
-        </w:rPr>
-      </w:r>
-    </w:p>
-    <w:p>
-      <w:pPr>
-        <w:pStyle w:val="normal1"/>
-        <w:spacing w:lineRule="auto" w:line="360" w:before="0" w:after="120"/>
-        <w:ind w:hanging="0" w:start="0"/>
-        <w:jc w:val="start"/>
-        <w:rPr/>
-      </w:pPr>
-      <w:r>
-        <w:rPr>
-          <w:rFonts w:eastAsia="Times New Roman" w:cs="Times New Roman" w:ascii="Times New Roman" w:hAnsi="Times New Roman"/>
-          <w:b/>
-          <w:sz w:val="24"/>
-        </w:rPr>
-        <w:t>Análisis e Interpretación</w:t>
-      </w:r>
-    </w:p>
-    <w:p>
-      <w:pPr>
-        <w:pStyle w:val="normal1"/>
-        <w:spacing w:lineRule="auto" w:line="360" w:before="0" w:after="120"/>
-        <w:ind w:firstLine="720" w:start="0"/>
-        <w:jc w:val="both"/>
-        <w:rPr/>
-      </w:pPr>
-      <w:r>
-        <w:rPr>
-          <w:rFonts w:eastAsia="Times New Roman" w:cs="Times New Roman" w:ascii="Times New Roman" w:hAnsi="Times New Roman"/>
-          <w:b w:val="false"/>
-          <w:sz w:val="24"/>
-        </w:rPr>
-        <w:t>Tal como se detalla en el Cuadro 6, el 100% de la población concuerda en que las interfaces del nuevo sistema deben ser altamente intuitivas para facilitar su uso diario. Este hallazgo es crucial para la etapa de desarrollo y diseño de la interfaz gráfica e interacción usuario-máquina.</w:t>
-      </w:r>
-    </w:p>
-    <w:p>
-      <w:pPr>
-        <w:pStyle w:val="normal1"/>
-        <w:spacing w:lineRule="auto" w:line="360" w:before="0" w:after="120"/>
-        <w:ind w:firstLine="720" w:start="0"/>
-        <w:jc w:val="both"/>
-        <w:rPr/>
-      </w:pPr>
-      <w:r>
-        <w:rPr>
-          <w:rFonts w:eastAsia="Times New Roman" w:cs="Times New Roman" w:ascii="Times New Roman" w:hAnsi="Times New Roman"/>
-          <w:b w:val="false"/>
-          <w:sz w:val="24"/>
-        </w:rPr>
-        <w:t>Atendiendo a lo que establece Pressman (2010) respecto al modelo de construcción de prototipos, la usabilidad y la amigabilidad de la interfaz son determinantes para asegurar la adopción tecnológica por parte del usuario final y minimizar la resistencia al cambio. En consecuencia, el sistema se desarrollará con principios de ergonomía visual y flujos de trabajo claros, asegurando que el cajero y el administrador puedan registrar operaciones complejas de empeño de forma natural y ágil.</w:t>
-      </w:r>
-    </w:p>
-    <w:p>
-      <w:pPr>
-        <w:pStyle w:val="normal1"/>
-        <w:spacing w:lineRule="auto" w:line="360" w:before="0" w:after="120"/>
-        <w:ind w:hanging="0" w:start="0"/>
-        <w:jc w:val="start"/>
-        <w:rPr/>
-      </w:pPr>
-      <w:r>
-        <w:rPr>
-          <w:rFonts w:eastAsia="Times New Roman" w:cs="Times New Roman" w:ascii="Times New Roman" w:hAnsi="Times New Roman"/>
-          <w:b/>
-          <w:sz w:val="24"/>
-        </w:rPr>
-        <w:t>Ítem 7. ¿Requiere reportes administrativos automáticos para gerencia?</w:t>
-      </w:r>
-    </w:p>
-    <w:p>
-      <w:pPr>
-        <w:pStyle w:val="normal1"/>
-        <w:spacing w:lineRule="auto" w:line="360" w:before="0" w:after="120"/>
-        <w:ind w:hanging="0" w:start="0"/>
-        <w:jc w:val="center"/>
-        <w:rPr/>
-      </w:pPr>
-      <w:r>
-        <w:rPr>
-          <w:rFonts w:eastAsia="Times New Roman" w:cs="Times New Roman" w:ascii="Times New Roman" w:hAnsi="Times New Roman"/>
-          <w:b w:val="false"/>
-          <w:sz w:val="24"/>
+        <w:keepNext/>
+      </w:pPr>
+      <w:r>
+        <w:rPr>
+          <w:rFonts w:ascii="Times New Roman" w:hAnsi="Times New Roman" w:cs="Times New Roman"/>
+          <w:sz w:val="24"/>
+          <w:b/>
         </w:rPr>
         <w:t>Cuadro 7</w:t>
+      </w:r>
+      <w:r>
         <w:br/>
+      </w:r>
+      <w:r>
+        <w:rPr>
+          <w:rFonts w:ascii="Times New Roman" w:hAnsi="Times New Roman" w:cs="Times New Roman"/>
+          <w:sz w:val="24"/>
+          <w:b/>
+        </w:rPr>
         <w:t>Requerimiento de reportes administrativos automáticos</w:t>
       </w:r>
     </w:p>
@@ -9956,15 +9796,13 @@
     <w:p>
       <w:pPr>
         <w:pStyle w:val="normal1"/>
-        <w:spacing w:lineRule="auto" w:line="360" w:before="0" w:after="120"/>
+        <w:spacing w:line="360" w:lineRule="auto" w:before="40" w:after="160"/>
         <w:ind w:hanging="0" w:start="0"/>
-        <w:jc w:val="start"/>
-        <w:rPr/>
-      </w:pPr>
-      <w:r>
-        <w:rPr>
-          <w:rFonts w:eastAsia="Times New Roman" w:cs="Times New Roman" w:ascii="Times New Roman" w:hAnsi="Times New Roman"/>
-          <w:b w:val="false"/>
+        <w:jc w:val="left"/>
+      </w:pPr>
+      <w:r>
+        <w:rPr>
+          <w:rFonts w:ascii="Times New Roman" w:hAnsi="Times New Roman" w:cs="Times New Roman"/>
           <w:sz w:val="24"/>
         </w:rPr>
         <w:t>Fuente: Alvarado, L. (2026).</w:t>
@@ -9973,14 +9811,43 @@
     <w:p>
       <w:pPr>
         <w:pStyle w:val="normal1"/>
-        <w:spacing w:lineRule="auto" w:line="360" w:before="0" w:after="120"/>
+        <w:spacing w:line="360" w:lineRule="auto" w:before="160" w:after="80"/>
         <w:ind w:hanging="0" w:start="0"/>
         <w:jc w:val="center"/>
+        <w:keepNext/>
+      </w:pPr>
+      <w:r>
+        <w:rPr>
+          <w:rFonts w:ascii="Times New Roman" w:hAnsi="Times New Roman" w:cs="Times New Roman"/>
+          <w:sz w:val="24"/>
+          <w:b/>
+        </w:rPr>
+        <w:t>Gráfico 7</w:t>
+      </w:r>
+      <w:r>
+        <w:br/>
+      </w:r>
+      <w:r>
+        <w:rPr>
+          <w:rFonts w:ascii="Times New Roman" w:hAnsi="Times New Roman" w:cs="Times New Roman"/>
+          <w:sz w:val="24"/>
+          <w:b/>
+        </w:rPr>
+        <w:t>Requerimiento de reportes administrativos automáticos</w:t>
+      </w:r>
+    </w:p>
+    <w:p>
+      <w:pPr>
+        <w:pStyle w:val="normal1"/>
+        <w:spacing w:lineRule="auto" w:line="360" w:before="80" w:after="40"/>
+        <w:ind w:hanging="0" w:start="0"/>
+        <w:jc w:val="center"/>
         <w:rPr>
           <w:rFonts w:ascii="Times New Roman" w:hAnsi="Times New Roman" w:eastAsia="Times New Roman" w:cs="Times New Roman"/>
           <w:b/>
           <w:sz w:val="24"/>
         </w:rPr>
+        <w:keepNext/>
       </w:pPr>
       <w:r>
         <w:rPr>
@@ -9989,24 +9856,16 @@
           <w:sz w:val="24"/>
         </w:rPr>
         <w:drawing>
-          <wp:anchor distT="0" distB="0" distL="0" distR="0" simplePos="0" relativeHeight="22" behindDoc="0" locked="0" layoutInCell="0" allowOverlap="1">
-            <wp:simplePos x="0" y="0"/>
-            <wp:positionH relativeFrom="column">
-              <wp:posOffset>902335</wp:posOffset>
-            </wp:positionH>
-            <wp:positionV relativeFrom="paragraph">
-              <wp:posOffset>93980</wp:posOffset>
-            </wp:positionV>
+          <wp:inline distT="0" distB="0" distL="0" distR="0">
             <wp:extent cx="3397250" cy="2426335"/>
             <wp:effectExtent l="0" t="0" r="0" b="0"/>
-            <wp:wrapSquare wrapText="largest"/>
             <wp:docPr id="10" name="Image6 Copy 1 Copy 3"/>
             <wp:cNvGraphicFramePr>
               <a:graphicFrameLocks xmlns:a="http://schemas.openxmlformats.org/drawingml/2006/main" noChangeAspect="1"/>
             </wp:cNvGraphicFramePr>
             <a:graphic xmlns:a="http://schemas.openxmlformats.org/drawingml/2006/main">
               <a:graphicData uri="http://schemas.openxmlformats.org/drawingml/2006/picture">
-                <pic:pic xmlns:pic="http://schemas.openxmlformats.org/drawingml/2006/picture">
+                <pic:pic>
                   <pic:nvPicPr>
                     <pic:cNvPr id="10" name="Image6 Copy 1 Copy 3"/>
                     <pic:cNvPicPr>
@@ -10032,114 +9891,114 @@
                 </pic:pic>
               </a:graphicData>
             </a:graphic>
-          </wp:anchor>
+          </wp:inline>
         </w:drawing>
       </w:r>
     </w:p>
     <w:p>
       <w:pPr>
         <w:pStyle w:val="normal1"/>
-        <w:spacing w:lineRule="auto" w:line="360" w:before="0" w:after="120"/>
+        <w:spacing w:line="360" w:lineRule="auto" w:before="40" w:after="160"/>
+        <w:ind w:hanging="0" w:start="0"/>
+        <w:jc w:val="left"/>
+      </w:pPr>
+      <w:r>
+        <w:rPr>
+          <w:rFonts w:ascii="Times New Roman" w:hAnsi="Times New Roman" w:cs="Times New Roman"/>
+          <w:sz w:val="24"/>
+        </w:rPr>
+        <w:t>Fuente: Alvarado, L. (2026).</w:t>
+      </w:r>
+    </w:p>
+    <w:p>
+      <w:pPr>
+        <w:pStyle w:val="normal1"/>
+        <w:spacing w:line="360" w:lineRule="auto" w:before="160" w:after="80"/>
+        <w:ind w:hanging="0" w:start="0"/>
+        <w:jc w:val="left"/>
+        <w:keepNext/>
+      </w:pPr>
+      <w:r>
+        <w:rPr>
+          <w:rFonts w:ascii="Times New Roman" w:hAnsi="Times New Roman" w:cs="Times New Roman"/>
+          <w:sz w:val="24"/>
+          <w:b/>
+        </w:rPr>
+        <w:t>Análisis e Interpretación</w:t>
+      </w:r>
+    </w:p>
+    <w:p>
+      <w:pPr>
+        <w:pStyle w:val="normal1"/>
+        <w:spacing w:line="360" w:lineRule="auto" w:before="0" w:after="120"/>
+        <w:ind w:hanging="0" w:firstLine="720"/>
+        <w:jc w:val="justify"/>
+      </w:pPr>
+      <w:r>
+        <w:rPr>
+          <w:rFonts w:ascii="Times New Roman" w:hAnsi="Times New Roman" w:cs="Times New Roman"/>
+          <w:sz w:val="24"/>
+        </w:rPr>
+        <w:t>El Cuadro 7 demuestra que la totalidad de la muestra (100%) afirma requerir reportes administrativos automáticos para apoyar las funciones de la alta gerencia. Este indicador unánime refleja una necesidad gerencial insatisfecha por el actual modelo manual, el cual demanda una alta e improductiva inversión de horas-hombre para consolidar los cuadres de caja y el estado global del inventario.</w:t>
+      </w:r>
+    </w:p>
+    <w:p>
+      <w:pPr>
+        <w:pStyle w:val="normal1"/>
+        <w:spacing w:line="360" w:lineRule="auto" w:before="0" w:after="240"/>
+        <w:ind w:hanging="0" w:firstLine="720"/>
+        <w:jc w:val="justify"/>
+      </w:pPr>
+      <w:r>
+        <w:rPr>
+          <w:rFonts w:ascii="Times New Roman" w:hAnsi="Times New Roman" w:cs="Times New Roman"/>
+          <w:sz w:val="24"/>
+        </w:rPr>
+        <w:t>Teóricamente, esto se alinea con la definición de sistemas de información gerencial, cuyo propósito principal es procesar datos transaccionales para la toma de decisiones estratégicas de la directiva. El nuevo software cumplirá con este requerimiento imperativo al incorporar un módulo de reportes automatizados que ofrecerá métricas exactas y balances financieros en tiempo real a la gerencia de la empresa.</w:t>
+      </w:r>
+    </w:p>
+    <w:p>
+      <w:pPr>
+        <w:pStyle w:val="normal1"/>
+        <w:spacing w:line="360" w:lineRule="auto" w:before="240" w:after="120"/>
+        <w:ind w:hanging="0" w:start="0"/>
+        <w:jc w:val="justify"/>
+        <w:keepNext/>
+      </w:pPr>
+      <w:r>
+        <w:rPr>
+          <w:rFonts w:ascii="Times New Roman" w:hAnsi="Times New Roman" w:cs="Times New Roman"/>
+          <w:sz w:val="24"/>
+          <w:b/>
+        </w:rPr>
+        <w:t>Ítem 8. ¿Es la automatización de consultas esencial para el flujo de trabajo?</w:t>
+      </w:r>
+    </w:p>
+    <w:p>
+      <w:pPr>
+        <w:pStyle w:val="normal1"/>
+        <w:spacing w:line="360" w:lineRule="auto" w:before="120" w:after="120"/>
         <w:ind w:hanging="0" w:start="0"/>
         <w:jc w:val="center"/>
-        <w:rPr>
-          <w:rFonts w:ascii="Times New Roman" w:hAnsi="Times New Roman" w:eastAsia="Times New Roman" w:cs="Times New Roman"/>
-          <w:b/>
-          <w:sz w:val="24"/>
-        </w:rPr>
-      </w:pPr>
-      <w:r>
-        <w:rPr>
-          <w:rFonts w:eastAsia="Times New Roman" w:cs="Times New Roman" w:ascii="Times New Roman" w:hAnsi="Times New Roman"/>
-          <w:b/>
-          <w:sz w:val="24"/>
-        </w:rPr>
-      </w:r>
-    </w:p>
-    <w:p>
-      <w:pPr>
-        <w:pStyle w:val="normal1"/>
-        <w:spacing w:lineRule="auto" w:line="360" w:before="0" w:after="120"/>
-        <w:ind w:hanging="0" w:start="0"/>
-        <w:jc w:val="start"/>
-        <w:rPr/>
-      </w:pPr>
-      <w:r>
-        <w:rPr>
-          <w:rFonts w:eastAsia="Times New Roman" w:cs="Times New Roman" w:ascii="Times New Roman" w:hAnsi="Times New Roman"/>
-          <w:b/>
-          <w:sz w:val="24"/>
-        </w:rPr>
-        <w:t>Análisis e Interpretación</w:t>
-      </w:r>
-    </w:p>
-    <w:p>
-      <w:pPr>
-        <w:pStyle w:val="normal1"/>
-        <w:spacing w:lineRule="auto" w:line="360" w:before="0" w:after="120"/>
-        <w:ind w:firstLine="720" w:start="0"/>
-        <w:jc w:val="both"/>
-        <w:rPr/>
-      </w:pPr>
-      <w:r>
-        <w:rPr>
-          <w:rFonts w:eastAsia="Times New Roman" w:cs="Times New Roman" w:ascii="Times New Roman" w:hAnsi="Times New Roman"/>
-          <w:b w:val="false"/>
-          <w:sz w:val="24"/>
-        </w:rPr>
-        <w:t>El Cuadro 7 demuestra que la totalidad de la muestra (100%) afirma requerir reportes administrativos automáticos para apoyar las funciones de la alta gerencia. Este indicador unánime refleja una necesidad gerencial insatisfecha por el actual modelo manual, el cual demanda una alta e improductiva inversión de horas-hombre para consolidar los cuadres de caja y el estado global del inventario.</w:t>
-      </w:r>
-    </w:p>
-    <w:p>
-      <w:pPr>
-        <w:pStyle w:val="normal1"/>
-        <w:spacing w:lineRule="auto" w:line="360" w:before="0" w:after="120"/>
-        <w:ind w:firstLine="720" w:start="0"/>
-        <w:jc w:val="both"/>
-        <w:rPr/>
-      </w:pPr>
-      <w:r>
-        <w:rPr>
-          <w:rFonts w:eastAsia="Times New Roman" w:cs="Times New Roman" w:ascii="Times New Roman" w:hAnsi="Times New Roman"/>
-          <w:b w:val="false"/>
-          <w:sz w:val="24"/>
-        </w:rPr>
-        <w:t>Teóricamente, esto se alinea con la definición de sistemas de información gerencial, cuyo propósito principal es procesar datos transaccionales para la toma de decisiones estratégicas de la directiva. El nuevo software cumplirá con este requerimiento imperativo al incorporar un módulo de reportes automatizados que ofrecerá métricas exactas y balances financieros en tiempo real a la gerencia de la empresa.</w:t>
-      </w:r>
-    </w:p>
-    <w:p>
-      <w:pPr>
-        <w:pStyle w:val="normal1"/>
-        <w:spacing w:lineRule="auto" w:line="360" w:before="0" w:after="120"/>
-        <w:ind w:hanging="0" w:start="0"/>
-        <w:jc w:val="start"/>
-        <w:rPr/>
-      </w:pPr>
-      <w:r>
-        <w:rPr>
-          <w:rFonts w:eastAsia="Times New Roman" w:cs="Times New Roman" w:ascii="Times New Roman" w:hAnsi="Times New Roman"/>
-          <w:b/>
-          <w:sz w:val="24"/>
-        </w:rPr>
-        <w:t>Ítem 8. ¿Es la automatización de consultas esencial para el flujo de trabajo?</w:t>
-      </w:r>
-    </w:p>
-    <w:p>
-      <w:pPr>
-        <w:pStyle w:val="normal1"/>
-        <w:spacing w:lineRule="auto" w:line="360" w:before="0" w:after="120"/>
-        <w:ind w:hanging="0" w:start="0"/>
-        <w:jc w:val="center"/>
-        <w:rPr/>
-      </w:pPr>
-      <w:r>
-        <w:rPr>
-          <w:rFonts w:eastAsia="Times New Roman" w:cs="Times New Roman" w:ascii="Times New Roman" w:hAnsi="Times New Roman"/>
-          <w:b w:val="false"/>
-          <w:sz w:val="24"/>
+        <w:keepNext/>
+      </w:pPr>
+      <w:r>
+        <w:rPr>
+          <w:rFonts w:ascii="Times New Roman" w:hAnsi="Times New Roman" w:cs="Times New Roman"/>
+          <w:sz w:val="24"/>
+          <w:b/>
         </w:rPr>
         <w:t>Cuadro 8</w:t>
+      </w:r>
+      <w:r>
         <w:br/>
+      </w:r>
+      <w:r>
+        <w:rPr>
+          <w:rFonts w:ascii="Times New Roman" w:hAnsi="Times New Roman" w:cs="Times New Roman"/>
+          <w:sz w:val="24"/>
+          <w:b/>
+        </w:rPr>
         <w:t>Esencialidad de la automatización de consultas</w:t>
       </w:r>
     </w:p>
@@ -10492,15 +10351,13 @@
     <w:p>
       <w:pPr>
         <w:pStyle w:val="normal1"/>
-        <w:spacing w:lineRule="auto" w:line="360" w:before="0" w:after="120"/>
+        <w:spacing w:line="360" w:lineRule="auto" w:before="40" w:after="160"/>
         <w:ind w:hanging="0" w:start="0"/>
-        <w:jc w:val="start"/>
-        <w:rPr/>
-      </w:pPr>
-      <w:r>
-        <w:rPr>
-          <w:rFonts w:eastAsia="Times New Roman" w:cs="Times New Roman" w:ascii="Times New Roman" w:hAnsi="Times New Roman"/>
-          <w:b w:val="false"/>
+        <w:jc w:val="left"/>
+      </w:pPr>
+      <w:r>
+        <w:rPr>
+          <w:rFonts w:ascii="Times New Roman" w:hAnsi="Times New Roman" w:cs="Times New Roman"/>
           <w:sz w:val="24"/>
         </w:rPr>
         <w:t>Fuente: Alvarado, L. (2026).</w:t>
@@ -10509,27 +10366,35 @@
     <w:p>
       <w:pPr>
         <w:pStyle w:val="normal1"/>
-        <w:spacing w:lineRule="auto" w:line="360" w:before="0" w:after="120"/>
+        <w:spacing w:line="360" w:lineRule="auto" w:before="160" w:after="80"/>
         <w:ind w:hanging="0" w:start="0"/>
         <w:jc w:val="center"/>
-        <w:rPr>
-          <w:rFonts w:ascii="Times New Roman" w:hAnsi="Times New Roman" w:eastAsia="Times New Roman" w:cs="Times New Roman"/>
-          <w:b/>
-          <w:sz w:val="24"/>
-        </w:rPr>
-      </w:pPr>
-      <w:r>
-        <w:rPr>
-          <w:rFonts w:eastAsia="Times New Roman" w:cs="Times New Roman" w:ascii="Times New Roman" w:hAnsi="Times New Roman"/>
-          <w:b/>
-          <w:sz w:val="24"/>
-        </w:rPr>
-      </w:r>
-    </w:p>
-    <w:p>
-      <w:pPr>
-        <w:pStyle w:val="normal1"/>
-        <w:spacing w:lineRule="auto" w:line="360" w:before="0" w:after="120"/>
+        <w:keepNext/>
+      </w:pPr>
+      <w:r>
+        <w:rPr>
+          <w:rFonts w:ascii="Times New Roman" w:hAnsi="Times New Roman" w:cs="Times New Roman"/>
+          <w:sz w:val="24"/>
+          <w:b/>
+        </w:rPr>
+        <w:t>Gráfico 8</w:t>
+      </w:r>
+      <w:r>
+        <w:br/>
+      </w:r>
+      <w:r>
+        <w:rPr>
+          <w:rFonts w:ascii="Times New Roman" w:hAnsi="Times New Roman" w:cs="Times New Roman"/>
+          <w:sz w:val="24"/>
+          <w:b/>
+        </w:rPr>
+        <w:t>Esencialidad de la automatización de consultas</w:t>
+      </w:r>
+    </w:p>
+    <w:p>
+      <w:pPr>
+        <w:pStyle w:val="normal1"/>
+        <w:spacing w:lineRule="auto" w:line="360" w:before="80" w:after="40"/>
         <w:ind w:hanging="0" w:start="0"/>
         <w:jc w:val="center"/>
         <w:rPr>
@@ -10537,6 +10402,7 @@
           <w:b/>
           <w:sz w:val="24"/>
         </w:rPr>
+        <w:keepNext/>
       </w:pPr>
       <w:r>
         <w:rPr>
@@ -10545,24 +10411,16 @@
           <w:sz w:val="24"/>
         </w:rPr>
         <w:drawing>
-          <wp:anchor distT="0" distB="0" distL="0" distR="0" simplePos="0" relativeHeight="24" behindDoc="0" locked="0" layoutInCell="0" allowOverlap="1">
-            <wp:simplePos x="0" y="0"/>
-            <wp:positionH relativeFrom="column">
-              <wp:posOffset>902335</wp:posOffset>
-            </wp:positionH>
-            <wp:positionV relativeFrom="paragraph">
-              <wp:posOffset>93980</wp:posOffset>
-            </wp:positionV>
+          <wp:inline distT="0" distB="0" distL="0" distR="0">
             <wp:extent cx="3397250" cy="2426335"/>
             <wp:effectExtent l="0" t="0" r="0" b="0"/>
-            <wp:wrapSquare wrapText="largest"/>
             <wp:docPr id="11" name="Image6 Copy 1 Copy 2 Copy 1"/>
             <wp:cNvGraphicFramePr>
               <a:graphicFrameLocks xmlns:a="http://schemas.openxmlformats.org/drawingml/2006/main" noChangeAspect="1"/>
             </wp:cNvGraphicFramePr>
             <a:graphic xmlns:a="http://schemas.openxmlformats.org/drawingml/2006/main">
               <a:graphicData uri="http://schemas.openxmlformats.org/drawingml/2006/picture">
-                <pic:pic xmlns:pic="http://schemas.openxmlformats.org/drawingml/2006/picture">
+                <pic:pic>
                   <pic:nvPicPr>
                     <pic:cNvPr id="11" name="Image6 Copy 1 Copy 2 Copy 1"/>
                     <pic:cNvPicPr>
@@ -10588,23 +10446,38 @@
                 </pic:pic>
               </a:graphicData>
             </a:graphic>
-          </wp:anchor>
+          </wp:inline>
         </w:drawing>
       </w:r>
     </w:p>
     <w:p>
       <w:pPr>
         <w:pStyle w:val="normal1"/>
-        <w:spacing w:lineRule="auto" w:line="360" w:before="0" w:after="120"/>
+        <w:spacing w:line="360" w:lineRule="auto" w:before="40" w:after="160"/>
         <w:ind w:hanging="0" w:start="0"/>
-        <w:jc w:val="start"/>
-        <w:rPr/>
-      </w:pPr>
-      <w:r>
-        <w:rPr>
-          <w:rFonts w:eastAsia="Times New Roman" w:cs="Times New Roman" w:ascii="Times New Roman" w:hAnsi="Times New Roman"/>
-          <w:b/>
-          <w:sz w:val="24"/>
+        <w:jc w:val="left"/>
+      </w:pPr>
+      <w:r>
+        <w:rPr>
+          <w:rFonts w:ascii="Times New Roman" w:hAnsi="Times New Roman" w:cs="Times New Roman"/>
+          <w:sz w:val="24"/>
+        </w:rPr>
+        <w:t>Fuente: Alvarado, L. (2026).</w:t>
+      </w:r>
+    </w:p>
+    <w:p>
+      <w:pPr>
+        <w:pStyle w:val="normal1"/>
+        <w:spacing w:line="360" w:lineRule="auto" w:before="160" w:after="80"/>
+        <w:ind w:hanging="0" w:start="0"/>
+        <w:jc w:val="left"/>
+        <w:keepNext/>
+      </w:pPr>
+      <w:r>
+        <w:rPr>
+          <w:rFonts w:ascii="Times New Roman" w:hAnsi="Times New Roman" w:cs="Times New Roman"/>
+          <w:sz w:val="24"/>
+          <w:b/>
         </w:rPr>
         <w:t>Análisis e Interpretación</w:t>
       </w:r>
@@ -10612,15 +10485,13 @@
     <w:p>
       <w:pPr>
         <w:pStyle w:val="normal1"/>
-        <w:spacing w:lineRule="auto" w:line="360" w:before="0" w:after="120"/>
-        <w:ind w:firstLine="720" w:start="0"/>
-        <w:jc w:val="both"/>
-        <w:rPr/>
-      </w:pPr>
-      <w:r>
-        <w:rPr>
-          <w:rFonts w:eastAsia="Times New Roman" w:cs="Times New Roman" w:ascii="Times New Roman" w:hAnsi="Times New Roman"/>
-          <w:b w:val="false"/>
+        <w:spacing w:line="360" w:lineRule="auto" w:before="0" w:after="120"/>
+        <w:ind w:hanging="0" w:firstLine="720"/>
+        <w:jc w:val="justify"/>
+      </w:pPr>
+      <w:r>
+        <w:rPr>
+          <w:rFonts w:ascii="Times New Roman" w:hAnsi="Times New Roman" w:cs="Times New Roman"/>
           <w:sz w:val="24"/>
         </w:rPr>
         <w:t>Finalmente, el Cuadro 8 refleja que el 100% de los empleados encuestados considera que la automatización de consultas es un elemento esencial para optimizar el flujo de trabajo diario de la organización. Este resultado reafirma de manera concluyente la viabilidad y pertinencia del proyecto factible aquí planteado.</w:t>
@@ -10629,65 +10500,16 @@
     <w:p>
       <w:pPr>
         <w:pStyle w:val="normal1"/>
-        <w:spacing w:lineRule="auto" w:line="360" w:before="0" w:after="120"/>
-        <w:ind w:firstLine="720" w:start="0"/>
-        <w:jc w:val="both"/>
-        <w:rPr>
-          <w:rFonts w:ascii="Times New Roman" w:hAnsi="Times New Roman" w:eastAsia="Times New Roman" w:cs="Times New Roman"/>
-          <w:b w:val="false"/>
-          <w:sz w:val="24"/>
-        </w:rPr>
-      </w:pPr>
-      <w:r>
-        <w:rPr>
-          <w:rFonts w:eastAsia="Times New Roman" w:cs="Times New Roman" w:ascii="Times New Roman" w:hAnsi="Times New Roman"/>
-          <w:b w:val="false"/>
+        <w:spacing w:line="360" w:lineRule="auto" w:before="0" w:after="240"/>
+        <w:ind w:hanging="0" w:firstLine="720"/>
+        <w:jc w:val="justify"/>
+      </w:pPr>
+      <w:r>
+        <w:rPr>
+          <w:rFonts w:ascii="Times New Roman" w:hAnsi="Times New Roman" w:cs="Times New Roman"/>
           <w:sz w:val="24"/>
         </w:rPr>
         <w:t>Al automatizar la consulta del estatus de los contratos prendarios, los cálculos de interés compuesto y la disponibilidad de metales en bóveda, se eliminarán drásticamente los tiempos muertos operativos, garantizando simultáneamente una atención al cliente de primer nivel. Este hallazgo cierra la etapa de diagnóstico con una validación absoluta por parte de los futuros usuarios, justificando tanto técnica como operativamente la implementación definitiva del sistema de información web para Inversiones Más Por Tu Oro 17 C.A.</w:t>
-      </w:r>
-    </w:p>
-    <w:p>
-      <w:pPr>
-        <w:pStyle w:val="normal1"/>
-        <w:spacing w:lineRule="auto" w:line="360" w:before="0" w:after="120"/>
-        <w:ind w:firstLine="720" w:start="0"/>
-        <w:jc w:val="both"/>
-        <w:rPr>
-          <w:rFonts w:ascii="Times New Roman" w:hAnsi="Times New Roman" w:eastAsia="Times New Roman" w:cs="Times New Roman"/>
-          <w:b w:val="false"/>
-          <w:sz w:val="24"/>
-        </w:rPr>
-      </w:pPr>
-      <w:r>
-        <w:rPr>
-          <w:rFonts w:eastAsia="Times New Roman" w:cs="Times New Roman" w:ascii="Times New Roman" w:hAnsi="Times New Roman"/>
-          <w:b w:val="false"/>
-          <w:sz w:val="24"/>
-        </w:rPr>
-      </w:r>
-    </w:p>
-    <w:p>
-      <w:pPr>
-        <w:pStyle w:val="normal1"/>
-        <w:spacing w:lineRule="auto" w:line="360" w:before="0" w:after="120"/>
-        <w:ind w:firstLine="720" w:start="0"/>
-        <w:jc w:val="both"/>
-        <w:rPr>
-          <w:rFonts w:ascii="Times New Roman" w:hAnsi="Times New Roman" w:eastAsia="Times New Roman" w:cs="Times New Roman"/>
-          <w:b w:val="false"/>
-          <w:sz w:val="24"/>
-        </w:rPr>
-      </w:pPr>
-      <w:r>
-        <w:rPr>
-          <w:rFonts w:eastAsia="Times New Roman" w:cs="Times New Roman" w:ascii="Times New Roman" w:hAnsi="Times New Roman"/>
-          <w:b w:val="false"/>
-          <w:sz w:val="24"/>
-        </w:rPr>
-      </w:r>
-      <w:r>
-        <w:br w:type="page"/>
       </w:r>
     </w:p>
     <w:p>

</xml_diff>

<commit_message>
fix(thesis): unify architecture into single Next.js stack and reframe as academic proposal
</commit_message>
<xml_diff>
--- a/proyecto_de_grado/final.docx
+++ b/proyecto_de_grado/final.docx
@@ -1005,7 +1005,7 @@
           <w:i w:val="0"/>
           <w:sz w:val="24"/>
         </w:rPr>
-        <w:t>Justificación de la Investigación .................................   3</w:t>
+        <w:t>Justificación de la Investigación .................................   2</w:t>
       </w:r>
     </w:p>
     <w:p>
@@ -1090,7 +1090,7 @@
           <w:i w:val="0"/>
           <w:sz w:val="24"/>
         </w:rPr>
-        <w:t>Sistema de Variables .............................................   12</w:t>
+        <w:t>Sistema de Variables .............................................   11</w:t>
       </w:r>
     </w:p>
     <w:p>
@@ -1285,7 +1285,7 @@
           <w:i w:val="0"/>
           <w:sz w:val="24"/>
         </w:rPr>
-        <w:t>Recomendaciones ..................................................   32</w:t>
+        <w:t>Recomendaciones ..................................................   31</w:t>
       </w:r>
     </w:p>
     <w:p>
@@ -1327,7 +1327,7 @@
           <w:i w:val="0"/>
           <w:sz w:val="24"/>
         </w:rPr>
-        <w:t>Objetivos de la Propuesta ........................................   35</w:t>
+        <w:t>Objetivos de la Propuesta ........................................   34</w:t>
       </w:r>
     </w:p>
     <w:p>
@@ -1355,7 +1355,7 @@
           <w:i w:val="0"/>
           <w:sz w:val="24"/>
         </w:rPr>
-        <w:t>Estudio de Factibilidad (Mercado, Técnica y Económica) ...........   37</w:t>
+        <w:t>Estudio de Factibilidad (Mercado, Técnica y Económica) ...........   16</w:t>
       </w:r>
     </w:p>
     <w:p>
@@ -2604,7 +2604,7 @@
       <w:pPr>
         <w:pStyle w:val="normal1"/>
         <w:spacing w:lineRule="auto" w:line="360" w:before="0" w:after="240"/>
-        <w:ind w:firstLine="720" w:start="0"/>
+        <w:ind w:start="0" w:firstLine="720"/>
         <w:jc w:val="both"/>
         <w:rPr>
           <w:rFonts w:ascii="Times New Roman" w:hAnsi="Times New Roman" w:eastAsia="Times New Roman" w:cs="Times New Roman"/>
@@ -2614,9 +2614,9 @@
       </w:pPr>
       <w:r>
         <w:rPr>
-          <w:rFonts w:eastAsia="Times New Roman" w:cs="Times New Roman" w:ascii="Times New Roman" w:hAnsi="Times New Roman"/>
-          <w:b w:val="false"/>
-          <w:i w:val="false"/>
+          <w:rFonts w:ascii="Times New Roman" w:hAnsi="Times New Roman" w:cs="Times New Roman"/>
+          <w:b w:val="0"/>
+          <w:i w:val="0"/>
           <w:sz w:val="24"/>
         </w:rPr>
         <w:t>¿Cuál es el estado actual de los procesos de registro, control de inventario y atención al cliente en la empresa Inversiones Más Por Tu Oro 17 C.A.?</w:t>
@@ -2626,7 +2626,7 @@
       <w:pPr>
         <w:pStyle w:val="normal1"/>
         <w:spacing w:lineRule="auto" w:line="360" w:before="0" w:after="240"/>
-        <w:ind w:firstLine="720" w:start="0"/>
+        <w:ind w:start="0" w:firstLine="720"/>
         <w:jc w:val="both"/>
         <w:rPr>
           <w:rFonts w:ascii="Times New Roman" w:hAnsi="Times New Roman" w:eastAsia="Times New Roman" w:cs="Times New Roman"/>
@@ -2636,19 +2636,19 @@
       </w:pPr>
       <w:r>
         <w:rPr>
-          <w:rFonts w:eastAsia="Times New Roman" w:cs="Times New Roman" w:ascii="Times New Roman" w:hAnsi="Times New Roman"/>
-          <w:b w:val="false"/>
-          <w:i w:val="false"/>
-          <w:sz w:val="24"/>
-        </w:rPr>
-        <w:t>¿Qué requerimientos técnicos y funcionales son necesarios para la automatización y optimización de la gestión de inventario y control de préstamos prendarios de la empresa?</w:t>
+          <w:rFonts w:ascii="Times New Roman" w:hAnsi="Times New Roman" w:cs="Times New Roman"/>
+          <w:b w:val="0"/>
+          <w:i w:val="0"/>
+          <w:sz w:val="24"/>
+        </w:rPr>
+        <w:t>¿Cuál es la factibilidad técnica, operativa y económica de proponer un sistema de información para la gestión de inventario y control de préstamos prendarios en la empresa?</w:t>
       </w:r>
     </w:p>
     <w:p>
       <w:pPr>
         <w:pStyle w:val="normal1"/>
         <w:spacing w:lineRule="auto" w:line="360" w:before="0" w:after="240"/>
-        <w:ind w:firstLine="720" w:start="0"/>
+        <w:ind w:start="0" w:firstLine="720"/>
         <w:jc w:val="both"/>
         <w:rPr>
           <w:rFonts w:ascii="Times New Roman" w:hAnsi="Times New Roman" w:eastAsia="Times New Roman" w:cs="Times New Roman"/>
@@ -2658,19 +2658,123 @@
       </w:pPr>
       <w:r>
         <w:rPr>
-          <w:rFonts w:eastAsia="Times New Roman" w:cs="Times New Roman" w:ascii="Times New Roman" w:hAnsi="Times New Roman"/>
-          <w:b w:val="false"/>
-          <w:i w:val="false"/>
-          <w:sz w:val="24"/>
-        </w:rPr>
-        <w:t>¿Cómo debe diseñarse la arquitectura lógica del sistema, su base de datos relacional y las interfaces de usuario para garantizar la centralización y seguridad de la información?</w:t>
+          <w:rFonts w:ascii="Times New Roman" w:hAnsi="Times New Roman" w:cs="Times New Roman"/>
+          <w:b w:val="0"/>
+          <w:i w:val="0"/>
+          <w:sz w:val="24"/>
+        </w:rPr>
+        <w:t>¿Cómo debe estructurarse el diseño de la propuesta del sistema de información, integrando la arquitectura web en tres capas, el modelo de datos relacional, las interfaces de usuario y el manual de operación?</w:t>
+      </w:r>
+    </w:p>
+    <w:p>
+      <w:pPr>
+        <w:pStyle w:val="normal1"/>
+        <w:spacing w:lineRule="auto" w:line="360"/>
+        <w:jc w:val="both"/>
+        <w:rPr>
+          <w:rFonts w:ascii="Times New Roman" w:hAnsi="Times New Roman" w:eastAsia="Times New Roman" w:cs="Times New Roman"/>
+          <w:b/>
+          <w:bCs/>
+          <w:sz w:val="24"/>
+          <w:szCs w:val="24"/>
+        </w:rPr>
+      </w:pPr>
+      <w:r>
+        <w:rPr>
+          <w:rFonts w:eastAsia="Times New Roman" w:cs="Times New Roman" w:ascii="Times New Roman" w:hAnsi="Times New Roman"/>
+          <w:b/>
+          <w:bCs/>
+          <w:sz w:val="24"/>
+          <w:szCs w:val="24"/>
+        </w:rPr>
+        <w:t xml:space="preserve"> </w:t>
+      </w:r>
+      <w:r>
+        <w:rPr>
+          <w:rFonts w:eastAsia="Times New Roman" w:cs="Times New Roman" w:ascii="Times New Roman" w:hAnsi="Times New Roman"/>
+          <w:b/>
+          <w:bCs/>
+          <w:sz w:val="24"/>
+          <w:szCs w:val="24"/>
+        </w:rPr>
+        <w:t>Objetivos de Investigación</w:t>
+      </w:r>
+    </w:p>
+    <w:p>
+      <w:pPr>
+        <w:pStyle w:val="normal1"/>
+        <w:spacing w:lineRule="auto" w:line="360"/>
+        <w:jc w:val="both"/>
+        <w:rPr>
+          <w:rFonts w:ascii="Times New Roman" w:hAnsi="Times New Roman" w:eastAsia="Times New Roman" w:cs="Times New Roman"/>
+          <w:b/>
+          <w:bCs/>
+          <w:sz w:val="24"/>
+          <w:szCs w:val="24"/>
+        </w:rPr>
+      </w:pPr>
+      <w:r>
+        <w:rPr>
+          <w:rFonts w:eastAsia="Times New Roman" w:cs="Times New Roman" w:ascii="Times New Roman" w:hAnsi="Times New Roman"/>
+          <w:b/>
+          <w:bCs/>
+          <w:sz w:val="24"/>
+          <w:szCs w:val="24"/>
+        </w:rPr>
+        <w:t>Objetivo General</w:t>
+      </w:r>
+    </w:p>
+    <w:p>
+      <w:pPr>
+        <w:pStyle w:val="normal1"/>
+        <w:spacing w:lineRule="auto" w:line="360" w:before="0" w:after="120"/>
+        <w:ind w:start="0" w:firstLine="720"/>
+        <w:jc w:val="both"/>
+        <w:rPr>
+          <w:rFonts w:ascii="Times New Roman" w:hAnsi="Times New Roman" w:eastAsia="Times New Roman" w:cs="Times New Roman"/>
+          <w:sz w:val="24"/>
+          <w:szCs w:val="24"/>
+        </w:rPr>
+      </w:pPr>
+      <w:r>
+        <w:rPr>
+          <w:rFonts w:ascii="Times New Roman" w:hAnsi="Times New Roman" w:cs="Times New Roman"/>
+          <w:b w:val="0"/>
+          <w:i w:val="0"/>
+          <w:sz w:val="24"/>
+        </w:rPr>
+        <w:t>Proponer un Sistema de Información para la Gestión de Inventario y Control de Préstamos Prendarios en la empresa Inversiones Más Por Tu Oro 17 C.A.</w:t>
+      </w:r>
+    </w:p>
+    <w:p>
+      <w:pPr>
+        <w:pStyle w:val="normal1"/>
+        <w:spacing w:lineRule="auto" w:line="360"/>
+        <w:jc w:val="both"/>
+        <w:rPr>
+          <w:rFonts w:ascii="Times New Roman" w:hAnsi="Times New Roman" w:eastAsia="Times New Roman" w:cs="Times New Roman"/>
+          <w:b/>
+          <w:bCs/>
+          <w:sz w:val="24"/>
+          <w:szCs w:val="24"/>
+        </w:rPr>
+      </w:pPr>
+      <w:r>
+        <w:rPr>
+          <w:rFonts w:eastAsia="Times New Roman" w:cs="Times New Roman" w:ascii="Times New Roman" w:hAnsi="Times New Roman"/>
+          <w:b/>
+          <w:bCs/>
+          <w:sz w:val="24"/>
+          <w:szCs w:val="24"/>
+        </w:rPr>
+        <w:t>Objetivos Específicos</w:t>
       </w:r>
     </w:p>
     <w:p>
       <w:pPr>
         <w:pStyle w:val="normal1"/>
         <w:spacing w:lineRule="auto" w:line="360" w:before="0" w:after="240"/>
-        <w:ind w:firstLine="720" w:start="0"/>
+        <w:ind w:start="0" w:firstLine="720"/>
         <w:jc w:val="both"/>
         <w:rPr>
           <w:rFonts w:ascii="Times New Roman" w:hAnsi="Times New Roman" w:eastAsia="Times New Roman" w:cs="Times New Roman"/>
@@ -2680,203 +2784,56 @@
       </w:pPr>
       <w:r>
         <w:rPr>
-          <w:rFonts w:eastAsia="Times New Roman" w:cs="Times New Roman" w:ascii="Times New Roman" w:hAnsi="Times New Roman"/>
-          <w:b w:val="false"/>
-          <w:i w:val="false"/>
-          <w:sz w:val="24"/>
-        </w:rPr>
-        <w:t>¿De qué manera el desarrollo e implementación del sistema de información propuesto optimizará el tiempo de respuesta y la confiabilidad de las operaciones de la empresa?</w:t>
-      </w:r>
-    </w:p>
-    <w:p>
-      <w:pPr>
-        <w:pStyle w:val="normal1"/>
-        <w:spacing w:lineRule="auto" w:line="360"/>
+          <w:rFonts w:ascii="Times New Roman" w:hAnsi="Times New Roman" w:cs="Times New Roman"/>
+          <w:b w:val="0"/>
+          <w:i w:val="0"/>
+          <w:sz w:val="24"/>
+        </w:rPr>
+        <w:t>1. Diagnosticar el estado actual de los procesos de registro, control de inventario y atención al cliente en la empresa Inversiones Más Por Tu Oro 17 C.A.</w:t>
+      </w:r>
+    </w:p>
+    <w:p>
+      <w:pPr>
+        <w:pStyle w:val="normal1"/>
+        <w:spacing w:lineRule="auto" w:line="360" w:before="0" w:after="240"/>
+        <w:ind w:start="0" w:firstLine="720"/>
         <w:jc w:val="both"/>
         <w:rPr>
           <w:rFonts w:ascii="Times New Roman" w:hAnsi="Times New Roman" w:eastAsia="Times New Roman" w:cs="Times New Roman"/>
-          <w:b/>
-          <w:bCs/>
-          <w:sz w:val="24"/>
-          <w:szCs w:val="24"/>
-        </w:rPr>
-      </w:pPr>
-      <w:r>
-        <w:rPr>
-          <w:rFonts w:eastAsia="Times New Roman" w:cs="Times New Roman" w:ascii="Times New Roman" w:hAnsi="Times New Roman"/>
-          <w:b/>
-          <w:bCs/>
-          <w:sz w:val="24"/>
-          <w:szCs w:val="24"/>
-        </w:rPr>
-        <w:t xml:space="preserve"> </w:t>
-      </w:r>
-      <w:r>
-        <w:rPr>
-          <w:rFonts w:eastAsia="Times New Roman" w:cs="Times New Roman" w:ascii="Times New Roman" w:hAnsi="Times New Roman"/>
-          <w:b/>
-          <w:bCs/>
-          <w:sz w:val="24"/>
-          <w:szCs w:val="24"/>
-        </w:rPr>
-        <w:t>Objetivos de Investigación</w:t>
-      </w:r>
-    </w:p>
-    <w:p>
-      <w:pPr>
-        <w:pStyle w:val="normal1"/>
-        <w:spacing w:lineRule="auto" w:line="360"/>
+          <w:sz w:val="24"/>
+          <w:szCs w:val="24"/>
+        </w:rPr>
+      </w:pPr>
+      <w:r>
+        <w:rPr>
+          <w:rFonts w:ascii="Times New Roman" w:hAnsi="Times New Roman" w:cs="Times New Roman"/>
+          <w:b w:val="0"/>
+          <w:i w:val="0"/>
+          <w:sz w:val="24"/>
+        </w:rPr>
+        <w:t>2. Determinar la factibilidad técnica, operativa y económica para la propuesta de un sistema de información en la empresa.</w:t>
+      </w:r>
+    </w:p>
+    <w:p>
+      <w:pPr>
+        <w:pStyle w:val="normal1"/>
+        <w:spacing w:lineRule="auto" w:line="360" w:before="0" w:after="240"/>
+        <w:ind w:start="0" w:firstLine="720"/>
         <w:jc w:val="both"/>
         <w:rPr>
           <w:rFonts w:ascii="Times New Roman" w:hAnsi="Times New Roman" w:eastAsia="Times New Roman" w:cs="Times New Roman"/>
-          <w:b/>
-          <w:bCs/>
-          <w:sz w:val="24"/>
-          <w:szCs w:val="24"/>
-        </w:rPr>
-      </w:pPr>
-      <w:r>
-        <w:rPr>
-          <w:rFonts w:eastAsia="Times New Roman" w:cs="Times New Roman" w:ascii="Times New Roman" w:hAnsi="Times New Roman"/>
-          <w:b/>
-          <w:bCs/>
-          <w:sz w:val="24"/>
-          <w:szCs w:val="24"/>
-        </w:rPr>
-        <w:t>Objetivo General</w:t>
-      </w:r>
-    </w:p>
-    <w:p>
-      <w:pPr>
-        <w:pStyle w:val="normal1"/>
-        <w:spacing w:lineRule="auto" w:line="360" w:before="0" w:after="120"/>
-        <w:ind w:firstLine="720" w:start="0"/>
-        <w:jc w:val="both"/>
-        <w:rPr>
-          <w:rFonts w:ascii="Times New Roman" w:hAnsi="Times New Roman" w:eastAsia="Times New Roman" w:cs="Times New Roman"/>
-          <w:sz w:val="24"/>
-          <w:szCs w:val="24"/>
-        </w:rPr>
-      </w:pPr>
-      <w:r>
-        <w:rPr>
-          <w:rFonts w:eastAsia="Times New Roman" w:cs="Times New Roman" w:ascii="Times New Roman" w:hAnsi="Times New Roman"/>
-          <w:b w:val="false"/>
-          <w:sz w:val="24"/>
-        </w:rPr>
-        <w:t>Desarrollar un Sistema de Información para la Gestión de Inventario y Control de Préstamos Prendarios en la empresa Inversiones Más Por Tu Oro 17 C.A.</w:t>
-      </w:r>
-    </w:p>
-    <w:p>
-      <w:pPr>
-        <w:pStyle w:val="normal1"/>
-        <w:spacing w:lineRule="auto" w:line="360"/>
-        <w:jc w:val="both"/>
-        <w:rPr>
-          <w:rFonts w:ascii="Times New Roman" w:hAnsi="Times New Roman" w:eastAsia="Times New Roman" w:cs="Times New Roman"/>
-          <w:b/>
-          <w:bCs/>
-          <w:sz w:val="24"/>
-          <w:szCs w:val="24"/>
-        </w:rPr>
-      </w:pPr>
-      <w:r>
-        <w:rPr>
-          <w:rFonts w:eastAsia="Times New Roman" w:cs="Times New Roman" w:ascii="Times New Roman" w:hAnsi="Times New Roman"/>
-          <w:b/>
-          <w:bCs/>
-          <w:sz w:val="24"/>
-          <w:szCs w:val="24"/>
-        </w:rPr>
-        <w:t>Objetivos Específicos</w:t>
-      </w:r>
-    </w:p>
-    <w:p>
-      <w:pPr>
-        <w:pStyle w:val="normal1"/>
-        <w:spacing w:lineRule="auto" w:line="360" w:before="0" w:after="240"/>
-        <w:ind w:firstLine="720" w:start="0"/>
-        <w:jc w:val="both"/>
-        <w:rPr>
-          <w:rFonts w:ascii="Times New Roman" w:hAnsi="Times New Roman" w:eastAsia="Times New Roman" w:cs="Times New Roman"/>
-          <w:sz w:val="24"/>
-          <w:szCs w:val="24"/>
-        </w:rPr>
-      </w:pPr>
-      <w:r>
-        <w:rPr>
-          <w:rFonts w:eastAsia="Times New Roman" w:cs="Times New Roman" w:ascii="Times New Roman" w:hAnsi="Times New Roman"/>
-          <w:b w:val="false"/>
-          <w:i w:val="false"/>
-          <w:sz w:val="24"/>
-        </w:rPr>
-        <w:t>Diagnosticar el estado actual de los procesos de registro, control de inventario y atención al cliente en la empresa Inversiones Más Por Tu Oro 17 C.A.</w:t>
-      </w:r>
-    </w:p>
-    <w:p>
-      <w:pPr>
-        <w:pStyle w:val="normal1"/>
-        <w:spacing w:lineRule="auto" w:line="360" w:before="0" w:after="240"/>
-        <w:ind w:firstLine="720" w:start="0"/>
-        <w:jc w:val="both"/>
-        <w:rPr>
-          <w:rFonts w:ascii="Times New Roman" w:hAnsi="Times New Roman" w:eastAsia="Times New Roman" w:cs="Times New Roman"/>
-          <w:sz w:val="24"/>
-          <w:szCs w:val="24"/>
-        </w:rPr>
-      </w:pPr>
-      <w:r>
-        <w:rPr>
-          <w:rFonts w:eastAsia="Times New Roman" w:cs="Times New Roman" w:ascii="Times New Roman" w:hAnsi="Times New Roman"/>
-          <w:b w:val="false"/>
-          <w:i w:val="false"/>
-          <w:sz w:val="24"/>
-        </w:rPr>
-        <w:t>Determinar los requerimientos técnicos y funcionales necesarios para la automatización y optimización de la gestión de inventario y control de préstamos prendarios.</w:t>
-      </w:r>
-    </w:p>
-    <w:p>
-      <w:pPr>
-        <w:pStyle w:val="normal1"/>
-        <w:spacing w:lineRule="auto" w:line="360" w:before="0" w:after="240"/>
-        <w:ind w:firstLine="720" w:start="0"/>
-        <w:jc w:val="both"/>
-        <w:rPr>
-          <w:rFonts w:ascii="Times New Roman" w:hAnsi="Times New Roman" w:eastAsia="Times New Roman" w:cs="Times New Roman"/>
-          <w:sz w:val="24"/>
-          <w:szCs w:val="24"/>
-        </w:rPr>
-      </w:pPr>
-      <w:r>
-        <w:rPr>
-          <w:rFonts w:eastAsia="Times New Roman" w:cs="Times New Roman" w:ascii="Times New Roman" w:hAnsi="Times New Roman"/>
-          <w:b w:val="false"/>
-          <w:i w:val="false"/>
-          <w:sz w:val="24"/>
-        </w:rPr>
-        <w:t>Diseñar la arquitectura lógica, la base de datos relacional y las interfaces de usuario del sistema de información para garantizar la centralización y seguridad de los datos.</w:t>
-      </w:r>
-    </w:p>
-    <w:p>
-      <w:pPr>
-        <w:pStyle w:val="normal1"/>
-        <w:spacing w:lineRule="auto" w:line="360" w:before="0" w:after="240"/>
-        <w:ind w:firstLine="720" w:start="0"/>
-        <w:jc w:val="both"/>
-        <w:rPr>
-          <w:rFonts w:ascii="Times New Roman" w:hAnsi="Times New Roman" w:eastAsia="Times New Roman" w:cs="Times New Roman"/>
-          <w:sz w:val="24"/>
-          <w:szCs w:val="24"/>
-        </w:rPr>
-      </w:pPr>
-      <w:r>
-        <w:rPr>
-          <w:rFonts w:eastAsia="Times New Roman" w:cs="Times New Roman" w:ascii="Times New Roman" w:hAnsi="Times New Roman"/>
-          <w:b w:val="false"/>
-          <w:i w:val="false"/>
-          <w:sz w:val="24"/>
-        </w:rPr>
-        <w:t>Desarrollar e implementar el sistema de información propuesto para optimizar el tiempo de respuesta y la confiabilidad de las operaciones de la empresa.</w:t>
+          <w:sz w:val="24"/>
+          <w:szCs w:val="24"/>
+        </w:rPr>
+      </w:pPr>
+      <w:r>
+        <w:rPr>
+          <w:rFonts w:ascii="Times New Roman" w:hAnsi="Times New Roman" w:cs="Times New Roman"/>
+          <w:b w:val="0"/>
+          <w:i w:val="0"/>
+          <w:sz w:val="24"/>
+        </w:rPr>
+        <w:t>3. Diseñar la propuesta del sistema de información para la gestión de inventario y control de préstamos prendarios, incluyendo la arquitectura lógica, el modelo de datos relacional, los prototipos de interfaz y el manual de operación.</w:t>
       </w:r>
     </w:p>
     <w:p>
@@ -3809,9 +3766,10 @@
             <w:r>
               <w:rPr>
                 <w:rFonts w:eastAsia="Times New Roman" w:cs="Times New Roman" w:ascii="Times New Roman" w:hAnsi="Times New Roman"/>
-                <w:b/>
+                <w:b w:val="0"/>
                 <w:bCs/>
-                <w:sz w:val="24"/>
+                <w:i w:val="0"/>
+                <w:sz w:val="20"/>
                 <w:szCs w:val="20"/>
               </w:rPr>
               <w:t>Objetivos Específicos</w:t>
@@ -3839,9 +3797,10 @@
             <w:r>
               <w:rPr>
                 <w:rFonts w:eastAsia="Times New Roman" w:cs="Times New Roman" w:ascii="Times New Roman" w:hAnsi="Times New Roman"/>
-                <w:b/>
+                <w:b w:val="0"/>
                 <w:bCs/>
-                <w:sz w:val="24"/>
+                <w:i w:val="0"/>
+                <w:sz w:val="20"/>
                 <w:szCs w:val="20"/>
               </w:rPr>
               <w:t>Variables</w:t>
@@ -3869,9 +3828,10 @@
             <w:r>
               <w:rPr>
                 <w:rFonts w:eastAsia="Times New Roman" w:cs="Times New Roman" w:ascii="Times New Roman" w:hAnsi="Times New Roman"/>
-                <w:b/>
+                <w:b w:val="0"/>
                 <w:bCs/>
-                <w:sz w:val="24"/>
+                <w:i w:val="0"/>
+                <w:sz w:val="20"/>
                 <w:szCs w:val="20"/>
               </w:rPr>
               <w:t>Definición Conceptual</w:t>
@@ -3899,9 +3859,10 @@
             <w:r>
               <w:rPr>
                 <w:rFonts w:eastAsia="Times New Roman" w:cs="Times New Roman" w:ascii="Times New Roman" w:hAnsi="Times New Roman"/>
-                <w:b/>
+                <w:b w:val="0"/>
                 <w:bCs/>
-                <w:sz w:val="24"/>
+                <w:i w:val="0"/>
+                <w:sz w:val="20"/>
                 <w:szCs w:val="20"/>
               </w:rPr>
               <w:t>Definición Operacional</w:t>
@@ -3929,9 +3890,10 @@
             <w:r>
               <w:rPr>
                 <w:rFonts w:eastAsia="Times New Roman" w:cs="Times New Roman" w:ascii="Times New Roman" w:hAnsi="Times New Roman"/>
-                <w:b/>
+                <w:b w:val="0"/>
                 <w:bCs/>
-                <w:sz w:val="24"/>
+                <w:i w:val="0"/>
+                <w:sz w:val="20"/>
                 <w:szCs w:val="20"/>
               </w:rPr>
               <w:t>Dimensión</w:t>
@@ -3959,9 +3921,10 @@
             <w:r>
               <w:rPr>
                 <w:rFonts w:eastAsia="Times New Roman" w:cs="Times New Roman" w:ascii="Times New Roman" w:hAnsi="Times New Roman"/>
-                <w:b/>
+                <w:b w:val="0"/>
                 <w:bCs/>
-                <w:sz w:val="24"/>
+                <w:i w:val="0"/>
+                <w:sz w:val="20"/>
                 <w:szCs w:val="20"/>
               </w:rPr>
               <w:t>Indicadores</w:t>
@@ -3989,9 +3952,10 @@
             <w:r>
               <w:rPr>
                 <w:rFonts w:eastAsia="Times New Roman" w:cs="Times New Roman" w:ascii="Times New Roman" w:hAnsi="Times New Roman"/>
-                <w:b/>
+                <w:b w:val="0"/>
                 <w:bCs/>
-                <w:sz w:val="24"/>
+                <w:i w:val="0"/>
+                <w:sz w:val="20"/>
                 <w:szCs w:val="20"/>
               </w:rPr>
               <w:t>Diseño y Tipo de Investigación</w:t>
@@ -4019,9 +3983,10 @@
             <w:r>
               <w:rPr>
                 <w:rFonts w:eastAsia="Times New Roman" w:cs="Times New Roman" w:ascii="Times New Roman" w:hAnsi="Times New Roman"/>
-                <w:b/>
+                <w:b w:val="0"/>
                 <w:bCs/>
-                <w:sz w:val="24"/>
+                <w:i w:val="0"/>
+                <w:sz w:val="20"/>
                 <w:szCs w:val="20"/>
               </w:rPr>
               <w:t>Ítems</w:t>
@@ -4042,19 +4007,12 @@
             </w:tcBorders>
           </w:tcPr>
           <w:p>
-            <w:pPr>
-              <w:pStyle w:val="normal1"/>
-              <w:widowControl/>
-              <w:suppressAutoHyphens w:val="true"/>
-              <w:bidi w:val="0"/>
-              <w:spacing w:lineRule="auto" w:line="259" w:before="0" w:after="160"/>
-              <w:jc w:val="start"/>
-              <w:rPr/>
-            </w:pPr>
-            <w:r>
-              <w:rPr>
-                <w:rFonts w:eastAsia="Times New Roman" w:cs="Times New Roman" w:ascii="Times New Roman" w:hAnsi="Times New Roman"/>
-                <w:sz w:val="24"/>
+            <w:r>
+              <w:rPr>
+                <w:rFonts w:ascii="Times New Roman" w:hAnsi="Times New Roman" w:cs="Times New Roman"/>
+                <w:b w:val="0"/>
+                <w:i w:val="0"/>
+                <w:sz w:val="20"/>
               </w:rPr>
               <w:t>Diagnosticar el estado de registro, control de inventario y atención al cliente.</w:t>
             </w:r>
@@ -4071,17 +4029,12 @@
             </w:tcBorders>
           </w:tcPr>
           <w:p>
-            <w:pPr>
-              <w:pStyle w:val="normal1"/>
-              <w:spacing w:before="0" w:after="160"/>
-              <w:jc w:val="both"/>
-              <w:rPr/>
-            </w:pPr>
-            <w:r>
-              <w:rPr>
-                <w:rFonts w:eastAsia="Times New Roman" w:cs="Times New Roman" w:ascii="Times New Roman" w:hAnsi="Times New Roman"/>
-                <w:sz w:val="24"/>
-                <w:szCs w:val="20"/>
+            <w:r>
+              <w:rPr>
+                <w:rFonts w:ascii="Times New Roman" w:hAnsi="Times New Roman" w:cs="Times New Roman"/>
+                <w:b w:val="0"/>
+                <w:i w:val="0"/>
+                <w:sz w:val="20"/>
               </w:rPr>
               <w:t>Gestión Manual de Datos</w:t>
             </w:r>
@@ -4098,17 +4051,12 @@
             </w:tcBorders>
           </w:tcPr>
           <w:p>
-            <w:pPr>
-              <w:pStyle w:val="normal1"/>
-              <w:spacing w:before="0" w:after="160"/>
-              <w:jc w:val="both"/>
-              <w:rPr/>
-            </w:pPr>
-            <w:r>
-              <w:rPr>
-                <w:rFonts w:eastAsia="Times New Roman" w:cs="Times New Roman" w:ascii="Times New Roman" w:hAnsi="Times New Roman"/>
-                <w:sz w:val="24"/>
-                <w:szCs w:val="20"/>
+            <w:r>
+              <w:rPr>
+                <w:rFonts w:ascii="Times New Roman" w:hAnsi="Times New Roman" w:cs="Times New Roman"/>
+                <w:b w:val="0"/>
+                <w:i w:val="0"/>
+                <w:sz w:val="20"/>
               </w:rPr>
               <w:t>Proceso actual de registro basado en herramientas ofimáticas descentralizadas.</w:t>
             </w:r>
@@ -4125,17 +4073,12 @@
             </w:tcBorders>
           </w:tcPr>
           <w:p>
-            <w:pPr>
-              <w:pStyle w:val="normal1"/>
-              <w:spacing w:before="0" w:after="160"/>
-              <w:jc w:val="both"/>
-              <w:rPr/>
-            </w:pPr>
-            <w:r>
-              <w:rPr>
-                <w:rFonts w:eastAsia="Times New Roman" w:cs="Times New Roman" w:ascii="Times New Roman" w:hAnsi="Times New Roman"/>
-                <w:sz w:val="24"/>
-                <w:szCs w:val="20"/>
+            <w:r>
+              <w:rPr>
+                <w:rFonts w:ascii="Times New Roman" w:hAnsi="Times New Roman" w:cs="Times New Roman"/>
+                <w:b w:val="0"/>
+                <w:i w:val="0"/>
+                <w:sz w:val="20"/>
               </w:rPr>
               <w:t>Análisis de la fragmentación de archivos Excel en la empresa.</w:t>
             </w:r>
@@ -4152,17 +4095,12 @@
             </w:tcBorders>
           </w:tcPr>
           <w:p>
-            <w:pPr>
-              <w:pStyle w:val="normal1"/>
-              <w:spacing w:before="0" w:after="160"/>
-              <w:jc w:val="center"/>
-              <w:rPr/>
-            </w:pPr>
-            <w:r>
-              <w:rPr>
-                <w:rFonts w:eastAsia="Times New Roman" w:cs="Times New Roman" w:ascii="Times New Roman" w:hAnsi="Times New Roman"/>
-                <w:sz w:val="24"/>
-                <w:szCs w:val="20"/>
+            <w:r>
+              <w:rPr>
+                <w:rFonts w:ascii="Times New Roman" w:hAnsi="Times New Roman" w:cs="Times New Roman"/>
+                <w:b w:val="0"/>
+                <w:i w:val="0"/>
+                <w:sz w:val="20"/>
               </w:rPr>
               <w:t>Operativa</w:t>
             </w:r>
@@ -4179,17 +4117,12 @@
             </w:tcBorders>
           </w:tcPr>
           <w:p>
-            <w:pPr>
-              <w:pStyle w:val="normal1"/>
-              <w:spacing w:before="0" w:after="160"/>
-              <w:jc w:val="both"/>
-              <w:rPr/>
-            </w:pPr>
-            <w:r>
-              <w:rPr>
-                <w:rFonts w:eastAsia="Times New Roman" w:cs="Times New Roman" w:ascii="Times New Roman" w:hAnsi="Times New Roman"/>
-                <w:sz w:val="24"/>
-                <w:szCs w:val="20"/>
+            <w:r>
+              <w:rPr>
+                <w:rFonts w:ascii="Times New Roman" w:hAnsi="Times New Roman" w:cs="Times New Roman"/>
+                <w:b w:val="0"/>
+                <w:i w:val="0"/>
+                <w:sz w:val="20"/>
               </w:rPr>
               <w:t>Registro manual, Tiempo de respuesta.</w:t>
             </w:r>
@@ -4206,17 +4139,12 @@
             </w:tcBorders>
           </w:tcPr>
           <w:p>
-            <w:pPr>
-              <w:pStyle w:val="normal1"/>
-              <w:spacing w:before="0" w:after="160"/>
-              <w:jc w:val="center"/>
-              <w:rPr/>
-            </w:pPr>
-            <w:r>
-              <w:rPr>
-                <w:rFonts w:eastAsia="Times New Roman" w:cs="Times New Roman" w:ascii="Times New Roman" w:hAnsi="Times New Roman"/>
-                <w:sz w:val="24"/>
-                <w:szCs w:val="20"/>
+            <w:r>
+              <w:rPr>
+                <w:rFonts w:ascii="Times New Roman" w:hAnsi="Times New Roman" w:cs="Times New Roman"/>
+                <w:b w:val="0"/>
+                <w:i w:val="0"/>
+                <w:sz w:val="20"/>
               </w:rPr>
               <w:t>Descriptiva y de Campo.</w:t>
             </w:r>
@@ -4233,17 +4161,12 @@
             </w:tcBorders>
           </w:tcPr>
           <w:p>
-            <w:pPr>
-              <w:pStyle w:val="normal1"/>
-              <w:spacing w:before="0" w:after="160"/>
-              <w:jc w:val="center"/>
-              <w:rPr/>
-            </w:pPr>
-            <w:r>
-              <w:rPr>
-                <w:rFonts w:eastAsia="Times New Roman" w:cs="Times New Roman" w:ascii="Times New Roman" w:hAnsi="Times New Roman"/>
-                <w:sz w:val="24"/>
-                <w:szCs w:val="20"/>
+            <w:r>
+              <w:rPr>
+                <w:rFonts w:ascii="Times New Roman" w:hAnsi="Times New Roman" w:cs="Times New Roman"/>
+                <w:b w:val="0"/>
+                <w:i w:val="0"/>
+                <w:sz w:val="20"/>
               </w:rPr>
               <w:t>1, 2</w:t>
             </w:r>
@@ -4263,21 +4186,14 @@
             </w:tcBorders>
           </w:tcPr>
           <w:p>
-            <w:pPr>
-              <w:pStyle w:val="normal1"/>
-              <w:widowControl/>
-              <w:suppressAutoHyphens w:val="true"/>
-              <w:bidi w:val="0"/>
-              <w:spacing w:lineRule="auto" w:line="259" w:before="0" w:after="160"/>
-              <w:jc w:val="start"/>
-              <w:rPr/>
-            </w:pPr>
-            <w:r>
-              <w:rPr>
-                <w:rFonts w:eastAsia="Times New Roman" w:cs="Times New Roman" w:ascii="Times New Roman" w:hAnsi="Times New Roman"/>
-                <w:sz w:val="24"/>
-              </w:rPr>
-              <w:t>Determinar los requerimientos técnicos y funcionales del sistema propuesto.</w:t>
+            <w:r>
+              <w:rPr>
+                <w:rFonts w:ascii="Times New Roman" w:hAnsi="Times New Roman" w:cs="Times New Roman"/>
+                <w:b w:val="0"/>
+                <w:i w:val="0"/>
+                <w:sz w:val="20"/>
+              </w:rPr>
+              <w:t>Determinar la factibilidad técnica, operativa y económica del sistema propuesto.</w:t>
             </w:r>
           </w:p>
         </w:tc>
@@ -4292,19 +4208,14 @@
             </w:tcBorders>
           </w:tcPr>
           <w:p>
-            <w:pPr>
-              <w:pStyle w:val="normal1"/>
-              <w:spacing w:before="0" w:after="160"/>
-              <w:jc w:val="both"/>
-              <w:rPr/>
-            </w:pPr>
-            <w:r>
-              <w:rPr>
-                <w:rFonts w:eastAsia="Times New Roman" w:cs="Times New Roman" w:ascii="Times New Roman" w:hAnsi="Times New Roman"/>
-                <w:sz w:val="24"/>
-                <w:szCs w:val="20"/>
-              </w:rPr>
-              <w:t>Requerimientos Técnicos</w:t>
+            <w:r>
+              <w:rPr>
+                <w:rFonts w:ascii="Times New Roman" w:hAnsi="Times New Roman" w:cs="Times New Roman"/>
+                <w:b w:val="0"/>
+                <w:i w:val="0"/>
+                <w:sz w:val="20"/>
+              </w:rPr>
+              <w:t>Factibilidad y Requerimientos</w:t>
             </w:r>
           </w:p>
         </w:tc>
@@ -4319,19 +4230,14 @@
             </w:tcBorders>
           </w:tcPr>
           <w:p>
-            <w:pPr>
-              <w:pStyle w:val="normal1"/>
-              <w:spacing w:before="0" w:after="160"/>
-              <w:jc w:val="both"/>
-              <w:rPr/>
-            </w:pPr>
-            <w:r>
-              <w:rPr>
-                <w:rFonts w:eastAsia="Times New Roman" w:cs="Times New Roman" w:ascii="Times New Roman" w:hAnsi="Times New Roman"/>
-                <w:sz w:val="24"/>
-                <w:szCs w:val="20"/>
-              </w:rPr>
-              <w:t>Necesidades del software para ejecutar cálculos de empeño y compras.</w:t>
+            <w:r>
+              <w:rPr>
+                <w:rFonts w:ascii="Times New Roman" w:hAnsi="Times New Roman" w:cs="Times New Roman"/>
+                <w:b w:val="0"/>
+                <w:i w:val="0"/>
+                <w:sz w:val="20"/>
+              </w:rPr>
+              <w:t>Viabilidad integral y necesidades de cálculo financiero y seguridad de datos.</w:t>
             </w:r>
           </w:p>
         </w:tc>
@@ -4346,19 +4252,14 @@
             </w:tcBorders>
           </w:tcPr>
           <w:p>
-            <w:pPr>
-              <w:pStyle w:val="normal1"/>
-              <w:spacing w:before="0" w:after="160"/>
-              <w:jc w:val="both"/>
-              <w:rPr/>
-            </w:pPr>
-            <w:r>
-              <w:rPr>
-                <w:rFonts w:eastAsia="Times New Roman" w:cs="Times New Roman" w:ascii="Times New Roman" w:hAnsi="Times New Roman"/>
-                <w:sz w:val="24"/>
-                <w:szCs w:val="20"/>
-              </w:rPr>
-              <w:t>Especificación de módulos para el sistema de préstamos y caja.</w:t>
+            <w:r>
+              <w:rPr>
+                <w:rFonts w:ascii="Times New Roman" w:hAnsi="Times New Roman" w:cs="Times New Roman"/>
+                <w:b w:val="0"/>
+                <w:i w:val="0"/>
+                <w:sz w:val="20"/>
+              </w:rPr>
+              <w:t>Estudio de factibilidad técnica y operativa para la solución tecnológica.</w:t>
             </w:r>
           </w:p>
         </w:tc>
@@ -4373,17 +4274,12 @@
             </w:tcBorders>
           </w:tcPr>
           <w:p>
-            <w:pPr>
-              <w:pStyle w:val="normal1"/>
-              <w:spacing w:before="0" w:after="160"/>
-              <w:jc w:val="center"/>
-              <w:rPr/>
-            </w:pPr>
-            <w:r>
-              <w:rPr>
-                <w:rFonts w:eastAsia="Times New Roman" w:cs="Times New Roman" w:ascii="Times New Roman" w:hAnsi="Times New Roman"/>
-                <w:sz w:val="24"/>
-                <w:szCs w:val="20"/>
+            <w:r>
+              <w:rPr>
+                <w:rFonts w:ascii="Times New Roman" w:hAnsi="Times New Roman" w:cs="Times New Roman"/>
+                <w:b w:val="0"/>
+                <w:i w:val="0"/>
+                <w:sz w:val="20"/>
               </w:rPr>
               <w:t>Técnica</w:t>
             </w:r>
@@ -4400,17 +4296,12 @@
             </w:tcBorders>
           </w:tcPr>
           <w:p>
-            <w:pPr>
-              <w:pStyle w:val="normal1"/>
-              <w:spacing w:before="0" w:after="160"/>
-              <w:jc w:val="both"/>
-              <w:rPr/>
-            </w:pPr>
-            <w:r>
-              <w:rPr>
-                <w:rFonts w:eastAsia="Times New Roman" w:cs="Times New Roman" w:ascii="Times New Roman" w:hAnsi="Times New Roman"/>
-                <w:sz w:val="24"/>
-                <w:szCs w:val="20"/>
+            <w:r>
+              <w:rPr>
+                <w:rFonts w:ascii="Times New Roman" w:hAnsi="Times New Roman" w:cs="Times New Roman"/>
+                <w:b w:val="0"/>
+                <w:i w:val="0"/>
+                <w:sz w:val="20"/>
               </w:rPr>
               <w:t>Algoritmos de cálculo, Seguridad.</w:t>
             </w:r>
@@ -4427,17 +4318,12 @@
             </w:tcBorders>
           </w:tcPr>
           <w:p>
-            <w:pPr>
-              <w:pStyle w:val="normal1"/>
-              <w:spacing w:before="0" w:after="160"/>
-              <w:jc w:val="center"/>
-              <w:rPr/>
-            </w:pPr>
-            <w:r>
-              <w:rPr>
-                <w:rFonts w:eastAsia="Times New Roman" w:cs="Times New Roman" w:ascii="Times New Roman" w:hAnsi="Times New Roman"/>
-                <w:sz w:val="24"/>
-                <w:szCs w:val="20"/>
+            <w:r>
+              <w:rPr>
+                <w:rFonts w:ascii="Times New Roman" w:hAnsi="Times New Roman" w:cs="Times New Roman"/>
+                <w:b w:val="0"/>
+                <w:i w:val="0"/>
+                <w:sz w:val="20"/>
               </w:rPr>
               <w:t>Descriptiva y de Campo.</w:t>
             </w:r>
@@ -4454,17 +4340,12 @@
             </w:tcBorders>
           </w:tcPr>
           <w:p>
-            <w:pPr>
-              <w:pStyle w:val="normal1"/>
-              <w:spacing w:before="0" w:after="160"/>
-              <w:jc w:val="center"/>
-              <w:rPr/>
-            </w:pPr>
-            <w:r>
-              <w:rPr>
-                <w:rFonts w:eastAsia="Times New Roman" w:cs="Times New Roman" w:ascii="Times New Roman" w:hAnsi="Times New Roman"/>
-                <w:sz w:val="24"/>
-                <w:szCs w:val="20"/>
+            <w:r>
+              <w:rPr>
+                <w:rFonts w:ascii="Times New Roman" w:hAnsi="Times New Roman" w:cs="Times New Roman"/>
+                <w:b w:val="0"/>
+                <w:i w:val="0"/>
+                <w:sz w:val="20"/>
               </w:rPr>
               <w:t>3, 4</w:t>
             </w:r>
@@ -4484,21 +4365,14 @@
             </w:tcBorders>
           </w:tcPr>
           <w:p>
-            <w:pPr>
-              <w:pStyle w:val="normal1"/>
-              <w:widowControl/>
-              <w:suppressAutoHyphens w:val="true"/>
-              <w:bidi w:val="0"/>
-              <w:spacing w:lineRule="auto" w:line="259" w:before="0" w:after="160"/>
-              <w:jc w:val="start"/>
-              <w:rPr/>
-            </w:pPr>
-            <w:r>
-              <w:rPr>
-                <w:rFonts w:eastAsia="Times New Roman" w:cs="Times New Roman" w:ascii="Times New Roman" w:hAnsi="Times New Roman"/>
-                <w:sz w:val="24"/>
-              </w:rPr>
-              <w:t>Diseñar la arquitectura lógica, base de datos relacional e interfaces.</w:t>
+            <w:r>
+              <w:rPr>
+                <w:rFonts w:ascii="Times New Roman" w:hAnsi="Times New Roman" w:cs="Times New Roman"/>
+                <w:b w:val="0"/>
+                <w:i w:val="0"/>
+                <w:sz w:val="20"/>
+              </w:rPr>
+              <w:t>Diseñar la arquitectura lógica, base de datos relacional y prototipos de interfaz.</w:t>
             </w:r>
           </w:p>
         </w:tc>
@@ -4513,19 +4387,14 @@
             </w:tcBorders>
           </w:tcPr>
           <w:p>
-            <w:pPr>
-              <w:pStyle w:val="normal1"/>
-              <w:spacing w:before="0" w:after="160"/>
-              <w:jc w:val="both"/>
-              <w:rPr/>
-            </w:pPr>
-            <w:r>
-              <w:rPr>
-                <w:rFonts w:eastAsia="Times New Roman" w:cs="Times New Roman" w:ascii="Times New Roman" w:hAnsi="Times New Roman"/>
-                <w:sz w:val="24"/>
-                <w:szCs w:val="20"/>
-              </w:rPr>
-              <w:t>Diseño del Sistema</w:t>
+            <w:r>
+              <w:rPr>
+                <w:rFonts w:ascii="Times New Roman" w:hAnsi="Times New Roman" w:cs="Times New Roman"/>
+                <w:b w:val="0"/>
+                <w:i w:val="0"/>
+                <w:sz w:val="20"/>
+              </w:rPr>
+              <w:t>Diseño de la Propuesta</w:t>
             </w:r>
           </w:p>
         </w:tc>
@@ -4540,19 +4409,14 @@
             </w:tcBorders>
           </w:tcPr>
           <w:p>
-            <w:pPr>
-              <w:pStyle w:val="normal1"/>
-              <w:spacing w:before="0" w:after="160"/>
-              <w:jc w:val="both"/>
-              <w:rPr/>
-            </w:pPr>
-            <w:r>
-              <w:rPr>
-                <w:rFonts w:eastAsia="Times New Roman" w:cs="Times New Roman" w:ascii="Times New Roman" w:hAnsi="Times New Roman"/>
-                <w:sz w:val="24"/>
-                <w:szCs w:val="20"/>
-              </w:rPr>
-              <w:t>Estructura lógica y visual para centralizar la información de metales.</w:t>
+            <w:r>
+              <w:rPr>
+                <w:rFonts w:ascii="Times New Roman" w:hAnsi="Times New Roman" w:cs="Times New Roman"/>
+                <w:b w:val="0"/>
+                <w:i w:val="0"/>
+                <w:sz w:val="20"/>
+              </w:rPr>
+              <w:t>Estructura arquitectónica y relacional para centralizar la gestión prendaria.</w:t>
             </w:r>
           </w:p>
         </w:tc>
@@ -4567,19 +4431,14 @@
             </w:tcBorders>
           </w:tcPr>
           <w:p>
-            <w:pPr>
-              <w:pStyle w:val="normal1"/>
-              <w:spacing w:before="0" w:after="160"/>
-              <w:jc w:val="both"/>
-              <w:rPr/>
-            </w:pPr>
-            <w:r>
-              <w:rPr>
-                <w:rFonts w:eastAsia="Times New Roman" w:cs="Times New Roman" w:ascii="Times New Roman" w:hAnsi="Times New Roman"/>
-                <w:sz w:val="24"/>
-                <w:szCs w:val="20"/>
-              </w:rPr>
-              <w:t>Modelado del esquema de datos y prototipos de interfaz web.</w:t>
+            <w:r>
+              <w:rPr>
+                <w:rFonts w:ascii="Times New Roman" w:hAnsi="Times New Roman" w:cs="Times New Roman"/>
+                <w:b w:val="0"/>
+                <w:i w:val="0"/>
+                <w:sz w:val="20"/>
+              </w:rPr>
+              <w:t>Modelado de base de datos relacional y pantallas prototipo de usuario.</w:t>
             </w:r>
           </w:p>
         </w:tc>
@@ -4594,17 +4453,12 @@
             </w:tcBorders>
           </w:tcPr>
           <w:p>
-            <w:pPr>
-              <w:pStyle w:val="normal1"/>
-              <w:spacing w:before="0" w:after="160"/>
-              <w:jc w:val="center"/>
-              <w:rPr/>
-            </w:pPr>
-            <w:r>
-              <w:rPr>
-                <w:rFonts w:eastAsia="Times New Roman" w:cs="Times New Roman" w:ascii="Times New Roman" w:hAnsi="Times New Roman"/>
-                <w:sz w:val="24"/>
-                <w:szCs w:val="20"/>
+            <w:r>
+              <w:rPr>
+                <w:rFonts w:ascii="Times New Roman" w:hAnsi="Times New Roman" w:cs="Times New Roman"/>
+                <w:b w:val="0"/>
+                <w:i w:val="0"/>
+                <w:sz w:val="20"/>
               </w:rPr>
               <w:t>Informática</w:t>
             </w:r>
@@ -4621,17 +4475,12 @@
             </w:tcBorders>
           </w:tcPr>
           <w:p>
-            <w:pPr>
-              <w:pStyle w:val="normal1"/>
-              <w:spacing w:before="0" w:after="160"/>
-              <w:jc w:val="both"/>
-              <w:rPr/>
-            </w:pPr>
-            <w:r>
-              <w:rPr>
-                <w:rFonts w:eastAsia="Times New Roman" w:cs="Times New Roman" w:ascii="Times New Roman" w:hAnsi="Times New Roman"/>
-                <w:sz w:val="24"/>
-                <w:szCs w:val="20"/>
+            <w:r>
+              <w:rPr>
+                <w:rFonts w:ascii="Times New Roman" w:hAnsi="Times New Roman" w:cs="Times New Roman"/>
+                <w:b w:val="0"/>
+                <w:i w:val="0"/>
+                <w:sz w:val="20"/>
               </w:rPr>
               <w:t>Esquema de BD, Prototipo visual.</w:t>
             </w:r>
@@ -4648,17 +4497,12 @@
             </w:tcBorders>
           </w:tcPr>
           <w:p>
-            <w:pPr>
-              <w:pStyle w:val="normal1"/>
-              <w:spacing w:before="0" w:after="160"/>
-              <w:jc w:val="center"/>
-              <w:rPr/>
-            </w:pPr>
-            <w:r>
-              <w:rPr>
-                <w:rFonts w:eastAsia="Times New Roman" w:cs="Times New Roman" w:ascii="Times New Roman" w:hAnsi="Times New Roman"/>
-                <w:sz w:val="24"/>
-                <w:szCs w:val="20"/>
+            <w:r>
+              <w:rPr>
+                <w:rFonts w:ascii="Times New Roman" w:hAnsi="Times New Roman" w:cs="Times New Roman"/>
+                <w:b w:val="0"/>
+                <w:i w:val="0"/>
+                <w:sz w:val="20"/>
               </w:rPr>
               <w:t>Descriptiva y de Campo.</w:t>
             </w:r>
@@ -4675,17 +4519,12 @@
             </w:tcBorders>
           </w:tcPr>
           <w:p>
-            <w:pPr>
-              <w:pStyle w:val="normal1"/>
-              <w:spacing w:before="0" w:after="160"/>
-              <w:jc w:val="center"/>
-              <w:rPr/>
-            </w:pPr>
-            <w:r>
-              <w:rPr>
-                <w:rFonts w:eastAsia="Times New Roman" w:cs="Times New Roman" w:ascii="Times New Roman" w:hAnsi="Times New Roman"/>
-                <w:sz w:val="24"/>
-                <w:szCs w:val="20"/>
+            <w:r>
+              <w:rPr>
+                <w:rFonts w:ascii="Times New Roman" w:hAnsi="Times New Roman" w:cs="Times New Roman"/>
+                <w:b w:val="0"/>
+                <w:i w:val="0"/>
+                <w:sz w:val="20"/>
               </w:rPr>
               <w:t>5, 6</w:t>
             </w:r>
@@ -4705,21 +4544,14 @@
             </w:tcBorders>
           </w:tcPr>
           <w:p>
-            <w:pPr>
-              <w:pStyle w:val="normal1"/>
-              <w:widowControl/>
-              <w:suppressAutoHyphens w:val="true"/>
-              <w:bidi w:val="0"/>
-              <w:spacing w:lineRule="auto" w:line="259" w:before="0" w:after="160"/>
-              <w:jc w:val="start"/>
-              <w:rPr/>
-            </w:pPr>
-            <w:r>
-              <w:rPr>
-                <w:rFonts w:eastAsia="Times New Roman" w:cs="Times New Roman" w:ascii="Times New Roman" w:hAnsi="Times New Roman"/>
-                <w:sz w:val="24"/>
-              </w:rPr>
-              <w:t>Desarrollar e implementar el sistema de información propuesto.</w:t>
+            <w:r>
+              <w:rPr>
+                <w:rFonts w:ascii="Times New Roman" w:hAnsi="Times New Roman" w:cs="Times New Roman"/>
+                <w:b w:val="0"/>
+                <w:i w:val="0"/>
+                <w:sz w:val="20"/>
+              </w:rPr>
+              <w:t>Diseñar los módulos de reportes administrativos y consultas operativas automatizadas.</w:t>
             </w:r>
           </w:p>
         </w:tc>
@@ -4734,19 +4566,14 @@
             </w:tcBorders>
           </w:tcPr>
           <w:p>
-            <w:pPr>
-              <w:pStyle w:val="normal1"/>
-              <w:spacing w:before="0" w:after="160"/>
-              <w:jc w:val="both"/>
-              <w:rPr/>
-            </w:pPr>
-            <w:r>
-              <w:rPr>
-                <w:rFonts w:eastAsia="Times New Roman" w:cs="Times New Roman" w:ascii="Times New Roman" w:hAnsi="Times New Roman"/>
-                <w:sz w:val="24"/>
-                <w:szCs w:val="20"/>
-              </w:rPr>
-              <w:t>Implementación de Software</w:t>
+            <w:r>
+              <w:rPr>
+                <w:rFonts w:ascii="Times New Roman" w:hAnsi="Times New Roman" w:cs="Times New Roman"/>
+                <w:b w:val="0"/>
+                <w:i w:val="0"/>
+                <w:sz w:val="20"/>
+              </w:rPr>
+              <w:t>Propuesta de Automatización</w:t>
             </w:r>
           </w:p>
         </w:tc>
@@ -4761,19 +4588,14 @@
             </w:tcBorders>
           </w:tcPr>
           <w:p>
-            <w:pPr>
-              <w:pStyle w:val="normal1"/>
-              <w:spacing w:before="0" w:after="160"/>
-              <w:jc w:val="both"/>
-              <w:rPr/>
-            </w:pPr>
-            <w:r>
-              <w:rPr>
-                <w:rFonts w:eastAsia="Times New Roman" w:cs="Times New Roman" w:ascii="Times New Roman" w:hAnsi="Times New Roman"/>
-                <w:sz w:val="24"/>
-                <w:szCs w:val="20"/>
-              </w:rPr>
-              <w:t>Construcción de la herramienta final para la optimización administrativa.</w:t>
+            <w:r>
+              <w:rPr>
+                <w:rFonts w:ascii="Times New Roman" w:hAnsi="Times New Roman" w:cs="Times New Roman"/>
+                <w:b w:val="0"/>
+                <w:i w:val="0"/>
+                <w:sz w:val="20"/>
+              </w:rPr>
+              <w:t>Especificación de reportes automáticos y flujos de consulta en la propuesta.</w:t>
             </w:r>
           </w:p>
         </w:tc>
@@ -4788,19 +4610,14 @@
             </w:tcBorders>
           </w:tcPr>
           <w:p>
-            <w:pPr>
-              <w:pStyle w:val="normal1"/>
-              <w:spacing w:before="0" w:after="160"/>
-              <w:jc w:val="both"/>
-              <w:rPr/>
-            </w:pPr>
-            <w:r>
-              <w:rPr>
-                <w:rFonts w:eastAsia="Times New Roman" w:cs="Times New Roman" w:ascii="Times New Roman" w:hAnsi="Times New Roman"/>
-                <w:sz w:val="24"/>
-                <w:szCs w:val="20"/>
-              </w:rPr>
-              <w:t>Desarrollo de la aplicación en Vercel y el sistema de empeños.</w:t>
+            <w:r>
+              <w:rPr>
+                <w:rFonts w:ascii="Times New Roman" w:hAnsi="Times New Roman" w:cs="Times New Roman"/>
+                <w:b w:val="0"/>
+                <w:i w:val="0"/>
+                <w:sz w:val="20"/>
+              </w:rPr>
+              <w:t>Diseño de interfaces de consulta y generación documental para gerencia.</w:t>
             </w:r>
           </w:p>
         </w:tc>
@@ -4815,17 +4632,12 @@
             </w:tcBorders>
           </w:tcPr>
           <w:p>
-            <w:pPr>
-              <w:pStyle w:val="normal1"/>
-              <w:spacing w:before="0" w:after="160"/>
-              <w:jc w:val="center"/>
-              <w:rPr/>
-            </w:pPr>
-            <w:r>
-              <w:rPr>
-                <w:rFonts w:eastAsia="Times New Roman" w:cs="Times New Roman" w:ascii="Times New Roman" w:hAnsi="Times New Roman"/>
-                <w:sz w:val="24"/>
-                <w:szCs w:val="20"/>
+            <w:r>
+              <w:rPr>
+                <w:rFonts w:ascii="Times New Roman" w:hAnsi="Times New Roman" w:cs="Times New Roman"/>
+                <w:b w:val="0"/>
+                <w:i w:val="0"/>
+                <w:sz w:val="20"/>
               </w:rPr>
               <w:t>Administrativa</w:t>
             </w:r>
@@ -4842,17 +4654,12 @@
             </w:tcBorders>
           </w:tcPr>
           <w:p>
-            <w:pPr>
-              <w:pStyle w:val="normal1"/>
-              <w:spacing w:before="0" w:after="160"/>
-              <w:jc w:val="both"/>
-              <w:rPr/>
-            </w:pPr>
-            <w:r>
-              <w:rPr>
-                <w:rFonts w:eastAsia="Times New Roman" w:cs="Times New Roman" w:ascii="Times New Roman" w:hAnsi="Times New Roman"/>
-                <w:sz w:val="24"/>
-                <w:szCs w:val="20"/>
+            <w:r>
+              <w:rPr>
+                <w:rFonts w:ascii="Times New Roman" w:hAnsi="Times New Roman" w:cs="Times New Roman"/>
+                <w:b w:val="0"/>
+                <w:i w:val="0"/>
+                <w:sz w:val="20"/>
               </w:rPr>
               <w:t>Reportes generados, Consultas exitosas.</w:t>
             </w:r>
@@ -4869,17 +4676,12 @@
             </w:tcBorders>
           </w:tcPr>
           <w:p>
-            <w:pPr>
-              <w:pStyle w:val="normal1"/>
-              <w:spacing w:before="0" w:after="160"/>
-              <w:jc w:val="center"/>
-              <w:rPr/>
-            </w:pPr>
-            <w:r>
-              <w:rPr>
-                <w:rFonts w:eastAsia="Times New Roman" w:cs="Times New Roman" w:ascii="Times New Roman" w:hAnsi="Times New Roman"/>
-                <w:sz w:val="24"/>
-                <w:szCs w:val="20"/>
+            <w:r>
+              <w:rPr>
+                <w:rFonts w:ascii="Times New Roman" w:hAnsi="Times New Roman" w:cs="Times New Roman"/>
+                <w:b w:val="0"/>
+                <w:i w:val="0"/>
+                <w:sz w:val="20"/>
               </w:rPr>
               <w:t>Descriptiva y de Campo.</w:t>
             </w:r>
@@ -4896,17 +4698,12 @@
             </w:tcBorders>
           </w:tcPr>
           <w:p>
-            <w:pPr>
-              <w:pStyle w:val="normal1"/>
-              <w:spacing w:before="0" w:after="160"/>
-              <w:jc w:val="center"/>
-              <w:rPr/>
-            </w:pPr>
-            <w:r>
-              <w:rPr>
-                <w:rFonts w:eastAsia="Times New Roman" w:cs="Times New Roman" w:ascii="Times New Roman" w:hAnsi="Times New Roman"/>
-                <w:sz w:val="24"/>
-                <w:szCs w:val="20"/>
+            <w:r>
+              <w:rPr>
+                <w:rFonts w:ascii="Times New Roman" w:hAnsi="Times New Roman" w:cs="Times New Roman"/>
+                <w:b w:val="0"/>
+                <w:i w:val="0"/>
+                <w:sz w:val="20"/>
               </w:rPr>
               <w:t>7, 8</w:t>
             </w:r>
@@ -10707,9 +10504,11 @@
       <w:r>
         <w:rPr>
           <w:rFonts w:ascii="Times New Roman" w:hAnsi="Times New Roman" w:cs="Times New Roman"/>
-          <w:sz w:val="24"/>
-        </w:rPr>
-        <w:t>En función del diagnóstico realizado sobre la situación actual de los procesos de registro, control de inventario y atención al cliente en la empresa Inversiones Más Por Tu Oro 17 C.A., se concluye que existe una deficiencia operativa total. La homogeneidad absoluta (100% de consenso) en las respuestas emitidas por la gerencia y administración reflejó que el uso exclusivo de hojas de cálculo de Excel vulnera la seguridad del inventario y ocasiona una significativa pérdida de tiempo en el cálculo manual de intereses de préstamos prendarios.</w:t>
+          <w:b w:val="0"/>
+          <w:i w:val="0"/>
+          <w:sz w:val="24"/>
+        </w:rPr>
+        <w:t>En función del diagnóstico realizado sobre la situación actual de los procesos de registro, inventario y atención al cliente en Inversiones Más Por Tu Oro 17 C.A., se evidenció que la utilización de múltiples archivos de Excel genera lentitud operativa, riesgos de inconsistencia en los cálculos de intereses prendarios y vulnerabilidad ante la ausencia de respaldos de información automatizados. Esta realidad justificó plenamente la necesidad de plantear una solución tecnológica estructurada.</w:t>
       </w:r>
     </w:p>
     <w:p>
@@ -10723,8 +10522,11 @@
       <w:r>
         <w:rPr>
           <w:rFonts w:ascii="Times New Roman" w:hAnsi="Times New Roman" w:cs="Times New Roman"/>
-        </w:rPr>
-        <w:t>En cuanto a los requerimientos técnicos y funcionales necesarios para la automatización, se determinó que la institución requiere con carácter de urgencia la implementación de una base de datos relacional centralizada. Funcionalmente, se precisó la necesidad de contar con perfiles de acceso escalonados (Gerente, Administrador, Cajero) y módulos independientes que separen la gestión de mercancía en metales (oro y plata) del control contractual de los préstamos mediante contratos de mutuo con garantía prendaria.</w:t>
+          <w:b w:val="0"/>
+          <w:i w:val="0"/>
+          <w:sz w:val="24"/>
+        </w:rPr>
+        <w:t>En cuanto al estudio de factibilidad técnica, operativa y económica, se comprobó la viabilidad total de la propuesta. La empresa dispone de los recursos de hardware y conectividad requeridos; el personal manifiesta disposición favorable y necesidad de una herramienta centralizada; y la inversión estimada es plenamente accesible y rentable, garantizando la recuperación de costos al mitigar pérdidas monetarias por errores de cálculo manual.</w:t>
       </w:r>
     </w:p>
     <w:p>
@@ -10738,25 +10540,11 @@
       <w:r>
         <w:rPr>
           <w:rFonts w:ascii="Times New Roman" w:hAnsi="Times New Roman" w:cs="Times New Roman"/>
-          <w:sz w:val="24"/>
-        </w:rPr>
-        <w:t>Respecto al diseño de la arquitectura lógica e interfaces del sistema, se concluye que el modelo de datos relacional propuesto (mediante tecnologías de bases de datos avanzadas como PostgreSQL) resuelve íntegramente el nudo crítico del negocio. La parametrización de las variables financieras en la base de datos permite automatizar de forma precisa y exenta de errores los ciclos de interés, la gestión de deudores y la tasación de metales según su pureza, garantizando la centralización y seguridad de las operaciones comerciales.</w:t>
-      </w:r>
-    </w:p>
-    <w:p>
-      <w:pPr>
-        <w:pStyle w:val="normal1"/>
-        <w:spacing w:lineRule="auto" w:line="360"/>
-        <w:ind w:firstLine="720"/>
-        <w:jc w:val="both"/>
-        <w:rPr/>
-      </w:pPr>
-      <w:r>
-        <w:rPr>
-          <w:rFonts w:ascii="Times New Roman" w:hAnsi="Times New Roman" w:cs="Times New Roman"/>
-          <w:sz w:val="24"/>
-        </w:rPr>
-        <w:t>Finalmente, con relación al desarrollo e implementación del sistema de información web propuesto, se concluye que dicha plataforma optimiza de forma radical el tiempo de respuesta y la confiabilidad operativa de Inversiones Más Por Tu Oro 17 C.A. La sistematización permite llevar un control estricto de las fuentes de capital, las liquidaciones y el cierre diario de cajas, brindando así un ecosistema tecnológico seguro, auditable y escalable para la toma de decisiones empresariales.</w:t>
+          <w:b w:val="0"/>
+          <w:i w:val="0"/>
+          <w:sz w:val="24"/>
+        </w:rPr>
+        <w:t>Finalmente, respecto al diseño de la propuesta, se logró estructurar un modelo arquitectónico de software robusto, sustentado en una arquitectura web en tres capas, un modelo relacional de base de datos normalizado, interfaces prototipo altamente intuitivas y un manual de operación detallado. La propuesta técnica formulada resuelve de manera integral los requerimientos funcionales de la organización, sentando las bases definitivas para su futura adopción tecnológica.</w:t>
       </w:r>
     </w:p>
     <w:p>
@@ -10786,9 +10574,11 @@
       <w:r>
         <w:rPr>
           <w:rFonts w:ascii="Times New Roman" w:hAnsi="Times New Roman" w:cs="Times New Roman"/>
-          <w:sz w:val="24"/>
-        </w:rPr>
-        <w:t>A partir de las conclusiones formuladas y considerando el impacto directo de la investigación sobre Inversiones Más Por Tu Oro 17 C.A., se plantean las siguientes recomendaciones:</w:t>
+          <w:b w:val="0"/>
+          <w:i w:val="0"/>
+          <w:sz w:val="24"/>
+        </w:rPr>
+        <w:t>A partir de las conclusiones formuladas y considerando la viabilidad de la propuesta técnica desarrollada, se presentan las siguientes recomendaciones a la empresa Inversiones Más Por Tu Oro 17 C.A.:</w:t>
       </w:r>
     </w:p>
     <w:p>
@@ -10802,9 +10592,11 @@
       <w:r>
         <w:rPr>
           <w:rFonts w:ascii="Times New Roman" w:hAnsi="Times New Roman" w:cs="Times New Roman"/>
-          <w:sz w:val="24"/>
-        </w:rPr>
-        <w:t>Se recomienda formalizar de manera inmediata la adopción del software web desarrollado para la ejecución de las operaciones diarias de la empresa, reemplazando el uso de archivos de Excel como medida primaria para mitigar riesgos de seguridad y pérdida de información de los clientes.</w:t>
+          <w:b w:val="0"/>
+          <w:i w:val="0"/>
+          <w:sz w:val="24"/>
+        </w:rPr>
+        <w:t>1. Aprobar formalmente por parte de la directiva de la empresa la ejecución e implementación de la propuesta del sistema de información web diseñada en el presente Trabajo de Grado.</w:t>
       </w:r>
     </w:p>
     <w:p>
@@ -10818,8 +10610,11 @@
       <w:r>
         <w:rPr>
           <w:rFonts w:ascii="Times New Roman" w:hAnsi="Times New Roman" w:cs="Times New Roman"/>
-        </w:rPr>
-        <w:t>Ejecutar un taller de capacitación técnica e inducción al cambio dirigido al Gerente, el Administrador y el Cajero de la institución, con el fin de garantizar el correcto dominio de las funciones del nuevo sistema, la asignación de permisos según sus roles y el manejo del módulo de empeños (contratos de mutuo con garantía prendaria).</w:t>
+          <w:b w:val="0"/>
+          <w:i w:val="0"/>
+          <w:sz w:val="24"/>
+        </w:rPr>
+        <w:t>2. Planificar sesiones de capacitación e inducción dirigidas al Gerente, Administrador y Cajero, tomando como base la Guía Operativa y el Manual de Operación incluidos en la propuesta.</w:t>
       </w:r>
     </w:p>
     <w:p>
@@ -10833,9 +10628,11 @@
       <w:r>
         <w:rPr>
           <w:rFonts w:ascii="Times New Roman" w:hAnsi="Times New Roman" w:cs="Times New Roman"/>
-          <w:sz w:val="24"/>
-        </w:rPr>
-        <w:t>Realizar un respaldo (backup) íntegro de la data histórica manejada en los libros de Excel actuales, para posteriormente efectuar una migración de datos estructurada hacia la nueva base de datos relacional, asegurando la continuidad del negocio y el seguimiento ininterrumpido de las deudas monetarias activas.</w:t>
+          <w:b w:val="0"/>
+          <w:i w:val="0"/>
+          <w:sz w:val="24"/>
+        </w:rPr>
+        <w:t>3. Efectuar el proceso de migración de los datos históricos de los libros de Excel hacia el nuevo motor de base de datos relacional una vez iniciada la fase de implantación.</w:t>
       </w:r>
     </w:p>
     <w:p>
@@ -10849,9 +10646,11 @@
       <w:r>
         <w:rPr>
           <w:rFonts w:ascii="Times New Roman" w:hAnsi="Times New Roman" w:cs="Times New Roman"/>
-          <w:sz w:val="24"/>
-        </w:rPr>
-        <w:t>Establecer políticas obligatorias de mantenimiento preventivo y de copias de seguridad de las bases de datos del sistema, recomendando el uso de servicios en la nube para proteger la información vital relacionada con la identidad de los clientes y las liquidaciones de las fuentes de capital.</w:t>
+          <w:b w:val="0"/>
+          <w:i w:val="0"/>
+          <w:sz w:val="24"/>
+        </w:rPr>
+        <w:t>4. Establecer políticas organizacionales de copias de seguridad periódicas y mantenimiento preventivo para salvaguardar la integridad de los registros financieros y la información de los clientes.</w:t>
       </w:r>
     </w:p>
     <w:p>
@@ -10935,13 +10734,8 @@
       <w:pPr>
         <w:jc w:val="both"/>
         <w:spacing w:line="360" w:lineRule="auto" w:after="120" w:before="0"/>
-        <w:ind w:firstLine="720" w:left="0"/>
-      </w:pPr>
-      <w:r>
-        <w:rPr>
-          <w:rFonts w:ascii="Times New Roman" w:hAnsi="Times New Roman" w:cs="Times New Roman"/>
-        </w:rPr>
-      </w:r>
+        <w:ind w:left="0" w:firstLine="720"/>
+      </w:pPr>
       <w:r>
         <w:rPr>
           <w:rFonts w:ascii="Times New Roman" w:hAnsi="Times New Roman" w:cs="Times New Roman"/>
@@ -10949,20 +10743,15 @@
           <w:i w:val="0"/>
           <w:sz w:val="24"/>
         </w:rPr>
-        <w:t>En este marco institucional, la presente propuesta técnica comprende el diseño e implementación del "Sistema de Información para la Gestión de Inventario y Control de Préstamos Prendarios", concebido a medida para responder a las exigencias operacionales de la empresa Inversiones Más Por Tu Oro 17 C.A., ubicada en la ciudad de Caracas. La solución consolida una plataforma web moderna e integrada, estructurada mediante dos módulos funcionales complementarios y sincronizados:</w:t>
+        <w:t>En este marco institucional, la presente propuesta técnica comprende el diseño de un Sistema de Información Web Integrado para la Gestión de Inventario y Control de Préstamos Prendarios, concebido para responder a las exigencias operacionales de la empresa Inversiones Más Por Tu Oro 17 C.A., ubicada en la ciudad de Caracas. La solución consolida una plataforma web unificada y moderna bajo la arquitectura de Next.js (React y TypeScript) y el motor relacional PostgreSQL, estructurada para sustituir de manera definitiva el manejo disperso en libros de cálculo de Microsoft Excel.</w:t>
       </w:r>
     </w:p>
     <w:p>
       <w:pPr>
         <w:jc w:val="both"/>
         <w:spacing w:line="360" w:lineRule="auto" w:after="120" w:before="0"/>
-        <w:ind w:firstLine="720" w:left="0"/>
-      </w:pPr>
-      <w:r>
-        <w:rPr>
-          <w:rFonts w:ascii="Times New Roman" w:hAnsi="Times New Roman" w:cs="Times New Roman"/>
-        </w:rPr>
-      </w:r>
+        <w:ind w:left="0" w:firstLine="720"/>
+      </w:pPr>
       <w:r>
         <w:rPr>
           <w:rFonts w:ascii="Times New Roman" w:hAnsi="Times New Roman" w:cs="Times New Roman"/>
@@ -10970,49 +10759,7 @@
           <w:i w:val="0"/>
           <w:sz w:val="24"/>
         </w:rPr>
-        <w:t>1. Módulo de Control de Préstamos Prendarios y Empeños: Desarrollado bajo una arquitectura web moderna con Next.js y React en TypeScript, respaldado por el ORM Prisma y una base de datos relacional PostgreSQL desplegada sobre infraestructura en la nube. Este módulo administra el ciclo de vida íntegro de las boletas de empeño, desde la tasación del bien, captura fotográfica remota de la prenda en tiempo real, cálculo automatizado de tasas de interés y custodia, hasta la emisión digital de contratos en formato carta con código QR de verificación, renovaciones periódicas y rescates.</w:t>
-      </w:r>
-    </w:p>
-    <w:p>
-      <w:pPr>
-        <w:jc w:val="both"/>
-        <w:spacing w:line="360" w:lineRule="auto" w:after="120" w:before="0"/>
-        <w:ind w:firstLine="720" w:left="0"/>
-      </w:pPr>
-      <w:r>
-        <w:rPr>
-          <w:rFonts w:ascii="Times New Roman" w:hAnsi="Times New Roman" w:cs="Times New Roman"/>
-        </w:rPr>
-      </w:r>
-      <w:r>
-        <w:rPr>
-          <w:rFonts w:ascii="Times New Roman" w:hAnsi="Times New Roman" w:cs="Times New Roman"/>
-          <w:b w:val="0"/>
-          <w:i w:val="0"/>
-          <w:sz w:val="24"/>
-        </w:rPr>
-        <w:t>2. Módulo de Arqueo de Caja, Compra de Metales Preciosos e Inventario en Bóveda: Estructurado mediante una arquitectura cliente-servidor desacoplada con servicios backend en Python (Django REST Framework) y una interfaz gráfica interactiva tipo SPA (Single Page Application) desarrollada en Vite y React. Este módulo gestiona la compra directa de oro y plata por kilataje y ley, determinando automáticamente los gramos puros equivalentes y el valor de liquidación, a la vez que centraliza el arqueo diario de caja multimoneda (dólares en efectivo y bolívares digitales) y el registro de egresos operativos.</w:t>
-      </w:r>
-    </w:p>
-    <w:p>
-      <w:pPr>
-        <w:jc w:val="both"/>
-        <w:spacing w:line="360" w:lineRule="auto" w:after="120" w:before="0"/>
-        <w:ind w:firstLine="720" w:left="0"/>
-      </w:pPr>
-      <w:r>
-        <w:rPr>
-          <w:rFonts w:ascii="Times New Roman" w:hAnsi="Times New Roman" w:cs="Times New Roman"/>
-        </w:rPr>
-      </w:r>
-      <w:r>
-        <w:rPr>
-          <w:rFonts w:ascii="Times New Roman" w:hAnsi="Times New Roman" w:cs="Times New Roman"/>
-          <w:b w:val="0"/>
-          <w:i w:val="0"/>
-          <w:sz w:val="24"/>
-        </w:rPr>
-        <w:t>La unificación de estos módulos proporciona un ecosistema informático robusto que sustituye de manera definitiva el manejo disperso en libros de cálculo de Microsoft Excel, garantizando la centralización de datos, la trazabilidad de los metales en bóveda y la inmediatez en la toma de decisiones gerenciales.</w:t>
+        <w:t>La plataforma web propuesta centraliza de forma armónica los procesos clave del negocio: emisión y administración de boletas de empeño, tasación física de prendas, compra de metales preciosos (oro y plata), control riguroso de inventario en bóveda, arqueo diario de caja multimoneda y generación automatizada de reportes gerenciales, garantizando la consistencia de los datos y la inmediatez en las consultas.</w:t>
       </w:r>
     </w:p>
     <w:p>
@@ -11040,13 +10787,8 @@
       <w:pPr>
         <w:jc w:val="both"/>
         <w:spacing w:line="360" w:lineRule="auto" w:after="120" w:before="0"/>
-        <w:ind w:firstLine="720" w:left="0"/>
-      </w:pPr>
-      <w:r>
-        <w:rPr>
-          <w:rFonts w:ascii="Times New Roman" w:hAnsi="Times New Roman" w:cs="Times New Roman"/>
-        </w:rPr>
-      </w:r>
+        <w:ind w:left="0" w:firstLine="720"/>
+      </w:pPr>
       <w:r>
         <w:rPr>
           <w:rFonts w:ascii="Times New Roman" w:hAnsi="Times New Roman" w:cs="Times New Roman"/>
@@ -11054,7 +10796,7 @@
           <w:i w:val="0"/>
           <w:sz w:val="24"/>
         </w:rPr>
-        <w:t>La implementación de la plataforma tecnológica en Inversiones Más Por Tu Oro 17 C.A. encuentra su justificación en múltiples dimensiones:</w:t>
+        <w:t>La adopción de la propuesta tecnológica en Inversiones Más Por Tu Oro 17 C.A. encuentra su justificación en múltiples dimensiones:</w:t>
       </w:r>
     </w:p>
     <w:p>
@@ -11166,13 +10908,8 @@
       <w:pPr>
         <w:jc w:val="both"/>
         <w:spacing w:line="360" w:lineRule="auto" w:after="120" w:before="0"/>
-        <w:ind w:firstLine="720" w:left="0"/>
-      </w:pPr>
-      <w:r>
-        <w:rPr>
-          <w:rFonts w:ascii="Times New Roman" w:hAnsi="Times New Roman" w:cs="Times New Roman"/>
-        </w:rPr>
-      </w:r>
+        <w:ind w:left="0" w:firstLine="720"/>
+      </w:pPr>
       <w:r>
         <w:rPr>
           <w:rFonts w:ascii="Times New Roman" w:hAnsi="Times New Roman" w:cs="Times New Roman"/>
@@ -11180,7 +10917,7 @@
           <w:i w:val="0"/>
           <w:sz w:val="24"/>
         </w:rPr>
-        <w:t>Implementar un Sistema de Información Web Integrado para la Gestión de Inventario, Control de Préstamos Prendarios y Arqueo de Caja en la empresa Inversiones Más Por Tu Oro 17 C.A., con el propósito de optimizar los tiempos de atención, garantizar la seguridad de los registros financieros y centralizar el control de activos en custodia.</w:t>
+        <w:t>Diseñar una propuesta de Sistema de Información Web Integrado para la Gestión de Inventario, Control de Préstamos Prendarios y Arqueo de Caja en la empresa Inversiones Más Por Tu Oro 17 C.A., con el propósito de optimizar los tiempos de atención, garantizar la seguridad de los registros financieros y centralizar el control de activos en custodia.</w:t>
       </w:r>
     </w:p>
     <w:p>
@@ -11439,13 +11176,8 @@
       <w:pPr>
         <w:jc w:val="both"/>
         <w:spacing w:line="360" w:lineRule="auto" w:after="120" w:before="0"/>
-        <w:ind w:firstLine="720" w:left="0"/>
-      </w:pPr>
-      <w:r>
-        <w:rPr>
-          <w:rFonts w:ascii="Times New Roman" w:hAnsi="Times New Roman" w:cs="Times New Roman"/>
-        </w:rPr>
-      </w:r>
+        <w:ind w:left="0" w:firstLine="720"/>
+      </w:pPr>
       <w:r>
         <w:rPr>
           <w:rFonts w:ascii="Times New Roman" w:hAnsi="Times New Roman" w:cs="Times New Roman"/>
@@ -11453,20 +11185,15 @@
           <w:i w:val="0"/>
           <w:sz w:val="24"/>
         </w:rPr>
-        <w:t>a) Frontend Reactivo y Modular: La interfaz del módulo de préstamos está construida con Next.js (React y TypeScript con Tailwind CSS), mientras que el módulo de caja e inventario utiliza Vite con React. Ambos proporcionan renderizado ágil, componentes accesibles y diseño responsivo adaptado para computadores de escritorio y dispositivos móviles.</w:t>
+        <w:t>a) Capa de Presentación (Frontend Web): Se propone una interfaz de usuario moderna y responsiva construida con Next.js (React y TypeScript con Tailwind CSS), garantizando renderizado de alto rendimiento, accesibilidad visual y adaptabilidad tanto a estaciones de trabajo de escritorio como a dispositivos móviles.</w:t>
       </w:r>
     </w:p>
     <w:p>
       <w:pPr>
         <w:jc w:val="both"/>
         <w:spacing w:line="360" w:lineRule="auto" w:after="120" w:before="0"/>
-        <w:ind w:firstLine="720" w:left="0"/>
-      </w:pPr>
-      <w:r>
-        <w:rPr>
-          <w:rFonts w:ascii="Times New Roman" w:hAnsi="Times New Roman" w:cs="Times New Roman"/>
-        </w:rPr>
-      </w:r>
+        <w:ind w:left="0" w:firstLine="720"/>
+      </w:pPr>
       <w:r>
         <w:rPr>
           <w:rFonts w:ascii="Times New Roman" w:hAnsi="Times New Roman" w:cs="Times New Roman"/>
@@ -11474,20 +11201,15 @@
           <w:i w:val="0"/>
           <w:sz w:val="24"/>
         </w:rPr>
-        <w:t>b) Capa de Servicios Backend y APIs RESTful: Se integran Server Actions y microservicios construidos con Django REST Framework (Python). Esta capa centraliza las reglas financieras (algoritmos de cálculo de interés diario/mensual, prorrateo, tasas de custodia, conversión de kilatajes a gramos puros) y la validación de datos.</w:t>
+        <w:t>b) Capa de Lógica de Negocio (Backend y Controladores): Se estructura a través de controladores y servicios de aplicación en Next.js (TypeScript), centralizando la ejecución de las reglas financieras (algoritmos de interés diario/mensual, tasas de custodia prendaria, conversión de kilatajes a gramos puros) y la validación estricta de esquemas de datos.</w:t>
       </w:r>
     </w:p>
     <w:p>
       <w:pPr>
         <w:jc w:val="both"/>
         <w:spacing w:line="360" w:lineRule="auto" w:after="120" w:before="0"/>
-        <w:ind w:firstLine="720" w:left="0"/>
-      </w:pPr>
-      <w:r>
-        <w:rPr>
-          <w:rFonts w:ascii="Times New Roman" w:hAnsi="Times New Roman" w:cs="Times New Roman"/>
-        </w:rPr>
-      </w:r>
+        <w:ind w:left="0" w:firstLine="720"/>
+      </w:pPr>
       <w:r>
         <w:rPr>
           <w:rFonts w:ascii="Times New Roman" w:hAnsi="Times New Roman" w:cs="Times New Roman"/>
@@ -11495,7 +11217,7 @@
           <w:i w:val="0"/>
           <w:sz w:val="24"/>
         </w:rPr>
-        <w:t>c) Persistencia y Generación de Documentos: Se utiliza el motor relacional PostgreSQL alojado en la nube, garantizando aislamiento transaccional (ACID). Para la emisión de contratos de empeño, actas de rescate y recibos de pago, se implementa la biblioteca @react-pdf/renderer configurada en formato Carta (Letter), asegurando fidelidad tipográfica, membrete institucional y código QR para verificación digital.</w:t>
+        <w:t>c) Capa de Persistencia y Generación Documental: Se proyecta el uso del Sistema Gestor de Bases de Datos Relacional PostgreSQL, asegurando el cumplimiento de las propiedades transaccionales ACID y máxima integridad referencial. Para la emisión formal de contratos de empeño en formato Carta (Letter), se contempla un módulo de generación de documentos en PDF con código QR verificable.</w:t>
       </w:r>
     </w:p>
     <w:p>
@@ -14946,13 +14668,8 @@
       <w:pPr>
         <w:jc w:val="both"/>
         <w:spacing w:line="360" w:lineRule="auto" w:after="120" w:before="0"/>
-        <w:ind w:firstLine="720" w:left="0"/>
-      </w:pPr>
-      <w:r>
-        <w:rPr>
-          <w:rFonts w:ascii="Times New Roman" w:hAnsi="Times New Roman" w:cs="Times New Roman"/>
-        </w:rPr>
-      </w:r>
+        <w:ind w:left="0" w:firstLine="720"/>
+      </w:pPr>
       <w:r>
         <w:rPr>
           <w:rFonts w:ascii="Times New Roman" w:hAnsi="Times New Roman" w:cs="Times New Roman"/>
@@ -14960,7 +14677,7 @@
           <w:i w:val="0"/>
           <w:sz w:val="24"/>
         </w:rPr>
-        <w:t>• RNF-06 (Mantenibilidad): Código fuente modular y tipado estricto en TypeScript y Python, con separación clara de capas de negocio y presentación.</w:t>
+        <w:t>• RNF-06 (Mantenibilidad): Código fuente modular y tipado estricto en TypeScript, con separación clara de capas de negocio y presentación.</w:t>
       </w:r>
     </w:p>
     <w:p>
@@ -15009,13 +14726,8 @@
       <w:pPr>
         <w:jc w:val="both"/>
         <w:spacing w:line="360" w:lineRule="auto" w:after="120" w:before="0"/>
-        <w:ind w:firstLine="720" w:left="0"/>
-      </w:pPr>
-      <w:r>
-        <w:rPr>
-          <w:rFonts w:ascii="Times New Roman" w:hAnsi="Times New Roman" w:cs="Times New Roman"/>
-        </w:rPr>
-      </w:r>
+        <w:ind w:left="0" w:firstLine="720"/>
+      </w:pPr>
       <w:r>
         <w:rPr>
           <w:rFonts w:ascii="Times New Roman" w:hAnsi="Times New Roman" w:cs="Times New Roman"/>
@@ -15023,20 +14735,15 @@
           <w:i w:val="0"/>
           <w:sz w:val="24"/>
         </w:rPr>
-        <w:t>1. Capa de Presentación (Frontend): Compuesta por la aplicación web construida con Next.js/React y la interfaz SPA en Vite. Los operadores acceden desde cualquier navegador web moderno (Google Chrome, Mozilla Firefox, Safari) sin requerir instalaciones locales.</w:t>
+        <w:t>1. Capa de Presentación (Frontend): Interfaz web unificada desarrollada con Next.js y React, accesible desde cualquier navegador estándar (Google Chrome, Mozilla Firefox, Safari) sin requerir instalaciones cliente adicionales.</w:t>
       </w:r>
     </w:p>
     <w:p>
       <w:pPr>
         <w:jc w:val="both"/>
         <w:spacing w:line="360" w:lineRule="auto" w:after="120" w:before="0"/>
-        <w:ind w:firstLine="720" w:left="0"/>
-      </w:pPr>
-      <w:r>
-        <w:rPr>
-          <w:rFonts w:ascii="Times New Roman" w:hAnsi="Times New Roman" w:cs="Times New Roman"/>
-        </w:rPr>
-      </w:r>
+        <w:ind w:left="0" w:firstLine="720"/>
+      </w:pPr>
       <w:r>
         <w:rPr>
           <w:rFonts w:ascii="Times New Roman" w:hAnsi="Times New Roman" w:cs="Times New Roman"/>
@@ -15044,20 +14751,15 @@
           <w:i w:val="0"/>
           <w:sz w:val="24"/>
         </w:rPr>
-        <w:t>2. Capa de Lógica de Negocio (Backend y APIs): Integrada por Server Actions de Next.js y los servicios REST construidos en Django REST Framework. Esta capa centraliza las reglas financieras (algoritmos de cálculo de interés diario/mensual, prorrateo, tasas de custodia, conversión de kilatajes a gramos puros) y la validación de esquemas.</w:t>
+        <w:t>2. Capa de Lógica de Negocio (Backend): Módulos de servicios y controladores en Next.js/TypeScript encargados de la ejecución de algoritmos financieros, control de sesiones, validación de reglas de negocio y seguridad de acceso por roles.</w:t>
       </w:r>
     </w:p>
     <w:p>
       <w:pPr>
         <w:jc w:val="both"/>
         <w:spacing w:line="360" w:lineRule="auto" w:after="120" w:before="0"/>
-        <w:ind w:firstLine="720" w:left="0"/>
-      </w:pPr>
-      <w:r>
-        <w:rPr>
-          <w:rFonts w:ascii="Times New Roman" w:hAnsi="Times New Roman" w:cs="Times New Roman"/>
-        </w:rPr>
-      </w:r>
+        <w:ind w:left="0" w:firstLine="720"/>
+      </w:pPr>
       <w:r>
         <w:rPr>
           <w:rFonts w:ascii="Times New Roman" w:hAnsi="Times New Roman" w:cs="Times New Roman"/>
@@ -15065,7 +14767,7 @@
           <w:i w:val="0"/>
           <w:sz w:val="24"/>
         </w:rPr>
-        <w:t>3. Capa de Persistencia y Almacenamiento (Base de Datos): Soportada por el motor relacional PostgreSQL alojado en la nube. Gestiona las tablas con integridad referencial estricta y almacena las fotografías de prendas en almacenamiento seguro de objetos.</w:t>
+        <w:t>3. Capa de Persistencia y Datos (Base de Datos): Soportada por el motor relacional PostgreSQL, garantizando integridad referencial estricta, claves foráneas indexadas y procedimientos de almacenamiento seguro.</w:t>
       </w:r>
     </w:p>
     <w:p>
@@ -15219,13 +14921,8 @@
       <w:pPr>
         <w:jc w:val="both"/>
         <w:spacing w:line="360" w:lineRule="auto" w:after="120" w:before="0"/>
-        <w:ind w:firstLine="720" w:left="0"/>
-      </w:pPr>
-      <w:r>
-        <w:rPr>
-          <w:rFonts w:ascii="Times New Roman" w:hAnsi="Times New Roman" w:cs="Times New Roman"/>
-        </w:rPr>
-      </w:r>
+        <w:ind w:left="0" w:firstLine="720"/>
+      </w:pPr>
       <w:r>
         <w:rPr>
           <w:rFonts w:ascii="Times New Roman" w:hAnsi="Times New Roman" w:cs="Times New Roman"/>
@@ -15233,20 +14930,15 @@
           <w:i w:val="0"/>
           <w:sz w:val="24"/>
         </w:rPr>
-        <w:t>• Entidad Closure (Sesión de Caja): Control del turno contable (id, fecha, balanceInicialUSD, balanceInicialVES, totalEntradasUSD, totalSalidasUSD, arqueoEfectivo, estado [ABIERTA, CERRADA], usuarioId).</w:t>
+        <w:t>• Entidad Sesión de Caja (CajaDiaria): Control del turno contable diario (id, fecha, balanceInicialUSD, balanceInicialVES, totalEntradasUSD, totalSalidasUSD, arqueoEfectivo, estado [ABIERTA, CERRADA], usuarioId).</w:t>
       </w:r>
     </w:p>
     <w:p>
       <w:pPr>
         <w:jc w:val="both"/>
         <w:spacing w:line="360" w:lineRule="auto" w:after="120" w:before="0"/>
-        <w:ind w:firstLine="720" w:left="0"/>
-      </w:pPr>
-      <w:r>
-        <w:rPr>
-          <w:rFonts w:ascii="Times New Roman" w:hAnsi="Times New Roman" w:cs="Times New Roman"/>
-        </w:rPr>
-      </w:r>
+        <w:ind w:left="0" w:firstLine="720"/>
+      </w:pPr>
       <w:r>
         <w:rPr>
           <w:rFonts w:ascii="Times New Roman" w:hAnsi="Times New Roman" w:cs="Times New Roman"/>
@@ -15254,7 +14946,7 @@
           <w:i w:val="0"/>
           <w:sz w:val="24"/>
         </w:rPr>
-        <w:t>• Entidad ClosureGoldItem: Transacciones de compra de oro (id, closureId [FK], fecha, nombreCliente, kilate, pesoDelOro, precioDelOro, pureGrams, totalVenta, ganancia).</w:t>
+        <w:t>• Entidad Compra de Metales (CompraOroPlata): Transacciones de adquisición de metales (id, cajaId [FK], fecha, nombreCliente, kilate, pesoDelOro, precioDelOro, pureGrams, totalVenta, gananciaEstimada).</w:t>
       </w:r>
     </w:p>
     <w:p>

</xml_diff>